<commit_message>
Format contents page as bordered INDEX table (Chapter | Particulars | Page)
</commit_message>
<xml_diff>
--- a/report/HAL_Internship_Report.docx
+++ b/report/HAL_Internship_Report.docx
@@ -1152,37 +1152,38 @@
     <w:p>
       <w:pPr>
         <w:keepNext/>
-        <w:spacing w:before="120" w:after="180" w:line="360" w:lineRule="auto"/>
-        <w:jc w:val="left"/>
+        <w:spacing w:before="120" w:after="240" w:line="360" w:lineRule="auto"/>
+        <w:jc w:val="center"/>
       </w:pPr>
       <w:r>
         <w:rPr>
           <w:rFonts w:ascii="Times New Roman" w:hAnsi="Times New Roman" w:cs="Times New Roman"/>
           <w:b/>
-          <w:sz w:val="32"/>
-          <w:szCs w:val="32"/>
-        </w:rPr>
-        <w:t xml:space="preserve">TABLE OF CONTENTS</w:t>
+          <w:sz w:val="40"/>
+          <w:szCs w:val="40"/>
+        </w:rPr>
+        <w:t xml:space="preserve">INDEX</w:t>
       </w:r>
     </w:p>
     <w:tbl>
       <w:tblPr>
         <w:tblStyle w:val="TableGrid"/>
-        <w:tblW w:w="0" w:type="auto"/>
+        <w:tblW w:w="9360" w:type="dxa"/>
+        <w:jc w:val="center"/>
         <w:tblBorders>
-          <w:top w:val="single" w:sz="4" w:color="555555"/>
-          <w:left w:val="single" w:sz="4" w:color="555555"/>
-          <w:bottom w:val="single" w:sz="4" w:color="555555"/>
-          <w:right w:val="single" w:sz="4" w:color="555555"/>
-          <w:insideH w:val="single" w:sz="4" w:color="999999"/>
-          <w:insideV w:val="single" w:sz="4" w:color="999999"/>
+          <w:top w:val="single" w:sz="12" w:color="000000"/>
+          <w:left w:val="single" w:sz="12" w:color="000000"/>
+          <w:bottom w:val="single" w:sz="12" w:color="000000"/>
+          <w:right w:val="single" w:sz="12" w:color="000000"/>
+          <w:insideH w:val="single" w:sz="12" w:color="000000"/>
+          <w:insideV w:val="single" w:sz="12" w:color="000000"/>
         </w:tblBorders>
         <w:tblLook w:val="04A0"/>
       </w:tblPr>
       <w:tblGrid>
-        <w:gridCol w:w="900"/>
-        <w:gridCol w:w="7460"/>
-        <w:gridCol w:w="1000"/>
+        <w:gridCol w:w="1500"/>
+        <w:gridCol w:w="6360"/>
+        <w:gridCol w:w="1500"/>
       </w:tblGrid>
       <w:tr>
         <w:trPr>
@@ -1190,68 +1191,98 @@
         </w:trPr>
         <w:tc>
           <w:tcPr>
-            <w:tcW w:w="900" w:type="dxa"/>
-            <w:shd w:val="clear" w:color="auto" w:fill="1F3864"/>
-            <w:vAlign w:val="center"/>
-          </w:tcPr>
-          <w:p>
-            <w:pPr>
-              <w:spacing w:before="20" w:after="20" w:line="240" w:lineRule="auto"/>
-              <w:jc w:val="left"/>
+            <w:tcW w:w="1500" w:type="dxa"/>
+            <w:tcBorders>
+              <w:top w:val="single" w:sz="12" w:color="000000"/>
+              <w:left w:val="single" w:sz="12" w:color="000000"/>
+              <w:bottom w:val="single" w:sz="12" w:color="000000"/>
+              <w:right w:val="single" w:sz="12" w:color="000000"/>
+            </w:tcBorders>
+            <w:tcMar>
+              <w:top w:w="120" w:type="dxa"/>
+              <w:bottom w:w="120" w:type="dxa"/>
+              <w:left w:w="120" w:type="dxa"/>
+              <w:right w:w="120" w:type="dxa"/>
+            </w:tcMar>
+            <w:vAlign w:val="center"/>
+          </w:tcPr>
+          <w:p>
+            <w:pPr>
+              <w:spacing w:before="80" w:after="80" w:line="240" w:lineRule="auto"/>
+              <w:jc w:val="center"/>
             </w:pPr>
             <w:r>
               <w:rPr>
                 <w:rFonts w:ascii="Times New Roman" w:hAnsi="Times New Roman" w:cs="Times New Roman"/>
                 <w:b/>
-                <w:color w:val="FFFFFF"/>
-                <w:sz w:val="22"/>
-                <w:szCs w:val="22"/>
-              </w:rPr>
-              <w:t xml:space="preserve">Ch.</w:t>
-            </w:r>
-          </w:p>
-        </w:tc>
-        <w:tc>
-          <w:tcPr>
-            <w:tcW w:w="7460" w:type="dxa"/>
-            <w:shd w:val="clear" w:color="auto" w:fill="1F3864"/>
-            <w:vAlign w:val="center"/>
-          </w:tcPr>
-          <w:p>
-            <w:pPr>
-              <w:spacing w:before="20" w:after="20" w:line="240" w:lineRule="auto"/>
-              <w:jc w:val="left"/>
+                <w:sz w:val="28"/>
+                <w:szCs w:val="28"/>
+              </w:rPr>
+              <w:t xml:space="preserve">Chapter</w:t>
+            </w:r>
+          </w:p>
+        </w:tc>
+        <w:tc>
+          <w:tcPr>
+            <w:tcW w:w="6360" w:type="dxa"/>
+            <w:tcBorders>
+              <w:top w:val="single" w:sz="12" w:color="000000"/>
+              <w:left w:val="single" w:sz="12" w:color="000000"/>
+              <w:bottom w:val="single" w:sz="12" w:color="000000"/>
+              <w:right w:val="single" w:sz="12" w:color="000000"/>
+            </w:tcBorders>
+            <w:tcMar>
+              <w:top w:w="120" w:type="dxa"/>
+              <w:bottom w:w="120" w:type="dxa"/>
+              <w:left w:w="120" w:type="dxa"/>
+              <w:right w:w="120" w:type="dxa"/>
+            </w:tcMar>
+            <w:vAlign w:val="center"/>
+          </w:tcPr>
+          <w:p>
+            <w:pPr>
+              <w:spacing w:before="80" w:after="80" w:line="240" w:lineRule="auto"/>
+              <w:jc w:val="center"/>
             </w:pPr>
             <w:r>
               <w:rPr>
                 <w:rFonts w:ascii="Times New Roman" w:hAnsi="Times New Roman" w:cs="Times New Roman"/>
                 <w:b/>
-                <w:color w:val="FFFFFF"/>
-                <w:sz w:val="22"/>
-                <w:szCs w:val="22"/>
-              </w:rPr>
-              <w:t xml:space="preserve">Title</w:t>
-            </w:r>
-          </w:p>
-        </w:tc>
-        <w:tc>
-          <w:tcPr>
-            <w:tcW w:w="1000" w:type="dxa"/>
-            <w:shd w:val="clear" w:color="auto" w:fill="1F3864"/>
-            <w:vAlign w:val="center"/>
-          </w:tcPr>
-          <w:p>
-            <w:pPr>
-              <w:spacing w:before="20" w:after="20" w:line="240" w:lineRule="auto"/>
-              <w:jc w:val="left"/>
+                <w:sz w:val="28"/>
+                <w:szCs w:val="28"/>
+              </w:rPr>
+              <w:t xml:space="preserve">Particulars</w:t>
+            </w:r>
+          </w:p>
+        </w:tc>
+        <w:tc>
+          <w:tcPr>
+            <w:tcW w:w="1500" w:type="dxa"/>
+            <w:tcBorders>
+              <w:top w:val="single" w:sz="12" w:color="000000"/>
+              <w:left w:val="single" w:sz="12" w:color="000000"/>
+              <w:bottom w:val="single" w:sz="12" w:color="000000"/>
+              <w:right w:val="single" w:sz="12" w:color="000000"/>
+            </w:tcBorders>
+            <w:tcMar>
+              <w:top w:w="120" w:type="dxa"/>
+              <w:bottom w:w="120" w:type="dxa"/>
+              <w:left w:w="120" w:type="dxa"/>
+              <w:right w:w="120" w:type="dxa"/>
+            </w:tcMar>
+            <w:vAlign w:val="center"/>
+          </w:tcPr>
+          <w:p>
+            <w:pPr>
+              <w:spacing w:before="80" w:after="80" w:line="240" w:lineRule="auto"/>
+              <w:jc w:val="center"/>
             </w:pPr>
             <w:r>
               <w:rPr>
                 <w:rFonts w:ascii="Times New Roman" w:hAnsi="Times New Roman" w:cs="Times New Roman"/>
                 <w:b/>
-                <w:color w:val="FFFFFF"/>
-                <w:sz w:val="22"/>
-                <w:szCs w:val="22"/>
+                <w:sz w:val="28"/>
+                <w:szCs w:val="28"/>
               </w:rPr>
               <w:t xml:space="preserve">Page</w:t>
             </w:r>
@@ -1261,61 +1292,97 @@
       <w:tr>
         <w:tc>
           <w:tcPr>
-            <w:tcW w:w="900" w:type="dxa"/>
-            <w:vAlign w:val="center"/>
-          </w:tcPr>
-          <w:p>
-            <w:pPr>
-              <w:spacing w:before="20" w:after="20" w:line="240" w:lineRule="auto"/>
-              <w:jc w:val="left"/>
-            </w:pPr>
-            <w:r>
-              <w:rPr>
-                <w:rFonts w:ascii="Times New Roman" w:hAnsi="Times New Roman" w:cs="Times New Roman"/>
-                <w:sz w:val="22"/>
-                <w:szCs w:val="22"/>
-              </w:rPr>
-              <w:t xml:space="preserve"/>
-            </w:r>
-          </w:p>
-        </w:tc>
-        <w:tc>
-          <w:tcPr>
-            <w:tcW w:w="7460" w:type="dxa"/>
-            <w:vAlign w:val="center"/>
-          </w:tcPr>
-          <w:p>
-            <w:pPr>
-              <w:spacing w:before="20" w:after="20" w:line="240" w:lineRule="auto"/>
-              <w:jc w:val="left"/>
-            </w:pPr>
-            <w:r>
-              <w:rPr>
-                <w:rFonts w:ascii="Times New Roman" w:hAnsi="Times New Roman" w:cs="Times New Roman"/>
-                <w:sz w:val="22"/>
-                <w:szCs w:val="22"/>
-              </w:rPr>
-              <w:t xml:space="preserve">Cover Page</w:t>
-            </w:r>
-          </w:p>
-        </w:tc>
-        <w:tc>
-          <w:tcPr>
-            <w:tcW w:w="1000" w:type="dxa"/>
-            <w:vAlign w:val="center"/>
-          </w:tcPr>
-          <w:p>
-            <w:pPr>
-              <w:spacing w:before="20" w:after="20" w:line="240" w:lineRule="auto"/>
-              <w:jc w:val="left"/>
-            </w:pPr>
-            <w:r>
-              <w:rPr>
-                <w:rFonts w:ascii="Times New Roman" w:hAnsi="Times New Roman" w:cs="Times New Roman"/>
-                <w:sz w:val="22"/>
-                <w:szCs w:val="22"/>
-              </w:rPr>
-              <w:t xml:space="preserve">i</w:t>
+            <w:tcW w:w="1500" w:type="dxa"/>
+            <w:tcBorders>
+              <w:top w:val="single" w:sz="12" w:color="000000"/>
+              <w:left w:val="single" w:sz="12" w:color="000000"/>
+              <w:bottom w:val="single" w:sz="12" w:color="000000"/>
+              <w:right w:val="single" w:sz="12" w:color="000000"/>
+            </w:tcBorders>
+            <w:tcMar>
+              <w:top w:w="120" w:type="dxa"/>
+              <w:bottom w:w="120" w:type="dxa"/>
+              <w:left w:w="120" w:type="dxa"/>
+              <w:right w:w="120" w:type="dxa"/>
+            </w:tcMar>
+            <w:vAlign w:val="center"/>
+          </w:tcPr>
+          <w:p>
+            <w:pPr>
+              <w:spacing w:before="80" w:after="80" w:line="240" w:lineRule="auto"/>
+              <w:jc w:val="center"/>
+            </w:pPr>
+            <w:r>
+              <w:rPr>
+                <w:rFonts w:ascii="Times New Roman" w:hAnsi="Times New Roman" w:cs="Times New Roman"/>
+                <w:sz w:val="26"/>
+                <w:szCs w:val="26"/>
+              </w:rPr>
+              <w:t xml:space="preserve">1</w:t>
+            </w:r>
+          </w:p>
+        </w:tc>
+        <w:tc>
+          <w:tcPr>
+            <w:tcW w:w="6360" w:type="dxa"/>
+            <w:tcBorders>
+              <w:top w:val="single" w:sz="12" w:color="000000"/>
+              <w:left w:val="single" w:sz="12" w:color="000000"/>
+              <w:bottom w:val="single" w:sz="12" w:color="000000"/>
+              <w:right w:val="single" w:sz="12" w:color="000000"/>
+            </w:tcBorders>
+            <w:tcMar>
+              <w:top w:w="120" w:type="dxa"/>
+              <w:bottom w:w="120" w:type="dxa"/>
+              <w:left w:w="120" w:type="dxa"/>
+              <w:right w:w="120" w:type="dxa"/>
+            </w:tcMar>
+            <w:vAlign w:val="center"/>
+          </w:tcPr>
+          <w:p>
+            <w:pPr>
+              <w:spacing w:before="80" w:after="80" w:line="240" w:lineRule="auto"/>
+              <w:jc w:val="left"/>
+            </w:pPr>
+            <w:r>
+              <w:rPr>
+                <w:rFonts w:ascii="Times New Roman" w:hAnsi="Times New Roman" w:cs="Times New Roman"/>
+                <w:sz w:val="26"/>
+                <w:szCs w:val="26"/>
+              </w:rPr>
+              <w:t xml:space="preserve">Introduction</w:t>
+            </w:r>
+          </w:p>
+        </w:tc>
+        <w:tc>
+          <w:tcPr>
+            <w:tcW w:w="1500" w:type="dxa"/>
+            <w:tcBorders>
+              <w:top w:val="single" w:sz="12" w:color="000000"/>
+              <w:left w:val="single" w:sz="12" w:color="000000"/>
+              <w:bottom w:val="single" w:sz="12" w:color="000000"/>
+              <w:right w:val="single" w:sz="12" w:color="000000"/>
+            </w:tcBorders>
+            <w:tcMar>
+              <w:top w:w="120" w:type="dxa"/>
+              <w:bottom w:w="120" w:type="dxa"/>
+              <w:left w:w="120" w:type="dxa"/>
+              <w:right w:w="120" w:type="dxa"/>
+            </w:tcMar>
+            <w:vAlign w:val="center"/>
+          </w:tcPr>
+          <w:p>
+            <w:pPr>
+              <w:spacing w:before="80" w:after="80" w:line="240" w:lineRule="auto"/>
+              <w:jc w:val="center"/>
+            </w:pPr>
+            <w:r>
+              <w:rPr>
+                <w:rFonts w:ascii="Times New Roman" w:hAnsi="Times New Roman" w:cs="Times New Roman"/>
+                <w:sz w:val="22"/>
+                <w:szCs w:val="22"/>
+              </w:rPr>
+              <w:t xml:space="preserve">1</w:t>
             </w:r>
           </w:p>
         </w:tc>
@@ -1323,61 +1390,97 @@
       <w:tr>
         <w:tc>
           <w:tcPr>
-            <w:tcW w:w="900" w:type="dxa"/>
-            <w:vAlign w:val="center"/>
-          </w:tcPr>
-          <w:p>
-            <w:pPr>
-              <w:spacing w:before="20" w:after="20" w:line="240" w:lineRule="auto"/>
-              <w:jc w:val="left"/>
-            </w:pPr>
-            <w:r>
-              <w:rPr>
-                <w:rFonts w:ascii="Times New Roman" w:hAnsi="Times New Roman" w:cs="Times New Roman"/>
-                <w:sz w:val="22"/>
-                <w:szCs w:val="22"/>
-              </w:rPr>
-              <w:t xml:space="preserve"/>
-            </w:r>
-          </w:p>
-        </w:tc>
-        <w:tc>
-          <w:tcPr>
-            <w:tcW w:w="7460" w:type="dxa"/>
-            <w:vAlign w:val="center"/>
-          </w:tcPr>
-          <w:p>
-            <w:pPr>
-              <w:spacing w:before="20" w:after="20" w:line="240" w:lineRule="auto"/>
-              <w:jc w:val="left"/>
-            </w:pPr>
-            <w:r>
-              <w:rPr>
-                <w:rFonts w:ascii="Times New Roman" w:hAnsi="Times New Roman" w:cs="Times New Roman"/>
-                <w:sz w:val="22"/>
-                <w:szCs w:val="22"/>
-              </w:rPr>
-              <w:t xml:space="preserve">Certificate</w:t>
-            </w:r>
-          </w:p>
-        </w:tc>
-        <w:tc>
-          <w:tcPr>
-            <w:tcW w:w="1000" w:type="dxa"/>
-            <w:vAlign w:val="center"/>
-          </w:tcPr>
-          <w:p>
-            <w:pPr>
-              <w:spacing w:before="20" w:after="20" w:line="240" w:lineRule="auto"/>
-              <w:jc w:val="left"/>
-            </w:pPr>
-            <w:r>
-              <w:rPr>
-                <w:rFonts w:ascii="Times New Roman" w:hAnsi="Times New Roman" w:cs="Times New Roman"/>
-                <w:sz w:val="22"/>
-                <w:szCs w:val="22"/>
-              </w:rPr>
-              <w:t xml:space="preserve">ii</w:t>
+            <w:tcW w:w="1500" w:type="dxa"/>
+            <w:tcBorders>
+              <w:top w:val="single" w:sz="12" w:color="000000"/>
+              <w:left w:val="single" w:sz="12" w:color="000000"/>
+              <w:bottom w:val="single" w:sz="12" w:color="000000"/>
+              <w:right w:val="single" w:sz="12" w:color="000000"/>
+            </w:tcBorders>
+            <w:tcMar>
+              <w:top w:w="120" w:type="dxa"/>
+              <w:bottom w:w="120" w:type="dxa"/>
+              <w:left w:w="120" w:type="dxa"/>
+              <w:right w:w="120" w:type="dxa"/>
+            </w:tcMar>
+            <w:vAlign w:val="center"/>
+          </w:tcPr>
+          <w:p>
+            <w:pPr>
+              <w:spacing w:before="80" w:after="80" w:line="240" w:lineRule="auto"/>
+              <w:jc w:val="center"/>
+            </w:pPr>
+            <w:r>
+              <w:rPr>
+                <w:rFonts w:ascii="Times New Roman" w:hAnsi="Times New Roman" w:cs="Times New Roman"/>
+                <w:sz w:val="26"/>
+                <w:szCs w:val="26"/>
+              </w:rPr>
+              <w:t xml:space="preserve">2</w:t>
+            </w:r>
+          </w:p>
+        </w:tc>
+        <w:tc>
+          <w:tcPr>
+            <w:tcW w:w="6360" w:type="dxa"/>
+            <w:tcBorders>
+              <w:top w:val="single" w:sz="12" w:color="000000"/>
+              <w:left w:val="single" w:sz="12" w:color="000000"/>
+              <w:bottom w:val="single" w:sz="12" w:color="000000"/>
+              <w:right w:val="single" w:sz="12" w:color="000000"/>
+            </w:tcBorders>
+            <w:tcMar>
+              <w:top w:w="120" w:type="dxa"/>
+              <w:bottom w:w="120" w:type="dxa"/>
+              <w:left w:w="120" w:type="dxa"/>
+              <w:right w:w="120" w:type="dxa"/>
+            </w:tcMar>
+            <w:vAlign w:val="center"/>
+          </w:tcPr>
+          <w:p>
+            <w:pPr>
+              <w:spacing w:before="80" w:after="80" w:line="240" w:lineRule="auto"/>
+              <w:jc w:val="left"/>
+            </w:pPr>
+            <w:r>
+              <w:rPr>
+                <w:rFonts w:ascii="Times New Roman" w:hAnsi="Times New Roman" w:cs="Times New Roman"/>
+                <w:sz w:val="26"/>
+                <w:szCs w:val="26"/>
+              </w:rPr>
+              <w:t xml:space="preserve">About Hindustan Aeronautics Limited (HAL)</w:t>
+            </w:r>
+          </w:p>
+        </w:tc>
+        <w:tc>
+          <w:tcPr>
+            <w:tcW w:w="1500" w:type="dxa"/>
+            <w:tcBorders>
+              <w:top w:val="single" w:sz="12" w:color="000000"/>
+              <w:left w:val="single" w:sz="12" w:color="000000"/>
+              <w:bottom w:val="single" w:sz="12" w:color="000000"/>
+              <w:right w:val="single" w:sz="12" w:color="000000"/>
+            </w:tcBorders>
+            <w:tcMar>
+              <w:top w:w="120" w:type="dxa"/>
+              <w:bottom w:w="120" w:type="dxa"/>
+              <w:left w:w="120" w:type="dxa"/>
+              <w:right w:w="120" w:type="dxa"/>
+            </w:tcMar>
+            <w:vAlign w:val="center"/>
+          </w:tcPr>
+          <w:p>
+            <w:pPr>
+              <w:spacing w:before="80" w:after="80" w:line="240" w:lineRule="auto"/>
+              <w:jc w:val="center"/>
+            </w:pPr>
+            <w:r>
+              <w:rPr>
+                <w:rFonts w:ascii="Times New Roman" w:hAnsi="Times New Roman" w:cs="Times New Roman"/>
+                <w:sz w:val="22"/>
+                <w:szCs w:val="22"/>
+              </w:rPr>
+              <w:t xml:space="preserve">4</w:t>
             </w:r>
           </w:p>
         </w:tc>
@@ -1385,61 +1488,97 @@
       <w:tr>
         <w:tc>
           <w:tcPr>
-            <w:tcW w:w="900" w:type="dxa"/>
-            <w:vAlign w:val="center"/>
-          </w:tcPr>
-          <w:p>
-            <w:pPr>
-              <w:spacing w:before="20" w:after="20" w:line="240" w:lineRule="auto"/>
-              <w:jc w:val="left"/>
-            </w:pPr>
-            <w:r>
-              <w:rPr>
-                <w:rFonts w:ascii="Times New Roman" w:hAnsi="Times New Roman" w:cs="Times New Roman"/>
-                <w:sz w:val="22"/>
-                <w:szCs w:val="22"/>
-              </w:rPr>
-              <w:t xml:space="preserve"/>
-            </w:r>
-          </w:p>
-        </w:tc>
-        <w:tc>
-          <w:tcPr>
-            <w:tcW w:w="7460" w:type="dxa"/>
-            <w:vAlign w:val="center"/>
-          </w:tcPr>
-          <w:p>
-            <w:pPr>
-              <w:spacing w:before="20" w:after="20" w:line="240" w:lineRule="auto"/>
-              <w:jc w:val="left"/>
-            </w:pPr>
-            <w:r>
-              <w:rPr>
-                <w:rFonts w:ascii="Times New Roman" w:hAnsi="Times New Roman" w:cs="Times New Roman"/>
-                <w:sz w:val="22"/>
-                <w:szCs w:val="22"/>
-              </w:rPr>
-              <w:t xml:space="preserve">Internship Completion Certificate</w:t>
-            </w:r>
-          </w:p>
-        </w:tc>
-        <w:tc>
-          <w:tcPr>
-            <w:tcW w:w="1000" w:type="dxa"/>
-            <w:vAlign w:val="center"/>
-          </w:tcPr>
-          <w:p>
-            <w:pPr>
-              <w:spacing w:before="20" w:after="20" w:line="240" w:lineRule="auto"/>
-              <w:jc w:val="left"/>
-            </w:pPr>
-            <w:r>
-              <w:rPr>
-                <w:rFonts w:ascii="Times New Roman" w:hAnsi="Times New Roman" w:cs="Times New Roman"/>
-                <w:sz w:val="22"/>
-                <w:szCs w:val="22"/>
-              </w:rPr>
-              <w:t xml:space="preserve">iii</w:t>
+            <w:tcW w:w="1500" w:type="dxa"/>
+            <w:tcBorders>
+              <w:top w:val="single" w:sz="12" w:color="000000"/>
+              <w:left w:val="single" w:sz="12" w:color="000000"/>
+              <w:bottom w:val="single" w:sz="12" w:color="000000"/>
+              <w:right w:val="single" w:sz="12" w:color="000000"/>
+            </w:tcBorders>
+            <w:tcMar>
+              <w:top w:w="120" w:type="dxa"/>
+              <w:bottom w:w="120" w:type="dxa"/>
+              <w:left w:w="120" w:type="dxa"/>
+              <w:right w:w="120" w:type="dxa"/>
+            </w:tcMar>
+            <w:vAlign w:val="center"/>
+          </w:tcPr>
+          <w:p>
+            <w:pPr>
+              <w:spacing w:before="80" w:after="80" w:line="240" w:lineRule="auto"/>
+              <w:jc w:val="center"/>
+            </w:pPr>
+            <w:r>
+              <w:rPr>
+                <w:rFonts w:ascii="Times New Roman" w:hAnsi="Times New Roman" w:cs="Times New Roman"/>
+                <w:sz w:val="26"/>
+                <w:szCs w:val="26"/>
+              </w:rPr>
+              <w:t xml:space="preserve">3</w:t>
+            </w:r>
+          </w:p>
+        </w:tc>
+        <w:tc>
+          <w:tcPr>
+            <w:tcW w:w="6360" w:type="dxa"/>
+            <w:tcBorders>
+              <w:top w:val="single" w:sz="12" w:color="000000"/>
+              <w:left w:val="single" w:sz="12" w:color="000000"/>
+              <w:bottom w:val="single" w:sz="12" w:color="000000"/>
+              <w:right w:val="single" w:sz="12" w:color="000000"/>
+            </w:tcBorders>
+            <w:tcMar>
+              <w:top w:w="120" w:type="dxa"/>
+              <w:bottom w:w="120" w:type="dxa"/>
+              <w:left w:w="120" w:type="dxa"/>
+              <w:right w:w="120" w:type="dxa"/>
+            </w:tcMar>
+            <w:vAlign w:val="center"/>
+          </w:tcPr>
+          <w:p>
+            <w:pPr>
+              <w:spacing w:before="80" w:after="80" w:line="240" w:lineRule="auto"/>
+              <w:jc w:val="left"/>
+            </w:pPr>
+            <w:r>
+              <w:rPr>
+                <w:rFonts w:ascii="Times New Roman" w:hAnsi="Times New Roman" w:cs="Times New Roman"/>
+                <w:sz w:val="26"/>
+                <w:szCs w:val="26"/>
+              </w:rPr>
+              <w:t xml:space="preserve">Rotary Wing Research &amp; Design Centre (RWR&amp;DC)</w:t>
+            </w:r>
+          </w:p>
+        </w:tc>
+        <w:tc>
+          <w:tcPr>
+            <w:tcW w:w="1500" w:type="dxa"/>
+            <w:tcBorders>
+              <w:top w:val="single" w:sz="12" w:color="000000"/>
+              <w:left w:val="single" w:sz="12" w:color="000000"/>
+              <w:bottom w:val="single" w:sz="12" w:color="000000"/>
+              <w:right w:val="single" w:sz="12" w:color="000000"/>
+            </w:tcBorders>
+            <w:tcMar>
+              <w:top w:w="120" w:type="dxa"/>
+              <w:bottom w:w="120" w:type="dxa"/>
+              <w:left w:w="120" w:type="dxa"/>
+              <w:right w:w="120" w:type="dxa"/>
+            </w:tcMar>
+            <w:vAlign w:val="center"/>
+          </w:tcPr>
+          <w:p>
+            <w:pPr>
+              <w:spacing w:before="80" w:after="80" w:line="240" w:lineRule="auto"/>
+              <w:jc w:val="center"/>
+            </w:pPr>
+            <w:r>
+              <w:rPr>
+                <w:rFonts w:ascii="Times New Roman" w:hAnsi="Times New Roman" w:cs="Times New Roman"/>
+                <w:sz w:val="22"/>
+                <w:szCs w:val="22"/>
+              </w:rPr>
+              <w:t xml:space="preserve">8</w:t>
             </w:r>
           </w:p>
         </w:tc>
@@ -1447,61 +1586,97 @@
       <w:tr>
         <w:tc>
           <w:tcPr>
-            <w:tcW w:w="900" w:type="dxa"/>
-            <w:vAlign w:val="center"/>
-          </w:tcPr>
-          <w:p>
-            <w:pPr>
-              <w:spacing w:before="20" w:after="20" w:line="240" w:lineRule="auto"/>
-              <w:jc w:val="left"/>
-            </w:pPr>
-            <w:r>
-              <w:rPr>
-                <w:rFonts w:ascii="Times New Roman" w:hAnsi="Times New Roman" w:cs="Times New Roman"/>
-                <w:sz w:val="22"/>
-                <w:szCs w:val="22"/>
-              </w:rPr>
-              <w:t xml:space="preserve"/>
-            </w:r>
-          </w:p>
-        </w:tc>
-        <w:tc>
-          <w:tcPr>
-            <w:tcW w:w="7460" w:type="dxa"/>
-            <w:vAlign w:val="center"/>
-          </w:tcPr>
-          <w:p>
-            <w:pPr>
-              <w:spacing w:before="20" w:after="20" w:line="240" w:lineRule="auto"/>
-              <w:jc w:val="left"/>
-            </w:pPr>
-            <w:r>
-              <w:rPr>
-                <w:rFonts w:ascii="Times New Roman" w:hAnsi="Times New Roman" w:cs="Times New Roman"/>
-                <w:sz w:val="22"/>
-                <w:szCs w:val="22"/>
-              </w:rPr>
-              <w:t xml:space="preserve">Acknowledgement</w:t>
-            </w:r>
-          </w:p>
-        </w:tc>
-        <w:tc>
-          <w:tcPr>
-            <w:tcW w:w="1000" w:type="dxa"/>
-            <w:vAlign w:val="center"/>
-          </w:tcPr>
-          <w:p>
-            <w:pPr>
-              <w:spacing w:before="20" w:after="20" w:line="240" w:lineRule="auto"/>
-              <w:jc w:val="left"/>
-            </w:pPr>
-            <w:r>
-              <w:rPr>
-                <w:rFonts w:ascii="Times New Roman" w:hAnsi="Times New Roman" w:cs="Times New Roman"/>
-                <w:sz w:val="22"/>
-                <w:szCs w:val="22"/>
-              </w:rPr>
-              <w:t xml:space="preserve">iv</w:t>
+            <w:tcW w:w="1500" w:type="dxa"/>
+            <w:tcBorders>
+              <w:top w:val="single" w:sz="12" w:color="000000"/>
+              <w:left w:val="single" w:sz="12" w:color="000000"/>
+              <w:bottom w:val="single" w:sz="12" w:color="000000"/>
+              <w:right w:val="single" w:sz="12" w:color="000000"/>
+            </w:tcBorders>
+            <w:tcMar>
+              <w:top w:w="120" w:type="dxa"/>
+              <w:bottom w:w="120" w:type="dxa"/>
+              <w:left w:w="120" w:type="dxa"/>
+              <w:right w:w="120" w:type="dxa"/>
+            </w:tcMar>
+            <w:vAlign w:val="center"/>
+          </w:tcPr>
+          <w:p>
+            <w:pPr>
+              <w:spacing w:before="80" w:after="80" w:line="240" w:lineRule="auto"/>
+              <w:jc w:val="center"/>
+            </w:pPr>
+            <w:r>
+              <w:rPr>
+                <w:rFonts w:ascii="Times New Roman" w:hAnsi="Times New Roman" w:cs="Times New Roman"/>
+                <w:sz w:val="26"/>
+                <w:szCs w:val="26"/>
+              </w:rPr>
+              <w:t xml:space="preserve">4</w:t>
+            </w:r>
+          </w:p>
+        </w:tc>
+        <w:tc>
+          <w:tcPr>
+            <w:tcW w:w="6360" w:type="dxa"/>
+            <w:tcBorders>
+              <w:top w:val="single" w:sz="12" w:color="000000"/>
+              <w:left w:val="single" w:sz="12" w:color="000000"/>
+              <w:bottom w:val="single" w:sz="12" w:color="000000"/>
+              <w:right w:val="single" w:sz="12" w:color="000000"/>
+            </w:tcBorders>
+            <w:tcMar>
+              <w:top w:w="120" w:type="dxa"/>
+              <w:bottom w:w="120" w:type="dxa"/>
+              <w:left w:w="120" w:type="dxa"/>
+              <w:right w:w="120" w:type="dxa"/>
+            </w:tcMar>
+            <w:vAlign w:val="center"/>
+          </w:tcPr>
+          <w:p>
+            <w:pPr>
+              <w:spacing w:before="80" w:after="80" w:line="240" w:lineRule="auto"/>
+              <w:jc w:val="left"/>
+            </w:pPr>
+            <w:r>
+              <w:rPr>
+                <w:rFonts w:ascii="Times New Roman" w:hAnsi="Times New Roman" w:cs="Times New Roman"/>
+                <w:sz w:val="26"/>
+                <w:szCs w:val="26"/>
+              </w:rPr>
+              <w:t xml:space="preserve">Flight Testing Centre</w:t>
+            </w:r>
+          </w:p>
+        </w:tc>
+        <w:tc>
+          <w:tcPr>
+            <w:tcW w:w="1500" w:type="dxa"/>
+            <w:tcBorders>
+              <w:top w:val="single" w:sz="12" w:color="000000"/>
+              <w:left w:val="single" w:sz="12" w:color="000000"/>
+              <w:bottom w:val="single" w:sz="12" w:color="000000"/>
+              <w:right w:val="single" w:sz="12" w:color="000000"/>
+            </w:tcBorders>
+            <w:tcMar>
+              <w:top w:w="120" w:type="dxa"/>
+              <w:bottom w:w="120" w:type="dxa"/>
+              <w:left w:w="120" w:type="dxa"/>
+              <w:right w:w="120" w:type="dxa"/>
+            </w:tcMar>
+            <w:vAlign w:val="center"/>
+          </w:tcPr>
+          <w:p>
+            <w:pPr>
+              <w:spacing w:before="80" w:after="80" w:line="240" w:lineRule="auto"/>
+              <w:jc w:val="center"/>
+            </w:pPr>
+            <w:r>
+              <w:rPr>
+                <w:rFonts w:ascii="Times New Roman" w:hAnsi="Times New Roman" w:cs="Times New Roman"/>
+                <w:sz w:val="22"/>
+                <w:szCs w:val="22"/>
+              </w:rPr>
+              <w:t xml:space="preserve">11</w:t>
             </w:r>
           </w:p>
         </w:tc>
@@ -1509,61 +1684,97 @@
       <w:tr>
         <w:tc>
           <w:tcPr>
-            <w:tcW w:w="900" w:type="dxa"/>
-            <w:vAlign w:val="center"/>
-          </w:tcPr>
-          <w:p>
-            <w:pPr>
-              <w:spacing w:before="20" w:after="20" w:line="240" w:lineRule="auto"/>
-              <w:jc w:val="left"/>
-            </w:pPr>
-            <w:r>
-              <w:rPr>
-                <w:rFonts w:ascii="Times New Roman" w:hAnsi="Times New Roman" w:cs="Times New Roman"/>
-                <w:sz w:val="22"/>
-                <w:szCs w:val="22"/>
-              </w:rPr>
-              <w:t xml:space="preserve"/>
-            </w:r>
-          </w:p>
-        </w:tc>
-        <w:tc>
-          <w:tcPr>
-            <w:tcW w:w="7460" w:type="dxa"/>
-            <w:vAlign w:val="center"/>
-          </w:tcPr>
-          <w:p>
-            <w:pPr>
-              <w:spacing w:before="20" w:after="20" w:line="240" w:lineRule="auto"/>
-              <w:jc w:val="left"/>
-            </w:pPr>
-            <w:r>
-              <w:rPr>
-                <w:rFonts w:ascii="Times New Roman" w:hAnsi="Times New Roman" w:cs="Times New Roman"/>
-                <w:sz w:val="22"/>
-                <w:szCs w:val="22"/>
-              </w:rPr>
-              <w:t xml:space="preserve">Abstract</w:t>
-            </w:r>
-          </w:p>
-        </w:tc>
-        <w:tc>
-          <w:tcPr>
-            <w:tcW w:w="1000" w:type="dxa"/>
-            <w:vAlign w:val="center"/>
-          </w:tcPr>
-          <w:p>
-            <w:pPr>
-              <w:spacing w:before="20" w:after="20" w:line="240" w:lineRule="auto"/>
-              <w:jc w:val="left"/>
-            </w:pPr>
-            <w:r>
-              <w:rPr>
-                <w:rFonts w:ascii="Times New Roman" w:hAnsi="Times New Roman" w:cs="Times New Roman"/>
-                <w:sz w:val="22"/>
-                <w:szCs w:val="22"/>
-              </w:rPr>
-              <w:t xml:space="preserve">v</w:t>
+            <w:tcW w:w="1500" w:type="dxa"/>
+            <w:tcBorders>
+              <w:top w:val="single" w:sz="12" w:color="000000"/>
+              <w:left w:val="single" w:sz="12" w:color="000000"/>
+              <w:bottom w:val="single" w:sz="12" w:color="000000"/>
+              <w:right w:val="single" w:sz="12" w:color="000000"/>
+            </w:tcBorders>
+            <w:tcMar>
+              <w:top w:w="120" w:type="dxa"/>
+              <w:bottom w:w="120" w:type="dxa"/>
+              <w:left w:w="120" w:type="dxa"/>
+              <w:right w:w="120" w:type="dxa"/>
+            </w:tcMar>
+            <w:vAlign w:val="center"/>
+          </w:tcPr>
+          <w:p>
+            <w:pPr>
+              <w:spacing w:before="80" w:after="80" w:line="240" w:lineRule="auto"/>
+              <w:jc w:val="center"/>
+            </w:pPr>
+            <w:r>
+              <w:rPr>
+                <w:rFonts w:ascii="Times New Roman" w:hAnsi="Times New Roman" w:cs="Times New Roman"/>
+                <w:sz w:val="26"/>
+                <w:szCs w:val="26"/>
+              </w:rPr>
+              <w:t xml:space="preserve">5</w:t>
+            </w:r>
+          </w:p>
+        </w:tc>
+        <w:tc>
+          <w:tcPr>
+            <w:tcW w:w="6360" w:type="dxa"/>
+            <w:tcBorders>
+              <w:top w:val="single" w:sz="12" w:color="000000"/>
+              <w:left w:val="single" w:sz="12" w:color="000000"/>
+              <w:bottom w:val="single" w:sz="12" w:color="000000"/>
+              <w:right w:val="single" w:sz="12" w:color="000000"/>
+            </w:tcBorders>
+            <w:tcMar>
+              <w:top w:w="120" w:type="dxa"/>
+              <w:bottom w:w="120" w:type="dxa"/>
+              <w:left w:w="120" w:type="dxa"/>
+              <w:right w:w="120" w:type="dxa"/>
+            </w:tcMar>
+            <w:vAlign w:val="center"/>
+          </w:tcPr>
+          <w:p>
+            <w:pPr>
+              <w:spacing w:before="80" w:after="80" w:line="240" w:lineRule="auto"/>
+              <w:jc w:val="left"/>
+            </w:pPr>
+            <w:r>
+              <w:rPr>
+                <w:rFonts w:ascii="Times New Roman" w:hAnsi="Times New Roman" w:cs="Times New Roman"/>
+                <w:sz w:val="26"/>
+                <w:szCs w:val="26"/>
+              </w:rPr>
+              <w:t xml:space="preserve">Internship Activities</w:t>
+            </w:r>
+          </w:p>
+        </w:tc>
+        <w:tc>
+          <w:tcPr>
+            <w:tcW w:w="1500" w:type="dxa"/>
+            <w:tcBorders>
+              <w:top w:val="single" w:sz="12" w:color="000000"/>
+              <w:left w:val="single" w:sz="12" w:color="000000"/>
+              <w:bottom w:val="single" w:sz="12" w:color="000000"/>
+              <w:right w:val="single" w:sz="12" w:color="000000"/>
+            </w:tcBorders>
+            <w:tcMar>
+              <w:top w:w="120" w:type="dxa"/>
+              <w:bottom w:w="120" w:type="dxa"/>
+              <w:left w:w="120" w:type="dxa"/>
+              <w:right w:w="120" w:type="dxa"/>
+            </w:tcMar>
+            <w:vAlign w:val="center"/>
+          </w:tcPr>
+          <w:p>
+            <w:pPr>
+              <w:spacing w:before="80" w:after="80" w:line="240" w:lineRule="auto"/>
+              <w:jc w:val="center"/>
+            </w:pPr>
+            <w:r>
+              <w:rPr>
+                <w:rFonts w:ascii="Times New Roman" w:hAnsi="Times New Roman" w:cs="Times New Roman"/>
+                <w:sz w:val="22"/>
+                <w:szCs w:val="22"/>
+              </w:rPr>
+              <w:t xml:space="preserve">15</w:t>
             </w:r>
           </w:p>
         </w:tc>
@@ -1571,61 +1782,97 @@
       <w:tr>
         <w:tc>
           <w:tcPr>
-            <w:tcW w:w="900" w:type="dxa"/>
-            <w:vAlign w:val="center"/>
-          </w:tcPr>
-          <w:p>
-            <w:pPr>
-              <w:spacing w:before="20" w:after="20" w:line="240" w:lineRule="auto"/>
-              <w:jc w:val="left"/>
-            </w:pPr>
-            <w:r>
-              <w:rPr>
-                <w:rFonts w:ascii="Times New Roman" w:hAnsi="Times New Roman" w:cs="Times New Roman"/>
-                <w:sz w:val="22"/>
-                <w:szCs w:val="22"/>
-              </w:rPr>
-              <w:t xml:space="preserve"/>
-            </w:r>
-          </w:p>
-        </w:tc>
-        <w:tc>
-          <w:tcPr>
-            <w:tcW w:w="7460" w:type="dxa"/>
-            <w:vAlign w:val="center"/>
-          </w:tcPr>
-          <w:p>
-            <w:pPr>
-              <w:spacing w:before="20" w:after="20" w:line="240" w:lineRule="auto"/>
-              <w:jc w:val="left"/>
-            </w:pPr>
-            <w:r>
-              <w:rPr>
-                <w:rFonts w:ascii="Times New Roman" w:hAnsi="Times New Roman" w:cs="Times New Roman"/>
-                <w:sz w:val="22"/>
-                <w:szCs w:val="22"/>
-              </w:rPr>
-              <w:t xml:space="preserve">Table of Contents</w:t>
-            </w:r>
-          </w:p>
-        </w:tc>
-        <w:tc>
-          <w:tcPr>
-            <w:tcW w:w="1000" w:type="dxa"/>
-            <w:vAlign w:val="center"/>
-          </w:tcPr>
-          <w:p>
-            <w:pPr>
-              <w:spacing w:before="20" w:after="20" w:line="240" w:lineRule="auto"/>
-              <w:jc w:val="left"/>
-            </w:pPr>
-            <w:r>
-              <w:rPr>
-                <w:rFonts w:ascii="Times New Roman" w:hAnsi="Times New Roman" w:cs="Times New Roman"/>
-                <w:sz w:val="22"/>
-                <w:szCs w:val="22"/>
-              </w:rPr>
-              <w:t xml:space="preserve">vi</w:t>
+            <w:tcW w:w="1500" w:type="dxa"/>
+            <w:tcBorders>
+              <w:top w:val="single" w:sz="12" w:color="000000"/>
+              <w:left w:val="single" w:sz="12" w:color="000000"/>
+              <w:bottom w:val="single" w:sz="12" w:color="000000"/>
+              <w:right w:val="single" w:sz="12" w:color="000000"/>
+            </w:tcBorders>
+            <w:tcMar>
+              <w:top w:w="120" w:type="dxa"/>
+              <w:bottom w:w="120" w:type="dxa"/>
+              <w:left w:w="120" w:type="dxa"/>
+              <w:right w:w="120" w:type="dxa"/>
+            </w:tcMar>
+            <w:vAlign w:val="center"/>
+          </w:tcPr>
+          <w:p>
+            <w:pPr>
+              <w:spacing w:before="80" w:after="80" w:line="240" w:lineRule="auto"/>
+              <w:jc w:val="center"/>
+            </w:pPr>
+            <w:r>
+              <w:rPr>
+                <w:rFonts w:ascii="Times New Roman" w:hAnsi="Times New Roman" w:cs="Times New Roman"/>
+                <w:sz w:val="26"/>
+                <w:szCs w:val="26"/>
+              </w:rPr>
+              <w:t xml:space="preserve">6</w:t>
+            </w:r>
+          </w:p>
+        </w:tc>
+        <w:tc>
+          <w:tcPr>
+            <w:tcW w:w="6360" w:type="dxa"/>
+            <w:tcBorders>
+              <w:top w:val="single" w:sz="12" w:color="000000"/>
+              <w:left w:val="single" w:sz="12" w:color="000000"/>
+              <w:bottom w:val="single" w:sz="12" w:color="000000"/>
+              <w:right w:val="single" w:sz="12" w:color="000000"/>
+            </w:tcBorders>
+            <w:tcMar>
+              <w:top w:w="120" w:type="dxa"/>
+              <w:bottom w:w="120" w:type="dxa"/>
+              <w:left w:w="120" w:type="dxa"/>
+              <w:right w:w="120" w:type="dxa"/>
+            </w:tcMar>
+            <w:vAlign w:val="center"/>
+          </w:tcPr>
+          <w:p>
+            <w:pPr>
+              <w:spacing w:before="80" w:after="80" w:line="240" w:lineRule="auto"/>
+              <w:jc w:val="left"/>
+            </w:pPr>
+            <w:r>
+              <w:rPr>
+                <w:rFonts w:ascii="Times New Roman" w:hAnsi="Times New Roman" w:cs="Times New Roman"/>
+                <w:sz w:val="26"/>
+                <w:szCs w:val="26"/>
+              </w:rPr>
+              <w:t xml:space="preserve">System Requirements</w:t>
+            </w:r>
+          </w:p>
+        </w:tc>
+        <w:tc>
+          <w:tcPr>
+            <w:tcW w:w="1500" w:type="dxa"/>
+            <w:tcBorders>
+              <w:top w:val="single" w:sz="12" w:color="000000"/>
+              <w:left w:val="single" w:sz="12" w:color="000000"/>
+              <w:bottom w:val="single" w:sz="12" w:color="000000"/>
+              <w:right w:val="single" w:sz="12" w:color="000000"/>
+            </w:tcBorders>
+            <w:tcMar>
+              <w:top w:w="120" w:type="dxa"/>
+              <w:bottom w:w="120" w:type="dxa"/>
+              <w:left w:w="120" w:type="dxa"/>
+              <w:right w:w="120" w:type="dxa"/>
+            </w:tcMar>
+            <w:vAlign w:val="center"/>
+          </w:tcPr>
+          <w:p>
+            <w:pPr>
+              <w:spacing w:before="80" w:after="80" w:line="240" w:lineRule="auto"/>
+              <w:jc w:val="center"/>
+            </w:pPr>
+            <w:r>
+              <w:rPr>
+                <w:rFonts w:ascii="Times New Roman" w:hAnsi="Times New Roman" w:cs="Times New Roman"/>
+                <w:sz w:val="22"/>
+                <w:szCs w:val="22"/>
+              </w:rPr>
+              <w:t xml:space="preserve">18</w:t>
             </w:r>
           </w:p>
         </w:tc>
@@ -1633,61 +1880,97 @@
       <w:tr>
         <w:tc>
           <w:tcPr>
-            <w:tcW w:w="900" w:type="dxa"/>
-            <w:vAlign w:val="center"/>
-          </w:tcPr>
-          <w:p>
-            <w:pPr>
-              <w:spacing w:before="20" w:after="20" w:line="240" w:lineRule="auto"/>
-              <w:jc w:val="left"/>
-            </w:pPr>
-            <w:r>
-              <w:rPr>
-                <w:rFonts w:ascii="Times New Roman" w:hAnsi="Times New Roman" w:cs="Times New Roman"/>
-                <w:sz w:val="22"/>
-                <w:szCs w:val="22"/>
-              </w:rPr>
-              <w:t xml:space="preserve">1</w:t>
-            </w:r>
-          </w:p>
-        </w:tc>
-        <w:tc>
-          <w:tcPr>
-            <w:tcW w:w="7460" w:type="dxa"/>
-            <w:vAlign w:val="center"/>
-          </w:tcPr>
-          <w:p>
-            <w:pPr>
-              <w:spacing w:before="20" w:after="20" w:line="240" w:lineRule="auto"/>
-              <w:jc w:val="left"/>
-            </w:pPr>
-            <w:r>
-              <w:rPr>
-                <w:rFonts w:ascii="Times New Roman" w:hAnsi="Times New Roman" w:cs="Times New Roman"/>
-                <w:sz w:val="22"/>
-                <w:szCs w:val="22"/>
-              </w:rPr>
-              <w:t xml:space="preserve">Introduction</w:t>
-            </w:r>
-          </w:p>
-        </w:tc>
-        <w:tc>
-          <w:tcPr>
-            <w:tcW w:w="1000" w:type="dxa"/>
-            <w:vAlign w:val="center"/>
-          </w:tcPr>
-          <w:p>
-            <w:pPr>
-              <w:spacing w:before="20" w:after="20" w:line="240" w:lineRule="auto"/>
-              <w:jc w:val="left"/>
-            </w:pPr>
-            <w:r>
-              <w:rPr>
-                <w:rFonts w:ascii="Times New Roman" w:hAnsi="Times New Roman" w:cs="Times New Roman"/>
-                <w:sz w:val="22"/>
-                <w:szCs w:val="22"/>
-              </w:rPr>
-              <w:t xml:space="preserve">1</w:t>
+            <w:tcW w:w="1500" w:type="dxa"/>
+            <w:tcBorders>
+              <w:top w:val="single" w:sz="12" w:color="000000"/>
+              <w:left w:val="single" w:sz="12" w:color="000000"/>
+              <w:bottom w:val="single" w:sz="12" w:color="000000"/>
+              <w:right w:val="single" w:sz="12" w:color="000000"/>
+            </w:tcBorders>
+            <w:tcMar>
+              <w:top w:w="120" w:type="dxa"/>
+              <w:bottom w:w="120" w:type="dxa"/>
+              <w:left w:w="120" w:type="dxa"/>
+              <w:right w:w="120" w:type="dxa"/>
+            </w:tcMar>
+            <w:vAlign w:val="center"/>
+          </w:tcPr>
+          <w:p>
+            <w:pPr>
+              <w:spacing w:before="80" w:after="80" w:line="240" w:lineRule="auto"/>
+              <w:jc w:val="center"/>
+            </w:pPr>
+            <w:r>
+              <w:rPr>
+                <w:rFonts w:ascii="Times New Roman" w:hAnsi="Times New Roman" w:cs="Times New Roman"/>
+                <w:sz w:val="26"/>
+                <w:szCs w:val="26"/>
+              </w:rPr>
+              <w:t xml:space="preserve">7</w:t>
+            </w:r>
+          </w:p>
+        </w:tc>
+        <w:tc>
+          <w:tcPr>
+            <w:tcW w:w="6360" w:type="dxa"/>
+            <w:tcBorders>
+              <w:top w:val="single" w:sz="12" w:color="000000"/>
+              <w:left w:val="single" w:sz="12" w:color="000000"/>
+              <w:bottom w:val="single" w:sz="12" w:color="000000"/>
+              <w:right w:val="single" w:sz="12" w:color="000000"/>
+            </w:tcBorders>
+            <w:tcMar>
+              <w:top w:w="120" w:type="dxa"/>
+              <w:bottom w:w="120" w:type="dxa"/>
+              <w:left w:w="120" w:type="dxa"/>
+              <w:right w:w="120" w:type="dxa"/>
+            </w:tcMar>
+            <w:vAlign w:val="center"/>
+          </w:tcPr>
+          <w:p>
+            <w:pPr>
+              <w:spacing w:before="80" w:after="80" w:line="240" w:lineRule="auto"/>
+              <w:jc w:val="left"/>
+            </w:pPr>
+            <w:r>
+              <w:rPr>
+                <w:rFonts w:ascii="Times New Roman" w:hAnsi="Times New Roman" w:cs="Times New Roman"/>
+                <w:sz w:val="26"/>
+                <w:szCs w:val="26"/>
+              </w:rPr>
+              <w:t xml:space="preserve">Technologies Used</w:t>
+            </w:r>
+          </w:p>
+        </w:tc>
+        <w:tc>
+          <w:tcPr>
+            <w:tcW w:w="1500" w:type="dxa"/>
+            <w:tcBorders>
+              <w:top w:val="single" w:sz="12" w:color="000000"/>
+              <w:left w:val="single" w:sz="12" w:color="000000"/>
+              <w:bottom w:val="single" w:sz="12" w:color="000000"/>
+              <w:right w:val="single" w:sz="12" w:color="000000"/>
+            </w:tcBorders>
+            <w:tcMar>
+              <w:top w:w="120" w:type="dxa"/>
+              <w:bottom w:w="120" w:type="dxa"/>
+              <w:left w:w="120" w:type="dxa"/>
+              <w:right w:w="120" w:type="dxa"/>
+            </w:tcMar>
+            <w:vAlign w:val="center"/>
+          </w:tcPr>
+          <w:p>
+            <w:pPr>
+              <w:spacing w:before="80" w:after="80" w:line="240" w:lineRule="auto"/>
+              <w:jc w:val="center"/>
+            </w:pPr>
+            <w:r>
+              <w:rPr>
+                <w:rFonts w:ascii="Times New Roman" w:hAnsi="Times New Roman" w:cs="Times New Roman"/>
+                <w:sz w:val="22"/>
+                <w:szCs w:val="22"/>
+              </w:rPr>
+              <w:t xml:space="preserve">20</w:t>
             </w:r>
           </w:p>
         </w:tc>
@@ -1695,61 +1978,97 @@
       <w:tr>
         <w:tc>
           <w:tcPr>
-            <w:tcW w:w="900" w:type="dxa"/>
-            <w:vAlign w:val="center"/>
-          </w:tcPr>
-          <w:p>
-            <w:pPr>
-              <w:spacing w:before="20" w:after="20" w:line="240" w:lineRule="auto"/>
-              <w:jc w:val="left"/>
-            </w:pPr>
-            <w:r>
-              <w:rPr>
-                <w:rFonts w:ascii="Times New Roman" w:hAnsi="Times New Roman" w:cs="Times New Roman"/>
-                <w:sz w:val="22"/>
-                <w:szCs w:val="22"/>
-              </w:rPr>
-              <w:t xml:space="preserve">2</w:t>
-            </w:r>
-          </w:p>
-        </w:tc>
-        <w:tc>
-          <w:tcPr>
-            <w:tcW w:w="7460" w:type="dxa"/>
-            <w:vAlign w:val="center"/>
-          </w:tcPr>
-          <w:p>
-            <w:pPr>
-              <w:spacing w:before="20" w:after="20" w:line="240" w:lineRule="auto"/>
-              <w:jc w:val="left"/>
-            </w:pPr>
-            <w:r>
-              <w:rPr>
-                <w:rFonts w:ascii="Times New Roman" w:hAnsi="Times New Roman" w:cs="Times New Roman"/>
-                <w:sz w:val="22"/>
-                <w:szCs w:val="22"/>
-              </w:rPr>
-              <w:t xml:space="preserve">About Hindustan Aeronautics Limited (HAL)</w:t>
-            </w:r>
-          </w:p>
-        </w:tc>
-        <w:tc>
-          <w:tcPr>
-            <w:tcW w:w="1000" w:type="dxa"/>
-            <w:vAlign w:val="center"/>
-          </w:tcPr>
-          <w:p>
-            <w:pPr>
-              <w:spacing w:before="20" w:after="20" w:line="240" w:lineRule="auto"/>
-              <w:jc w:val="left"/>
-            </w:pPr>
-            <w:r>
-              <w:rPr>
-                <w:rFonts w:ascii="Times New Roman" w:hAnsi="Times New Roman" w:cs="Times New Roman"/>
-                <w:sz w:val="22"/>
-                <w:szCs w:val="22"/>
-              </w:rPr>
-              <w:t xml:space="preserve">4</w:t>
+            <w:tcW w:w="1500" w:type="dxa"/>
+            <w:tcBorders>
+              <w:top w:val="single" w:sz="12" w:color="000000"/>
+              <w:left w:val="single" w:sz="12" w:color="000000"/>
+              <w:bottom w:val="single" w:sz="12" w:color="000000"/>
+              <w:right w:val="single" w:sz="12" w:color="000000"/>
+            </w:tcBorders>
+            <w:tcMar>
+              <w:top w:w="120" w:type="dxa"/>
+              <w:bottom w:w="120" w:type="dxa"/>
+              <w:left w:w="120" w:type="dxa"/>
+              <w:right w:w="120" w:type="dxa"/>
+            </w:tcMar>
+            <w:vAlign w:val="center"/>
+          </w:tcPr>
+          <w:p>
+            <w:pPr>
+              <w:spacing w:before="80" w:after="80" w:line="240" w:lineRule="auto"/>
+              <w:jc w:val="center"/>
+            </w:pPr>
+            <w:r>
+              <w:rPr>
+                <w:rFonts w:ascii="Times New Roman" w:hAnsi="Times New Roman" w:cs="Times New Roman"/>
+                <w:sz w:val="26"/>
+                <w:szCs w:val="26"/>
+              </w:rPr>
+              <w:t xml:space="preserve">8</w:t>
+            </w:r>
+          </w:p>
+        </w:tc>
+        <w:tc>
+          <w:tcPr>
+            <w:tcW w:w="6360" w:type="dxa"/>
+            <w:tcBorders>
+              <w:top w:val="single" w:sz="12" w:color="000000"/>
+              <w:left w:val="single" w:sz="12" w:color="000000"/>
+              <w:bottom w:val="single" w:sz="12" w:color="000000"/>
+              <w:right w:val="single" w:sz="12" w:color="000000"/>
+            </w:tcBorders>
+            <w:tcMar>
+              <w:top w:w="120" w:type="dxa"/>
+              <w:bottom w:w="120" w:type="dxa"/>
+              <w:left w:w="120" w:type="dxa"/>
+              <w:right w:w="120" w:type="dxa"/>
+            </w:tcMar>
+            <w:vAlign w:val="center"/>
+          </w:tcPr>
+          <w:p>
+            <w:pPr>
+              <w:spacing w:before="80" w:after="80" w:line="240" w:lineRule="auto"/>
+              <w:jc w:val="left"/>
+            </w:pPr>
+            <w:r>
+              <w:rPr>
+                <w:rFonts w:ascii="Times New Roman" w:hAnsi="Times New Roman" w:cs="Times New Roman"/>
+                <w:sz w:val="26"/>
+                <w:szCs w:val="26"/>
+              </w:rPr>
+              <w:t xml:space="preserve">Project Overview</w:t>
+            </w:r>
+          </w:p>
+        </w:tc>
+        <w:tc>
+          <w:tcPr>
+            <w:tcW w:w="1500" w:type="dxa"/>
+            <w:tcBorders>
+              <w:top w:val="single" w:sz="12" w:color="000000"/>
+              <w:left w:val="single" w:sz="12" w:color="000000"/>
+              <w:bottom w:val="single" w:sz="12" w:color="000000"/>
+              <w:right w:val="single" w:sz="12" w:color="000000"/>
+            </w:tcBorders>
+            <w:tcMar>
+              <w:top w:w="120" w:type="dxa"/>
+              <w:bottom w:w="120" w:type="dxa"/>
+              <w:left w:w="120" w:type="dxa"/>
+              <w:right w:w="120" w:type="dxa"/>
+            </w:tcMar>
+            <w:vAlign w:val="center"/>
+          </w:tcPr>
+          <w:p>
+            <w:pPr>
+              <w:spacing w:before="80" w:after="80" w:line="240" w:lineRule="auto"/>
+              <w:jc w:val="center"/>
+            </w:pPr>
+            <w:r>
+              <w:rPr>
+                <w:rFonts w:ascii="Times New Roman" w:hAnsi="Times New Roman" w:cs="Times New Roman"/>
+                <w:sz w:val="22"/>
+                <w:szCs w:val="22"/>
+              </w:rPr>
+              <w:t xml:space="preserve">24</w:t>
             </w:r>
           </w:p>
         </w:tc>
@@ -1757,61 +2076,97 @@
       <w:tr>
         <w:tc>
           <w:tcPr>
-            <w:tcW w:w="900" w:type="dxa"/>
-            <w:vAlign w:val="center"/>
-          </w:tcPr>
-          <w:p>
-            <w:pPr>
-              <w:spacing w:before="20" w:after="20" w:line="240" w:lineRule="auto"/>
-              <w:jc w:val="left"/>
-            </w:pPr>
-            <w:r>
-              <w:rPr>
-                <w:rFonts w:ascii="Times New Roman" w:hAnsi="Times New Roman" w:cs="Times New Roman"/>
-                <w:sz w:val="22"/>
-                <w:szCs w:val="22"/>
-              </w:rPr>
-              <w:t xml:space="preserve">3</w:t>
-            </w:r>
-          </w:p>
-        </w:tc>
-        <w:tc>
-          <w:tcPr>
-            <w:tcW w:w="7460" w:type="dxa"/>
-            <w:vAlign w:val="center"/>
-          </w:tcPr>
-          <w:p>
-            <w:pPr>
-              <w:spacing w:before="20" w:after="20" w:line="240" w:lineRule="auto"/>
-              <w:jc w:val="left"/>
-            </w:pPr>
-            <w:r>
-              <w:rPr>
-                <w:rFonts w:ascii="Times New Roman" w:hAnsi="Times New Roman" w:cs="Times New Roman"/>
-                <w:sz w:val="22"/>
-                <w:szCs w:val="22"/>
-              </w:rPr>
-              <w:t xml:space="preserve">Rotary Wing Research &amp; Design Centre (RWR&amp;DC)</w:t>
-            </w:r>
-          </w:p>
-        </w:tc>
-        <w:tc>
-          <w:tcPr>
-            <w:tcW w:w="1000" w:type="dxa"/>
-            <w:vAlign w:val="center"/>
-          </w:tcPr>
-          <w:p>
-            <w:pPr>
-              <w:spacing w:before="20" w:after="20" w:line="240" w:lineRule="auto"/>
-              <w:jc w:val="left"/>
-            </w:pPr>
-            <w:r>
-              <w:rPr>
-                <w:rFonts w:ascii="Times New Roman" w:hAnsi="Times New Roman" w:cs="Times New Roman"/>
-                <w:sz w:val="22"/>
-                <w:szCs w:val="22"/>
-              </w:rPr>
-              <w:t xml:space="preserve">8</w:t>
+            <w:tcW w:w="1500" w:type="dxa"/>
+            <w:tcBorders>
+              <w:top w:val="single" w:sz="12" w:color="000000"/>
+              <w:left w:val="single" w:sz="12" w:color="000000"/>
+              <w:bottom w:val="single" w:sz="12" w:color="000000"/>
+              <w:right w:val="single" w:sz="12" w:color="000000"/>
+            </w:tcBorders>
+            <w:tcMar>
+              <w:top w:w="120" w:type="dxa"/>
+              <w:bottom w:w="120" w:type="dxa"/>
+              <w:left w:w="120" w:type="dxa"/>
+              <w:right w:w="120" w:type="dxa"/>
+            </w:tcMar>
+            <w:vAlign w:val="center"/>
+          </w:tcPr>
+          <w:p>
+            <w:pPr>
+              <w:spacing w:before="80" w:after="80" w:line="240" w:lineRule="auto"/>
+              <w:jc w:val="center"/>
+            </w:pPr>
+            <w:r>
+              <w:rPr>
+                <w:rFonts w:ascii="Times New Roman" w:hAnsi="Times New Roman" w:cs="Times New Roman"/>
+                <w:sz w:val="26"/>
+                <w:szCs w:val="26"/>
+              </w:rPr>
+              <w:t xml:space="preserve">9</w:t>
+            </w:r>
+          </w:p>
+        </w:tc>
+        <w:tc>
+          <w:tcPr>
+            <w:tcW w:w="6360" w:type="dxa"/>
+            <w:tcBorders>
+              <w:top w:val="single" w:sz="12" w:color="000000"/>
+              <w:left w:val="single" w:sz="12" w:color="000000"/>
+              <w:bottom w:val="single" w:sz="12" w:color="000000"/>
+              <w:right w:val="single" w:sz="12" w:color="000000"/>
+            </w:tcBorders>
+            <w:tcMar>
+              <w:top w:w="120" w:type="dxa"/>
+              <w:bottom w:w="120" w:type="dxa"/>
+              <w:left w:w="120" w:type="dxa"/>
+              <w:right w:w="120" w:type="dxa"/>
+            </w:tcMar>
+            <w:vAlign w:val="center"/>
+          </w:tcPr>
+          <w:p>
+            <w:pPr>
+              <w:spacing w:before="80" w:after="80" w:line="240" w:lineRule="auto"/>
+              <w:jc w:val="left"/>
+            </w:pPr>
+            <w:r>
+              <w:rPr>
+                <w:rFonts w:ascii="Times New Roman" w:hAnsi="Times New Roman" w:cs="Times New Roman"/>
+                <w:sz w:val="26"/>
+                <w:szCs w:val="26"/>
+              </w:rPr>
+              <w:t xml:space="preserve">System Architecture and Design Diagrams</w:t>
+            </w:r>
+          </w:p>
+        </w:tc>
+        <w:tc>
+          <w:tcPr>
+            <w:tcW w:w="1500" w:type="dxa"/>
+            <w:tcBorders>
+              <w:top w:val="single" w:sz="12" w:color="000000"/>
+              <w:left w:val="single" w:sz="12" w:color="000000"/>
+              <w:bottom w:val="single" w:sz="12" w:color="000000"/>
+              <w:right w:val="single" w:sz="12" w:color="000000"/>
+            </w:tcBorders>
+            <w:tcMar>
+              <w:top w:w="120" w:type="dxa"/>
+              <w:bottom w:w="120" w:type="dxa"/>
+              <w:left w:w="120" w:type="dxa"/>
+              <w:right w:w="120" w:type="dxa"/>
+            </w:tcMar>
+            <w:vAlign w:val="center"/>
+          </w:tcPr>
+          <w:p>
+            <w:pPr>
+              <w:spacing w:before="80" w:after="80" w:line="240" w:lineRule="auto"/>
+              <w:jc w:val="center"/>
+            </w:pPr>
+            <w:r>
+              <w:rPr>
+                <w:rFonts w:ascii="Times New Roman" w:hAnsi="Times New Roman" w:cs="Times New Roman"/>
+                <w:sz w:val="22"/>
+                <w:szCs w:val="22"/>
+              </w:rPr>
+              <w:t xml:space="preserve">27</w:t>
             </w:r>
           </w:p>
         </w:tc>
@@ -1819,61 +2174,97 @@
       <w:tr>
         <w:tc>
           <w:tcPr>
-            <w:tcW w:w="900" w:type="dxa"/>
-            <w:vAlign w:val="center"/>
-          </w:tcPr>
-          <w:p>
-            <w:pPr>
-              <w:spacing w:before="20" w:after="20" w:line="240" w:lineRule="auto"/>
-              <w:jc w:val="left"/>
-            </w:pPr>
-            <w:r>
-              <w:rPr>
-                <w:rFonts w:ascii="Times New Roman" w:hAnsi="Times New Roman" w:cs="Times New Roman"/>
-                <w:sz w:val="22"/>
-                <w:szCs w:val="22"/>
-              </w:rPr>
-              <w:t xml:space="preserve">4</w:t>
-            </w:r>
-          </w:p>
-        </w:tc>
-        <w:tc>
-          <w:tcPr>
-            <w:tcW w:w="7460" w:type="dxa"/>
-            <w:vAlign w:val="center"/>
-          </w:tcPr>
-          <w:p>
-            <w:pPr>
-              <w:spacing w:before="20" w:after="20" w:line="240" w:lineRule="auto"/>
-              <w:jc w:val="left"/>
-            </w:pPr>
-            <w:r>
-              <w:rPr>
-                <w:rFonts w:ascii="Times New Roman" w:hAnsi="Times New Roman" w:cs="Times New Roman"/>
-                <w:sz w:val="22"/>
-                <w:szCs w:val="22"/>
-              </w:rPr>
-              <w:t xml:space="preserve">Flight Testing Centre</w:t>
-            </w:r>
-          </w:p>
-        </w:tc>
-        <w:tc>
-          <w:tcPr>
-            <w:tcW w:w="1000" w:type="dxa"/>
-            <w:vAlign w:val="center"/>
-          </w:tcPr>
-          <w:p>
-            <w:pPr>
-              <w:spacing w:before="20" w:after="20" w:line="240" w:lineRule="auto"/>
-              <w:jc w:val="left"/>
-            </w:pPr>
-            <w:r>
-              <w:rPr>
-                <w:rFonts w:ascii="Times New Roman" w:hAnsi="Times New Roman" w:cs="Times New Roman"/>
-                <w:sz w:val="22"/>
-                <w:szCs w:val="22"/>
-              </w:rPr>
-              <w:t xml:space="preserve">11</w:t>
+            <w:tcW w:w="1500" w:type="dxa"/>
+            <w:tcBorders>
+              <w:top w:val="single" w:sz="12" w:color="000000"/>
+              <w:left w:val="single" w:sz="12" w:color="000000"/>
+              <w:bottom w:val="single" w:sz="12" w:color="000000"/>
+              <w:right w:val="single" w:sz="12" w:color="000000"/>
+            </w:tcBorders>
+            <w:tcMar>
+              <w:top w:w="120" w:type="dxa"/>
+              <w:bottom w:w="120" w:type="dxa"/>
+              <w:left w:w="120" w:type="dxa"/>
+              <w:right w:w="120" w:type="dxa"/>
+            </w:tcMar>
+            <w:vAlign w:val="center"/>
+          </w:tcPr>
+          <w:p>
+            <w:pPr>
+              <w:spacing w:before="80" w:after="80" w:line="240" w:lineRule="auto"/>
+              <w:jc w:val="center"/>
+            </w:pPr>
+            <w:r>
+              <w:rPr>
+                <w:rFonts w:ascii="Times New Roman" w:hAnsi="Times New Roman" w:cs="Times New Roman"/>
+                <w:sz w:val="26"/>
+                <w:szCs w:val="26"/>
+              </w:rPr>
+              <w:t xml:space="preserve">10</w:t>
+            </w:r>
+          </w:p>
+        </w:tc>
+        <w:tc>
+          <w:tcPr>
+            <w:tcW w:w="6360" w:type="dxa"/>
+            <w:tcBorders>
+              <w:top w:val="single" w:sz="12" w:color="000000"/>
+              <w:left w:val="single" w:sz="12" w:color="000000"/>
+              <w:bottom w:val="single" w:sz="12" w:color="000000"/>
+              <w:right w:val="single" w:sz="12" w:color="000000"/>
+            </w:tcBorders>
+            <w:tcMar>
+              <w:top w:w="120" w:type="dxa"/>
+              <w:bottom w:w="120" w:type="dxa"/>
+              <w:left w:w="120" w:type="dxa"/>
+              <w:right w:w="120" w:type="dxa"/>
+            </w:tcMar>
+            <w:vAlign w:val="center"/>
+          </w:tcPr>
+          <w:p>
+            <w:pPr>
+              <w:spacing w:before="80" w:after="80" w:line="240" w:lineRule="auto"/>
+              <w:jc w:val="left"/>
+            </w:pPr>
+            <w:r>
+              <w:rPr>
+                <w:rFonts w:ascii="Times New Roman" w:hAnsi="Times New Roman" w:cs="Times New Roman"/>
+                <w:sz w:val="26"/>
+                <w:szCs w:val="26"/>
+              </w:rPr>
+              <w:t xml:space="preserve">System Modules</w:t>
+            </w:r>
+          </w:p>
+        </w:tc>
+        <w:tc>
+          <w:tcPr>
+            <w:tcW w:w="1500" w:type="dxa"/>
+            <w:tcBorders>
+              <w:top w:val="single" w:sz="12" w:color="000000"/>
+              <w:left w:val="single" w:sz="12" w:color="000000"/>
+              <w:bottom w:val="single" w:sz="12" w:color="000000"/>
+              <w:right w:val="single" w:sz="12" w:color="000000"/>
+            </w:tcBorders>
+            <w:tcMar>
+              <w:top w:w="120" w:type="dxa"/>
+              <w:bottom w:w="120" w:type="dxa"/>
+              <w:left w:w="120" w:type="dxa"/>
+              <w:right w:w="120" w:type="dxa"/>
+            </w:tcMar>
+            <w:vAlign w:val="center"/>
+          </w:tcPr>
+          <w:p>
+            <w:pPr>
+              <w:spacing w:before="80" w:after="80" w:line="240" w:lineRule="auto"/>
+              <w:jc w:val="center"/>
+            </w:pPr>
+            <w:r>
+              <w:rPr>
+                <w:rFonts w:ascii="Times New Roman" w:hAnsi="Times New Roman" w:cs="Times New Roman"/>
+                <w:sz w:val="22"/>
+                <w:szCs w:val="22"/>
+              </w:rPr>
+              <w:t xml:space="preserve">31</w:t>
             </w:r>
           </w:p>
         </w:tc>
@@ -1881,61 +2272,97 @@
       <w:tr>
         <w:tc>
           <w:tcPr>
-            <w:tcW w:w="900" w:type="dxa"/>
-            <w:vAlign w:val="center"/>
-          </w:tcPr>
-          <w:p>
-            <w:pPr>
-              <w:spacing w:before="20" w:after="20" w:line="240" w:lineRule="auto"/>
-              <w:jc w:val="left"/>
-            </w:pPr>
-            <w:r>
-              <w:rPr>
-                <w:rFonts w:ascii="Times New Roman" w:hAnsi="Times New Roman" w:cs="Times New Roman"/>
-                <w:sz w:val="22"/>
-                <w:szCs w:val="22"/>
-              </w:rPr>
-              <w:t xml:space="preserve">5</w:t>
-            </w:r>
-          </w:p>
-        </w:tc>
-        <w:tc>
-          <w:tcPr>
-            <w:tcW w:w="7460" w:type="dxa"/>
-            <w:vAlign w:val="center"/>
-          </w:tcPr>
-          <w:p>
-            <w:pPr>
-              <w:spacing w:before="20" w:after="20" w:line="240" w:lineRule="auto"/>
-              <w:jc w:val="left"/>
-            </w:pPr>
-            <w:r>
-              <w:rPr>
-                <w:rFonts w:ascii="Times New Roman" w:hAnsi="Times New Roman" w:cs="Times New Roman"/>
-                <w:sz w:val="22"/>
-                <w:szCs w:val="22"/>
-              </w:rPr>
-              <w:t xml:space="preserve">Internship Activities</w:t>
-            </w:r>
-          </w:p>
-        </w:tc>
-        <w:tc>
-          <w:tcPr>
-            <w:tcW w:w="1000" w:type="dxa"/>
-            <w:vAlign w:val="center"/>
-          </w:tcPr>
-          <w:p>
-            <w:pPr>
-              <w:spacing w:before="20" w:after="20" w:line="240" w:lineRule="auto"/>
-              <w:jc w:val="left"/>
-            </w:pPr>
-            <w:r>
-              <w:rPr>
-                <w:rFonts w:ascii="Times New Roman" w:hAnsi="Times New Roman" w:cs="Times New Roman"/>
-                <w:sz w:val="22"/>
-                <w:szCs w:val="22"/>
-              </w:rPr>
-              <w:t xml:space="preserve">15</w:t>
+            <w:tcW w:w="1500" w:type="dxa"/>
+            <w:tcBorders>
+              <w:top w:val="single" w:sz="12" w:color="000000"/>
+              <w:left w:val="single" w:sz="12" w:color="000000"/>
+              <w:bottom w:val="single" w:sz="12" w:color="000000"/>
+              <w:right w:val="single" w:sz="12" w:color="000000"/>
+            </w:tcBorders>
+            <w:tcMar>
+              <w:top w:w="120" w:type="dxa"/>
+              <w:bottom w:w="120" w:type="dxa"/>
+              <w:left w:w="120" w:type="dxa"/>
+              <w:right w:w="120" w:type="dxa"/>
+            </w:tcMar>
+            <w:vAlign w:val="center"/>
+          </w:tcPr>
+          <w:p>
+            <w:pPr>
+              <w:spacing w:before="80" w:after="80" w:line="240" w:lineRule="auto"/>
+              <w:jc w:val="center"/>
+            </w:pPr>
+            <w:r>
+              <w:rPr>
+                <w:rFonts w:ascii="Times New Roman" w:hAnsi="Times New Roman" w:cs="Times New Roman"/>
+                <w:sz w:val="26"/>
+                <w:szCs w:val="26"/>
+              </w:rPr>
+              <w:t xml:space="preserve">11</w:t>
+            </w:r>
+          </w:p>
+        </w:tc>
+        <w:tc>
+          <w:tcPr>
+            <w:tcW w:w="6360" w:type="dxa"/>
+            <w:tcBorders>
+              <w:top w:val="single" w:sz="12" w:color="000000"/>
+              <w:left w:val="single" w:sz="12" w:color="000000"/>
+              <w:bottom w:val="single" w:sz="12" w:color="000000"/>
+              <w:right w:val="single" w:sz="12" w:color="000000"/>
+            </w:tcBorders>
+            <w:tcMar>
+              <w:top w:w="120" w:type="dxa"/>
+              <w:bottom w:w="120" w:type="dxa"/>
+              <w:left w:w="120" w:type="dxa"/>
+              <w:right w:w="120" w:type="dxa"/>
+            </w:tcMar>
+            <w:vAlign w:val="center"/>
+          </w:tcPr>
+          <w:p>
+            <w:pPr>
+              <w:spacing w:before="80" w:after="80" w:line="240" w:lineRule="auto"/>
+              <w:jc w:val="left"/>
+            </w:pPr>
+            <w:r>
+              <w:rPr>
+                <w:rFonts w:ascii="Times New Roman" w:hAnsi="Times New Roman" w:cs="Times New Roman"/>
+                <w:sz w:val="26"/>
+                <w:szCs w:val="26"/>
+              </w:rPr>
+              <w:t xml:space="preserve">Database Design</w:t>
+            </w:r>
+          </w:p>
+        </w:tc>
+        <w:tc>
+          <w:tcPr>
+            <w:tcW w:w="1500" w:type="dxa"/>
+            <w:tcBorders>
+              <w:top w:val="single" w:sz="12" w:color="000000"/>
+              <w:left w:val="single" w:sz="12" w:color="000000"/>
+              <w:bottom w:val="single" w:sz="12" w:color="000000"/>
+              <w:right w:val="single" w:sz="12" w:color="000000"/>
+            </w:tcBorders>
+            <w:tcMar>
+              <w:top w:w="120" w:type="dxa"/>
+              <w:bottom w:w="120" w:type="dxa"/>
+              <w:left w:w="120" w:type="dxa"/>
+              <w:right w:w="120" w:type="dxa"/>
+            </w:tcMar>
+            <w:vAlign w:val="center"/>
+          </w:tcPr>
+          <w:p>
+            <w:pPr>
+              <w:spacing w:before="80" w:after="80" w:line="240" w:lineRule="auto"/>
+              <w:jc w:val="center"/>
+            </w:pPr>
+            <w:r>
+              <w:rPr>
+                <w:rFonts w:ascii="Times New Roman" w:hAnsi="Times New Roman" w:cs="Times New Roman"/>
+                <w:sz w:val="22"/>
+                <w:szCs w:val="22"/>
+              </w:rPr>
+              <w:t xml:space="preserve">35</w:t>
             </w:r>
           </w:p>
         </w:tc>
@@ -1943,61 +2370,97 @@
       <w:tr>
         <w:tc>
           <w:tcPr>
-            <w:tcW w:w="900" w:type="dxa"/>
-            <w:vAlign w:val="center"/>
-          </w:tcPr>
-          <w:p>
-            <w:pPr>
-              <w:spacing w:before="20" w:after="20" w:line="240" w:lineRule="auto"/>
-              <w:jc w:val="left"/>
-            </w:pPr>
-            <w:r>
-              <w:rPr>
-                <w:rFonts w:ascii="Times New Roman" w:hAnsi="Times New Roman" w:cs="Times New Roman"/>
-                <w:sz w:val="22"/>
-                <w:szCs w:val="22"/>
-              </w:rPr>
-              <w:t xml:space="preserve">6</w:t>
-            </w:r>
-          </w:p>
-        </w:tc>
-        <w:tc>
-          <w:tcPr>
-            <w:tcW w:w="7460" w:type="dxa"/>
-            <w:vAlign w:val="center"/>
-          </w:tcPr>
-          <w:p>
-            <w:pPr>
-              <w:spacing w:before="20" w:after="20" w:line="240" w:lineRule="auto"/>
-              <w:jc w:val="left"/>
-            </w:pPr>
-            <w:r>
-              <w:rPr>
-                <w:rFonts w:ascii="Times New Roman" w:hAnsi="Times New Roman" w:cs="Times New Roman"/>
-                <w:sz w:val="22"/>
-                <w:szCs w:val="22"/>
-              </w:rPr>
-              <w:t xml:space="preserve">System Requirements</w:t>
-            </w:r>
-          </w:p>
-        </w:tc>
-        <w:tc>
-          <w:tcPr>
-            <w:tcW w:w="1000" w:type="dxa"/>
-            <w:vAlign w:val="center"/>
-          </w:tcPr>
-          <w:p>
-            <w:pPr>
-              <w:spacing w:before="20" w:after="20" w:line="240" w:lineRule="auto"/>
-              <w:jc w:val="left"/>
-            </w:pPr>
-            <w:r>
-              <w:rPr>
-                <w:rFonts w:ascii="Times New Roman" w:hAnsi="Times New Roman" w:cs="Times New Roman"/>
-                <w:sz w:val="22"/>
-                <w:szCs w:val="22"/>
-              </w:rPr>
-              <w:t xml:space="preserve">18</w:t>
+            <w:tcW w:w="1500" w:type="dxa"/>
+            <w:tcBorders>
+              <w:top w:val="single" w:sz="12" w:color="000000"/>
+              <w:left w:val="single" w:sz="12" w:color="000000"/>
+              <w:bottom w:val="single" w:sz="12" w:color="000000"/>
+              <w:right w:val="single" w:sz="12" w:color="000000"/>
+            </w:tcBorders>
+            <w:tcMar>
+              <w:top w:w="120" w:type="dxa"/>
+              <w:bottom w:w="120" w:type="dxa"/>
+              <w:left w:w="120" w:type="dxa"/>
+              <w:right w:w="120" w:type="dxa"/>
+            </w:tcMar>
+            <w:vAlign w:val="center"/>
+          </w:tcPr>
+          <w:p>
+            <w:pPr>
+              <w:spacing w:before="80" w:after="80" w:line="240" w:lineRule="auto"/>
+              <w:jc w:val="center"/>
+            </w:pPr>
+            <w:r>
+              <w:rPr>
+                <w:rFonts w:ascii="Times New Roman" w:hAnsi="Times New Roman" w:cs="Times New Roman"/>
+                <w:sz w:val="26"/>
+                <w:szCs w:val="26"/>
+              </w:rPr>
+              <w:t xml:space="preserve">12</w:t>
+            </w:r>
+          </w:p>
+        </w:tc>
+        <w:tc>
+          <w:tcPr>
+            <w:tcW w:w="6360" w:type="dxa"/>
+            <w:tcBorders>
+              <w:top w:val="single" w:sz="12" w:color="000000"/>
+              <w:left w:val="single" w:sz="12" w:color="000000"/>
+              <w:bottom w:val="single" w:sz="12" w:color="000000"/>
+              <w:right w:val="single" w:sz="12" w:color="000000"/>
+            </w:tcBorders>
+            <w:tcMar>
+              <w:top w:w="120" w:type="dxa"/>
+              <w:bottom w:w="120" w:type="dxa"/>
+              <w:left w:w="120" w:type="dxa"/>
+              <w:right w:w="120" w:type="dxa"/>
+            </w:tcMar>
+            <w:vAlign w:val="center"/>
+          </w:tcPr>
+          <w:p>
+            <w:pPr>
+              <w:spacing w:before="80" w:after="80" w:line="240" w:lineRule="auto"/>
+              <w:jc w:val="left"/>
+            </w:pPr>
+            <w:r>
+              <w:rPr>
+                <w:rFonts w:ascii="Times New Roman" w:hAnsi="Times New Roman" w:cs="Times New Roman"/>
+                <w:sz w:val="26"/>
+                <w:szCs w:val="26"/>
+              </w:rPr>
+              <w:t xml:space="preserve">Project Screenshots</w:t>
+            </w:r>
+          </w:p>
+        </w:tc>
+        <w:tc>
+          <w:tcPr>
+            <w:tcW w:w="1500" w:type="dxa"/>
+            <w:tcBorders>
+              <w:top w:val="single" w:sz="12" w:color="000000"/>
+              <w:left w:val="single" w:sz="12" w:color="000000"/>
+              <w:bottom w:val="single" w:sz="12" w:color="000000"/>
+              <w:right w:val="single" w:sz="12" w:color="000000"/>
+            </w:tcBorders>
+            <w:tcMar>
+              <w:top w:w="120" w:type="dxa"/>
+              <w:bottom w:w="120" w:type="dxa"/>
+              <w:left w:w="120" w:type="dxa"/>
+              <w:right w:w="120" w:type="dxa"/>
+            </w:tcMar>
+            <w:vAlign w:val="center"/>
+          </w:tcPr>
+          <w:p>
+            <w:pPr>
+              <w:spacing w:before="80" w:after="80" w:line="240" w:lineRule="auto"/>
+              <w:jc w:val="center"/>
+            </w:pPr>
+            <w:r>
+              <w:rPr>
+                <w:rFonts w:ascii="Times New Roman" w:hAnsi="Times New Roman" w:cs="Times New Roman"/>
+                <w:sz w:val="22"/>
+                <w:szCs w:val="22"/>
+              </w:rPr>
+              <w:t xml:space="preserve">37</w:t>
             </w:r>
           </w:p>
         </w:tc>
@@ -2005,61 +2468,97 @@
       <w:tr>
         <w:tc>
           <w:tcPr>
-            <w:tcW w:w="900" w:type="dxa"/>
-            <w:vAlign w:val="center"/>
-          </w:tcPr>
-          <w:p>
-            <w:pPr>
-              <w:spacing w:before="20" w:after="20" w:line="240" w:lineRule="auto"/>
-              <w:jc w:val="left"/>
-            </w:pPr>
-            <w:r>
-              <w:rPr>
-                <w:rFonts w:ascii="Times New Roman" w:hAnsi="Times New Roman" w:cs="Times New Roman"/>
-                <w:sz w:val="22"/>
-                <w:szCs w:val="22"/>
-              </w:rPr>
-              <w:t xml:space="preserve">7</w:t>
-            </w:r>
-          </w:p>
-        </w:tc>
-        <w:tc>
-          <w:tcPr>
-            <w:tcW w:w="7460" w:type="dxa"/>
-            <w:vAlign w:val="center"/>
-          </w:tcPr>
-          <w:p>
-            <w:pPr>
-              <w:spacing w:before="20" w:after="20" w:line="240" w:lineRule="auto"/>
-              <w:jc w:val="left"/>
-            </w:pPr>
-            <w:r>
-              <w:rPr>
-                <w:rFonts w:ascii="Times New Roman" w:hAnsi="Times New Roman" w:cs="Times New Roman"/>
-                <w:sz w:val="22"/>
-                <w:szCs w:val="22"/>
-              </w:rPr>
-              <w:t xml:space="preserve">Technologies Used</w:t>
-            </w:r>
-          </w:p>
-        </w:tc>
-        <w:tc>
-          <w:tcPr>
-            <w:tcW w:w="1000" w:type="dxa"/>
-            <w:vAlign w:val="center"/>
-          </w:tcPr>
-          <w:p>
-            <w:pPr>
-              <w:spacing w:before="20" w:after="20" w:line="240" w:lineRule="auto"/>
-              <w:jc w:val="left"/>
-            </w:pPr>
-            <w:r>
-              <w:rPr>
-                <w:rFonts w:ascii="Times New Roman" w:hAnsi="Times New Roman" w:cs="Times New Roman"/>
-                <w:sz w:val="22"/>
-                <w:szCs w:val="22"/>
-              </w:rPr>
-              <w:t xml:space="preserve">20</w:t>
+            <w:tcW w:w="1500" w:type="dxa"/>
+            <w:tcBorders>
+              <w:top w:val="single" w:sz="12" w:color="000000"/>
+              <w:left w:val="single" w:sz="12" w:color="000000"/>
+              <w:bottom w:val="single" w:sz="12" w:color="000000"/>
+              <w:right w:val="single" w:sz="12" w:color="000000"/>
+            </w:tcBorders>
+            <w:tcMar>
+              <w:top w:w="120" w:type="dxa"/>
+              <w:bottom w:w="120" w:type="dxa"/>
+              <w:left w:w="120" w:type="dxa"/>
+              <w:right w:w="120" w:type="dxa"/>
+            </w:tcMar>
+            <w:vAlign w:val="center"/>
+          </w:tcPr>
+          <w:p>
+            <w:pPr>
+              <w:spacing w:before="80" w:after="80" w:line="240" w:lineRule="auto"/>
+              <w:jc w:val="center"/>
+            </w:pPr>
+            <w:r>
+              <w:rPr>
+                <w:rFonts w:ascii="Times New Roman" w:hAnsi="Times New Roman" w:cs="Times New Roman"/>
+                <w:sz w:val="26"/>
+                <w:szCs w:val="26"/>
+              </w:rPr>
+              <w:t xml:space="preserve">13</w:t>
+            </w:r>
+          </w:p>
+        </w:tc>
+        <w:tc>
+          <w:tcPr>
+            <w:tcW w:w="6360" w:type="dxa"/>
+            <w:tcBorders>
+              <w:top w:val="single" w:sz="12" w:color="000000"/>
+              <w:left w:val="single" w:sz="12" w:color="000000"/>
+              <w:bottom w:val="single" w:sz="12" w:color="000000"/>
+              <w:right w:val="single" w:sz="12" w:color="000000"/>
+            </w:tcBorders>
+            <w:tcMar>
+              <w:top w:w="120" w:type="dxa"/>
+              <w:bottom w:w="120" w:type="dxa"/>
+              <w:left w:w="120" w:type="dxa"/>
+              <w:right w:w="120" w:type="dxa"/>
+            </w:tcMar>
+            <w:vAlign w:val="center"/>
+          </w:tcPr>
+          <w:p>
+            <w:pPr>
+              <w:spacing w:before="80" w:after="80" w:line="240" w:lineRule="auto"/>
+              <w:jc w:val="left"/>
+            </w:pPr>
+            <w:r>
+              <w:rPr>
+                <w:rFonts w:ascii="Times New Roman" w:hAnsi="Times New Roman" w:cs="Times New Roman"/>
+                <w:sz w:val="26"/>
+                <w:szCs w:val="26"/>
+              </w:rPr>
+              <w:t xml:space="preserve">Source Code Explanation</w:t>
+            </w:r>
+          </w:p>
+        </w:tc>
+        <w:tc>
+          <w:tcPr>
+            <w:tcW w:w="1500" w:type="dxa"/>
+            <w:tcBorders>
+              <w:top w:val="single" w:sz="12" w:color="000000"/>
+              <w:left w:val="single" w:sz="12" w:color="000000"/>
+              <w:bottom w:val="single" w:sz="12" w:color="000000"/>
+              <w:right w:val="single" w:sz="12" w:color="000000"/>
+            </w:tcBorders>
+            <w:tcMar>
+              <w:top w:w="120" w:type="dxa"/>
+              <w:bottom w:w="120" w:type="dxa"/>
+              <w:left w:w="120" w:type="dxa"/>
+              <w:right w:w="120" w:type="dxa"/>
+            </w:tcMar>
+            <w:vAlign w:val="center"/>
+          </w:tcPr>
+          <w:p>
+            <w:pPr>
+              <w:spacing w:before="80" w:after="80" w:line="240" w:lineRule="auto"/>
+              <w:jc w:val="center"/>
+            </w:pPr>
+            <w:r>
+              <w:rPr>
+                <w:rFonts w:ascii="Times New Roman" w:hAnsi="Times New Roman" w:cs="Times New Roman"/>
+                <w:sz w:val="22"/>
+                <w:szCs w:val="22"/>
+              </w:rPr>
+              <w:t xml:space="preserve">42</w:t>
             </w:r>
           </w:p>
         </w:tc>
@@ -2067,61 +2566,97 @@
       <w:tr>
         <w:tc>
           <w:tcPr>
-            <w:tcW w:w="900" w:type="dxa"/>
-            <w:vAlign w:val="center"/>
-          </w:tcPr>
-          <w:p>
-            <w:pPr>
-              <w:spacing w:before="20" w:after="20" w:line="240" w:lineRule="auto"/>
-              <w:jc w:val="left"/>
-            </w:pPr>
-            <w:r>
-              <w:rPr>
-                <w:rFonts w:ascii="Times New Roman" w:hAnsi="Times New Roman" w:cs="Times New Roman"/>
-                <w:sz w:val="22"/>
-                <w:szCs w:val="22"/>
-              </w:rPr>
-              <w:t xml:space="preserve">8</w:t>
-            </w:r>
-          </w:p>
-        </w:tc>
-        <w:tc>
-          <w:tcPr>
-            <w:tcW w:w="7460" w:type="dxa"/>
-            <w:vAlign w:val="center"/>
-          </w:tcPr>
-          <w:p>
-            <w:pPr>
-              <w:spacing w:before="20" w:after="20" w:line="240" w:lineRule="auto"/>
-              <w:jc w:val="left"/>
-            </w:pPr>
-            <w:r>
-              <w:rPr>
-                <w:rFonts w:ascii="Times New Roman" w:hAnsi="Times New Roman" w:cs="Times New Roman"/>
-                <w:sz w:val="22"/>
-                <w:szCs w:val="22"/>
-              </w:rPr>
-              <w:t xml:space="preserve">Project Overview</w:t>
-            </w:r>
-          </w:p>
-        </w:tc>
-        <w:tc>
-          <w:tcPr>
-            <w:tcW w:w="1000" w:type="dxa"/>
-            <w:vAlign w:val="center"/>
-          </w:tcPr>
-          <w:p>
-            <w:pPr>
-              <w:spacing w:before="20" w:after="20" w:line="240" w:lineRule="auto"/>
-              <w:jc w:val="left"/>
-            </w:pPr>
-            <w:r>
-              <w:rPr>
-                <w:rFonts w:ascii="Times New Roman" w:hAnsi="Times New Roman" w:cs="Times New Roman"/>
-                <w:sz w:val="22"/>
-                <w:szCs w:val="22"/>
-              </w:rPr>
-              <w:t xml:space="preserve">24</w:t>
+            <w:tcW w:w="1500" w:type="dxa"/>
+            <w:tcBorders>
+              <w:top w:val="single" w:sz="12" w:color="000000"/>
+              <w:left w:val="single" w:sz="12" w:color="000000"/>
+              <w:bottom w:val="single" w:sz="12" w:color="000000"/>
+              <w:right w:val="single" w:sz="12" w:color="000000"/>
+            </w:tcBorders>
+            <w:tcMar>
+              <w:top w:w="120" w:type="dxa"/>
+              <w:bottom w:w="120" w:type="dxa"/>
+              <w:left w:w="120" w:type="dxa"/>
+              <w:right w:w="120" w:type="dxa"/>
+            </w:tcMar>
+            <w:vAlign w:val="center"/>
+          </w:tcPr>
+          <w:p>
+            <w:pPr>
+              <w:spacing w:before="80" w:after="80" w:line="240" w:lineRule="auto"/>
+              <w:jc w:val="center"/>
+            </w:pPr>
+            <w:r>
+              <w:rPr>
+                <w:rFonts w:ascii="Times New Roman" w:hAnsi="Times New Roman" w:cs="Times New Roman"/>
+                <w:sz w:val="26"/>
+                <w:szCs w:val="26"/>
+              </w:rPr>
+              <w:t xml:space="preserve">14</w:t>
+            </w:r>
+          </w:p>
+        </w:tc>
+        <w:tc>
+          <w:tcPr>
+            <w:tcW w:w="6360" w:type="dxa"/>
+            <w:tcBorders>
+              <w:top w:val="single" w:sz="12" w:color="000000"/>
+              <w:left w:val="single" w:sz="12" w:color="000000"/>
+              <w:bottom w:val="single" w:sz="12" w:color="000000"/>
+              <w:right w:val="single" w:sz="12" w:color="000000"/>
+            </w:tcBorders>
+            <w:tcMar>
+              <w:top w:w="120" w:type="dxa"/>
+              <w:bottom w:w="120" w:type="dxa"/>
+              <w:left w:w="120" w:type="dxa"/>
+              <w:right w:w="120" w:type="dxa"/>
+            </w:tcMar>
+            <w:vAlign w:val="center"/>
+          </w:tcPr>
+          <w:p>
+            <w:pPr>
+              <w:spacing w:before="80" w:after="80" w:line="240" w:lineRule="auto"/>
+              <w:jc w:val="left"/>
+            </w:pPr>
+            <w:r>
+              <w:rPr>
+                <w:rFonts w:ascii="Times New Roman" w:hAnsi="Times New Roman" w:cs="Times New Roman"/>
+                <w:sz w:val="26"/>
+                <w:szCs w:val="26"/>
+              </w:rPr>
+              <w:t xml:space="preserve">Testing</w:t>
+            </w:r>
+          </w:p>
+        </w:tc>
+        <w:tc>
+          <w:tcPr>
+            <w:tcW w:w="1500" w:type="dxa"/>
+            <w:tcBorders>
+              <w:top w:val="single" w:sz="12" w:color="000000"/>
+              <w:left w:val="single" w:sz="12" w:color="000000"/>
+              <w:bottom w:val="single" w:sz="12" w:color="000000"/>
+              <w:right w:val="single" w:sz="12" w:color="000000"/>
+            </w:tcBorders>
+            <w:tcMar>
+              <w:top w:w="120" w:type="dxa"/>
+              <w:bottom w:w="120" w:type="dxa"/>
+              <w:left w:w="120" w:type="dxa"/>
+              <w:right w:w="120" w:type="dxa"/>
+            </w:tcMar>
+            <w:vAlign w:val="center"/>
+          </w:tcPr>
+          <w:p>
+            <w:pPr>
+              <w:spacing w:before="80" w:after="80" w:line="240" w:lineRule="auto"/>
+              <w:jc w:val="center"/>
+            </w:pPr>
+            <w:r>
+              <w:rPr>
+                <w:rFonts w:ascii="Times New Roman" w:hAnsi="Times New Roman" w:cs="Times New Roman"/>
+                <w:sz w:val="22"/>
+                <w:szCs w:val="22"/>
+              </w:rPr>
+              <w:t xml:space="preserve">47</w:t>
             </w:r>
           </w:p>
         </w:tc>
@@ -2129,61 +2664,97 @@
       <w:tr>
         <w:tc>
           <w:tcPr>
-            <w:tcW w:w="900" w:type="dxa"/>
-            <w:vAlign w:val="center"/>
-          </w:tcPr>
-          <w:p>
-            <w:pPr>
-              <w:spacing w:before="20" w:after="20" w:line="240" w:lineRule="auto"/>
-              <w:jc w:val="left"/>
-            </w:pPr>
-            <w:r>
-              <w:rPr>
-                <w:rFonts w:ascii="Times New Roman" w:hAnsi="Times New Roman" w:cs="Times New Roman"/>
-                <w:sz w:val="22"/>
-                <w:szCs w:val="22"/>
-              </w:rPr>
-              <w:t xml:space="preserve">9</w:t>
-            </w:r>
-          </w:p>
-        </w:tc>
-        <w:tc>
-          <w:tcPr>
-            <w:tcW w:w="7460" w:type="dxa"/>
-            <w:vAlign w:val="center"/>
-          </w:tcPr>
-          <w:p>
-            <w:pPr>
-              <w:spacing w:before="20" w:after="20" w:line="240" w:lineRule="auto"/>
-              <w:jc w:val="left"/>
-            </w:pPr>
-            <w:r>
-              <w:rPr>
-                <w:rFonts w:ascii="Times New Roman" w:hAnsi="Times New Roman" w:cs="Times New Roman"/>
-                <w:sz w:val="22"/>
-                <w:szCs w:val="22"/>
-              </w:rPr>
-              <w:t xml:space="preserve">System Architecture and Design Diagrams</w:t>
-            </w:r>
-          </w:p>
-        </w:tc>
-        <w:tc>
-          <w:tcPr>
-            <w:tcW w:w="1000" w:type="dxa"/>
-            <w:vAlign w:val="center"/>
-          </w:tcPr>
-          <w:p>
-            <w:pPr>
-              <w:spacing w:before="20" w:after="20" w:line="240" w:lineRule="auto"/>
-              <w:jc w:val="left"/>
-            </w:pPr>
-            <w:r>
-              <w:rPr>
-                <w:rFonts w:ascii="Times New Roman" w:hAnsi="Times New Roman" w:cs="Times New Roman"/>
-                <w:sz w:val="22"/>
-                <w:szCs w:val="22"/>
-              </w:rPr>
-              <w:t xml:space="preserve">27</w:t>
+            <w:tcW w:w="1500" w:type="dxa"/>
+            <w:tcBorders>
+              <w:top w:val="single" w:sz="12" w:color="000000"/>
+              <w:left w:val="single" w:sz="12" w:color="000000"/>
+              <w:bottom w:val="single" w:sz="12" w:color="000000"/>
+              <w:right w:val="single" w:sz="12" w:color="000000"/>
+            </w:tcBorders>
+            <w:tcMar>
+              <w:top w:w="120" w:type="dxa"/>
+              <w:bottom w:w="120" w:type="dxa"/>
+              <w:left w:w="120" w:type="dxa"/>
+              <w:right w:w="120" w:type="dxa"/>
+            </w:tcMar>
+            <w:vAlign w:val="center"/>
+          </w:tcPr>
+          <w:p>
+            <w:pPr>
+              <w:spacing w:before="80" w:after="80" w:line="240" w:lineRule="auto"/>
+              <w:jc w:val="center"/>
+            </w:pPr>
+            <w:r>
+              <w:rPr>
+                <w:rFonts w:ascii="Times New Roman" w:hAnsi="Times New Roman" w:cs="Times New Roman"/>
+                <w:sz w:val="26"/>
+                <w:szCs w:val="26"/>
+              </w:rPr>
+              <w:t xml:space="preserve">15</w:t>
+            </w:r>
+          </w:p>
+        </w:tc>
+        <w:tc>
+          <w:tcPr>
+            <w:tcW w:w="6360" w:type="dxa"/>
+            <w:tcBorders>
+              <w:top w:val="single" w:sz="12" w:color="000000"/>
+              <w:left w:val="single" w:sz="12" w:color="000000"/>
+              <w:bottom w:val="single" w:sz="12" w:color="000000"/>
+              <w:right w:val="single" w:sz="12" w:color="000000"/>
+            </w:tcBorders>
+            <w:tcMar>
+              <w:top w:w="120" w:type="dxa"/>
+              <w:bottom w:w="120" w:type="dxa"/>
+              <w:left w:w="120" w:type="dxa"/>
+              <w:right w:w="120" w:type="dxa"/>
+            </w:tcMar>
+            <w:vAlign w:val="center"/>
+          </w:tcPr>
+          <w:p>
+            <w:pPr>
+              <w:spacing w:before="80" w:after="80" w:line="240" w:lineRule="auto"/>
+              <w:jc w:val="left"/>
+            </w:pPr>
+            <w:r>
+              <w:rPr>
+                <w:rFonts w:ascii="Times New Roman" w:hAnsi="Times New Roman" w:cs="Times New Roman"/>
+                <w:sz w:val="26"/>
+                <w:szCs w:val="26"/>
+              </w:rPr>
+              <w:t xml:space="preserve">Advantages</w:t>
+            </w:r>
+          </w:p>
+        </w:tc>
+        <w:tc>
+          <w:tcPr>
+            <w:tcW w:w="1500" w:type="dxa"/>
+            <w:tcBorders>
+              <w:top w:val="single" w:sz="12" w:color="000000"/>
+              <w:left w:val="single" w:sz="12" w:color="000000"/>
+              <w:bottom w:val="single" w:sz="12" w:color="000000"/>
+              <w:right w:val="single" w:sz="12" w:color="000000"/>
+            </w:tcBorders>
+            <w:tcMar>
+              <w:top w:w="120" w:type="dxa"/>
+              <w:bottom w:w="120" w:type="dxa"/>
+              <w:left w:w="120" w:type="dxa"/>
+              <w:right w:w="120" w:type="dxa"/>
+            </w:tcMar>
+            <w:vAlign w:val="center"/>
+          </w:tcPr>
+          <w:p>
+            <w:pPr>
+              <w:spacing w:before="80" w:after="80" w:line="240" w:lineRule="auto"/>
+              <w:jc w:val="center"/>
+            </w:pPr>
+            <w:r>
+              <w:rPr>
+                <w:rFonts w:ascii="Times New Roman" w:hAnsi="Times New Roman" w:cs="Times New Roman"/>
+                <w:sz w:val="22"/>
+                <w:szCs w:val="22"/>
+              </w:rPr>
+              <w:t xml:space="preserve">49</w:t>
             </w:r>
           </w:p>
         </w:tc>
@@ -2191,61 +2762,97 @@
       <w:tr>
         <w:tc>
           <w:tcPr>
-            <w:tcW w:w="900" w:type="dxa"/>
-            <w:vAlign w:val="center"/>
-          </w:tcPr>
-          <w:p>
-            <w:pPr>
-              <w:spacing w:before="20" w:after="20" w:line="240" w:lineRule="auto"/>
-              <w:jc w:val="left"/>
-            </w:pPr>
-            <w:r>
-              <w:rPr>
-                <w:rFonts w:ascii="Times New Roman" w:hAnsi="Times New Roman" w:cs="Times New Roman"/>
-                <w:sz w:val="22"/>
-                <w:szCs w:val="22"/>
-              </w:rPr>
-              <w:t xml:space="preserve">10</w:t>
-            </w:r>
-          </w:p>
-        </w:tc>
-        <w:tc>
-          <w:tcPr>
-            <w:tcW w:w="7460" w:type="dxa"/>
-            <w:vAlign w:val="center"/>
-          </w:tcPr>
-          <w:p>
-            <w:pPr>
-              <w:spacing w:before="20" w:after="20" w:line="240" w:lineRule="auto"/>
-              <w:jc w:val="left"/>
-            </w:pPr>
-            <w:r>
-              <w:rPr>
-                <w:rFonts w:ascii="Times New Roman" w:hAnsi="Times New Roman" w:cs="Times New Roman"/>
-                <w:sz w:val="22"/>
-                <w:szCs w:val="22"/>
-              </w:rPr>
-              <w:t xml:space="preserve">System Modules</w:t>
-            </w:r>
-          </w:p>
-        </w:tc>
-        <w:tc>
-          <w:tcPr>
-            <w:tcW w:w="1000" w:type="dxa"/>
-            <w:vAlign w:val="center"/>
-          </w:tcPr>
-          <w:p>
-            <w:pPr>
-              <w:spacing w:before="20" w:after="20" w:line="240" w:lineRule="auto"/>
-              <w:jc w:val="left"/>
-            </w:pPr>
-            <w:r>
-              <w:rPr>
-                <w:rFonts w:ascii="Times New Roman" w:hAnsi="Times New Roman" w:cs="Times New Roman"/>
-                <w:sz w:val="22"/>
-                <w:szCs w:val="22"/>
-              </w:rPr>
-              <w:t xml:space="preserve">31</w:t>
+            <w:tcW w:w="1500" w:type="dxa"/>
+            <w:tcBorders>
+              <w:top w:val="single" w:sz="12" w:color="000000"/>
+              <w:left w:val="single" w:sz="12" w:color="000000"/>
+              <w:bottom w:val="single" w:sz="12" w:color="000000"/>
+              <w:right w:val="single" w:sz="12" w:color="000000"/>
+            </w:tcBorders>
+            <w:tcMar>
+              <w:top w:w="120" w:type="dxa"/>
+              <w:bottom w:w="120" w:type="dxa"/>
+              <w:left w:w="120" w:type="dxa"/>
+              <w:right w:w="120" w:type="dxa"/>
+            </w:tcMar>
+            <w:vAlign w:val="center"/>
+          </w:tcPr>
+          <w:p>
+            <w:pPr>
+              <w:spacing w:before="80" w:after="80" w:line="240" w:lineRule="auto"/>
+              <w:jc w:val="center"/>
+            </w:pPr>
+            <w:r>
+              <w:rPr>
+                <w:rFonts w:ascii="Times New Roman" w:hAnsi="Times New Roman" w:cs="Times New Roman"/>
+                <w:sz w:val="26"/>
+                <w:szCs w:val="26"/>
+              </w:rPr>
+              <w:t xml:space="preserve">16</w:t>
+            </w:r>
+          </w:p>
+        </w:tc>
+        <w:tc>
+          <w:tcPr>
+            <w:tcW w:w="6360" w:type="dxa"/>
+            <w:tcBorders>
+              <w:top w:val="single" w:sz="12" w:color="000000"/>
+              <w:left w:val="single" w:sz="12" w:color="000000"/>
+              <w:bottom w:val="single" w:sz="12" w:color="000000"/>
+              <w:right w:val="single" w:sz="12" w:color="000000"/>
+            </w:tcBorders>
+            <w:tcMar>
+              <w:top w:w="120" w:type="dxa"/>
+              <w:bottom w:w="120" w:type="dxa"/>
+              <w:left w:w="120" w:type="dxa"/>
+              <w:right w:w="120" w:type="dxa"/>
+            </w:tcMar>
+            <w:vAlign w:val="center"/>
+          </w:tcPr>
+          <w:p>
+            <w:pPr>
+              <w:spacing w:before="80" w:after="80" w:line="240" w:lineRule="auto"/>
+              <w:jc w:val="left"/>
+            </w:pPr>
+            <w:r>
+              <w:rPr>
+                <w:rFonts w:ascii="Times New Roman" w:hAnsi="Times New Roman" w:cs="Times New Roman"/>
+                <w:sz w:val="26"/>
+                <w:szCs w:val="26"/>
+              </w:rPr>
+              <w:t xml:space="preserve">Learning Outcomes</w:t>
+            </w:r>
+          </w:p>
+        </w:tc>
+        <w:tc>
+          <w:tcPr>
+            <w:tcW w:w="1500" w:type="dxa"/>
+            <w:tcBorders>
+              <w:top w:val="single" w:sz="12" w:color="000000"/>
+              <w:left w:val="single" w:sz="12" w:color="000000"/>
+              <w:bottom w:val="single" w:sz="12" w:color="000000"/>
+              <w:right w:val="single" w:sz="12" w:color="000000"/>
+            </w:tcBorders>
+            <w:tcMar>
+              <w:top w:w="120" w:type="dxa"/>
+              <w:bottom w:w="120" w:type="dxa"/>
+              <w:left w:w="120" w:type="dxa"/>
+              <w:right w:w="120" w:type="dxa"/>
+            </w:tcMar>
+            <w:vAlign w:val="center"/>
+          </w:tcPr>
+          <w:p>
+            <w:pPr>
+              <w:spacing w:before="80" w:after="80" w:line="240" w:lineRule="auto"/>
+              <w:jc w:val="center"/>
+            </w:pPr>
+            <w:r>
+              <w:rPr>
+                <w:rFonts w:ascii="Times New Roman" w:hAnsi="Times New Roman" w:cs="Times New Roman"/>
+                <w:sz w:val="22"/>
+                <w:szCs w:val="22"/>
+              </w:rPr>
+              <w:t xml:space="preserve">51</w:t>
             </w:r>
           </w:p>
         </w:tc>
@@ -2253,61 +2860,97 @@
       <w:tr>
         <w:tc>
           <w:tcPr>
-            <w:tcW w:w="900" w:type="dxa"/>
-            <w:vAlign w:val="center"/>
-          </w:tcPr>
-          <w:p>
-            <w:pPr>
-              <w:spacing w:before="20" w:after="20" w:line="240" w:lineRule="auto"/>
-              <w:jc w:val="left"/>
-            </w:pPr>
-            <w:r>
-              <w:rPr>
-                <w:rFonts w:ascii="Times New Roman" w:hAnsi="Times New Roman" w:cs="Times New Roman"/>
-                <w:sz w:val="22"/>
-                <w:szCs w:val="22"/>
-              </w:rPr>
-              <w:t xml:space="preserve">11</w:t>
-            </w:r>
-          </w:p>
-        </w:tc>
-        <w:tc>
-          <w:tcPr>
-            <w:tcW w:w="7460" w:type="dxa"/>
-            <w:vAlign w:val="center"/>
-          </w:tcPr>
-          <w:p>
-            <w:pPr>
-              <w:spacing w:before="20" w:after="20" w:line="240" w:lineRule="auto"/>
-              <w:jc w:val="left"/>
-            </w:pPr>
-            <w:r>
-              <w:rPr>
-                <w:rFonts w:ascii="Times New Roman" w:hAnsi="Times New Roman" w:cs="Times New Roman"/>
-                <w:sz w:val="22"/>
-                <w:szCs w:val="22"/>
-              </w:rPr>
-              <w:t xml:space="preserve">Database Design</w:t>
-            </w:r>
-          </w:p>
-        </w:tc>
-        <w:tc>
-          <w:tcPr>
-            <w:tcW w:w="1000" w:type="dxa"/>
-            <w:vAlign w:val="center"/>
-          </w:tcPr>
-          <w:p>
-            <w:pPr>
-              <w:spacing w:before="20" w:after="20" w:line="240" w:lineRule="auto"/>
-              <w:jc w:val="left"/>
-            </w:pPr>
-            <w:r>
-              <w:rPr>
-                <w:rFonts w:ascii="Times New Roman" w:hAnsi="Times New Roman" w:cs="Times New Roman"/>
-                <w:sz w:val="22"/>
-                <w:szCs w:val="22"/>
-              </w:rPr>
-              <w:t xml:space="preserve">35</w:t>
+            <w:tcW w:w="1500" w:type="dxa"/>
+            <w:tcBorders>
+              <w:top w:val="single" w:sz="12" w:color="000000"/>
+              <w:left w:val="single" w:sz="12" w:color="000000"/>
+              <w:bottom w:val="single" w:sz="12" w:color="000000"/>
+              <w:right w:val="single" w:sz="12" w:color="000000"/>
+            </w:tcBorders>
+            <w:tcMar>
+              <w:top w:w="120" w:type="dxa"/>
+              <w:bottom w:w="120" w:type="dxa"/>
+              <w:left w:w="120" w:type="dxa"/>
+              <w:right w:w="120" w:type="dxa"/>
+            </w:tcMar>
+            <w:vAlign w:val="center"/>
+          </w:tcPr>
+          <w:p>
+            <w:pPr>
+              <w:spacing w:before="80" w:after="80" w:line="240" w:lineRule="auto"/>
+              <w:jc w:val="center"/>
+            </w:pPr>
+            <w:r>
+              <w:rPr>
+                <w:rFonts w:ascii="Times New Roman" w:hAnsi="Times New Roman" w:cs="Times New Roman"/>
+                <w:sz w:val="26"/>
+                <w:szCs w:val="26"/>
+              </w:rPr>
+              <w:t xml:space="preserve">17</w:t>
+            </w:r>
+          </w:p>
+        </w:tc>
+        <w:tc>
+          <w:tcPr>
+            <w:tcW w:w="6360" w:type="dxa"/>
+            <w:tcBorders>
+              <w:top w:val="single" w:sz="12" w:color="000000"/>
+              <w:left w:val="single" w:sz="12" w:color="000000"/>
+              <w:bottom w:val="single" w:sz="12" w:color="000000"/>
+              <w:right w:val="single" w:sz="12" w:color="000000"/>
+            </w:tcBorders>
+            <w:tcMar>
+              <w:top w:w="120" w:type="dxa"/>
+              <w:bottom w:w="120" w:type="dxa"/>
+              <w:left w:w="120" w:type="dxa"/>
+              <w:right w:w="120" w:type="dxa"/>
+            </w:tcMar>
+            <w:vAlign w:val="center"/>
+          </w:tcPr>
+          <w:p>
+            <w:pPr>
+              <w:spacing w:before="80" w:after="80" w:line="240" w:lineRule="auto"/>
+              <w:jc w:val="left"/>
+            </w:pPr>
+            <w:r>
+              <w:rPr>
+                <w:rFonts w:ascii="Times New Roman" w:hAnsi="Times New Roman" w:cs="Times New Roman"/>
+                <w:sz w:val="26"/>
+                <w:szCs w:val="26"/>
+              </w:rPr>
+              <w:t xml:space="preserve">Challenges</w:t>
+            </w:r>
+          </w:p>
+        </w:tc>
+        <w:tc>
+          <w:tcPr>
+            <w:tcW w:w="1500" w:type="dxa"/>
+            <w:tcBorders>
+              <w:top w:val="single" w:sz="12" w:color="000000"/>
+              <w:left w:val="single" w:sz="12" w:color="000000"/>
+              <w:bottom w:val="single" w:sz="12" w:color="000000"/>
+              <w:right w:val="single" w:sz="12" w:color="000000"/>
+            </w:tcBorders>
+            <w:tcMar>
+              <w:top w:w="120" w:type="dxa"/>
+              <w:bottom w:w="120" w:type="dxa"/>
+              <w:left w:w="120" w:type="dxa"/>
+              <w:right w:w="120" w:type="dxa"/>
+            </w:tcMar>
+            <w:vAlign w:val="center"/>
+          </w:tcPr>
+          <w:p>
+            <w:pPr>
+              <w:spacing w:before="80" w:after="80" w:line="240" w:lineRule="auto"/>
+              <w:jc w:val="center"/>
+            </w:pPr>
+            <w:r>
+              <w:rPr>
+                <w:rFonts w:ascii="Times New Roman" w:hAnsi="Times New Roman" w:cs="Times New Roman"/>
+                <w:sz w:val="22"/>
+                <w:szCs w:val="22"/>
+              </w:rPr>
+              <w:t xml:space="preserve">53</w:t>
             </w:r>
           </w:p>
         </w:tc>
@@ -2315,61 +2958,97 @@
       <w:tr>
         <w:tc>
           <w:tcPr>
-            <w:tcW w:w="900" w:type="dxa"/>
-            <w:vAlign w:val="center"/>
-          </w:tcPr>
-          <w:p>
-            <w:pPr>
-              <w:spacing w:before="20" w:after="20" w:line="240" w:lineRule="auto"/>
-              <w:jc w:val="left"/>
-            </w:pPr>
-            <w:r>
-              <w:rPr>
-                <w:rFonts w:ascii="Times New Roman" w:hAnsi="Times New Roman" w:cs="Times New Roman"/>
-                <w:sz w:val="22"/>
-                <w:szCs w:val="22"/>
-              </w:rPr>
-              <w:t xml:space="preserve">12</w:t>
-            </w:r>
-          </w:p>
-        </w:tc>
-        <w:tc>
-          <w:tcPr>
-            <w:tcW w:w="7460" w:type="dxa"/>
-            <w:vAlign w:val="center"/>
-          </w:tcPr>
-          <w:p>
-            <w:pPr>
-              <w:spacing w:before="20" w:after="20" w:line="240" w:lineRule="auto"/>
-              <w:jc w:val="left"/>
-            </w:pPr>
-            <w:r>
-              <w:rPr>
-                <w:rFonts w:ascii="Times New Roman" w:hAnsi="Times New Roman" w:cs="Times New Roman"/>
-                <w:sz w:val="22"/>
-                <w:szCs w:val="22"/>
-              </w:rPr>
-              <w:t xml:space="preserve">Project Screenshots</w:t>
-            </w:r>
-          </w:p>
-        </w:tc>
-        <w:tc>
-          <w:tcPr>
-            <w:tcW w:w="1000" w:type="dxa"/>
-            <w:vAlign w:val="center"/>
-          </w:tcPr>
-          <w:p>
-            <w:pPr>
-              <w:spacing w:before="20" w:after="20" w:line="240" w:lineRule="auto"/>
-              <w:jc w:val="left"/>
-            </w:pPr>
-            <w:r>
-              <w:rPr>
-                <w:rFonts w:ascii="Times New Roman" w:hAnsi="Times New Roman" w:cs="Times New Roman"/>
-                <w:sz w:val="22"/>
-                <w:szCs w:val="22"/>
-              </w:rPr>
-              <w:t xml:space="preserve">37</w:t>
+            <w:tcW w:w="1500" w:type="dxa"/>
+            <w:tcBorders>
+              <w:top w:val="single" w:sz="12" w:color="000000"/>
+              <w:left w:val="single" w:sz="12" w:color="000000"/>
+              <w:bottom w:val="single" w:sz="12" w:color="000000"/>
+              <w:right w:val="single" w:sz="12" w:color="000000"/>
+            </w:tcBorders>
+            <w:tcMar>
+              <w:top w:w="120" w:type="dxa"/>
+              <w:bottom w:w="120" w:type="dxa"/>
+              <w:left w:w="120" w:type="dxa"/>
+              <w:right w:w="120" w:type="dxa"/>
+            </w:tcMar>
+            <w:vAlign w:val="center"/>
+          </w:tcPr>
+          <w:p>
+            <w:pPr>
+              <w:spacing w:before="80" w:after="80" w:line="240" w:lineRule="auto"/>
+              <w:jc w:val="center"/>
+            </w:pPr>
+            <w:r>
+              <w:rPr>
+                <w:rFonts w:ascii="Times New Roman" w:hAnsi="Times New Roman" w:cs="Times New Roman"/>
+                <w:sz w:val="26"/>
+                <w:szCs w:val="26"/>
+              </w:rPr>
+              <w:t xml:space="preserve">18</w:t>
+            </w:r>
+          </w:p>
+        </w:tc>
+        <w:tc>
+          <w:tcPr>
+            <w:tcW w:w="6360" w:type="dxa"/>
+            <w:tcBorders>
+              <w:top w:val="single" w:sz="12" w:color="000000"/>
+              <w:left w:val="single" w:sz="12" w:color="000000"/>
+              <w:bottom w:val="single" w:sz="12" w:color="000000"/>
+              <w:right w:val="single" w:sz="12" w:color="000000"/>
+            </w:tcBorders>
+            <w:tcMar>
+              <w:top w:w="120" w:type="dxa"/>
+              <w:bottom w:w="120" w:type="dxa"/>
+              <w:left w:w="120" w:type="dxa"/>
+              <w:right w:w="120" w:type="dxa"/>
+            </w:tcMar>
+            <w:vAlign w:val="center"/>
+          </w:tcPr>
+          <w:p>
+            <w:pPr>
+              <w:spacing w:before="80" w:after="80" w:line="240" w:lineRule="auto"/>
+              <w:jc w:val="left"/>
+            </w:pPr>
+            <w:r>
+              <w:rPr>
+                <w:rFonts w:ascii="Times New Roman" w:hAnsi="Times New Roman" w:cs="Times New Roman"/>
+                <w:sz w:val="26"/>
+                <w:szCs w:val="26"/>
+              </w:rPr>
+              <w:t xml:space="preserve">Future Scope</w:t>
+            </w:r>
+          </w:p>
+        </w:tc>
+        <w:tc>
+          <w:tcPr>
+            <w:tcW w:w="1500" w:type="dxa"/>
+            <w:tcBorders>
+              <w:top w:val="single" w:sz="12" w:color="000000"/>
+              <w:left w:val="single" w:sz="12" w:color="000000"/>
+              <w:bottom w:val="single" w:sz="12" w:color="000000"/>
+              <w:right w:val="single" w:sz="12" w:color="000000"/>
+            </w:tcBorders>
+            <w:tcMar>
+              <w:top w:w="120" w:type="dxa"/>
+              <w:bottom w:w="120" w:type="dxa"/>
+              <w:left w:w="120" w:type="dxa"/>
+              <w:right w:w="120" w:type="dxa"/>
+            </w:tcMar>
+            <w:vAlign w:val="center"/>
+          </w:tcPr>
+          <w:p>
+            <w:pPr>
+              <w:spacing w:before="80" w:after="80" w:line="240" w:lineRule="auto"/>
+              <w:jc w:val="center"/>
+            </w:pPr>
+            <w:r>
+              <w:rPr>
+                <w:rFonts w:ascii="Times New Roman" w:hAnsi="Times New Roman" w:cs="Times New Roman"/>
+                <w:sz w:val="22"/>
+                <w:szCs w:val="22"/>
+              </w:rPr>
+              <w:t xml:space="preserve">55</w:t>
             </w:r>
           </w:p>
         </w:tc>
@@ -2377,61 +3056,97 @@
       <w:tr>
         <w:tc>
           <w:tcPr>
-            <w:tcW w:w="900" w:type="dxa"/>
-            <w:vAlign w:val="center"/>
-          </w:tcPr>
-          <w:p>
-            <w:pPr>
-              <w:spacing w:before="20" w:after="20" w:line="240" w:lineRule="auto"/>
-              <w:jc w:val="left"/>
-            </w:pPr>
-            <w:r>
-              <w:rPr>
-                <w:rFonts w:ascii="Times New Roman" w:hAnsi="Times New Roman" w:cs="Times New Roman"/>
-                <w:sz w:val="22"/>
-                <w:szCs w:val="22"/>
-              </w:rPr>
-              <w:t xml:space="preserve">13</w:t>
-            </w:r>
-          </w:p>
-        </w:tc>
-        <w:tc>
-          <w:tcPr>
-            <w:tcW w:w="7460" w:type="dxa"/>
-            <w:vAlign w:val="center"/>
-          </w:tcPr>
-          <w:p>
-            <w:pPr>
-              <w:spacing w:before="20" w:after="20" w:line="240" w:lineRule="auto"/>
-              <w:jc w:val="left"/>
-            </w:pPr>
-            <w:r>
-              <w:rPr>
-                <w:rFonts w:ascii="Times New Roman" w:hAnsi="Times New Roman" w:cs="Times New Roman"/>
-                <w:sz w:val="22"/>
-                <w:szCs w:val="22"/>
-              </w:rPr>
-              <w:t xml:space="preserve">Source Code Explanation</w:t>
-            </w:r>
-          </w:p>
-        </w:tc>
-        <w:tc>
-          <w:tcPr>
-            <w:tcW w:w="1000" w:type="dxa"/>
-            <w:vAlign w:val="center"/>
-          </w:tcPr>
-          <w:p>
-            <w:pPr>
-              <w:spacing w:before="20" w:after="20" w:line="240" w:lineRule="auto"/>
-              <w:jc w:val="left"/>
-            </w:pPr>
-            <w:r>
-              <w:rPr>
-                <w:rFonts w:ascii="Times New Roman" w:hAnsi="Times New Roman" w:cs="Times New Roman"/>
-                <w:sz w:val="22"/>
-                <w:szCs w:val="22"/>
-              </w:rPr>
-              <w:t xml:space="preserve">42</w:t>
+            <w:tcW w:w="1500" w:type="dxa"/>
+            <w:tcBorders>
+              <w:top w:val="single" w:sz="12" w:color="000000"/>
+              <w:left w:val="single" w:sz="12" w:color="000000"/>
+              <w:bottom w:val="single" w:sz="12" w:color="000000"/>
+              <w:right w:val="single" w:sz="12" w:color="000000"/>
+            </w:tcBorders>
+            <w:tcMar>
+              <w:top w:w="120" w:type="dxa"/>
+              <w:bottom w:w="120" w:type="dxa"/>
+              <w:left w:w="120" w:type="dxa"/>
+              <w:right w:w="120" w:type="dxa"/>
+            </w:tcMar>
+            <w:vAlign w:val="center"/>
+          </w:tcPr>
+          <w:p>
+            <w:pPr>
+              <w:spacing w:before="80" w:after="80" w:line="240" w:lineRule="auto"/>
+              <w:jc w:val="center"/>
+            </w:pPr>
+            <w:r>
+              <w:rPr>
+                <w:rFonts w:ascii="Times New Roman" w:hAnsi="Times New Roman" w:cs="Times New Roman"/>
+                <w:sz w:val="26"/>
+                <w:szCs w:val="26"/>
+              </w:rPr>
+              <w:t xml:space="preserve">19</w:t>
+            </w:r>
+          </w:p>
+        </w:tc>
+        <w:tc>
+          <w:tcPr>
+            <w:tcW w:w="6360" w:type="dxa"/>
+            <w:tcBorders>
+              <w:top w:val="single" w:sz="12" w:color="000000"/>
+              <w:left w:val="single" w:sz="12" w:color="000000"/>
+              <w:bottom w:val="single" w:sz="12" w:color="000000"/>
+              <w:right w:val="single" w:sz="12" w:color="000000"/>
+            </w:tcBorders>
+            <w:tcMar>
+              <w:top w:w="120" w:type="dxa"/>
+              <w:bottom w:w="120" w:type="dxa"/>
+              <w:left w:w="120" w:type="dxa"/>
+              <w:right w:w="120" w:type="dxa"/>
+            </w:tcMar>
+            <w:vAlign w:val="center"/>
+          </w:tcPr>
+          <w:p>
+            <w:pPr>
+              <w:spacing w:before="80" w:after="80" w:line="240" w:lineRule="auto"/>
+              <w:jc w:val="left"/>
+            </w:pPr>
+            <w:r>
+              <w:rPr>
+                <w:rFonts w:ascii="Times New Roman" w:hAnsi="Times New Roman" w:cs="Times New Roman"/>
+                <w:sz w:val="26"/>
+                <w:szCs w:val="26"/>
+              </w:rPr>
+              <w:t xml:space="preserve">Conclusion</w:t>
+            </w:r>
+          </w:p>
+        </w:tc>
+        <w:tc>
+          <w:tcPr>
+            <w:tcW w:w="1500" w:type="dxa"/>
+            <w:tcBorders>
+              <w:top w:val="single" w:sz="12" w:color="000000"/>
+              <w:left w:val="single" w:sz="12" w:color="000000"/>
+              <w:bottom w:val="single" w:sz="12" w:color="000000"/>
+              <w:right w:val="single" w:sz="12" w:color="000000"/>
+            </w:tcBorders>
+            <w:tcMar>
+              <w:top w:w="120" w:type="dxa"/>
+              <w:bottom w:w="120" w:type="dxa"/>
+              <w:left w:w="120" w:type="dxa"/>
+              <w:right w:w="120" w:type="dxa"/>
+            </w:tcMar>
+            <w:vAlign w:val="center"/>
+          </w:tcPr>
+          <w:p>
+            <w:pPr>
+              <w:spacing w:before="80" w:after="80" w:line="240" w:lineRule="auto"/>
+              <w:jc w:val="center"/>
+            </w:pPr>
+            <w:r>
+              <w:rPr>
+                <w:rFonts w:ascii="Times New Roman" w:hAnsi="Times New Roman" w:cs="Times New Roman"/>
+                <w:sz w:val="22"/>
+                <w:szCs w:val="22"/>
+              </w:rPr>
+              <w:t xml:space="preserve">57</w:t>
             </w:r>
           </w:p>
         </w:tc>
@@ -2439,61 +3154,97 @@
       <w:tr>
         <w:tc>
           <w:tcPr>
-            <w:tcW w:w="900" w:type="dxa"/>
-            <w:vAlign w:val="center"/>
-          </w:tcPr>
-          <w:p>
-            <w:pPr>
-              <w:spacing w:before="20" w:after="20" w:line="240" w:lineRule="auto"/>
-              <w:jc w:val="left"/>
-            </w:pPr>
-            <w:r>
-              <w:rPr>
-                <w:rFonts w:ascii="Times New Roman" w:hAnsi="Times New Roman" w:cs="Times New Roman"/>
-                <w:sz w:val="22"/>
-                <w:szCs w:val="22"/>
-              </w:rPr>
-              <w:t xml:space="preserve">14</w:t>
-            </w:r>
-          </w:p>
-        </w:tc>
-        <w:tc>
-          <w:tcPr>
-            <w:tcW w:w="7460" w:type="dxa"/>
-            <w:vAlign w:val="center"/>
-          </w:tcPr>
-          <w:p>
-            <w:pPr>
-              <w:spacing w:before="20" w:after="20" w:line="240" w:lineRule="auto"/>
-              <w:jc w:val="left"/>
-            </w:pPr>
-            <w:r>
-              <w:rPr>
-                <w:rFonts w:ascii="Times New Roman" w:hAnsi="Times New Roman" w:cs="Times New Roman"/>
-                <w:sz w:val="22"/>
-                <w:szCs w:val="22"/>
-              </w:rPr>
-              <w:t xml:space="preserve">Testing</w:t>
-            </w:r>
-          </w:p>
-        </w:tc>
-        <w:tc>
-          <w:tcPr>
-            <w:tcW w:w="1000" w:type="dxa"/>
-            <w:vAlign w:val="center"/>
-          </w:tcPr>
-          <w:p>
-            <w:pPr>
-              <w:spacing w:before="20" w:after="20" w:line="240" w:lineRule="auto"/>
-              <w:jc w:val="left"/>
-            </w:pPr>
-            <w:r>
-              <w:rPr>
-                <w:rFonts w:ascii="Times New Roman" w:hAnsi="Times New Roman" w:cs="Times New Roman"/>
-                <w:sz w:val="22"/>
-                <w:szCs w:val="22"/>
-              </w:rPr>
-              <w:t xml:space="preserve">47</w:t>
+            <w:tcW w:w="1500" w:type="dxa"/>
+            <w:tcBorders>
+              <w:top w:val="single" w:sz="12" w:color="000000"/>
+              <w:left w:val="single" w:sz="12" w:color="000000"/>
+              <w:bottom w:val="single" w:sz="12" w:color="000000"/>
+              <w:right w:val="single" w:sz="12" w:color="000000"/>
+            </w:tcBorders>
+            <w:tcMar>
+              <w:top w:w="120" w:type="dxa"/>
+              <w:bottom w:w="120" w:type="dxa"/>
+              <w:left w:w="120" w:type="dxa"/>
+              <w:right w:w="120" w:type="dxa"/>
+            </w:tcMar>
+            <w:vAlign w:val="center"/>
+          </w:tcPr>
+          <w:p>
+            <w:pPr>
+              <w:spacing w:before="80" w:after="80" w:line="240" w:lineRule="auto"/>
+              <w:jc w:val="center"/>
+            </w:pPr>
+            <w:r>
+              <w:rPr>
+                <w:rFonts w:ascii="Times New Roman" w:hAnsi="Times New Roman" w:cs="Times New Roman"/>
+                <w:sz w:val="26"/>
+                <w:szCs w:val="26"/>
+              </w:rPr>
+              <w:t xml:space="preserve">20</w:t>
+            </w:r>
+          </w:p>
+        </w:tc>
+        <w:tc>
+          <w:tcPr>
+            <w:tcW w:w="6360" w:type="dxa"/>
+            <w:tcBorders>
+              <w:top w:val="single" w:sz="12" w:color="000000"/>
+              <w:left w:val="single" w:sz="12" w:color="000000"/>
+              <w:bottom w:val="single" w:sz="12" w:color="000000"/>
+              <w:right w:val="single" w:sz="12" w:color="000000"/>
+            </w:tcBorders>
+            <w:tcMar>
+              <w:top w:w="120" w:type="dxa"/>
+              <w:bottom w:w="120" w:type="dxa"/>
+              <w:left w:w="120" w:type="dxa"/>
+              <w:right w:w="120" w:type="dxa"/>
+            </w:tcMar>
+            <w:vAlign w:val="center"/>
+          </w:tcPr>
+          <w:p>
+            <w:pPr>
+              <w:spacing w:before="80" w:after="80" w:line="240" w:lineRule="auto"/>
+              <w:jc w:val="left"/>
+            </w:pPr>
+            <w:r>
+              <w:rPr>
+                <w:rFonts w:ascii="Times New Roman" w:hAnsi="Times New Roman" w:cs="Times New Roman"/>
+                <w:sz w:val="26"/>
+                <w:szCs w:val="26"/>
+              </w:rPr>
+              <w:t xml:space="preserve">Bibliography</w:t>
+            </w:r>
+          </w:p>
+        </w:tc>
+        <w:tc>
+          <w:tcPr>
+            <w:tcW w:w="1500" w:type="dxa"/>
+            <w:tcBorders>
+              <w:top w:val="single" w:sz="12" w:color="000000"/>
+              <w:left w:val="single" w:sz="12" w:color="000000"/>
+              <w:bottom w:val="single" w:sz="12" w:color="000000"/>
+              <w:right w:val="single" w:sz="12" w:color="000000"/>
+            </w:tcBorders>
+            <w:tcMar>
+              <w:top w:w="120" w:type="dxa"/>
+              <w:bottom w:w="120" w:type="dxa"/>
+              <w:left w:w="120" w:type="dxa"/>
+              <w:right w:w="120" w:type="dxa"/>
+            </w:tcMar>
+            <w:vAlign w:val="center"/>
+          </w:tcPr>
+          <w:p>
+            <w:pPr>
+              <w:spacing w:before="80" w:after="80" w:line="240" w:lineRule="auto"/>
+              <w:jc w:val="center"/>
+            </w:pPr>
+            <w:r>
+              <w:rPr>
+                <w:rFonts w:ascii="Times New Roman" w:hAnsi="Times New Roman" w:cs="Times New Roman"/>
+                <w:sz w:val="22"/>
+                <w:szCs w:val="22"/>
+              </w:rPr>
+              <w:t xml:space="preserve">59</w:t>
             </w:r>
           </w:p>
         </w:tc>
@@ -2501,391 +3252,31 @@
       <w:tr>
         <w:tc>
           <w:tcPr>
-            <w:tcW w:w="900" w:type="dxa"/>
-            <w:vAlign w:val="center"/>
-          </w:tcPr>
-          <w:p>
-            <w:pPr>
-              <w:spacing w:before="20" w:after="20" w:line="240" w:lineRule="auto"/>
-              <w:jc w:val="left"/>
-            </w:pPr>
-            <w:r>
-              <w:rPr>
-                <w:rFonts w:ascii="Times New Roman" w:hAnsi="Times New Roman" w:cs="Times New Roman"/>
-                <w:sz w:val="22"/>
-                <w:szCs w:val="22"/>
-              </w:rPr>
-              <w:t xml:space="preserve">15</w:t>
-            </w:r>
-          </w:p>
-        </w:tc>
-        <w:tc>
-          <w:tcPr>
-            <w:tcW w:w="7460" w:type="dxa"/>
-            <w:vAlign w:val="center"/>
-          </w:tcPr>
-          <w:p>
-            <w:pPr>
-              <w:spacing w:before="20" w:after="20" w:line="240" w:lineRule="auto"/>
-              <w:jc w:val="left"/>
-            </w:pPr>
-            <w:r>
-              <w:rPr>
-                <w:rFonts w:ascii="Times New Roman" w:hAnsi="Times New Roman" w:cs="Times New Roman"/>
-                <w:sz w:val="22"/>
-                <w:szCs w:val="22"/>
-              </w:rPr>
-              <w:t xml:space="preserve">Advantages</w:t>
-            </w:r>
-          </w:p>
-        </w:tc>
-        <w:tc>
-          <w:tcPr>
-            <w:tcW w:w="1000" w:type="dxa"/>
-            <w:vAlign w:val="center"/>
-          </w:tcPr>
-          <w:p>
-            <w:pPr>
-              <w:spacing w:before="20" w:after="20" w:line="240" w:lineRule="auto"/>
-              <w:jc w:val="left"/>
-            </w:pPr>
-            <w:r>
-              <w:rPr>
-                <w:rFonts w:ascii="Times New Roman" w:hAnsi="Times New Roman" w:cs="Times New Roman"/>
-                <w:sz w:val="22"/>
-                <w:szCs w:val="22"/>
-              </w:rPr>
-              <w:t xml:space="preserve">49</w:t>
-            </w:r>
-          </w:p>
-        </w:tc>
-      </w:tr>
-      <w:tr>
-        <w:tc>
-          <w:tcPr>
-            <w:tcW w:w="900" w:type="dxa"/>
-            <w:vAlign w:val="center"/>
-          </w:tcPr>
-          <w:p>
-            <w:pPr>
-              <w:spacing w:before="20" w:after="20" w:line="240" w:lineRule="auto"/>
-              <w:jc w:val="left"/>
-            </w:pPr>
-            <w:r>
-              <w:rPr>
-                <w:rFonts w:ascii="Times New Roman" w:hAnsi="Times New Roman" w:cs="Times New Roman"/>
-                <w:sz w:val="22"/>
-                <w:szCs w:val="22"/>
-              </w:rPr>
-              <w:t xml:space="preserve">16</w:t>
-            </w:r>
-          </w:p>
-        </w:tc>
-        <w:tc>
-          <w:tcPr>
-            <w:tcW w:w="7460" w:type="dxa"/>
-            <w:vAlign w:val="center"/>
-          </w:tcPr>
-          <w:p>
-            <w:pPr>
-              <w:spacing w:before="20" w:after="20" w:line="240" w:lineRule="auto"/>
-              <w:jc w:val="left"/>
-            </w:pPr>
-            <w:r>
-              <w:rPr>
-                <w:rFonts w:ascii="Times New Roman" w:hAnsi="Times New Roman" w:cs="Times New Roman"/>
-                <w:sz w:val="22"/>
-                <w:szCs w:val="22"/>
-              </w:rPr>
-              <w:t xml:space="preserve">Learning Outcomes</w:t>
-            </w:r>
-          </w:p>
-        </w:tc>
-        <w:tc>
-          <w:tcPr>
-            <w:tcW w:w="1000" w:type="dxa"/>
-            <w:vAlign w:val="center"/>
-          </w:tcPr>
-          <w:p>
-            <w:pPr>
-              <w:spacing w:before="20" w:after="20" w:line="240" w:lineRule="auto"/>
-              <w:jc w:val="left"/>
-            </w:pPr>
-            <w:r>
-              <w:rPr>
-                <w:rFonts w:ascii="Times New Roman" w:hAnsi="Times New Roman" w:cs="Times New Roman"/>
-                <w:sz w:val="22"/>
-                <w:szCs w:val="22"/>
-              </w:rPr>
-              <w:t xml:space="preserve">51</w:t>
-            </w:r>
-          </w:p>
-        </w:tc>
-      </w:tr>
-      <w:tr>
-        <w:tc>
-          <w:tcPr>
-            <w:tcW w:w="900" w:type="dxa"/>
-            <w:vAlign w:val="center"/>
-          </w:tcPr>
-          <w:p>
-            <w:pPr>
-              <w:spacing w:before="20" w:after="20" w:line="240" w:lineRule="auto"/>
-              <w:jc w:val="left"/>
-            </w:pPr>
-            <w:r>
-              <w:rPr>
-                <w:rFonts w:ascii="Times New Roman" w:hAnsi="Times New Roman" w:cs="Times New Roman"/>
-                <w:sz w:val="22"/>
-                <w:szCs w:val="22"/>
-              </w:rPr>
-              <w:t xml:space="preserve">17</w:t>
-            </w:r>
-          </w:p>
-        </w:tc>
-        <w:tc>
-          <w:tcPr>
-            <w:tcW w:w="7460" w:type="dxa"/>
-            <w:vAlign w:val="center"/>
-          </w:tcPr>
-          <w:p>
-            <w:pPr>
-              <w:spacing w:before="20" w:after="20" w:line="240" w:lineRule="auto"/>
-              <w:jc w:val="left"/>
-            </w:pPr>
-            <w:r>
-              <w:rPr>
-                <w:rFonts w:ascii="Times New Roman" w:hAnsi="Times New Roman" w:cs="Times New Roman"/>
-                <w:sz w:val="22"/>
-                <w:szCs w:val="22"/>
-              </w:rPr>
-              <w:t xml:space="preserve">Challenges</w:t>
-            </w:r>
-          </w:p>
-        </w:tc>
-        <w:tc>
-          <w:tcPr>
-            <w:tcW w:w="1000" w:type="dxa"/>
-            <w:vAlign w:val="center"/>
-          </w:tcPr>
-          <w:p>
-            <w:pPr>
-              <w:spacing w:before="20" w:after="20" w:line="240" w:lineRule="auto"/>
-              <w:jc w:val="left"/>
-            </w:pPr>
-            <w:r>
-              <w:rPr>
-                <w:rFonts w:ascii="Times New Roman" w:hAnsi="Times New Roman" w:cs="Times New Roman"/>
-                <w:sz w:val="22"/>
-                <w:szCs w:val="22"/>
-              </w:rPr>
-              <w:t xml:space="preserve">53</w:t>
-            </w:r>
-          </w:p>
-        </w:tc>
-      </w:tr>
-      <w:tr>
-        <w:tc>
-          <w:tcPr>
-            <w:tcW w:w="900" w:type="dxa"/>
-            <w:vAlign w:val="center"/>
-          </w:tcPr>
-          <w:p>
-            <w:pPr>
-              <w:spacing w:before="20" w:after="20" w:line="240" w:lineRule="auto"/>
-              <w:jc w:val="left"/>
-            </w:pPr>
-            <w:r>
-              <w:rPr>
-                <w:rFonts w:ascii="Times New Roman" w:hAnsi="Times New Roman" w:cs="Times New Roman"/>
-                <w:sz w:val="22"/>
-                <w:szCs w:val="22"/>
-              </w:rPr>
-              <w:t xml:space="preserve">18</w:t>
-            </w:r>
-          </w:p>
-        </w:tc>
-        <w:tc>
-          <w:tcPr>
-            <w:tcW w:w="7460" w:type="dxa"/>
-            <w:vAlign w:val="center"/>
-          </w:tcPr>
-          <w:p>
-            <w:pPr>
-              <w:spacing w:before="20" w:after="20" w:line="240" w:lineRule="auto"/>
-              <w:jc w:val="left"/>
-            </w:pPr>
-            <w:r>
-              <w:rPr>
-                <w:rFonts w:ascii="Times New Roman" w:hAnsi="Times New Roman" w:cs="Times New Roman"/>
-                <w:sz w:val="22"/>
-                <w:szCs w:val="22"/>
-              </w:rPr>
-              <w:t xml:space="preserve">Future Scope</w:t>
-            </w:r>
-          </w:p>
-        </w:tc>
-        <w:tc>
-          <w:tcPr>
-            <w:tcW w:w="1000" w:type="dxa"/>
-            <w:vAlign w:val="center"/>
-          </w:tcPr>
-          <w:p>
-            <w:pPr>
-              <w:spacing w:before="20" w:after="20" w:line="240" w:lineRule="auto"/>
-              <w:jc w:val="left"/>
-            </w:pPr>
-            <w:r>
-              <w:rPr>
-                <w:rFonts w:ascii="Times New Roman" w:hAnsi="Times New Roman" w:cs="Times New Roman"/>
-                <w:sz w:val="22"/>
-                <w:szCs w:val="22"/>
-              </w:rPr>
-              <w:t xml:space="preserve">55</w:t>
-            </w:r>
-          </w:p>
-        </w:tc>
-      </w:tr>
-      <w:tr>
-        <w:tc>
-          <w:tcPr>
-            <w:tcW w:w="900" w:type="dxa"/>
-            <w:vAlign w:val="center"/>
-          </w:tcPr>
-          <w:p>
-            <w:pPr>
-              <w:spacing w:before="20" w:after="20" w:line="240" w:lineRule="auto"/>
-              <w:jc w:val="left"/>
-            </w:pPr>
-            <w:r>
-              <w:rPr>
-                <w:rFonts w:ascii="Times New Roman" w:hAnsi="Times New Roman" w:cs="Times New Roman"/>
-                <w:sz w:val="22"/>
-                <w:szCs w:val="22"/>
-              </w:rPr>
-              <w:t xml:space="preserve">19</w:t>
-            </w:r>
-          </w:p>
-        </w:tc>
-        <w:tc>
-          <w:tcPr>
-            <w:tcW w:w="7460" w:type="dxa"/>
-            <w:vAlign w:val="center"/>
-          </w:tcPr>
-          <w:p>
-            <w:pPr>
-              <w:spacing w:before="20" w:after="20" w:line="240" w:lineRule="auto"/>
-              <w:jc w:val="left"/>
-            </w:pPr>
-            <w:r>
-              <w:rPr>
-                <w:rFonts w:ascii="Times New Roman" w:hAnsi="Times New Roman" w:cs="Times New Roman"/>
-                <w:sz w:val="22"/>
-                <w:szCs w:val="22"/>
-              </w:rPr>
-              <w:t xml:space="preserve">Conclusion</w:t>
-            </w:r>
-          </w:p>
-        </w:tc>
-        <w:tc>
-          <w:tcPr>
-            <w:tcW w:w="1000" w:type="dxa"/>
-            <w:vAlign w:val="center"/>
-          </w:tcPr>
-          <w:p>
-            <w:pPr>
-              <w:spacing w:before="20" w:after="20" w:line="240" w:lineRule="auto"/>
-              <w:jc w:val="left"/>
-            </w:pPr>
-            <w:r>
-              <w:rPr>
-                <w:rFonts w:ascii="Times New Roman" w:hAnsi="Times New Roman" w:cs="Times New Roman"/>
-                <w:sz w:val="22"/>
-                <w:szCs w:val="22"/>
-              </w:rPr>
-              <w:t xml:space="preserve">57</w:t>
-            </w:r>
-          </w:p>
-        </w:tc>
-      </w:tr>
-      <w:tr>
-        <w:tc>
-          <w:tcPr>
-            <w:tcW w:w="900" w:type="dxa"/>
-            <w:vAlign w:val="center"/>
-          </w:tcPr>
-          <w:p>
-            <w:pPr>
-              <w:spacing w:before="20" w:after="20" w:line="240" w:lineRule="auto"/>
-              <w:jc w:val="left"/>
-            </w:pPr>
-            <w:r>
-              <w:rPr>
-                <w:rFonts w:ascii="Times New Roman" w:hAnsi="Times New Roman" w:cs="Times New Roman"/>
-                <w:sz w:val="22"/>
-                <w:szCs w:val="22"/>
-              </w:rPr>
-              <w:t xml:space="preserve">20</w:t>
-            </w:r>
-          </w:p>
-        </w:tc>
-        <w:tc>
-          <w:tcPr>
-            <w:tcW w:w="7460" w:type="dxa"/>
-            <w:vAlign w:val="center"/>
-          </w:tcPr>
-          <w:p>
-            <w:pPr>
-              <w:spacing w:before="20" w:after="20" w:line="240" w:lineRule="auto"/>
-              <w:jc w:val="left"/>
-            </w:pPr>
-            <w:r>
-              <w:rPr>
-                <w:rFonts w:ascii="Times New Roman" w:hAnsi="Times New Roman" w:cs="Times New Roman"/>
-                <w:sz w:val="22"/>
-                <w:szCs w:val="22"/>
-              </w:rPr>
-              <w:t xml:space="preserve">Bibliography</w:t>
-            </w:r>
-          </w:p>
-        </w:tc>
-        <w:tc>
-          <w:tcPr>
-            <w:tcW w:w="1000" w:type="dxa"/>
-            <w:vAlign w:val="center"/>
-          </w:tcPr>
-          <w:p>
-            <w:pPr>
-              <w:spacing w:before="20" w:after="20" w:line="240" w:lineRule="auto"/>
-              <w:jc w:val="left"/>
-            </w:pPr>
-            <w:r>
-              <w:rPr>
-                <w:rFonts w:ascii="Times New Roman" w:hAnsi="Times New Roman" w:cs="Times New Roman"/>
-                <w:sz w:val="22"/>
-                <w:szCs w:val="22"/>
-              </w:rPr>
-              <w:t xml:space="preserve">59</w:t>
-            </w:r>
-          </w:p>
-        </w:tc>
-      </w:tr>
-      <w:tr>
-        <w:tc>
-          <w:tcPr>
-            <w:tcW w:w="900" w:type="dxa"/>
-            <w:vAlign w:val="center"/>
-          </w:tcPr>
-          <w:p>
-            <w:pPr>
-              <w:spacing w:before="20" w:after="20" w:line="240" w:lineRule="auto"/>
-              <w:jc w:val="left"/>
-            </w:pPr>
-            <w:r>
-              <w:rPr>
-                <w:rFonts w:ascii="Times New Roman" w:hAnsi="Times New Roman" w:cs="Times New Roman"/>
-                <w:sz w:val="22"/>
-                <w:szCs w:val="22"/>
+            <w:tcW w:w="1500" w:type="dxa"/>
+            <w:tcBorders>
+              <w:top w:val="single" w:sz="12" w:color="000000"/>
+              <w:left w:val="single" w:sz="12" w:color="000000"/>
+              <w:bottom w:val="single" w:sz="12" w:color="000000"/>
+              <w:right w:val="single" w:sz="12" w:color="000000"/>
+            </w:tcBorders>
+            <w:tcMar>
+              <w:top w:w="120" w:type="dxa"/>
+              <w:bottom w:w="120" w:type="dxa"/>
+              <w:left w:w="120" w:type="dxa"/>
+              <w:right w:w="120" w:type="dxa"/>
+            </w:tcMar>
+            <w:vAlign w:val="center"/>
+          </w:tcPr>
+          <w:p>
+            <w:pPr>
+              <w:spacing w:before="80" w:after="80" w:line="240" w:lineRule="auto"/>
+              <w:jc w:val="center"/>
+            </w:pPr>
+            <w:r>
+              <w:rPr>
+                <w:rFonts w:ascii="Times New Roman" w:hAnsi="Times New Roman" w:cs="Times New Roman"/>
+                <w:sz w:val="26"/>
+                <w:szCs w:val="26"/>
               </w:rPr>
               <w:t xml:space="preserve"/>
             </w:r>
@@ -2893,19 +3284,31 @@
         </w:tc>
         <w:tc>
           <w:tcPr>
-            <w:tcW w:w="7460" w:type="dxa"/>
-            <w:vAlign w:val="center"/>
-          </w:tcPr>
-          <w:p>
-            <w:pPr>
-              <w:spacing w:before="20" w:after="20" w:line="240" w:lineRule="auto"/>
-              <w:jc w:val="left"/>
-            </w:pPr>
-            <w:r>
-              <w:rPr>
-                <w:rFonts w:ascii="Times New Roman" w:hAnsi="Times New Roman" w:cs="Times New Roman"/>
-                <w:sz w:val="22"/>
-                <w:szCs w:val="22"/>
+            <w:tcW w:w="6360" w:type="dxa"/>
+            <w:tcBorders>
+              <w:top w:val="single" w:sz="12" w:color="000000"/>
+              <w:left w:val="single" w:sz="12" w:color="000000"/>
+              <w:bottom w:val="single" w:sz="12" w:color="000000"/>
+              <w:right w:val="single" w:sz="12" w:color="000000"/>
+            </w:tcBorders>
+            <w:tcMar>
+              <w:top w:w="120" w:type="dxa"/>
+              <w:bottom w:w="120" w:type="dxa"/>
+              <w:left w:w="120" w:type="dxa"/>
+              <w:right w:w="120" w:type="dxa"/>
+            </w:tcMar>
+            <w:vAlign w:val="center"/>
+          </w:tcPr>
+          <w:p>
+            <w:pPr>
+              <w:spacing w:before="80" w:after="80" w:line="240" w:lineRule="auto"/>
+              <w:jc w:val="left"/>
+            </w:pPr>
+            <w:r>
+              <w:rPr>
+                <w:rFonts w:ascii="Times New Roman" w:hAnsi="Times New Roman" w:cs="Times New Roman"/>
+                <w:sz w:val="26"/>
+                <w:szCs w:val="26"/>
               </w:rPr>
               <w:t xml:space="preserve">Appendix</w:t>
             </w:r>
@@ -2913,13 +3316,25 @@
         </w:tc>
         <w:tc>
           <w:tcPr>
-            <w:tcW w:w="1000" w:type="dxa"/>
-            <w:vAlign w:val="center"/>
-          </w:tcPr>
-          <w:p>
-            <w:pPr>
-              <w:spacing w:before="20" w:after="20" w:line="240" w:lineRule="auto"/>
-              <w:jc w:val="left"/>
+            <w:tcW w:w="1500" w:type="dxa"/>
+            <w:tcBorders>
+              <w:top w:val="single" w:sz="12" w:color="000000"/>
+              <w:left w:val="single" w:sz="12" w:color="000000"/>
+              <w:bottom w:val="single" w:sz="12" w:color="000000"/>
+              <w:right w:val="single" w:sz="12" w:color="000000"/>
+            </w:tcBorders>
+            <w:tcMar>
+              <w:top w:w="120" w:type="dxa"/>
+              <w:bottom w:w="120" w:type="dxa"/>
+              <w:left w:w="120" w:type="dxa"/>
+              <w:right w:w="120" w:type="dxa"/>
+            </w:tcMar>
+            <w:vAlign w:val="center"/>
+          </w:tcPr>
+          <w:p>
+            <w:pPr>
+              <w:spacing w:before="80" w:after="80" w:line="240" w:lineRule="auto"/>
+              <w:jc w:val="center"/>
             </w:pPr>
             <w:r>
               <w:rPr>
@@ -2933,48 +3348,6 @@
         </w:tc>
       </w:tr>
     </w:tbl>
-    <w:p>
-      <w:pPr>
-        <w:spacing w:before="0" w:after="60" w:line="120" w:lineRule="auto"/>
-        <w:jc w:val="both"/>
-      </w:pPr>
-      <w:r>
-        <w:rPr>
-          <w:rFonts w:ascii="Times New Roman" w:hAnsi="Times New Roman" w:cs="Times New Roman"/>
-          <w:sz w:val="12"/>
-          <w:szCs w:val="12"/>
-        </w:rPr>
-        <w:t xml:space="preserve"/>
-      </w:r>
-    </w:p>
-    <w:p>
-      <w:pPr>
-        <w:spacing w:before="0" w:after="0" w:line="240" w:lineRule="auto"/>
-        <w:jc w:val="center"/>
-      </w:pPr>
-      <w:r>
-        <w:rPr>
-          <w:rFonts w:ascii="Times New Roman" w:hAnsi="Times New Roman" w:cs="Times New Roman"/>
-          <w:sz w:val="24"/>
-          <w:szCs w:val="24"/>
-        </w:rPr>
-        <w:t xml:space="preserve"/>
-      </w:r>
-    </w:p>
-    <w:p>
-      <w:pPr>
-        <w:spacing w:before="0" w:after="120" w:line="360" w:lineRule="auto"/>
-        <w:jc w:val="both"/>
-      </w:pPr>
-      <w:r>
-        <w:rPr>
-          <w:rFonts w:ascii="Times New Roman" w:hAnsi="Times New Roman" w:cs="Times New Roman"/>
-          <w:sz w:val="24"/>
-          <w:szCs w:val="24"/>
-        </w:rPr>
-        <w:t xml:space="preserve">A complete list of figures and tables, with their captions, appears alongside the respective illustrations throughout this report.</w:t>
-      </w:r>
-    </w:p>
     <w:p>
       <w:r>
         <w:br w:type="page"/>

</xml_diff>

<commit_message>
Add screenshot placeholders to Development Pages chapter for a complete college report
</commit_message>
<xml_diff>
--- a/report/HAL_Internship_Report.docx
+++ b/report/HAL_Internship_Report.docx
@@ -6434,7 +6434,7 @@
           <w:sz w:val="24"/>
           <w:szCs w:val="24"/>
         </w:rPr>
-        <w:t xml:space="preserve">This chapter describes the pages, or screens, that were developed during the internship as part of the Advanced Live Aircraft Tracking System. Each page corresponds to a functional module of the application and was developed and tested in turn.</w:t>
+        <w:t xml:space="preserve">This chapter describes the pages, or screens, that were developed during the internship as part of the Advanced Live Aircraft Tracking System. Each page corresponds to a functional module of the application and was developed and tested in turn. A placeholder is provided for the screenshot of each page, in which the actual captured image should be inserted before submission.</w:t>
       </w:r>
     </w:p>
     <w:p>
@@ -6465,772 +6465,7 @@
           <w:sz w:val="24"/>
           <w:szCs w:val="24"/>
         </w:rPr>
-        <w:t xml:space="preserve">The application opens with a secure login page that authenticates the operator before granting access to the monitoring functions. It presents fields for a user identifier and a password and validates the credentials before revealing the main interface. This page establishes the access-control aspect of the system.</w:t>
-      </w:r>
-    </w:p>
-    <w:p>
-      <w:pPr>
-        <w:keepNext/>
-        <w:spacing w:before="160" w:after="120" w:line="360" w:lineRule="auto"/>
-        <w:jc w:val="left"/>
-      </w:pPr>
-      <w:r>
-        <w:rPr>
-          <w:rFonts w:ascii="Times New Roman" w:hAnsi="Times New Roman" w:cs="Times New Roman"/>
-          <w:b/>
-          <w:sz w:val="28"/>
-          <w:szCs w:val="28"/>
-        </w:rPr>
-        <w:t xml:space="preserve">7.3  Dashboard Page</w:t>
-      </w:r>
-    </w:p>
-    <w:p>
-      <w:pPr>
-        <w:spacing w:before="0" w:after="120" w:line="360" w:lineRule="auto"/>
-        <w:ind w:firstLine="360"/>
-        <w:jc w:val="both"/>
-      </w:pPr>
-      <w:r>
-        <w:rPr>
-          <w:rFonts w:ascii="Times New Roman" w:hAnsi="Times New Roman" w:cs="Times New Roman"/>
-          <w:sz w:val="24"/>
-          <w:szCs w:val="24"/>
-        </w:rPr>
-        <w:t xml:space="preserve">The dashboard is the central page of the application and provides an at-a-glance overview of the entire operational picture. It displays key performance indicators such as the number of aircraft airborne, the average altitude and speed across the fleet, and the count of active alerts, alongside the live map, a feed of recent alerts and a fleet-status table. The dashboard updates continuously so that the operator always sees the most current state.</w:t>
-      </w:r>
-    </w:p>
-    <w:p>
-      <w:pPr>
-        <w:keepNext/>
-        <w:spacing w:before="160" w:after="120" w:line="360" w:lineRule="auto"/>
-        <w:jc w:val="left"/>
-      </w:pPr>
-      <w:r>
-        <w:rPr>
-          <w:rFonts w:ascii="Times New Roman" w:hAnsi="Times New Roman" w:cs="Times New Roman"/>
-          <w:b/>
-          <w:sz w:val="28"/>
-          <w:szCs w:val="28"/>
-        </w:rPr>
-        <w:t xml:space="preserve">7.4  Live Tracking Page</w:t>
-      </w:r>
-    </w:p>
-    <w:p>
-      <w:pPr>
-        <w:spacing w:before="0" w:after="120" w:line="360" w:lineRule="auto"/>
-        <w:ind w:firstLine="360"/>
-        <w:jc w:val="both"/>
-      </w:pPr>
-      <w:r>
-        <w:rPr>
-          <w:rFonts w:ascii="Times New Roman" w:hAnsi="Times New Roman" w:cs="Times New Roman"/>
-          <w:sz w:val="24"/>
-          <w:szCs w:val="24"/>
-        </w:rPr>
-        <w:t xml:space="preserve">The tracking page allows the operator to examine individual aircraft in detail. It presents a searchable, filterable list of all tracked aircraft and, when an aircraft is selected, displays its full telemetry including altitude, ground speed, heading, position and status, together with derived values such as vertical rate.</w:t>
-      </w:r>
-    </w:p>
-    <w:p>
-      <w:pPr>
-        <w:keepNext/>
-        <w:spacing w:before="160" w:after="120" w:line="360" w:lineRule="auto"/>
-        <w:jc w:val="left"/>
-      </w:pPr>
-      <w:r>
-        <w:rPr>
-          <w:rFonts w:ascii="Times New Roman" w:hAnsi="Times New Roman" w:cs="Times New Roman"/>
-          <w:b/>
-          <w:sz w:val="28"/>
-          <w:szCs w:val="28"/>
-        </w:rPr>
-        <w:t xml:space="preserve">7.5  Radar Scope Page</w:t>
-      </w:r>
-    </w:p>
-    <w:p>
-      <w:pPr>
-        <w:spacing w:before="0" w:after="120" w:line="360" w:lineRule="auto"/>
-        <w:ind w:firstLine="360"/>
-        <w:jc w:val="both"/>
-      </w:pPr>
-      <w:r>
-        <w:rPr>
-          <w:rFonts w:ascii="Times New Roman" w:hAnsi="Times New Roman" w:cs="Times New Roman"/>
-          <w:sz w:val="24"/>
-          <w:szCs w:val="24"/>
-        </w:rPr>
-        <w:t xml:space="preserve">The radar scope page reproduces the appearance of a primary surveillance radar. It draws concentric range rings, cross hairs and a continuously rotating sweep, with aircraft shown as contacts on the display. This page demonstrates polar visualisation of position data and real-time animation on the Canvas.</w:t>
-      </w:r>
-    </w:p>
-    <w:p>
-      <w:pPr>
-        <w:keepNext/>
-        <w:spacing w:before="160" w:after="120" w:line="360" w:lineRule="auto"/>
-        <w:jc w:val="left"/>
-      </w:pPr>
-      <w:r>
-        <w:rPr>
-          <w:rFonts w:ascii="Times New Roman" w:hAnsi="Times New Roman" w:cs="Times New Roman"/>
-          <w:b/>
-          <w:sz w:val="28"/>
-          <w:szCs w:val="28"/>
-        </w:rPr>
-        <w:t xml:space="preserve">7.6  Analytics Page</w:t>
-      </w:r>
-    </w:p>
-    <w:p>
-      <w:pPr>
-        <w:spacing w:before="0" w:after="120" w:line="360" w:lineRule="auto"/>
-        <w:ind w:firstLine="360"/>
-        <w:jc w:val="both"/>
-      </w:pPr>
-      <w:r>
-        <w:rPr>
-          <w:rFonts w:ascii="Times New Roman" w:hAnsi="Times New Roman" w:cs="Times New Roman"/>
-          <w:sz w:val="24"/>
-          <w:szCs w:val="24"/>
-        </w:rPr>
-        <w:t xml:space="preserve">The analytics page processes the telemetry of the whole fleet to produce statistical summaries and charts. It presents an altitude-distribution histogram, a speed profile and a table of statistics giving the minimum, maximum and mean of each parameter, illustrating the analytical stage of data processing.</w:t>
-      </w:r>
-    </w:p>
-    <w:p>
-      <w:pPr>
-        <w:keepNext/>
-        <w:spacing w:before="160" w:after="120" w:line="360" w:lineRule="auto"/>
-        <w:jc w:val="left"/>
-      </w:pPr>
-      <w:r>
-        <w:rPr>
-          <w:rFonts w:ascii="Times New Roman" w:hAnsi="Times New Roman" w:cs="Times New Roman"/>
-          <w:b/>
-          <w:sz w:val="28"/>
-          <w:szCs w:val="28"/>
-        </w:rPr>
-        <w:t xml:space="preserve">7.7  Mission Control Page</w:t>
-      </w:r>
-    </w:p>
-    <w:p>
-      <w:pPr>
-        <w:spacing w:before="0" w:after="120" w:line="360" w:lineRule="auto"/>
-        <w:ind w:firstLine="360"/>
-        <w:jc w:val="both"/>
-      </w:pPr>
-      <w:r>
-        <w:rPr>
-          <w:rFonts w:ascii="Times New Roman" w:hAnsi="Times New Roman" w:cs="Times New Roman"/>
-          <w:sz w:val="24"/>
-          <w:szCs w:val="24"/>
-        </w:rPr>
-        <w:t xml:space="preserve">The mission-control page supports the planning and tracking of flight-test sorties. It lists active sorties with their objectives, current phase and progress, and presents a mission timeline depicting the standard phases of a sortie from briefing to debrief.</w:t>
-      </w:r>
-    </w:p>
-    <w:p>
-      <w:pPr>
-        <w:keepNext/>
-        <w:spacing w:before="160" w:after="120" w:line="360" w:lineRule="auto"/>
-        <w:jc w:val="left"/>
-      </w:pPr>
-      <w:r>
-        <w:rPr>
-          <w:rFonts w:ascii="Times New Roman" w:hAnsi="Times New Roman" w:cs="Times New Roman"/>
-          <w:b/>
-          <w:sz w:val="28"/>
-          <w:szCs w:val="28"/>
-        </w:rPr>
-        <w:t xml:space="preserve">7.8  Alert Feed Page</w:t>
-      </w:r>
-    </w:p>
-    <w:p>
-      <w:pPr>
-        <w:spacing w:before="0" w:after="120" w:line="360" w:lineRule="auto"/>
-        <w:ind w:firstLine="360"/>
-        <w:jc w:val="both"/>
-      </w:pPr>
-      <w:r>
-        <w:rPr>
-          <w:rFonts w:ascii="Times New Roman" w:hAnsi="Times New Roman" w:cs="Times New Roman"/>
-          <w:sz w:val="24"/>
-          <w:szCs w:val="24"/>
-        </w:rPr>
-        <w:t xml:space="preserve">The alert-feed page draws the operator's attention to abnormal conditions. Whenever a monitored parameter crosses a defined threshold, an alert is generated, classified by severity, time-stamped and added to the feed, with critical alerts visually distinguished from cautions.</w:t>
-      </w:r>
-    </w:p>
-    <w:p>
-      <w:pPr>
-        <w:keepNext/>
-        <w:spacing w:before="160" w:after="120" w:line="360" w:lineRule="auto"/>
-        <w:jc w:val="left"/>
-      </w:pPr>
-      <w:r>
-        <w:rPr>
-          <w:rFonts w:ascii="Times New Roman" w:hAnsi="Times New Roman" w:cs="Times New Roman"/>
-          <w:b/>
-          <w:sz w:val="28"/>
-          <w:szCs w:val="28"/>
-        </w:rPr>
-        <w:t xml:space="preserve">7.9  Admin Panel Page</w:t>
-      </w:r>
-    </w:p>
-    <w:p>
-      <w:pPr>
-        <w:spacing w:before="0" w:after="120" w:line="360" w:lineRule="auto"/>
-        <w:ind w:firstLine="360"/>
-        <w:jc w:val="both"/>
-      </w:pPr>
-      <w:r>
-        <w:rPr>
-          <w:rFonts w:ascii="Times New Roman" w:hAnsi="Times New Roman" w:cs="Times New Roman"/>
-          <w:sz w:val="24"/>
-          <w:szCs w:val="24"/>
-        </w:rPr>
-        <w:t xml:space="preserve">The administration page provides management functions. It allows new aircraft to be registered and existing aircraft to be removed, and it exposes system settings such as the data refresh rate and the alert threshold, demonstrating create and delete operations on the data model and configurable behaviour.</w:t>
-      </w:r>
-    </w:p>
-    <w:p>
-      <w:pPr>
-        <w:spacing w:before="120" w:after="60" w:line="240" w:lineRule="auto"/>
-        <w:jc w:val="center"/>
-      </w:pPr>
-      <w:r>
-        <w:rPr>
-          <w:rFonts w:ascii="Times New Roman" w:hAnsi="Times New Roman" w:cs="Times New Roman"/>
-          <w:i/>
-          <w:sz w:val="22"/>
-          <w:szCs w:val="22"/>
-        </w:rPr>
-        <w:t xml:space="preserve">Table 7  Summary of developed pages</w:t>
-      </w:r>
-    </w:p>
-    <w:tbl>
-      <w:tblPr>
-        <w:tblStyle w:val="TableGrid"/>
-        <w:tblW w:w="0" w:type="auto"/>
-        <w:tblBorders>
-          <w:top w:val="single" w:sz="4" w:color="555555"/>
-          <w:left w:val="single" w:sz="4" w:color="555555"/>
-          <w:bottom w:val="single" w:sz="4" w:color="555555"/>
-          <w:right w:val="single" w:sz="4" w:color="555555"/>
-          <w:insideH w:val="single" w:sz="4" w:color="999999"/>
-          <w:insideV w:val="single" w:sz="4" w:color="999999"/>
-        </w:tblBorders>
-        <w:tblLook w:val="04A0"/>
-      </w:tblPr>
-      <w:tblGrid>
-        <w:gridCol w:w="2800"/>
-        <w:gridCol w:w="6560"/>
-      </w:tblGrid>
-      <w:tr>
-        <w:trPr>
-          <w:tblHeader/>
-        </w:trPr>
-        <w:tc>
-          <w:tcPr>
-            <w:tcW w:w="2800" w:type="dxa"/>
-            <w:shd w:val="clear" w:color="auto" w:fill="1F3864"/>
-            <w:vAlign w:val="center"/>
-          </w:tcPr>
-          <w:p>
-            <w:pPr>
-              <w:spacing w:before="20" w:after="20" w:line="240" w:lineRule="auto"/>
-              <w:jc w:val="left"/>
-            </w:pPr>
-            <w:r>
-              <w:rPr>
-                <w:rFonts w:ascii="Times New Roman" w:hAnsi="Times New Roman" w:cs="Times New Roman"/>
-                <w:b/>
-                <w:color w:val="FFFFFF"/>
-                <w:sz w:val="22"/>
-                <w:szCs w:val="22"/>
-              </w:rPr>
-              <w:t xml:space="preserve">Page</w:t>
-            </w:r>
-          </w:p>
-        </w:tc>
-        <w:tc>
-          <w:tcPr>
-            <w:tcW w:w="6560" w:type="dxa"/>
-            <w:shd w:val="clear" w:color="auto" w:fill="1F3864"/>
-            <w:vAlign w:val="center"/>
-          </w:tcPr>
-          <w:p>
-            <w:pPr>
-              <w:spacing w:before="20" w:after="20" w:line="240" w:lineRule="auto"/>
-              <w:jc w:val="left"/>
-            </w:pPr>
-            <w:r>
-              <w:rPr>
-                <w:rFonts w:ascii="Times New Roman" w:hAnsi="Times New Roman" w:cs="Times New Roman"/>
-                <w:b/>
-                <w:color w:val="FFFFFF"/>
-                <w:sz w:val="22"/>
-                <w:szCs w:val="22"/>
-              </w:rPr>
-              <w:t xml:space="preserve">Primary Function</w:t>
-            </w:r>
-          </w:p>
-        </w:tc>
-      </w:tr>
-      <w:tr>
-        <w:tc>
-          <w:tcPr>
-            <w:tcW w:w="2800" w:type="dxa"/>
-            <w:vAlign w:val="center"/>
-          </w:tcPr>
-          <w:p>
-            <w:pPr>
-              <w:spacing w:before="20" w:after="20" w:line="240" w:lineRule="auto"/>
-              <w:jc w:val="left"/>
-            </w:pPr>
-            <w:r>
-              <w:rPr>
-                <w:rFonts w:ascii="Times New Roman" w:hAnsi="Times New Roman" w:cs="Times New Roman"/>
-                <w:sz w:val="22"/>
-                <w:szCs w:val="22"/>
-              </w:rPr>
-              <w:t xml:space="preserve">Login</w:t>
-            </w:r>
-          </w:p>
-        </w:tc>
-        <w:tc>
-          <w:tcPr>
-            <w:tcW w:w="6560" w:type="dxa"/>
-            <w:vAlign w:val="center"/>
-          </w:tcPr>
-          <w:p>
-            <w:pPr>
-              <w:spacing w:before="20" w:after="20" w:line="240" w:lineRule="auto"/>
-              <w:jc w:val="left"/>
-            </w:pPr>
-            <w:r>
-              <w:rPr>
-                <w:rFonts w:ascii="Times New Roman" w:hAnsi="Times New Roman" w:cs="Times New Roman"/>
-                <w:sz w:val="22"/>
-                <w:szCs w:val="22"/>
-              </w:rPr>
-              <w:t xml:space="preserve">Secure operator authentication</w:t>
-            </w:r>
-          </w:p>
-        </w:tc>
-      </w:tr>
-      <w:tr>
-        <w:tc>
-          <w:tcPr>
-            <w:tcW w:w="2800" w:type="dxa"/>
-            <w:vAlign w:val="center"/>
-          </w:tcPr>
-          <w:p>
-            <w:pPr>
-              <w:spacing w:before="20" w:after="20" w:line="240" w:lineRule="auto"/>
-              <w:jc w:val="left"/>
-            </w:pPr>
-            <w:r>
-              <w:rPr>
-                <w:rFonts w:ascii="Times New Roman" w:hAnsi="Times New Roman" w:cs="Times New Roman"/>
-                <w:sz w:val="22"/>
-                <w:szCs w:val="22"/>
-              </w:rPr>
-              <w:t xml:space="preserve">Dashboard</w:t>
-            </w:r>
-          </w:p>
-        </w:tc>
-        <w:tc>
-          <w:tcPr>
-            <w:tcW w:w="6560" w:type="dxa"/>
-            <w:vAlign w:val="center"/>
-          </w:tcPr>
-          <w:p>
-            <w:pPr>
-              <w:spacing w:before="20" w:after="20" w:line="240" w:lineRule="auto"/>
-              <w:jc w:val="left"/>
-            </w:pPr>
-            <w:r>
-              <w:rPr>
-                <w:rFonts w:ascii="Times New Roman" w:hAnsi="Times New Roman" w:cs="Times New Roman"/>
-                <w:sz w:val="22"/>
-                <w:szCs w:val="22"/>
-              </w:rPr>
-              <w:t xml:space="preserve">Consolidated real-time overview</w:t>
-            </w:r>
-          </w:p>
-        </w:tc>
-      </w:tr>
-      <w:tr>
-        <w:tc>
-          <w:tcPr>
-            <w:tcW w:w="2800" w:type="dxa"/>
-            <w:vAlign w:val="center"/>
-          </w:tcPr>
-          <w:p>
-            <w:pPr>
-              <w:spacing w:before="20" w:after="20" w:line="240" w:lineRule="auto"/>
-              <w:jc w:val="left"/>
-            </w:pPr>
-            <w:r>
-              <w:rPr>
-                <w:rFonts w:ascii="Times New Roman" w:hAnsi="Times New Roman" w:cs="Times New Roman"/>
-                <w:sz w:val="22"/>
-                <w:szCs w:val="22"/>
-              </w:rPr>
-              <w:t xml:space="preserve">Live Tracking</w:t>
-            </w:r>
-          </w:p>
-        </w:tc>
-        <w:tc>
-          <w:tcPr>
-            <w:tcW w:w="6560" w:type="dxa"/>
-            <w:vAlign w:val="center"/>
-          </w:tcPr>
-          <w:p>
-            <w:pPr>
-              <w:spacing w:before="20" w:after="20" w:line="240" w:lineRule="auto"/>
-              <w:jc w:val="left"/>
-            </w:pPr>
-            <w:r>
-              <w:rPr>
-                <w:rFonts w:ascii="Times New Roman" w:hAnsi="Times New Roman" w:cs="Times New Roman"/>
-                <w:sz w:val="22"/>
-                <w:szCs w:val="22"/>
-              </w:rPr>
-              <w:t xml:space="preserve">Per-aircraft telemetry and detail</w:t>
-            </w:r>
-          </w:p>
-        </w:tc>
-      </w:tr>
-      <w:tr>
-        <w:tc>
-          <w:tcPr>
-            <w:tcW w:w="2800" w:type="dxa"/>
-            <w:vAlign w:val="center"/>
-          </w:tcPr>
-          <w:p>
-            <w:pPr>
-              <w:spacing w:before="20" w:after="20" w:line="240" w:lineRule="auto"/>
-              <w:jc w:val="left"/>
-            </w:pPr>
-            <w:r>
-              <w:rPr>
-                <w:rFonts w:ascii="Times New Roman" w:hAnsi="Times New Roman" w:cs="Times New Roman"/>
-                <w:sz w:val="22"/>
-                <w:szCs w:val="22"/>
-              </w:rPr>
-              <w:t xml:space="preserve">Radar Scope</w:t>
-            </w:r>
-          </w:p>
-        </w:tc>
-        <w:tc>
-          <w:tcPr>
-            <w:tcW w:w="6560" w:type="dxa"/>
-            <w:vAlign w:val="center"/>
-          </w:tcPr>
-          <w:p>
-            <w:pPr>
-              <w:spacing w:before="20" w:after="20" w:line="240" w:lineRule="auto"/>
-              <w:jc w:val="left"/>
-            </w:pPr>
-            <w:r>
-              <w:rPr>
-                <w:rFonts w:ascii="Times New Roman" w:hAnsi="Times New Roman" w:cs="Times New Roman"/>
-                <w:sz w:val="22"/>
-                <w:szCs w:val="22"/>
-              </w:rPr>
-              <w:t xml:space="preserve">Polar surveillance display</w:t>
-            </w:r>
-          </w:p>
-        </w:tc>
-      </w:tr>
-      <w:tr>
-        <w:tc>
-          <w:tcPr>
-            <w:tcW w:w="2800" w:type="dxa"/>
-            <w:vAlign w:val="center"/>
-          </w:tcPr>
-          <w:p>
-            <w:pPr>
-              <w:spacing w:before="20" w:after="20" w:line="240" w:lineRule="auto"/>
-              <w:jc w:val="left"/>
-            </w:pPr>
-            <w:r>
-              <w:rPr>
-                <w:rFonts w:ascii="Times New Roman" w:hAnsi="Times New Roman" w:cs="Times New Roman"/>
-                <w:sz w:val="22"/>
-                <w:szCs w:val="22"/>
-              </w:rPr>
-              <w:t xml:space="preserve">Analytics</w:t>
-            </w:r>
-          </w:p>
-        </w:tc>
-        <w:tc>
-          <w:tcPr>
-            <w:tcW w:w="6560" w:type="dxa"/>
-            <w:vAlign w:val="center"/>
-          </w:tcPr>
-          <w:p>
-            <w:pPr>
-              <w:spacing w:before="20" w:after="20" w:line="240" w:lineRule="auto"/>
-              <w:jc w:val="left"/>
-            </w:pPr>
-            <w:r>
-              <w:rPr>
-                <w:rFonts w:ascii="Times New Roman" w:hAnsi="Times New Roman" w:cs="Times New Roman"/>
-                <w:sz w:val="22"/>
-                <w:szCs w:val="22"/>
-              </w:rPr>
-              <w:t xml:space="preserve">Statistical summaries and charts</w:t>
-            </w:r>
-          </w:p>
-        </w:tc>
-      </w:tr>
-      <w:tr>
-        <w:tc>
-          <w:tcPr>
-            <w:tcW w:w="2800" w:type="dxa"/>
-            <w:vAlign w:val="center"/>
-          </w:tcPr>
-          <w:p>
-            <w:pPr>
-              <w:spacing w:before="20" w:after="20" w:line="240" w:lineRule="auto"/>
-              <w:jc w:val="left"/>
-            </w:pPr>
-            <w:r>
-              <w:rPr>
-                <w:rFonts w:ascii="Times New Roman" w:hAnsi="Times New Roman" w:cs="Times New Roman"/>
-                <w:sz w:val="22"/>
-                <w:szCs w:val="22"/>
-              </w:rPr>
-              <w:t xml:space="preserve">Mission Control</w:t>
-            </w:r>
-          </w:p>
-        </w:tc>
-        <w:tc>
-          <w:tcPr>
-            <w:tcW w:w="6560" w:type="dxa"/>
-            <w:vAlign w:val="center"/>
-          </w:tcPr>
-          <w:p>
-            <w:pPr>
-              <w:spacing w:before="20" w:after="20" w:line="240" w:lineRule="auto"/>
-              <w:jc w:val="left"/>
-            </w:pPr>
-            <w:r>
-              <w:rPr>
-                <w:rFonts w:ascii="Times New Roman" w:hAnsi="Times New Roman" w:cs="Times New Roman"/>
-                <w:sz w:val="22"/>
-                <w:szCs w:val="22"/>
-              </w:rPr>
-              <w:t xml:space="preserve">Sortie planning and tracking</w:t>
-            </w:r>
-          </w:p>
-        </w:tc>
-      </w:tr>
-      <w:tr>
-        <w:tc>
-          <w:tcPr>
-            <w:tcW w:w="2800" w:type="dxa"/>
-            <w:vAlign w:val="center"/>
-          </w:tcPr>
-          <w:p>
-            <w:pPr>
-              <w:spacing w:before="20" w:after="20" w:line="240" w:lineRule="auto"/>
-              <w:jc w:val="left"/>
-            </w:pPr>
-            <w:r>
-              <w:rPr>
-                <w:rFonts w:ascii="Times New Roman" w:hAnsi="Times New Roman" w:cs="Times New Roman"/>
-                <w:sz w:val="22"/>
-                <w:szCs w:val="22"/>
-              </w:rPr>
-              <w:t xml:space="preserve">Alert Feed</w:t>
-            </w:r>
-          </w:p>
-        </w:tc>
-        <w:tc>
-          <w:tcPr>
-            <w:tcW w:w="6560" w:type="dxa"/>
-            <w:vAlign w:val="center"/>
-          </w:tcPr>
-          <w:p>
-            <w:pPr>
-              <w:spacing w:before="20" w:after="20" w:line="240" w:lineRule="auto"/>
-              <w:jc w:val="left"/>
-            </w:pPr>
-            <w:r>
-              <w:rPr>
-                <w:rFonts w:ascii="Times New Roman" w:hAnsi="Times New Roman" w:cs="Times New Roman"/>
-                <w:sz w:val="22"/>
-                <w:szCs w:val="22"/>
-              </w:rPr>
-              <w:t xml:space="preserve">Threshold-based alerting</w:t>
-            </w:r>
-          </w:p>
-        </w:tc>
-      </w:tr>
-      <w:tr>
-        <w:tc>
-          <w:tcPr>
-            <w:tcW w:w="2800" w:type="dxa"/>
-            <w:vAlign w:val="center"/>
-          </w:tcPr>
-          <w:p>
-            <w:pPr>
-              <w:spacing w:before="20" w:after="20" w:line="240" w:lineRule="auto"/>
-              <w:jc w:val="left"/>
-            </w:pPr>
-            <w:r>
-              <w:rPr>
-                <w:rFonts w:ascii="Times New Roman" w:hAnsi="Times New Roman" w:cs="Times New Roman"/>
-                <w:sz w:val="22"/>
-                <w:szCs w:val="22"/>
-              </w:rPr>
-              <w:t xml:space="preserve">Admin Panel</w:t>
-            </w:r>
-          </w:p>
-        </w:tc>
-        <w:tc>
-          <w:tcPr>
-            <w:tcW w:w="6560" w:type="dxa"/>
-            <w:vAlign w:val="center"/>
-          </w:tcPr>
-          <w:p>
-            <w:pPr>
-              <w:spacing w:before="20" w:after="20" w:line="240" w:lineRule="auto"/>
-              <w:jc w:val="left"/>
-            </w:pPr>
-            <w:r>
-              <w:rPr>
-                <w:rFonts w:ascii="Times New Roman" w:hAnsi="Times New Roman" w:cs="Times New Roman"/>
-                <w:sz w:val="22"/>
-                <w:szCs w:val="22"/>
-              </w:rPr>
-              <w:t xml:space="preserve">Aircraft registry and configuration</w:t>
-            </w:r>
-          </w:p>
-        </w:tc>
-      </w:tr>
-    </w:tbl>
-    <w:p>
-      <w:pPr>
-        <w:spacing w:before="0" w:after="60" w:line="120" w:lineRule="auto"/>
-        <w:jc w:val="both"/>
-      </w:pPr>
-      <w:r>
-        <w:rPr>
-          <w:rFonts w:ascii="Times New Roman" w:hAnsi="Times New Roman" w:cs="Times New Roman"/>
-          <w:sz w:val="12"/>
-          <w:szCs w:val="12"/>
-        </w:rPr>
-        <w:t xml:space="preserve"/>
-      </w:r>
-    </w:p>
-    <w:p>
-      <w:r>
-        <w:br w:type="page"/>
-      </w:r>
-    </w:p>
-    <w:p>
-      <w:pPr>
-        <w:keepNext/>
-        <w:spacing w:before="120" w:after="180" w:line="360" w:lineRule="auto"/>
-        <w:jc w:val="left"/>
-      </w:pPr>
-      <w:r>
-        <w:rPr>
-          <w:rFonts w:ascii="Times New Roman" w:hAnsi="Times New Roman" w:cs="Times New Roman"/>
-          <w:b/>
-          <w:sz w:val="32"/>
-          <w:szCs w:val="32"/>
-        </w:rPr>
-        <w:t xml:space="preserve">CHAPTER 8   SOURCE CODE</w:t>
-      </w:r>
-    </w:p>
-    <w:p>
-      <w:pPr>
-        <w:keepNext/>
-        <w:spacing w:before="160" w:after="120" w:line="360" w:lineRule="auto"/>
-        <w:jc w:val="left"/>
-      </w:pPr>
-      <w:r>
-        <w:rPr>
-          <w:rFonts w:ascii="Times New Roman" w:hAnsi="Times New Roman" w:cs="Times New Roman"/>
-          <w:b/>
-          <w:sz w:val="28"/>
-          <w:szCs w:val="28"/>
-        </w:rPr>
-        <w:t xml:space="preserve">8.1  Introduction</w:t>
-      </w:r>
-    </w:p>
-    <w:p>
-      <w:pPr>
-        <w:spacing w:before="0" w:after="120" w:line="360" w:lineRule="auto"/>
-        <w:jc w:val="both"/>
-      </w:pPr>
-      <w:r>
-        <w:rPr>
-          <w:rFonts w:ascii="Times New Roman" w:hAnsi="Times New Roman" w:cs="Times New Roman"/>
-          <w:sz w:val="24"/>
-          <w:szCs w:val="24"/>
-        </w:rPr>
-        <w:t xml:space="preserve">This chapter explains the structure and the principal elements of the source code of the Advanced Live Aircraft Tracking System. The complete source is provided in the project files; here the key parts are described to convey how the system works internally.</w:t>
-      </w:r>
-    </w:p>
-    <w:p>
-      <w:pPr>
-        <w:keepNext/>
-        <w:spacing w:before="160" w:after="120" w:line="360" w:lineRule="auto"/>
-        <w:jc w:val="left"/>
-      </w:pPr>
-      <w:r>
-        <w:rPr>
-          <w:rFonts w:ascii="Times New Roman" w:hAnsi="Times New Roman" w:cs="Times New Roman"/>
-          <w:b/>
-          <w:sz w:val="28"/>
-          <w:szCs w:val="28"/>
-        </w:rPr>
-        <w:t xml:space="preserve">8.2  Overall Structure</w:t>
-      </w:r>
-    </w:p>
-    <w:p>
-      <w:pPr>
-        <w:spacing w:before="0" w:after="120" w:line="360" w:lineRule="auto"/>
-        <w:ind w:firstLine="360"/>
-        <w:jc w:val="both"/>
-      </w:pPr>
-      <w:r>
-        <w:rPr>
-          <w:rFonts w:ascii="Times New Roman" w:hAnsi="Times New Roman" w:cs="Times New Roman"/>
-          <w:sz w:val="24"/>
-          <w:szCs w:val="24"/>
-        </w:rPr>
-        <w:t xml:space="preserve">The application is contained in a single, self-contained HTML file that includes the markup, the styles within a style block and the logic within a script block. This structure keeps the demonstration portable while preserving a clear internal separation between structure, presentation and behaviour.</w:t>
-      </w:r>
-    </w:p>
-    <w:p>
-      <w:pPr>
-        <w:keepNext/>
-        <w:spacing w:before="160" w:after="120" w:line="360" w:lineRule="auto"/>
-        <w:jc w:val="left"/>
-      </w:pPr>
-      <w:r>
-        <w:rPr>
-          <w:rFonts w:ascii="Times New Roman" w:hAnsi="Times New Roman" w:cs="Times New Roman"/>
-          <w:b/>
-          <w:sz w:val="28"/>
-          <w:szCs w:val="28"/>
-        </w:rPr>
-        <w:t xml:space="preserve">8.3  The Aircraft Data Model</w:t>
-      </w:r>
-    </w:p>
-    <w:p>
-      <w:pPr>
-        <w:spacing w:before="0" w:after="120" w:line="360" w:lineRule="auto"/>
-        <w:ind w:firstLine="360"/>
-        <w:jc w:val="both"/>
-      </w:pPr>
-      <w:r>
-        <w:rPr>
-          <w:rFonts w:ascii="Times New Roman" w:hAnsi="Times New Roman" w:cs="Times New Roman"/>
-          <w:sz w:val="24"/>
-          <w:szCs w:val="24"/>
-        </w:rPr>
-        <w:t xml:space="preserve">The state of the system is held in an array of aircraft objects. Each object stores the callsign, type, simulated position, altitude, speed, heading and status of one aircraft. This array is the single source of truth from which every view is rendered.</w:t>
+        <w:t xml:space="preserve">The application opens with a secure login page that authenticates the operator before granting access to the system. It validates the user identifier and password before revealing the main interface.</w:t>
       </w:r>
     </w:p>
     <w:tbl>
@@ -7247,81 +6482,44 @@
           <w:tcPr>
             <w:tcW w:w="9360" w:type="dxa"/>
             <w:tcBorders>
-              <w:top w:val="single" w:sz="4" w:color="CCCCCC"/>
-              <w:left w:val="single" w:sz="4" w:color="CCCCCC"/>
-              <w:bottom w:val="single" w:sz="4" w:color="CCCCCC"/>
-              <w:right w:val="single" w:sz="4" w:color="CCCCCC"/>
+              <w:top w:val="dashed" w:sz="8" w:color="888888"/>
+              <w:left w:val="dashed" w:sz="8" w:color="888888"/>
+              <w:bottom w:val="dashed" w:sz="8" w:color="888888"/>
+              <w:right w:val="dashed" w:sz="8" w:color="888888"/>
             </w:tcBorders>
-            <w:shd w:val="clear" w:color="auto" w:fill="F5F5F5"/>
-          </w:tcPr>
-          <w:p>
-            <w:pPr>
-              <w:spacing w:before="0" w:after="0" w:line="240" w:lineRule="auto"/>
-              <w:jc w:val="left"/>
-            </w:pPr>
-            <w:r>
-              <w:rPr>
-                <w:rFonts w:ascii="Consolas" w:hAnsi="Consolas" w:cs="Consolas"/>
-                <w:sz w:val="18"/>
-                <w:szCs w:val="18"/>
-              </w:rPr>
-              <w:t xml:space="preserve">let aircraft = [</w:t>
-            </w:r>
-          </w:p>
-          <w:p>
-            <w:pPr>
-              <w:spacing w:before="0" w:after="0" w:line="240" w:lineRule="auto"/>
-              <w:jc w:val="left"/>
-            </w:pPr>
-            <w:r>
-              <w:rPr>
-                <w:rFonts w:ascii="Consolas" w:hAnsi="Consolas" w:cs="Consolas"/>
-                <w:sz w:val="18"/>
-                <w:szCs w:val="18"/>
-              </w:rPr>
-              <w:t xml:space="preserve">  {cs:"HAL-LCH1", type:"LCH Prachand", lat:120, lon:90,</w:t>
-            </w:r>
-          </w:p>
-          <w:p>
-            <w:pPr>
-              <w:spacing w:before="0" w:after="0" w:line="240" w:lineRule="auto"/>
-              <w:jc w:val="left"/>
-            </w:pPr>
-            <w:r>
-              <w:rPr>
-                <w:rFonts w:ascii="Consolas" w:hAnsi="Consolas" w:cs="Consolas"/>
-                <w:sz w:val="18"/>
-                <w:szCs w:val="18"/>
-              </w:rPr>
-              <w:t xml:space="preserve">   alt:14200, spd:165, hdg:90, status:"ok"},</w:t>
-            </w:r>
-          </w:p>
-          <w:p>
-            <w:pPr>
-              <w:spacing w:before="0" w:after="0" w:line="240" w:lineRule="auto"/>
-              <w:jc w:val="left"/>
-            </w:pPr>
-            <w:r>
-              <w:rPr>
-                <w:rFonts w:ascii="Consolas" w:hAnsi="Consolas" w:cs="Consolas"/>
-                <w:sz w:val="18"/>
-                <w:szCs w:val="18"/>
-              </w:rPr>
-              <w:t xml:space="preserve">  // ... further aircraft ...</w:t>
-            </w:r>
-          </w:p>
-          <w:p>
-            <w:pPr>
-              <w:spacing w:before="0" w:after="0" w:line="240" w:lineRule="auto"/>
-              <w:jc w:val="left"/>
-            </w:pPr>
-            <w:r>
-              <w:rPr>
-                <w:rFonts w:ascii="Consolas" w:hAnsi="Consolas" w:cs="Consolas"/>
-                <w:sz w:val="18"/>
-                <w:szCs w:val="18"/>
-              </w:rPr>
-              <w:t xml:space="preserve">];</w:t>
+            <w:shd w:val="clear" w:color="auto" w:fill="F2F2F2"/>
+            <w:vAlign w:val="center"/>
+          </w:tcPr>
+          <w:p>
+            <w:pPr>
+              <w:spacing w:before="600" w:after="40" w:line="240" w:lineRule="auto"/>
+              <w:jc w:val="center"/>
+            </w:pPr>
+            <w:r>
+              <w:rPr>
+                <w:rFonts w:ascii="Times New Roman" w:hAnsi="Times New Roman" w:cs="Times New Roman"/>
+                <w:b/>
+                <w:color w:val="888888"/>
+                <w:sz w:val="24"/>
+                <w:szCs w:val="24"/>
+              </w:rPr>
+              <w:t xml:space="preserve">[ SCREENSHOT PLACEHOLDER ]</w:t>
+            </w:r>
+          </w:p>
+          <w:p>
+            <w:pPr>
+              <w:spacing w:before="0" w:after="600" w:line="240" w:lineRule="auto"/>
+              <w:jc w:val="center"/>
+            </w:pPr>
+            <w:r>
+              <w:rPr>
+                <w:rFonts w:ascii="Times New Roman" w:hAnsi="Times New Roman" w:cs="Times New Roman"/>
+                <w:i/>
+                <w:color w:val="888888"/>
+                <w:sz w:val="22"/>
+                <w:szCs w:val="22"/>
+              </w:rPr>
+              <w:t xml:space="preserve">Screenshot: Login Page</w:t>
             </w:r>
           </w:p>
         </w:tc>
@@ -7329,16 +6527,17 @@
     </w:tbl>
     <w:p>
       <w:pPr>
-        <w:spacing w:before="0" w:after="60" w:line="120" w:lineRule="auto"/>
-        <w:jc w:val="both"/>
-      </w:pPr>
-      <w:r>
-        <w:rPr>
-          <w:rFonts w:ascii="Times New Roman" w:hAnsi="Times New Roman" w:cs="Times New Roman"/>
-          <w:sz w:val="12"/>
-          <w:szCs w:val="12"/>
-        </w:rPr>
-        <w:t xml:space="preserve"/>
+        <w:spacing w:before="60" w:after="200" w:line="240" w:lineRule="auto"/>
+        <w:jc w:val="center"/>
+      </w:pPr>
+      <w:r>
+        <w:rPr>
+          <w:rFonts w:ascii="Times New Roman" w:hAnsi="Times New Roman" w:cs="Times New Roman"/>
+          <w:i/>
+          <w:sz w:val="22"/>
+          <w:szCs w:val="22"/>
+        </w:rPr>
+        <w:t xml:space="preserve">Fig. 1  Login Page of the Advanced Live Aircraft Tracking System</w:t>
       </w:r>
     </w:p>
     <w:p>
@@ -7354,7 +6553,7 @@
           <w:sz w:val="28"/>
           <w:szCs w:val="28"/>
         </w:rPr>
-        <w:t xml:space="preserve">8.4  The Simulation and Processing Function</w:t>
+        <w:t xml:space="preserve">7.3  Dashboard Page</w:t>
       </w:r>
     </w:p>
     <w:p>
@@ -7369,7 +6568,7 @@
           <w:sz w:val="24"/>
           <w:szCs w:val="24"/>
         </w:rPr>
-        <w:t xml:space="preserve">On every processing cycle the simulate function advances each aircraft according to its heading and speed, introduces small random variations to mimic real telemetry, and then derives the status of the aircraft by comparing its parameters against the configured thresholds. This single function embodies the simulation, processing and validation stages of the data pipeline.</w:t>
+        <w:t xml:space="preserve">The dashboard is the central page and provides an at-a-glance overview through key indicators, the live map, a recent-alerts feed and a fleet-status table, all updating in real time.</w:t>
       </w:r>
     </w:p>
     <w:tbl>
@@ -7386,179 +6585,44 @@
           <w:tcPr>
             <w:tcW w:w="9360" w:type="dxa"/>
             <w:tcBorders>
-              <w:top w:val="single" w:sz="4" w:color="CCCCCC"/>
-              <w:left w:val="single" w:sz="4" w:color="CCCCCC"/>
-              <w:bottom w:val="single" w:sz="4" w:color="CCCCCC"/>
-              <w:right w:val="single" w:sz="4" w:color="CCCCCC"/>
+              <w:top w:val="dashed" w:sz="8" w:color="888888"/>
+              <w:left w:val="dashed" w:sz="8" w:color="888888"/>
+              <w:bottom w:val="dashed" w:sz="8" w:color="888888"/>
+              <w:right w:val="dashed" w:sz="8" w:color="888888"/>
             </w:tcBorders>
-            <w:shd w:val="clear" w:color="auto" w:fill="F5F5F5"/>
-          </w:tcPr>
-          <w:p>
-            <w:pPr>
-              <w:spacing w:before="0" w:after="0" w:line="240" w:lineRule="auto"/>
-              <w:jc w:val="left"/>
-            </w:pPr>
-            <w:r>
-              <w:rPr>
-                <w:rFonts w:ascii="Consolas" w:hAnsi="Consolas" w:cs="Consolas"/>
-                <w:sz w:val="18"/>
-                <w:szCs w:val="18"/>
-              </w:rPr>
-              <w:t xml:space="preserve">function simulate(){</w:t>
-            </w:r>
-          </w:p>
-          <w:p>
-            <w:pPr>
-              <w:spacing w:before="0" w:after="0" w:line="240" w:lineRule="auto"/>
-              <w:jc w:val="left"/>
-            </w:pPr>
-            <w:r>
-              <w:rPr>
-                <w:rFonts w:ascii="Consolas" w:hAnsi="Consolas" w:cs="Consolas"/>
-                <w:sz w:val="18"/>
-                <w:szCs w:val="18"/>
-              </w:rPr>
-              <w:t xml:space="preserve">  aircraft.forEach(a=&gt;{</w:t>
-            </w:r>
-          </w:p>
-          <w:p>
-            <w:pPr>
-              <w:spacing w:before="0" w:after="0" w:line="240" w:lineRule="auto"/>
-              <w:jc w:val="left"/>
-            </w:pPr>
-            <w:r>
-              <w:rPr>
-                <w:rFonts w:ascii="Consolas" w:hAnsi="Consolas" w:cs="Consolas"/>
-                <w:sz w:val="18"/>
-                <w:szCs w:val="18"/>
-              </w:rPr>
-              <w:t xml:space="preserve">    const rad = a.hdg*Math.PI/180;</w:t>
-            </w:r>
-          </w:p>
-          <w:p>
-            <w:pPr>
-              <w:spacing w:before="0" w:after="0" w:line="240" w:lineRule="auto"/>
-              <w:jc w:val="left"/>
-            </w:pPr>
-            <w:r>
-              <w:rPr>
-                <w:rFonts w:ascii="Consolas" w:hAnsi="Consolas" w:cs="Consolas"/>
-                <w:sz w:val="18"/>
-                <w:szCs w:val="18"/>
-              </w:rPr>
-              <w:t xml:space="preserve">    a.lat += Math.cos(rad)*(a.spd/120);</w:t>
-            </w:r>
-          </w:p>
-          <w:p>
-            <w:pPr>
-              <w:spacing w:before="0" w:after="0" w:line="240" w:lineRule="auto"/>
-              <w:jc w:val="left"/>
-            </w:pPr>
-            <w:r>
-              <w:rPr>
-                <w:rFonts w:ascii="Consolas" w:hAnsi="Consolas" w:cs="Consolas"/>
-                <w:sz w:val="18"/>
-                <w:szCs w:val="18"/>
-              </w:rPr>
-              <w:t xml:space="preserve">    a.lon += Math.sin(rad)*(a.spd/120);</w:t>
-            </w:r>
-          </w:p>
-          <w:p>
-            <w:pPr>
-              <w:spacing w:before="0" w:after="0" w:line="240" w:lineRule="auto"/>
-              <w:jc w:val="left"/>
-            </w:pPr>
-            <w:r>
-              <w:rPr>
-                <w:rFonts w:ascii="Consolas" w:hAnsi="Consolas" w:cs="Consolas"/>
-                <w:sz w:val="18"/>
-                <w:szCs w:val="18"/>
-              </w:rPr>
-              <w:t xml:space="preserve">    a.alt += (Math.random()-0.5)*200;</w:t>
-            </w:r>
-          </w:p>
-          <w:p>
-            <w:pPr>
-              <w:spacing w:before="0" w:after="0" w:line="240" w:lineRule="auto"/>
-              <w:jc w:val="left"/>
-            </w:pPr>
-            <w:r>
-              <w:rPr>
-                <w:rFonts w:ascii="Consolas" w:hAnsi="Consolas" w:cs="Consolas"/>
-                <w:sz w:val="18"/>
-                <w:szCs w:val="18"/>
-              </w:rPr>
-              <w:t xml:space="preserve">    if(a.alt &gt; THR())              a.status='crit';</w:t>
-            </w:r>
-          </w:p>
-          <w:p>
-            <w:pPr>
-              <w:spacing w:before="0" w:after="0" w:line="240" w:lineRule="auto"/>
-              <w:jc w:val="left"/>
-            </w:pPr>
-            <w:r>
-              <w:rPr>
-                <w:rFonts w:ascii="Consolas" w:hAnsi="Consolas" w:cs="Consolas"/>
-                <w:sz w:val="18"/>
-                <w:szCs w:val="18"/>
-              </w:rPr>
-              <w:t xml:space="preserve">    else if(a.spd&gt;420||a.alt&lt;5000) a.status='warn';</w:t>
-            </w:r>
-          </w:p>
-          <w:p>
-            <w:pPr>
-              <w:spacing w:before="0" w:after="0" w:line="240" w:lineRule="auto"/>
-              <w:jc w:val="left"/>
-            </w:pPr>
-            <w:r>
-              <w:rPr>
-                <w:rFonts w:ascii="Consolas" w:hAnsi="Consolas" w:cs="Consolas"/>
-                <w:sz w:val="18"/>
-                <w:szCs w:val="18"/>
-              </w:rPr>
-              <w:t xml:space="preserve">    else                           a.status='ok';</w:t>
-            </w:r>
-          </w:p>
-          <w:p>
-            <w:pPr>
-              <w:spacing w:before="0" w:after="0" w:line="240" w:lineRule="auto"/>
-              <w:jc w:val="left"/>
-            </w:pPr>
-            <w:r>
-              <w:rPr>
-                <w:rFonts w:ascii="Consolas" w:hAnsi="Consolas" w:cs="Consolas"/>
-                <w:sz w:val="18"/>
-                <w:szCs w:val="18"/>
-              </w:rPr>
-              <w:t xml:space="preserve">  });</w:t>
-            </w:r>
-          </w:p>
-          <w:p>
-            <w:pPr>
-              <w:spacing w:before="0" w:after="0" w:line="240" w:lineRule="auto"/>
-              <w:jc w:val="left"/>
-            </w:pPr>
-            <w:r>
-              <w:rPr>
-                <w:rFonts w:ascii="Consolas" w:hAnsi="Consolas" w:cs="Consolas"/>
-                <w:sz w:val="18"/>
-                <w:szCs w:val="18"/>
-              </w:rPr>
-              <w:t xml:space="preserve">  renderAll();</w:t>
-            </w:r>
-          </w:p>
-          <w:p>
-            <w:pPr>
-              <w:spacing w:before="0" w:after="0" w:line="240" w:lineRule="auto"/>
-              <w:jc w:val="left"/>
-            </w:pPr>
-            <w:r>
-              <w:rPr>
-                <w:rFonts w:ascii="Consolas" w:hAnsi="Consolas" w:cs="Consolas"/>
-                <w:sz w:val="18"/>
-                <w:szCs w:val="18"/>
-              </w:rPr>
-              <w:t xml:space="preserve">}</w:t>
+            <w:shd w:val="clear" w:color="auto" w:fill="F2F2F2"/>
+            <w:vAlign w:val="center"/>
+          </w:tcPr>
+          <w:p>
+            <w:pPr>
+              <w:spacing w:before="600" w:after="40" w:line="240" w:lineRule="auto"/>
+              <w:jc w:val="center"/>
+            </w:pPr>
+            <w:r>
+              <w:rPr>
+                <w:rFonts w:ascii="Times New Roman" w:hAnsi="Times New Roman" w:cs="Times New Roman"/>
+                <w:b/>
+                <w:color w:val="888888"/>
+                <w:sz w:val="24"/>
+                <w:szCs w:val="24"/>
+              </w:rPr>
+              <w:t xml:space="preserve">[ SCREENSHOT PLACEHOLDER ]</w:t>
+            </w:r>
+          </w:p>
+          <w:p>
+            <w:pPr>
+              <w:spacing w:before="0" w:after="600" w:line="240" w:lineRule="auto"/>
+              <w:jc w:val="center"/>
+            </w:pPr>
+            <w:r>
+              <w:rPr>
+                <w:rFonts w:ascii="Times New Roman" w:hAnsi="Times New Roman" w:cs="Times New Roman"/>
+                <w:i/>
+                <w:color w:val="888888"/>
+                <w:sz w:val="22"/>
+                <w:szCs w:val="22"/>
+              </w:rPr>
+              <w:t xml:space="preserve">Screenshot: Dashboard Page</w:t>
             </w:r>
           </w:p>
         </w:tc>
@@ -7566,16 +6630,17 @@
     </w:tbl>
     <w:p>
       <w:pPr>
-        <w:spacing w:before="0" w:after="60" w:line="120" w:lineRule="auto"/>
-        <w:jc w:val="both"/>
-      </w:pPr>
-      <w:r>
-        <w:rPr>
-          <w:rFonts w:ascii="Times New Roman" w:hAnsi="Times New Roman" w:cs="Times New Roman"/>
-          <w:sz w:val="12"/>
-          <w:szCs w:val="12"/>
-        </w:rPr>
-        <w:t xml:space="preserve"/>
+        <w:spacing w:before="60" w:after="200" w:line="240" w:lineRule="auto"/>
+        <w:jc w:val="center"/>
+      </w:pPr>
+      <w:r>
+        <w:rPr>
+          <w:rFonts w:ascii="Times New Roman" w:hAnsi="Times New Roman" w:cs="Times New Roman"/>
+          <w:i/>
+          <w:sz w:val="22"/>
+          <w:szCs w:val="22"/>
+        </w:rPr>
+        <w:t xml:space="preserve">Fig. 2  Dashboard Page of the Advanced Live Aircraft Tracking System</w:t>
       </w:r>
     </w:p>
     <w:p>
@@ -7591,7 +6656,7 @@
           <w:sz w:val="28"/>
           <w:szCs w:val="28"/>
         </w:rPr>
-        <w:t xml:space="preserve">8.5  Canvas Drawing and Animation</w:t>
+        <w:t xml:space="preserve">7.4  Live Tracking Page</w:t>
       </w:r>
     </w:p>
     <w:p>
@@ -7606,7 +6671,7 @@
           <w:sz w:val="24"/>
           <w:szCs w:val="24"/>
         </w:rPr>
-        <w:t xml:space="preserve">The map and radar are drawn using the Canvas two-dimensional context. The drawMap function clears the canvas, draws the grid, and then iterates over the aircraft array drawing an oriented, colour-coded symbol for each aircraft together with its labels. The radar sweep is animated by recomputing the sweep angle from the current time on each frame.</w:t>
+        <w:t xml:space="preserve">The tracking page presents a searchable list of aircraft and, on selection, shows the full telemetry of the chosen aircraft including altitude, speed, heading and status.</w:t>
       </w:r>
     </w:p>
     <w:tbl>
@@ -7623,165 +6688,44 @@
           <w:tcPr>
             <w:tcW w:w="9360" w:type="dxa"/>
             <w:tcBorders>
-              <w:top w:val="single" w:sz="4" w:color="CCCCCC"/>
-              <w:left w:val="single" w:sz="4" w:color="CCCCCC"/>
-              <w:bottom w:val="single" w:sz="4" w:color="CCCCCC"/>
-              <w:right w:val="single" w:sz="4" w:color="CCCCCC"/>
+              <w:top w:val="dashed" w:sz="8" w:color="888888"/>
+              <w:left w:val="dashed" w:sz="8" w:color="888888"/>
+              <w:bottom w:val="dashed" w:sz="8" w:color="888888"/>
+              <w:right w:val="dashed" w:sz="8" w:color="888888"/>
             </w:tcBorders>
-            <w:shd w:val="clear" w:color="auto" w:fill="F5F5F5"/>
-          </w:tcPr>
-          <w:p>
-            <w:pPr>
-              <w:spacing w:before="0" w:after="0" w:line="240" w:lineRule="auto"/>
-              <w:jc w:val="left"/>
-            </w:pPr>
-            <w:r>
-              <w:rPr>
-                <w:rFonts w:ascii="Consolas" w:hAnsi="Consolas" w:cs="Consolas"/>
-                <w:sz w:val="18"/>
-                <w:szCs w:val="18"/>
-              </w:rPr>
-              <w:t xml:space="preserve">function drawMap(){</w:t>
-            </w:r>
-          </w:p>
-          <w:p>
-            <w:pPr>
-              <w:spacing w:before="0" w:after="0" w:line="240" w:lineRule="auto"/>
-              <w:jc w:val="left"/>
-            </w:pPr>
-            <w:r>
-              <w:rPr>
-                <w:rFonts w:ascii="Consolas" w:hAnsi="Consolas" w:cs="Consolas"/>
-                <w:sz w:val="18"/>
-                <w:szCs w:val="18"/>
-              </w:rPr>
-              <w:t xml:space="preserve">  const x = canvas.getContext('2d');</w:t>
-            </w:r>
-          </w:p>
-          <w:p>
-            <w:pPr>
-              <w:spacing w:before="0" w:after="0" w:line="240" w:lineRule="auto"/>
-              <w:jc w:val="left"/>
-            </w:pPr>
-            <w:r>
-              <w:rPr>
-                <w:rFonts w:ascii="Consolas" w:hAnsi="Consolas" w:cs="Consolas"/>
-                <w:sz w:val="18"/>
-                <w:szCs w:val="18"/>
-              </w:rPr>
-              <w:t xml:space="preserve">  x.clearRect(0,0,canvas.width,canvas.height);</w:t>
-            </w:r>
-          </w:p>
-          <w:p>
-            <w:pPr>
-              <w:spacing w:before="0" w:after="0" w:line="240" w:lineRule="auto"/>
-              <w:jc w:val="left"/>
-            </w:pPr>
-            <w:r>
-              <w:rPr>
-                <w:rFonts w:ascii="Consolas" w:hAnsi="Consolas" w:cs="Consolas"/>
-                <w:sz w:val="18"/>
-                <w:szCs w:val="18"/>
-              </w:rPr>
-              <w:t xml:space="preserve">  drawGrid(x);</w:t>
-            </w:r>
-          </w:p>
-          <w:p>
-            <w:pPr>
-              <w:spacing w:before="0" w:after="0" w:line="240" w:lineRule="auto"/>
-              <w:jc w:val="left"/>
-            </w:pPr>
-            <w:r>
-              <w:rPr>
-                <w:rFonts w:ascii="Consolas" w:hAnsi="Consolas" w:cs="Consolas"/>
-                <w:sz w:val="18"/>
-                <w:szCs w:val="18"/>
-              </w:rPr>
-              <w:t xml:space="preserve">  aircraft.forEach(a=&gt;{</w:t>
-            </w:r>
-          </w:p>
-          <w:p>
-            <w:pPr>
-              <w:spacing w:before="0" w:after="0" w:line="240" w:lineRule="auto"/>
-              <w:jc w:val="left"/>
-            </w:pPr>
-            <w:r>
-              <w:rPr>
-                <w:rFonts w:ascii="Consolas" w:hAnsi="Consolas" w:cs="Consolas"/>
-                <w:sz w:val="18"/>
-                <w:szCs w:val="18"/>
-              </w:rPr>
-              <w:t xml:space="preserve">    x.save(); x.translate(px,py); x.rotate(a.hdg*Math.PI/180);</w:t>
-            </w:r>
-          </w:p>
-          <w:p>
-            <w:pPr>
-              <w:spacing w:before="0" w:after="0" w:line="240" w:lineRule="auto"/>
-              <w:jc w:val="left"/>
-            </w:pPr>
-            <w:r>
-              <w:rPr>
-                <w:rFonts w:ascii="Consolas" w:hAnsi="Consolas" w:cs="Consolas"/>
-                <w:sz w:val="18"/>
-                <w:szCs w:val="18"/>
-              </w:rPr>
-              <w:t xml:space="preserve">    x.fillStyle = colourOf(a.status);</w:t>
-            </w:r>
-          </w:p>
-          <w:p>
-            <w:pPr>
-              <w:spacing w:before="0" w:after="0" w:line="240" w:lineRule="auto"/>
-              <w:jc w:val="left"/>
-            </w:pPr>
-            <w:r>
-              <w:rPr>
-                <w:rFonts w:ascii="Consolas" w:hAnsi="Consolas" w:cs="Consolas"/>
-                <w:sz w:val="18"/>
-                <w:szCs w:val="18"/>
-              </w:rPr>
-              <w:t xml:space="preserve">    drawAircraftSymbol(x);</w:t>
-            </w:r>
-          </w:p>
-          <w:p>
-            <w:pPr>
-              <w:spacing w:before="0" w:after="0" w:line="240" w:lineRule="auto"/>
-              <w:jc w:val="left"/>
-            </w:pPr>
-            <w:r>
-              <w:rPr>
-                <w:rFonts w:ascii="Consolas" w:hAnsi="Consolas" w:cs="Consolas"/>
-                <w:sz w:val="18"/>
-                <w:szCs w:val="18"/>
-              </w:rPr>
-              <w:t xml:space="preserve">    x.restore();</w:t>
-            </w:r>
-          </w:p>
-          <w:p>
-            <w:pPr>
-              <w:spacing w:before="0" w:after="0" w:line="240" w:lineRule="auto"/>
-              <w:jc w:val="left"/>
-            </w:pPr>
-            <w:r>
-              <w:rPr>
-                <w:rFonts w:ascii="Consolas" w:hAnsi="Consolas" w:cs="Consolas"/>
-                <w:sz w:val="18"/>
-                <w:szCs w:val="18"/>
-              </w:rPr>
-              <w:t xml:space="preserve">  });</w:t>
-            </w:r>
-          </w:p>
-          <w:p>
-            <w:pPr>
-              <w:spacing w:before="0" w:after="0" w:line="240" w:lineRule="auto"/>
-              <w:jc w:val="left"/>
-            </w:pPr>
-            <w:r>
-              <w:rPr>
-                <w:rFonts w:ascii="Consolas" w:hAnsi="Consolas" w:cs="Consolas"/>
-                <w:sz w:val="18"/>
-                <w:szCs w:val="18"/>
-              </w:rPr>
-              <w:t xml:space="preserve">}</w:t>
+            <w:shd w:val="clear" w:color="auto" w:fill="F2F2F2"/>
+            <w:vAlign w:val="center"/>
+          </w:tcPr>
+          <w:p>
+            <w:pPr>
+              <w:spacing w:before="600" w:after="40" w:line="240" w:lineRule="auto"/>
+              <w:jc w:val="center"/>
+            </w:pPr>
+            <w:r>
+              <w:rPr>
+                <w:rFonts w:ascii="Times New Roman" w:hAnsi="Times New Roman" w:cs="Times New Roman"/>
+                <w:b/>
+                <w:color w:val="888888"/>
+                <w:sz w:val="24"/>
+                <w:szCs w:val="24"/>
+              </w:rPr>
+              <w:t xml:space="preserve">[ SCREENSHOT PLACEHOLDER ]</w:t>
+            </w:r>
+          </w:p>
+          <w:p>
+            <w:pPr>
+              <w:spacing w:before="0" w:after="600" w:line="240" w:lineRule="auto"/>
+              <w:jc w:val="center"/>
+            </w:pPr>
+            <w:r>
+              <w:rPr>
+                <w:rFonts w:ascii="Times New Roman" w:hAnsi="Times New Roman" w:cs="Times New Roman"/>
+                <w:i/>
+                <w:color w:val="888888"/>
+                <w:sz w:val="22"/>
+                <w:szCs w:val="22"/>
+              </w:rPr>
+              <w:t xml:space="preserve">Screenshot: Live Tracking Page</w:t>
             </w:r>
           </w:p>
         </w:tc>
@@ -7789,16 +6733,17 @@
     </w:tbl>
     <w:p>
       <w:pPr>
-        <w:spacing w:before="0" w:after="60" w:line="120" w:lineRule="auto"/>
-        <w:jc w:val="both"/>
-      </w:pPr>
-      <w:r>
-        <w:rPr>
-          <w:rFonts w:ascii="Times New Roman" w:hAnsi="Times New Roman" w:cs="Times New Roman"/>
-          <w:sz w:val="12"/>
-          <w:szCs w:val="12"/>
-        </w:rPr>
-        <w:t xml:space="preserve"/>
+        <w:spacing w:before="60" w:after="200" w:line="240" w:lineRule="auto"/>
+        <w:jc w:val="center"/>
+      </w:pPr>
+      <w:r>
+        <w:rPr>
+          <w:rFonts w:ascii="Times New Roman" w:hAnsi="Times New Roman" w:cs="Times New Roman"/>
+          <w:i/>
+          <w:sz w:val="22"/>
+          <w:szCs w:val="22"/>
+        </w:rPr>
+        <w:t xml:space="preserve">Fig. 3  Live Tracking Page of the Advanced Live Aircraft Tracking System</w:t>
       </w:r>
     </w:p>
     <w:p>
@@ -7814,7 +6759,7 @@
           <w:sz w:val="28"/>
           <w:szCs w:val="28"/>
         </w:rPr>
-        <w:t xml:space="preserve">8.6  Event Handling and Navigation</w:t>
+        <w:t xml:space="preserve">7.5  Radar Scope Page</w:t>
       </w:r>
     </w:p>
     <w:p>
@@ -7829,7 +6774,7 @@
           <w:sz w:val="24"/>
           <w:szCs w:val="24"/>
         </w:rPr>
-        <w:t xml:space="preserve">User interactions are handled through event listeners. A single delegated listener on the navigation menu switches between modules by toggling the active page, which is an efficient and maintainable pattern.</w:t>
+        <w:t xml:space="preserve">The radar page reproduces a primary surveillance radar with range rings, cross hairs, a rotating sweep and aircraft contacts, demonstrating real-time animation on the Canvas.</w:t>
       </w:r>
     </w:p>
     <w:tbl>
@@ -7846,6 +6791,603 @@
           <w:tcPr>
             <w:tcW w:w="9360" w:type="dxa"/>
             <w:tcBorders>
+              <w:top w:val="dashed" w:sz="8" w:color="888888"/>
+              <w:left w:val="dashed" w:sz="8" w:color="888888"/>
+              <w:bottom w:val="dashed" w:sz="8" w:color="888888"/>
+              <w:right w:val="dashed" w:sz="8" w:color="888888"/>
+            </w:tcBorders>
+            <w:shd w:val="clear" w:color="auto" w:fill="F2F2F2"/>
+            <w:vAlign w:val="center"/>
+          </w:tcPr>
+          <w:p>
+            <w:pPr>
+              <w:spacing w:before="600" w:after="40" w:line="240" w:lineRule="auto"/>
+              <w:jc w:val="center"/>
+            </w:pPr>
+            <w:r>
+              <w:rPr>
+                <w:rFonts w:ascii="Times New Roman" w:hAnsi="Times New Roman" w:cs="Times New Roman"/>
+                <w:b/>
+                <w:color w:val="888888"/>
+                <w:sz w:val="24"/>
+                <w:szCs w:val="24"/>
+              </w:rPr>
+              <w:t xml:space="preserve">[ SCREENSHOT PLACEHOLDER ]</w:t>
+            </w:r>
+          </w:p>
+          <w:p>
+            <w:pPr>
+              <w:spacing w:before="0" w:after="600" w:line="240" w:lineRule="auto"/>
+              <w:jc w:val="center"/>
+            </w:pPr>
+            <w:r>
+              <w:rPr>
+                <w:rFonts w:ascii="Times New Roman" w:hAnsi="Times New Roman" w:cs="Times New Roman"/>
+                <w:i/>
+                <w:color w:val="888888"/>
+                <w:sz w:val="22"/>
+                <w:szCs w:val="22"/>
+              </w:rPr>
+              <w:t xml:space="preserve">Screenshot: Radar Scope Page</w:t>
+            </w:r>
+          </w:p>
+        </w:tc>
+      </w:tr>
+    </w:tbl>
+    <w:p>
+      <w:pPr>
+        <w:spacing w:before="60" w:after="200" w:line="240" w:lineRule="auto"/>
+        <w:jc w:val="center"/>
+      </w:pPr>
+      <w:r>
+        <w:rPr>
+          <w:rFonts w:ascii="Times New Roman" w:hAnsi="Times New Roman" w:cs="Times New Roman"/>
+          <w:i/>
+          <w:sz w:val="22"/>
+          <w:szCs w:val="22"/>
+        </w:rPr>
+        <w:t xml:space="preserve">Fig. 4  Radar Scope Page of the Advanced Live Aircraft Tracking System</w:t>
+      </w:r>
+    </w:p>
+    <w:p>
+      <w:pPr>
+        <w:keepNext/>
+        <w:spacing w:before="160" w:after="120" w:line="360" w:lineRule="auto"/>
+        <w:jc w:val="left"/>
+      </w:pPr>
+      <w:r>
+        <w:rPr>
+          <w:rFonts w:ascii="Times New Roman" w:hAnsi="Times New Roman" w:cs="Times New Roman"/>
+          <w:b/>
+          <w:sz w:val="28"/>
+          <w:szCs w:val="28"/>
+        </w:rPr>
+        <w:t xml:space="preserve">7.6  Analytics Page</w:t>
+      </w:r>
+    </w:p>
+    <w:p>
+      <w:pPr>
+        <w:spacing w:before="0" w:after="120" w:line="360" w:lineRule="auto"/>
+        <w:ind w:firstLine="360"/>
+        <w:jc w:val="both"/>
+      </w:pPr>
+      <w:r>
+        <w:rPr>
+          <w:rFonts w:ascii="Times New Roman" w:hAnsi="Times New Roman" w:cs="Times New Roman"/>
+          <w:sz w:val="24"/>
+          <w:szCs w:val="24"/>
+        </w:rPr>
+        <w:t xml:space="preserve">The analytics page processes fleet telemetry to produce an altitude histogram, a speed profile and a statistics table giving the minimum, maximum and mean of each parameter.</w:t>
+      </w:r>
+    </w:p>
+    <w:tbl>
+      <w:tblPr>
+        <w:tblW w:w="9360" w:type="dxa"/>
+        <w:jc w:val="center"/>
+        <w:tblLook w:val="04A0"/>
+      </w:tblPr>
+      <w:tblGrid>
+        <w:gridCol w:w="9360"/>
+      </w:tblGrid>
+      <w:tr>
+        <w:tc>
+          <w:tcPr>
+            <w:tcW w:w="9360" w:type="dxa"/>
+            <w:tcBorders>
+              <w:top w:val="dashed" w:sz="8" w:color="888888"/>
+              <w:left w:val="dashed" w:sz="8" w:color="888888"/>
+              <w:bottom w:val="dashed" w:sz="8" w:color="888888"/>
+              <w:right w:val="dashed" w:sz="8" w:color="888888"/>
+            </w:tcBorders>
+            <w:shd w:val="clear" w:color="auto" w:fill="F2F2F2"/>
+            <w:vAlign w:val="center"/>
+          </w:tcPr>
+          <w:p>
+            <w:pPr>
+              <w:spacing w:before="600" w:after="40" w:line="240" w:lineRule="auto"/>
+              <w:jc w:val="center"/>
+            </w:pPr>
+            <w:r>
+              <w:rPr>
+                <w:rFonts w:ascii="Times New Roman" w:hAnsi="Times New Roman" w:cs="Times New Roman"/>
+                <w:b/>
+                <w:color w:val="888888"/>
+                <w:sz w:val="24"/>
+                <w:szCs w:val="24"/>
+              </w:rPr>
+              <w:t xml:space="preserve">[ SCREENSHOT PLACEHOLDER ]</w:t>
+            </w:r>
+          </w:p>
+          <w:p>
+            <w:pPr>
+              <w:spacing w:before="0" w:after="600" w:line="240" w:lineRule="auto"/>
+              <w:jc w:val="center"/>
+            </w:pPr>
+            <w:r>
+              <w:rPr>
+                <w:rFonts w:ascii="Times New Roman" w:hAnsi="Times New Roman" w:cs="Times New Roman"/>
+                <w:i/>
+                <w:color w:val="888888"/>
+                <w:sz w:val="22"/>
+                <w:szCs w:val="22"/>
+              </w:rPr>
+              <w:t xml:space="preserve">Screenshot: Analytics Page</w:t>
+            </w:r>
+          </w:p>
+        </w:tc>
+      </w:tr>
+    </w:tbl>
+    <w:p>
+      <w:pPr>
+        <w:spacing w:before="60" w:after="200" w:line="240" w:lineRule="auto"/>
+        <w:jc w:val="center"/>
+      </w:pPr>
+      <w:r>
+        <w:rPr>
+          <w:rFonts w:ascii="Times New Roman" w:hAnsi="Times New Roman" w:cs="Times New Roman"/>
+          <w:i/>
+          <w:sz w:val="22"/>
+          <w:szCs w:val="22"/>
+        </w:rPr>
+        <w:t xml:space="preserve">Fig. 5  Analytics Page of the Advanced Live Aircraft Tracking System</w:t>
+      </w:r>
+    </w:p>
+    <w:p>
+      <w:pPr>
+        <w:keepNext/>
+        <w:spacing w:before="160" w:after="120" w:line="360" w:lineRule="auto"/>
+        <w:jc w:val="left"/>
+      </w:pPr>
+      <w:r>
+        <w:rPr>
+          <w:rFonts w:ascii="Times New Roman" w:hAnsi="Times New Roman" w:cs="Times New Roman"/>
+          <w:b/>
+          <w:sz w:val="28"/>
+          <w:szCs w:val="28"/>
+        </w:rPr>
+        <w:t xml:space="preserve">7.7  Mission Control Page</w:t>
+      </w:r>
+    </w:p>
+    <w:p>
+      <w:pPr>
+        <w:spacing w:before="0" w:after="120" w:line="360" w:lineRule="auto"/>
+        <w:ind w:firstLine="360"/>
+        <w:jc w:val="both"/>
+      </w:pPr>
+      <w:r>
+        <w:rPr>
+          <w:rFonts w:ascii="Times New Roman" w:hAnsi="Times New Roman" w:cs="Times New Roman"/>
+          <w:sz w:val="24"/>
+          <w:szCs w:val="24"/>
+        </w:rPr>
+        <w:t xml:space="preserve">The mission-control page lists active sorties with their objectives, phase and progress, and presents a timeline of the standard phases of a flight-test sortie.</w:t>
+      </w:r>
+    </w:p>
+    <w:tbl>
+      <w:tblPr>
+        <w:tblW w:w="9360" w:type="dxa"/>
+        <w:jc w:val="center"/>
+        <w:tblLook w:val="04A0"/>
+      </w:tblPr>
+      <w:tblGrid>
+        <w:gridCol w:w="9360"/>
+      </w:tblGrid>
+      <w:tr>
+        <w:tc>
+          <w:tcPr>
+            <w:tcW w:w="9360" w:type="dxa"/>
+            <w:tcBorders>
+              <w:top w:val="dashed" w:sz="8" w:color="888888"/>
+              <w:left w:val="dashed" w:sz="8" w:color="888888"/>
+              <w:bottom w:val="dashed" w:sz="8" w:color="888888"/>
+              <w:right w:val="dashed" w:sz="8" w:color="888888"/>
+            </w:tcBorders>
+            <w:shd w:val="clear" w:color="auto" w:fill="F2F2F2"/>
+            <w:vAlign w:val="center"/>
+          </w:tcPr>
+          <w:p>
+            <w:pPr>
+              <w:spacing w:before="600" w:after="40" w:line="240" w:lineRule="auto"/>
+              <w:jc w:val="center"/>
+            </w:pPr>
+            <w:r>
+              <w:rPr>
+                <w:rFonts w:ascii="Times New Roman" w:hAnsi="Times New Roman" w:cs="Times New Roman"/>
+                <w:b/>
+                <w:color w:val="888888"/>
+                <w:sz w:val="24"/>
+                <w:szCs w:val="24"/>
+              </w:rPr>
+              <w:t xml:space="preserve">[ SCREENSHOT PLACEHOLDER ]</w:t>
+            </w:r>
+          </w:p>
+          <w:p>
+            <w:pPr>
+              <w:spacing w:before="0" w:after="600" w:line="240" w:lineRule="auto"/>
+              <w:jc w:val="center"/>
+            </w:pPr>
+            <w:r>
+              <w:rPr>
+                <w:rFonts w:ascii="Times New Roman" w:hAnsi="Times New Roman" w:cs="Times New Roman"/>
+                <w:i/>
+                <w:color w:val="888888"/>
+                <w:sz w:val="22"/>
+                <w:szCs w:val="22"/>
+              </w:rPr>
+              <w:t xml:space="preserve">Screenshot: Mission Control Page</w:t>
+            </w:r>
+          </w:p>
+        </w:tc>
+      </w:tr>
+    </w:tbl>
+    <w:p>
+      <w:pPr>
+        <w:spacing w:before="60" w:after="200" w:line="240" w:lineRule="auto"/>
+        <w:jc w:val="center"/>
+      </w:pPr>
+      <w:r>
+        <w:rPr>
+          <w:rFonts w:ascii="Times New Roman" w:hAnsi="Times New Roman" w:cs="Times New Roman"/>
+          <w:i/>
+          <w:sz w:val="22"/>
+          <w:szCs w:val="22"/>
+        </w:rPr>
+        <w:t xml:space="preserve">Fig. 6  Mission Control Page of the Advanced Live Aircraft Tracking System</w:t>
+      </w:r>
+    </w:p>
+    <w:p>
+      <w:pPr>
+        <w:keepNext/>
+        <w:spacing w:before="160" w:after="120" w:line="360" w:lineRule="auto"/>
+        <w:jc w:val="left"/>
+      </w:pPr>
+      <w:r>
+        <w:rPr>
+          <w:rFonts w:ascii="Times New Roman" w:hAnsi="Times New Roman" w:cs="Times New Roman"/>
+          <w:b/>
+          <w:sz w:val="28"/>
+          <w:szCs w:val="28"/>
+        </w:rPr>
+        <w:t xml:space="preserve">7.8  Alert Feed Page</w:t>
+      </w:r>
+    </w:p>
+    <w:p>
+      <w:pPr>
+        <w:spacing w:before="0" w:after="120" w:line="360" w:lineRule="auto"/>
+        <w:ind w:firstLine="360"/>
+        <w:jc w:val="both"/>
+      </w:pPr>
+      <w:r>
+        <w:rPr>
+          <w:rFonts w:ascii="Times New Roman" w:hAnsi="Times New Roman" w:cs="Times New Roman"/>
+          <w:sz w:val="24"/>
+          <w:szCs w:val="24"/>
+        </w:rPr>
+        <w:t xml:space="preserve">The alert-feed page lists all generated alerts, classified by severity and time-stamped, with critical alerts visually distinguished from cautions.</w:t>
+      </w:r>
+    </w:p>
+    <w:tbl>
+      <w:tblPr>
+        <w:tblW w:w="9360" w:type="dxa"/>
+        <w:jc w:val="center"/>
+        <w:tblLook w:val="04A0"/>
+      </w:tblPr>
+      <w:tblGrid>
+        <w:gridCol w:w="9360"/>
+      </w:tblGrid>
+      <w:tr>
+        <w:tc>
+          <w:tcPr>
+            <w:tcW w:w="9360" w:type="dxa"/>
+            <w:tcBorders>
+              <w:top w:val="dashed" w:sz="8" w:color="888888"/>
+              <w:left w:val="dashed" w:sz="8" w:color="888888"/>
+              <w:bottom w:val="dashed" w:sz="8" w:color="888888"/>
+              <w:right w:val="dashed" w:sz="8" w:color="888888"/>
+            </w:tcBorders>
+            <w:shd w:val="clear" w:color="auto" w:fill="F2F2F2"/>
+            <w:vAlign w:val="center"/>
+          </w:tcPr>
+          <w:p>
+            <w:pPr>
+              <w:spacing w:before="600" w:after="40" w:line="240" w:lineRule="auto"/>
+              <w:jc w:val="center"/>
+            </w:pPr>
+            <w:r>
+              <w:rPr>
+                <w:rFonts w:ascii="Times New Roman" w:hAnsi="Times New Roman" w:cs="Times New Roman"/>
+                <w:b/>
+                <w:color w:val="888888"/>
+                <w:sz w:val="24"/>
+                <w:szCs w:val="24"/>
+              </w:rPr>
+              <w:t xml:space="preserve">[ SCREENSHOT PLACEHOLDER ]</w:t>
+            </w:r>
+          </w:p>
+          <w:p>
+            <w:pPr>
+              <w:spacing w:before="0" w:after="600" w:line="240" w:lineRule="auto"/>
+              <w:jc w:val="center"/>
+            </w:pPr>
+            <w:r>
+              <w:rPr>
+                <w:rFonts w:ascii="Times New Roman" w:hAnsi="Times New Roman" w:cs="Times New Roman"/>
+                <w:i/>
+                <w:color w:val="888888"/>
+                <w:sz w:val="22"/>
+                <w:szCs w:val="22"/>
+              </w:rPr>
+              <w:t xml:space="preserve">Screenshot: Alert Feed Page</w:t>
+            </w:r>
+          </w:p>
+        </w:tc>
+      </w:tr>
+    </w:tbl>
+    <w:p>
+      <w:pPr>
+        <w:spacing w:before="60" w:after="200" w:line="240" w:lineRule="auto"/>
+        <w:jc w:val="center"/>
+      </w:pPr>
+      <w:r>
+        <w:rPr>
+          <w:rFonts w:ascii="Times New Roman" w:hAnsi="Times New Roman" w:cs="Times New Roman"/>
+          <w:i/>
+          <w:sz w:val="22"/>
+          <w:szCs w:val="22"/>
+        </w:rPr>
+        <w:t xml:space="preserve">Fig. 7  Alert Feed Page of the Advanced Live Aircraft Tracking System</w:t>
+      </w:r>
+    </w:p>
+    <w:p>
+      <w:pPr>
+        <w:keepNext/>
+        <w:spacing w:before="160" w:after="120" w:line="360" w:lineRule="auto"/>
+        <w:jc w:val="left"/>
+      </w:pPr>
+      <w:r>
+        <w:rPr>
+          <w:rFonts w:ascii="Times New Roman" w:hAnsi="Times New Roman" w:cs="Times New Roman"/>
+          <w:b/>
+          <w:sz w:val="28"/>
+          <w:szCs w:val="28"/>
+        </w:rPr>
+        <w:t xml:space="preserve">7.9  Admin Panel Page</w:t>
+      </w:r>
+    </w:p>
+    <w:p>
+      <w:pPr>
+        <w:spacing w:before="0" w:after="120" w:line="360" w:lineRule="auto"/>
+        <w:ind w:firstLine="360"/>
+        <w:jc w:val="both"/>
+      </w:pPr>
+      <w:r>
+        <w:rPr>
+          <w:rFonts w:ascii="Times New Roman" w:hAnsi="Times New Roman" w:cs="Times New Roman"/>
+          <w:sz w:val="24"/>
+          <w:szCs w:val="24"/>
+        </w:rPr>
+        <w:t xml:space="preserve">The administration page allows aircraft to be registered or removed and exposes settings such as the refresh rate and the alert threshold.</w:t>
+      </w:r>
+    </w:p>
+    <w:tbl>
+      <w:tblPr>
+        <w:tblW w:w="9360" w:type="dxa"/>
+        <w:jc w:val="center"/>
+        <w:tblLook w:val="04A0"/>
+      </w:tblPr>
+      <w:tblGrid>
+        <w:gridCol w:w="9360"/>
+      </w:tblGrid>
+      <w:tr>
+        <w:tc>
+          <w:tcPr>
+            <w:tcW w:w="9360" w:type="dxa"/>
+            <w:tcBorders>
+              <w:top w:val="dashed" w:sz="8" w:color="888888"/>
+              <w:left w:val="dashed" w:sz="8" w:color="888888"/>
+              <w:bottom w:val="dashed" w:sz="8" w:color="888888"/>
+              <w:right w:val="dashed" w:sz="8" w:color="888888"/>
+            </w:tcBorders>
+            <w:shd w:val="clear" w:color="auto" w:fill="F2F2F2"/>
+            <w:vAlign w:val="center"/>
+          </w:tcPr>
+          <w:p>
+            <w:pPr>
+              <w:spacing w:before="600" w:after="40" w:line="240" w:lineRule="auto"/>
+              <w:jc w:val="center"/>
+            </w:pPr>
+            <w:r>
+              <w:rPr>
+                <w:rFonts w:ascii="Times New Roman" w:hAnsi="Times New Roman" w:cs="Times New Roman"/>
+                <w:b/>
+                <w:color w:val="888888"/>
+                <w:sz w:val="24"/>
+                <w:szCs w:val="24"/>
+              </w:rPr>
+              <w:t xml:space="preserve">[ SCREENSHOT PLACEHOLDER ]</w:t>
+            </w:r>
+          </w:p>
+          <w:p>
+            <w:pPr>
+              <w:spacing w:before="0" w:after="600" w:line="240" w:lineRule="auto"/>
+              <w:jc w:val="center"/>
+            </w:pPr>
+            <w:r>
+              <w:rPr>
+                <w:rFonts w:ascii="Times New Roman" w:hAnsi="Times New Roman" w:cs="Times New Roman"/>
+                <w:i/>
+                <w:color w:val="888888"/>
+                <w:sz w:val="22"/>
+                <w:szCs w:val="22"/>
+              </w:rPr>
+              <w:t xml:space="preserve">Screenshot: Admin Panel Page</w:t>
+            </w:r>
+          </w:p>
+        </w:tc>
+      </w:tr>
+    </w:tbl>
+    <w:p>
+      <w:pPr>
+        <w:spacing w:before="60" w:after="200" w:line="240" w:lineRule="auto"/>
+        <w:jc w:val="center"/>
+      </w:pPr>
+      <w:r>
+        <w:rPr>
+          <w:rFonts w:ascii="Times New Roman" w:hAnsi="Times New Roman" w:cs="Times New Roman"/>
+          <w:i/>
+          <w:sz w:val="22"/>
+          <w:szCs w:val="22"/>
+        </w:rPr>
+        <w:t xml:space="preserve">Fig. 8  Admin Panel Page of the Advanced Live Aircraft Tracking System</w:t>
+      </w:r>
+    </w:p>
+    <w:p>
+      <w:r>
+        <w:br w:type="page"/>
+      </w:r>
+    </w:p>
+    <w:p>
+      <w:pPr>
+        <w:keepNext/>
+        <w:spacing w:before="120" w:after="180" w:line="360" w:lineRule="auto"/>
+        <w:jc w:val="left"/>
+      </w:pPr>
+      <w:r>
+        <w:rPr>
+          <w:rFonts w:ascii="Times New Roman" w:hAnsi="Times New Roman" w:cs="Times New Roman"/>
+          <w:b/>
+          <w:sz w:val="32"/>
+          <w:szCs w:val="32"/>
+        </w:rPr>
+        <w:t xml:space="preserve">CHAPTER 8   SOURCE CODE</w:t>
+      </w:r>
+    </w:p>
+    <w:p>
+      <w:pPr>
+        <w:keepNext/>
+        <w:spacing w:before="160" w:after="120" w:line="360" w:lineRule="auto"/>
+        <w:jc w:val="left"/>
+      </w:pPr>
+      <w:r>
+        <w:rPr>
+          <w:rFonts w:ascii="Times New Roman" w:hAnsi="Times New Roman" w:cs="Times New Roman"/>
+          <w:b/>
+          <w:sz w:val="28"/>
+          <w:szCs w:val="28"/>
+        </w:rPr>
+        <w:t xml:space="preserve">8.1  Introduction</w:t>
+      </w:r>
+    </w:p>
+    <w:p>
+      <w:pPr>
+        <w:spacing w:before="0" w:after="120" w:line="360" w:lineRule="auto"/>
+        <w:jc w:val="both"/>
+      </w:pPr>
+      <w:r>
+        <w:rPr>
+          <w:rFonts w:ascii="Times New Roman" w:hAnsi="Times New Roman" w:cs="Times New Roman"/>
+          <w:sz w:val="24"/>
+          <w:szCs w:val="24"/>
+        </w:rPr>
+        <w:t xml:space="preserve">This chapter explains the structure and the principal elements of the source code of the Advanced Live Aircraft Tracking System. The complete source is provided in the project files; here the key parts are described to convey how the system works internally.</w:t>
+      </w:r>
+    </w:p>
+    <w:p>
+      <w:pPr>
+        <w:keepNext/>
+        <w:spacing w:before="160" w:after="120" w:line="360" w:lineRule="auto"/>
+        <w:jc w:val="left"/>
+      </w:pPr>
+      <w:r>
+        <w:rPr>
+          <w:rFonts w:ascii="Times New Roman" w:hAnsi="Times New Roman" w:cs="Times New Roman"/>
+          <w:b/>
+          <w:sz w:val="28"/>
+          <w:szCs w:val="28"/>
+        </w:rPr>
+        <w:t xml:space="preserve">8.2  Overall Structure</w:t>
+      </w:r>
+    </w:p>
+    <w:p>
+      <w:pPr>
+        <w:spacing w:before="0" w:after="120" w:line="360" w:lineRule="auto"/>
+        <w:ind w:firstLine="360"/>
+        <w:jc w:val="both"/>
+      </w:pPr>
+      <w:r>
+        <w:rPr>
+          <w:rFonts w:ascii="Times New Roman" w:hAnsi="Times New Roman" w:cs="Times New Roman"/>
+          <w:sz w:val="24"/>
+          <w:szCs w:val="24"/>
+        </w:rPr>
+        <w:t xml:space="preserve">The application is contained in a single, self-contained HTML file that includes the markup, the styles within a style block and the logic within a script block. This structure keeps the demonstration portable while preserving a clear internal separation between structure, presentation and behaviour.</w:t>
+      </w:r>
+    </w:p>
+    <w:p>
+      <w:pPr>
+        <w:keepNext/>
+        <w:spacing w:before="160" w:after="120" w:line="360" w:lineRule="auto"/>
+        <w:jc w:val="left"/>
+      </w:pPr>
+      <w:r>
+        <w:rPr>
+          <w:rFonts w:ascii="Times New Roman" w:hAnsi="Times New Roman" w:cs="Times New Roman"/>
+          <w:b/>
+          <w:sz w:val="28"/>
+          <w:szCs w:val="28"/>
+        </w:rPr>
+        <w:t xml:space="preserve">8.3  The Aircraft Data Model</w:t>
+      </w:r>
+    </w:p>
+    <w:p>
+      <w:pPr>
+        <w:spacing w:before="0" w:after="120" w:line="360" w:lineRule="auto"/>
+        <w:ind w:firstLine="360"/>
+        <w:jc w:val="both"/>
+      </w:pPr>
+      <w:r>
+        <w:rPr>
+          <w:rFonts w:ascii="Times New Roman" w:hAnsi="Times New Roman" w:cs="Times New Roman"/>
+          <w:sz w:val="24"/>
+          <w:szCs w:val="24"/>
+        </w:rPr>
+        <w:t xml:space="preserve">The state of the system is held in an array of aircraft objects. Each object stores the callsign, type, simulated position, altitude, speed, heading and status of one aircraft. This array is the single source of truth from which every view is rendered.</w:t>
+      </w:r>
+    </w:p>
+    <w:tbl>
+      <w:tblPr>
+        <w:tblW w:w="9360" w:type="dxa"/>
+        <w:jc w:val="center"/>
+        <w:tblLook w:val="04A0"/>
+      </w:tblPr>
+      <w:tblGrid>
+        <w:gridCol w:w="9360"/>
+      </w:tblGrid>
+      <w:tr>
+        <w:tc>
+          <w:tcPr>
+            <w:tcW w:w="9360" w:type="dxa"/>
+            <w:tcBorders>
               <w:top w:val="single" w:sz="4" w:color="CCCCCC"/>
               <w:left w:val="single" w:sz="4" w:color="CCCCCC"/>
               <w:bottom w:val="single" w:sz="4" w:color="CCCCCC"/>
@@ -7864,7 +7406,7 @@
                 <w:sz w:val="18"/>
                 <w:szCs w:val="18"/>
               </w:rPr>
-              <w:t xml:space="preserve">nav.addEventListener('click', e =&gt; {</w:t>
+              <w:t xml:space="preserve">let aircraft = [</w:t>
             </w:r>
           </w:p>
           <w:p>
@@ -7878,7 +7420,7 @@
                 <w:sz w:val="18"/>
                 <w:szCs w:val="18"/>
               </w:rPr>
-              <w:t xml:space="preserve">  const link = e.target.closest('a');</w:t>
+              <w:t xml:space="preserve">  {cs:"HAL-LCH1", type:"LCH Prachand", lat:120, lon:90,</w:t>
             </w:r>
           </w:p>
           <w:p>
@@ -7892,7 +7434,7 @@
                 <w:sz w:val="18"/>
                 <w:szCs w:val="18"/>
               </w:rPr>
-              <w:t xml:space="preserve">  if(!link) return;</w:t>
+              <w:t xml:space="preserve">   alt:14200, spd:165, hdg:90, status:"ok"},</w:t>
             </w:r>
           </w:p>
           <w:p>
@@ -7906,7 +7448,7 @@
                 <w:sz w:val="18"/>
                 <w:szCs w:val="18"/>
               </w:rPr>
-              <w:t xml:space="preserve">  showPage(link.dataset.p);   // switch active module</w:t>
+              <w:t xml:space="preserve">  // ... further aircraft ...</w:t>
             </w:r>
           </w:p>
           <w:p>
@@ -7920,7 +7462,7 @@
                 <w:sz w:val="18"/>
                 <w:szCs w:val="18"/>
               </w:rPr>
-              <w:t xml:space="preserve">});</w:t>
+              <w:t xml:space="preserve">];</w:t>
             </w:r>
           </w:p>
         </w:tc>
@@ -7953,6 +7495,605 @@
           <w:sz w:val="28"/>
           <w:szCs w:val="28"/>
         </w:rPr>
+        <w:t xml:space="preserve">8.4  The Simulation and Processing Function</w:t>
+      </w:r>
+    </w:p>
+    <w:p>
+      <w:pPr>
+        <w:spacing w:before="0" w:after="120" w:line="360" w:lineRule="auto"/>
+        <w:ind w:firstLine="360"/>
+        <w:jc w:val="both"/>
+      </w:pPr>
+      <w:r>
+        <w:rPr>
+          <w:rFonts w:ascii="Times New Roman" w:hAnsi="Times New Roman" w:cs="Times New Roman"/>
+          <w:sz w:val="24"/>
+          <w:szCs w:val="24"/>
+        </w:rPr>
+        <w:t xml:space="preserve">On every processing cycle the simulate function advances each aircraft according to its heading and speed, introduces small random variations to mimic real telemetry, and then derives the status of the aircraft by comparing its parameters against the configured thresholds. This single function embodies the simulation, processing and validation stages of the data pipeline.</w:t>
+      </w:r>
+    </w:p>
+    <w:tbl>
+      <w:tblPr>
+        <w:tblW w:w="9360" w:type="dxa"/>
+        <w:jc w:val="center"/>
+        <w:tblLook w:val="04A0"/>
+      </w:tblPr>
+      <w:tblGrid>
+        <w:gridCol w:w="9360"/>
+      </w:tblGrid>
+      <w:tr>
+        <w:tc>
+          <w:tcPr>
+            <w:tcW w:w="9360" w:type="dxa"/>
+            <w:tcBorders>
+              <w:top w:val="single" w:sz="4" w:color="CCCCCC"/>
+              <w:left w:val="single" w:sz="4" w:color="CCCCCC"/>
+              <w:bottom w:val="single" w:sz="4" w:color="CCCCCC"/>
+              <w:right w:val="single" w:sz="4" w:color="CCCCCC"/>
+            </w:tcBorders>
+            <w:shd w:val="clear" w:color="auto" w:fill="F5F5F5"/>
+          </w:tcPr>
+          <w:p>
+            <w:pPr>
+              <w:spacing w:before="0" w:after="0" w:line="240" w:lineRule="auto"/>
+              <w:jc w:val="left"/>
+            </w:pPr>
+            <w:r>
+              <w:rPr>
+                <w:rFonts w:ascii="Consolas" w:hAnsi="Consolas" w:cs="Consolas"/>
+                <w:sz w:val="18"/>
+                <w:szCs w:val="18"/>
+              </w:rPr>
+              <w:t xml:space="preserve">function simulate(){</w:t>
+            </w:r>
+          </w:p>
+          <w:p>
+            <w:pPr>
+              <w:spacing w:before="0" w:after="0" w:line="240" w:lineRule="auto"/>
+              <w:jc w:val="left"/>
+            </w:pPr>
+            <w:r>
+              <w:rPr>
+                <w:rFonts w:ascii="Consolas" w:hAnsi="Consolas" w:cs="Consolas"/>
+                <w:sz w:val="18"/>
+                <w:szCs w:val="18"/>
+              </w:rPr>
+              <w:t xml:space="preserve">  aircraft.forEach(a=&gt;{</w:t>
+            </w:r>
+          </w:p>
+          <w:p>
+            <w:pPr>
+              <w:spacing w:before="0" w:after="0" w:line="240" w:lineRule="auto"/>
+              <w:jc w:val="left"/>
+            </w:pPr>
+            <w:r>
+              <w:rPr>
+                <w:rFonts w:ascii="Consolas" w:hAnsi="Consolas" w:cs="Consolas"/>
+                <w:sz w:val="18"/>
+                <w:szCs w:val="18"/>
+              </w:rPr>
+              <w:t xml:space="preserve">    const rad = a.hdg*Math.PI/180;</w:t>
+            </w:r>
+          </w:p>
+          <w:p>
+            <w:pPr>
+              <w:spacing w:before="0" w:after="0" w:line="240" w:lineRule="auto"/>
+              <w:jc w:val="left"/>
+            </w:pPr>
+            <w:r>
+              <w:rPr>
+                <w:rFonts w:ascii="Consolas" w:hAnsi="Consolas" w:cs="Consolas"/>
+                <w:sz w:val="18"/>
+                <w:szCs w:val="18"/>
+              </w:rPr>
+              <w:t xml:space="preserve">    a.lat += Math.cos(rad)*(a.spd/120);</w:t>
+            </w:r>
+          </w:p>
+          <w:p>
+            <w:pPr>
+              <w:spacing w:before="0" w:after="0" w:line="240" w:lineRule="auto"/>
+              <w:jc w:val="left"/>
+            </w:pPr>
+            <w:r>
+              <w:rPr>
+                <w:rFonts w:ascii="Consolas" w:hAnsi="Consolas" w:cs="Consolas"/>
+                <w:sz w:val="18"/>
+                <w:szCs w:val="18"/>
+              </w:rPr>
+              <w:t xml:space="preserve">    a.lon += Math.sin(rad)*(a.spd/120);</w:t>
+            </w:r>
+          </w:p>
+          <w:p>
+            <w:pPr>
+              <w:spacing w:before="0" w:after="0" w:line="240" w:lineRule="auto"/>
+              <w:jc w:val="left"/>
+            </w:pPr>
+            <w:r>
+              <w:rPr>
+                <w:rFonts w:ascii="Consolas" w:hAnsi="Consolas" w:cs="Consolas"/>
+                <w:sz w:val="18"/>
+                <w:szCs w:val="18"/>
+              </w:rPr>
+              <w:t xml:space="preserve">    a.alt += (Math.random()-0.5)*200;</w:t>
+            </w:r>
+          </w:p>
+          <w:p>
+            <w:pPr>
+              <w:spacing w:before="0" w:after="0" w:line="240" w:lineRule="auto"/>
+              <w:jc w:val="left"/>
+            </w:pPr>
+            <w:r>
+              <w:rPr>
+                <w:rFonts w:ascii="Consolas" w:hAnsi="Consolas" w:cs="Consolas"/>
+                <w:sz w:val="18"/>
+                <w:szCs w:val="18"/>
+              </w:rPr>
+              <w:t xml:space="preserve">    if(a.alt &gt; THR())              a.status='crit';</w:t>
+            </w:r>
+          </w:p>
+          <w:p>
+            <w:pPr>
+              <w:spacing w:before="0" w:after="0" w:line="240" w:lineRule="auto"/>
+              <w:jc w:val="left"/>
+            </w:pPr>
+            <w:r>
+              <w:rPr>
+                <w:rFonts w:ascii="Consolas" w:hAnsi="Consolas" w:cs="Consolas"/>
+                <w:sz w:val="18"/>
+                <w:szCs w:val="18"/>
+              </w:rPr>
+              <w:t xml:space="preserve">    else if(a.spd&gt;420||a.alt&lt;5000) a.status='warn';</w:t>
+            </w:r>
+          </w:p>
+          <w:p>
+            <w:pPr>
+              <w:spacing w:before="0" w:after="0" w:line="240" w:lineRule="auto"/>
+              <w:jc w:val="left"/>
+            </w:pPr>
+            <w:r>
+              <w:rPr>
+                <w:rFonts w:ascii="Consolas" w:hAnsi="Consolas" w:cs="Consolas"/>
+                <w:sz w:val="18"/>
+                <w:szCs w:val="18"/>
+              </w:rPr>
+              <w:t xml:space="preserve">    else                           a.status='ok';</w:t>
+            </w:r>
+          </w:p>
+          <w:p>
+            <w:pPr>
+              <w:spacing w:before="0" w:after="0" w:line="240" w:lineRule="auto"/>
+              <w:jc w:val="left"/>
+            </w:pPr>
+            <w:r>
+              <w:rPr>
+                <w:rFonts w:ascii="Consolas" w:hAnsi="Consolas" w:cs="Consolas"/>
+                <w:sz w:val="18"/>
+                <w:szCs w:val="18"/>
+              </w:rPr>
+              <w:t xml:space="preserve">  });</w:t>
+            </w:r>
+          </w:p>
+          <w:p>
+            <w:pPr>
+              <w:spacing w:before="0" w:after="0" w:line="240" w:lineRule="auto"/>
+              <w:jc w:val="left"/>
+            </w:pPr>
+            <w:r>
+              <w:rPr>
+                <w:rFonts w:ascii="Consolas" w:hAnsi="Consolas" w:cs="Consolas"/>
+                <w:sz w:val="18"/>
+                <w:szCs w:val="18"/>
+              </w:rPr>
+              <w:t xml:space="preserve">  renderAll();</w:t>
+            </w:r>
+          </w:p>
+          <w:p>
+            <w:pPr>
+              <w:spacing w:before="0" w:after="0" w:line="240" w:lineRule="auto"/>
+              <w:jc w:val="left"/>
+            </w:pPr>
+            <w:r>
+              <w:rPr>
+                <w:rFonts w:ascii="Consolas" w:hAnsi="Consolas" w:cs="Consolas"/>
+                <w:sz w:val="18"/>
+                <w:szCs w:val="18"/>
+              </w:rPr>
+              <w:t xml:space="preserve">}</w:t>
+            </w:r>
+          </w:p>
+        </w:tc>
+      </w:tr>
+    </w:tbl>
+    <w:p>
+      <w:pPr>
+        <w:spacing w:before="0" w:after="60" w:line="120" w:lineRule="auto"/>
+        <w:jc w:val="both"/>
+      </w:pPr>
+      <w:r>
+        <w:rPr>
+          <w:rFonts w:ascii="Times New Roman" w:hAnsi="Times New Roman" w:cs="Times New Roman"/>
+          <w:sz w:val="12"/>
+          <w:szCs w:val="12"/>
+        </w:rPr>
+        <w:t xml:space="preserve"/>
+      </w:r>
+    </w:p>
+    <w:p>
+      <w:pPr>
+        <w:keepNext/>
+        <w:spacing w:before="160" w:after="120" w:line="360" w:lineRule="auto"/>
+        <w:jc w:val="left"/>
+      </w:pPr>
+      <w:r>
+        <w:rPr>
+          <w:rFonts w:ascii="Times New Roman" w:hAnsi="Times New Roman" w:cs="Times New Roman"/>
+          <w:b/>
+          <w:sz w:val="28"/>
+          <w:szCs w:val="28"/>
+        </w:rPr>
+        <w:t xml:space="preserve">8.5  Canvas Drawing and Animation</w:t>
+      </w:r>
+    </w:p>
+    <w:p>
+      <w:pPr>
+        <w:spacing w:before="0" w:after="120" w:line="360" w:lineRule="auto"/>
+        <w:ind w:firstLine="360"/>
+        <w:jc w:val="both"/>
+      </w:pPr>
+      <w:r>
+        <w:rPr>
+          <w:rFonts w:ascii="Times New Roman" w:hAnsi="Times New Roman" w:cs="Times New Roman"/>
+          <w:sz w:val="24"/>
+          <w:szCs w:val="24"/>
+        </w:rPr>
+        <w:t xml:space="preserve">The map and radar are drawn using the Canvas two-dimensional context. The drawMap function clears the canvas, draws the grid, and then iterates over the aircraft array drawing an oriented, colour-coded symbol for each aircraft together with its labels. The radar sweep is animated by recomputing the sweep angle from the current time on each frame.</w:t>
+      </w:r>
+    </w:p>
+    <w:tbl>
+      <w:tblPr>
+        <w:tblW w:w="9360" w:type="dxa"/>
+        <w:jc w:val="center"/>
+        <w:tblLook w:val="04A0"/>
+      </w:tblPr>
+      <w:tblGrid>
+        <w:gridCol w:w="9360"/>
+      </w:tblGrid>
+      <w:tr>
+        <w:tc>
+          <w:tcPr>
+            <w:tcW w:w="9360" w:type="dxa"/>
+            <w:tcBorders>
+              <w:top w:val="single" w:sz="4" w:color="CCCCCC"/>
+              <w:left w:val="single" w:sz="4" w:color="CCCCCC"/>
+              <w:bottom w:val="single" w:sz="4" w:color="CCCCCC"/>
+              <w:right w:val="single" w:sz="4" w:color="CCCCCC"/>
+            </w:tcBorders>
+            <w:shd w:val="clear" w:color="auto" w:fill="F5F5F5"/>
+          </w:tcPr>
+          <w:p>
+            <w:pPr>
+              <w:spacing w:before="0" w:after="0" w:line="240" w:lineRule="auto"/>
+              <w:jc w:val="left"/>
+            </w:pPr>
+            <w:r>
+              <w:rPr>
+                <w:rFonts w:ascii="Consolas" w:hAnsi="Consolas" w:cs="Consolas"/>
+                <w:sz w:val="18"/>
+                <w:szCs w:val="18"/>
+              </w:rPr>
+              <w:t xml:space="preserve">function drawMap(){</w:t>
+            </w:r>
+          </w:p>
+          <w:p>
+            <w:pPr>
+              <w:spacing w:before="0" w:after="0" w:line="240" w:lineRule="auto"/>
+              <w:jc w:val="left"/>
+            </w:pPr>
+            <w:r>
+              <w:rPr>
+                <w:rFonts w:ascii="Consolas" w:hAnsi="Consolas" w:cs="Consolas"/>
+                <w:sz w:val="18"/>
+                <w:szCs w:val="18"/>
+              </w:rPr>
+              <w:t xml:space="preserve">  const x = canvas.getContext('2d');</w:t>
+            </w:r>
+          </w:p>
+          <w:p>
+            <w:pPr>
+              <w:spacing w:before="0" w:after="0" w:line="240" w:lineRule="auto"/>
+              <w:jc w:val="left"/>
+            </w:pPr>
+            <w:r>
+              <w:rPr>
+                <w:rFonts w:ascii="Consolas" w:hAnsi="Consolas" w:cs="Consolas"/>
+                <w:sz w:val="18"/>
+                <w:szCs w:val="18"/>
+              </w:rPr>
+              <w:t xml:space="preserve">  x.clearRect(0,0,canvas.width,canvas.height);</w:t>
+            </w:r>
+          </w:p>
+          <w:p>
+            <w:pPr>
+              <w:spacing w:before="0" w:after="0" w:line="240" w:lineRule="auto"/>
+              <w:jc w:val="left"/>
+            </w:pPr>
+            <w:r>
+              <w:rPr>
+                <w:rFonts w:ascii="Consolas" w:hAnsi="Consolas" w:cs="Consolas"/>
+                <w:sz w:val="18"/>
+                <w:szCs w:val="18"/>
+              </w:rPr>
+              <w:t xml:space="preserve">  drawGrid(x);</w:t>
+            </w:r>
+          </w:p>
+          <w:p>
+            <w:pPr>
+              <w:spacing w:before="0" w:after="0" w:line="240" w:lineRule="auto"/>
+              <w:jc w:val="left"/>
+            </w:pPr>
+            <w:r>
+              <w:rPr>
+                <w:rFonts w:ascii="Consolas" w:hAnsi="Consolas" w:cs="Consolas"/>
+                <w:sz w:val="18"/>
+                <w:szCs w:val="18"/>
+              </w:rPr>
+              <w:t xml:space="preserve">  aircraft.forEach(a=&gt;{</w:t>
+            </w:r>
+          </w:p>
+          <w:p>
+            <w:pPr>
+              <w:spacing w:before="0" w:after="0" w:line="240" w:lineRule="auto"/>
+              <w:jc w:val="left"/>
+            </w:pPr>
+            <w:r>
+              <w:rPr>
+                <w:rFonts w:ascii="Consolas" w:hAnsi="Consolas" w:cs="Consolas"/>
+                <w:sz w:val="18"/>
+                <w:szCs w:val="18"/>
+              </w:rPr>
+              <w:t xml:space="preserve">    x.save(); x.translate(px,py); x.rotate(a.hdg*Math.PI/180);</w:t>
+            </w:r>
+          </w:p>
+          <w:p>
+            <w:pPr>
+              <w:spacing w:before="0" w:after="0" w:line="240" w:lineRule="auto"/>
+              <w:jc w:val="left"/>
+            </w:pPr>
+            <w:r>
+              <w:rPr>
+                <w:rFonts w:ascii="Consolas" w:hAnsi="Consolas" w:cs="Consolas"/>
+                <w:sz w:val="18"/>
+                <w:szCs w:val="18"/>
+              </w:rPr>
+              <w:t xml:space="preserve">    x.fillStyle = colourOf(a.status);</w:t>
+            </w:r>
+          </w:p>
+          <w:p>
+            <w:pPr>
+              <w:spacing w:before="0" w:after="0" w:line="240" w:lineRule="auto"/>
+              <w:jc w:val="left"/>
+            </w:pPr>
+            <w:r>
+              <w:rPr>
+                <w:rFonts w:ascii="Consolas" w:hAnsi="Consolas" w:cs="Consolas"/>
+                <w:sz w:val="18"/>
+                <w:szCs w:val="18"/>
+              </w:rPr>
+              <w:t xml:space="preserve">    drawAircraftSymbol(x);</w:t>
+            </w:r>
+          </w:p>
+          <w:p>
+            <w:pPr>
+              <w:spacing w:before="0" w:after="0" w:line="240" w:lineRule="auto"/>
+              <w:jc w:val="left"/>
+            </w:pPr>
+            <w:r>
+              <w:rPr>
+                <w:rFonts w:ascii="Consolas" w:hAnsi="Consolas" w:cs="Consolas"/>
+                <w:sz w:val="18"/>
+                <w:szCs w:val="18"/>
+              </w:rPr>
+              <w:t xml:space="preserve">    x.restore();</w:t>
+            </w:r>
+          </w:p>
+          <w:p>
+            <w:pPr>
+              <w:spacing w:before="0" w:after="0" w:line="240" w:lineRule="auto"/>
+              <w:jc w:val="left"/>
+            </w:pPr>
+            <w:r>
+              <w:rPr>
+                <w:rFonts w:ascii="Consolas" w:hAnsi="Consolas" w:cs="Consolas"/>
+                <w:sz w:val="18"/>
+                <w:szCs w:val="18"/>
+              </w:rPr>
+              <w:t xml:space="preserve">  });</w:t>
+            </w:r>
+          </w:p>
+          <w:p>
+            <w:pPr>
+              <w:spacing w:before="0" w:after="0" w:line="240" w:lineRule="auto"/>
+              <w:jc w:val="left"/>
+            </w:pPr>
+            <w:r>
+              <w:rPr>
+                <w:rFonts w:ascii="Consolas" w:hAnsi="Consolas" w:cs="Consolas"/>
+                <w:sz w:val="18"/>
+                <w:szCs w:val="18"/>
+              </w:rPr>
+              <w:t xml:space="preserve">}</w:t>
+            </w:r>
+          </w:p>
+        </w:tc>
+      </w:tr>
+    </w:tbl>
+    <w:p>
+      <w:pPr>
+        <w:spacing w:before="0" w:after="60" w:line="120" w:lineRule="auto"/>
+        <w:jc w:val="both"/>
+      </w:pPr>
+      <w:r>
+        <w:rPr>
+          <w:rFonts w:ascii="Times New Roman" w:hAnsi="Times New Roman" w:cs="Times New Roman"/>
+          <w:sz w:val="12"/>
+          <w:szCs w:val="12"/>
+        </w:rPr>
+        <w:t xml:space="preserve"/>
+      </w:r>
+    </w:p>
+    <w:p>
+      <w:pPr>
+        <w:keepNext/>
+        <w:spacing w:before="160" w:after="120" w:line="360" w:lineRule="auto"/>
+        <w:jc w:val="left"/>
+      </w:pPr>
+      <w:r>
+        <w:rPr>
+          <w:rFonts w:ascii="Times New Roman" w:hAnsi="Times New Roman" w:cs="Times New Roman"/>
+          <w:b/>
+          <w:sz w:val="28"/>
+          <w:szCs w:val="28"/>
+        </w:rPr>
+        <w:t xml:space="preserve">8.6  Event Handling and Navigation</w:t>
+      </w:r>
+    </w:p>
+    <w:p>
+      <w:pPr>
+        <w:spacing w:before="0" w:after="120" w:line="360" w:lineRule="auto"/>
+        <w:ind w:firstLine="360"/>
+        <w:jc w:val="both"/>
+      </w:pPr>
+      <w:r>
+        <w:rPr>
+          <w:rFonts w:ascii="Times New Roman" w:hAnsi="Times New Roman" w:cs="Times New Roman"/>
+          <w:sz w:val="24"/>
+          <w:szCs w:val="24"/>
+        </w:rPr>
+        <w:t xml:space="preserve">User interactions are handled through event listeners. A single delegated listener on the navigation menu switches between modules by toggling the active page, which is an efficient and maintainable pattern.</w:t>
+      </w:r>
+    </w:p>
+    <w:tbl>
+      <w:tblPr>
+        <w:tblW w:w="9360" w:type="dxa"/>
+        <w:jc w:val="center"/>
+        <w:tblLook w:val="04A0"/>
+      </w:tblPr>
+      <w:tblGrid>
+        <w:gridCol w:w="9360"/>
+      </w:tblGrid>
+      <w:tr>
+        <w:tc>
+          <w:tcPr>
+            <w:tcW w:w="9360" w:type="dxa"/>
+            <w:tcBorders>
+              <w:top w:val="single" w:sz="4" w:color="CCCCCC"/>
+              <w:left w:val="single" w:sz="4" w:color="CCCCCC"/>
+              <w:bottom w:val="single" w:sz="4" w:color="CCCCCC"/>
+              <w:right w:val="single" w:sz="4" w:color="CCCCCC"/>
+            </w:tcBorders>
+            <w:shd w:val="clear" w:color="auto" w:fill="F5F5F5"/>
+          </w:tcPr>
+          <w:p>
+            <w:pPr>
+              <w:spacing w:before="0" w:after="0" w:line="240" w:lineRule="auto"/>
+              <w:jc w:val="left"/>
+            </w:pPr>
+            <w:r>
+              <w:rPr>
+                <w:rFonts w:ascii="Consolas" w:hAnsi="Consolas" w:cs="Consolas"/>
+                <w:sz w:val="18"/>
+                <w:szCs w:val="18"/>
+              </w:rPr>
+              <w:t xml:space="preserve">nav.addEventListener('click', e =&gt; {</w:t>
+            </w:r>
+          </w:p>
+          <w:p>
+            <w:pPr>
+              <w:spacing w:before="0" w:after="0" w:line="240" w:lineRule="auto"/>
+              <w:jc w:val="left"/>
+            </w:pPr>
+            <w:r>
+              <w:rPr>
+                <w:rFonts w:ascii="Consolas" w:hAnsi="Consolas" w:cs="Consolas"/>
+                <w:sz w:val="18"/>
+                <w:szCs w:val="18"/>
+              </w:rPr>
+              <w:t xml:space="preserve">  const link = e.target.closest('a');</w:t>
+            </w:r>
+          </w:p>
+          <w:p>
+            <w:pPr>
+              <w:spacing w:before="0" w:after="0" w:line="240" w:lineRule="auto"/>
+              <w:jc w:val="left"/>
+            </w:pPr>
+            <w:r>
+              <w:rPr>
+                <w:rFonts w:ascii="Consolas" w:hAnsi="Consolas" w:cs="Consolas"/>
+                <w:sz w:val="18"/>
+                <w:szCs w:val="18"/>
+              </w:rPr>
+              <w:t xml:space="preserve">  if(!link) return;</w:t>
+            </w:r>
+          </w:p>
+          <w:p>
+            <w:pPr>
+              <w:spacing w:before="0" w:after="0" w:line="240" w:lineRule="auto"/>
+              <w:jc w:val="left"/>
+            </w:pPr>
+            <w:r>
+              <w:rPr>
+                <w:rFonts w:ascii="Consolas" w:hAnsi="Consolas" w:cs="Consolas"/>
+                <w:sz w:val="18"/>
+                <w:szCs w:val="18"/>
+              </w:rPr>
+              <w:t xml:space="preserve">  showPage(link.dataset.p);   // switch active module</w:t>
+            </w:r>
+          </w:p>
+          <w:p>
+            <w:pPr>
+              <w:spacing w:before="0" w:after="0" w:line="240" w:lineRule="auto"/>
+              <w:jc w:val="left"/>
+            </w:pPr>
+            <w:r>
+              <w:rPr>
+                <w:rFonts w:ascii="Consolas" w:hAnsi="Consolas" w:cs="Consolas"/>
+                <w:sz w:val="18"/>
+                <w:szCs w:val="18"/>
+              </w:rPr>
+              <w:t xml:space="preserve">});</w:t>
+            </w:r>
+          </w:p>
+        </w:tc>
+      </w:tr>
+    </w:tbl>
+    <w:p>
+      <w:pPr>
+        <w:spacing w:before="0" w:after="60" w:line="120" w:lineRule="auto"/>
+        <w:jc w:val="both"/>
+      </w:pPr>
+      <w:r>
+        <w:rPr>
+          <w:rFonts w:ascii="Times New Roman" w:hAnsi="Times New Roman" w:cs="Times New Roman"/>
+          <w:sz w:val="12"/>
+          <w:szCs w:val="12"/>
+        </w:rPr>
+        <w:t xml:space="preserve"/>
+      </w:r>
+    </w:p>
+    <w:p>
+      <w:pPr>
+        <w:keepNext/>
+        <w:spacing w:before="160" w:after="120" w:line="360" w:lineRule="auto"/>
+        <w:jc w:val="left"/>
+      </w:pPr>
+      <w:r>
+        <w:rPr>
+          <w:rFonts w:ascii="Times New Roman" w:hAnsi="Times New Roman" w:cs="Times New Roman"/>
+          <w:b/>
+          <w:sz w:val="28"/>
+          <w:szCs w:val="28"/>
+        </w:rPr>
         <w:t xml:space="preserve">8.7  Timers and Real-time Updates</w:t>
       </w:r>
     </w:p>
@@ -8081,7 +8222,7 @@
           <w:sz w:val="22"/>
           <w:szCs w:val="22"/>
         </w:rPr>
-        <w:t xml:space="preserve">Table 8  AIRCRAFT and TELEMETRY tables</w:t>
+        <w:t xml:space="preserve">Table 7  AIRCRAFT and TELEMETRY tables</w:t>
       </w:r>
     </w:p>
     <w:tbl>
@@ -8578,7 +8719,7 @@
           <w:sz w:val="22"/>
           <w:szCs w:val="22"/>
         </w:rPr>
-        <w:t xml:space="preserve">Table 9  Summary of benefits</w:t>
+        <w:t xml:space="preserve">Table 8  Summary of benefits</w:t>
       </w:r>
     </w:p>
     <w:tbl>

</xml_diff>

<commit_message>
Expand report content to ~50 pages and update INDEX page numbers
</commit_message>
<xml_diff>
--- a/report/HAL_Internship_Report.docx
+++ b/report/HAL_Internship_Report.docx
@@ -1382,7 +1382,7 @@
                 <w:sz w:val="22"/>
                 <w:szCs w:val="22"/>
               </w:rPr>
-              <w:t xml:space="preserve">1</w:t>
+              <w:t xml:space="preserve">1-4</w:t>
             </w:r>
           </w:p>
         </w:tc>
@@ -1480,7 +1480,7 @@
                 <w:sz w:val="22"/>
                 <w:szCs w:val="22"/>
               </w:rPr>
-              <w:t xml:space="preserve">2-4</w:t>
+              <w:t xml:space="preserve">5-8</w:t>
             </w:r>
           </w:p>
         </w:tc>
@@ -1578,7 +1578,7 @@
                 <w:sz w:val="22"/>
                 <w:szCs w:val="22"/>
               </w:rPr>
-              <w:t xml:space="preserve">5-6</w:t>
+              <w:t xml:space="preserve">9-11</w:t>
             </w:r>
           </w:p>
         </w:tc>
@@ -1676,7 +1676,7 @@
                 <w:sz w:val="22"/>
                 <w:szCs w:val="22"/>
               </w:rPr>
-              <w:t xml:space="preserve">7-10</w:t>
+              <w:t xml:space="preserve">12-16</w:t>
             </w:r>
           </w:p>
         </w:tc>
@@ -1774,7 +1774,7 @@
                 <w:sz w:val="22"/>
                 <w:szCs w:val="22"/>
               </w:rPr>
-              <w:t xml:space="preserve">11-19</w:t>
+              <w:t xml:space="preserve">17-25</w:t>
             </w:r>
           </w:p>
         </w:tc>
@@ -1872,7 +1872,7 @@
                 <w:sz w:val="22"/>
                 <w:szCs w:val="22"/>
               </w:rPr>
-              <w:t xml:space="preserve">20-25</w:t>
+              <w:t xml:space="preserve">26-31</w:t>
             </w:r>
           </w:p>
         </w:tc>
@@ -1970,7 +1970,7 @@
                 <w:sz w:val="22"/>
                 <w:szCs w:val="22"/>
               </w:rPr>
-              <w:t xml:space="preserve">26-28</w:t>
+              <w:t xml:space="preserve">32-37</w:t>
             </w:r>
           </w:p>
         </w:tc>
@@ -2068,7 +2068,7 @@
                 <w:sz w:val="22"/>
                 <w:szCs w:val="22"/>
               </w:rPr>
-              <w:t xml:space="preserve">29-32</w:t>
+              <w:t xml:space="preserve">38-42</w:t>
             </w:r>
           </w:p>
         </w:tc>
@@ -2166,7 +2166,7 @@
                 <w:sz w:val="22"/>
                 <w:szCs w:val="22"/>
               </w:rPr>
-              <w:t xml:space="preserve">33</w:t>
+              <w:t xml:space="preserve">43-44</w:t>
             </w:r>
           </w:p>
         </w:tc>
@@ -2264,7 +2264,7 @@
                 <w:sz w:val="22"/>
                 <w:szCs w:val="22"/>
               </w:rPr>
-              <w:t xml:space="preserve">34</w:t>
+              <w:t xml:space="preserve">45</w:t>
             </w:r>
           </w:p>
         </w:tc>
@@ -2362,7 +2362,7 @@
                 <w:sz w:val="22"/>
                 <w:szCs w:val="22"/>
               </w:rPr>
-              <w:t xml:space="preserve">35</w:t>
+              <w:t xml:space="preserve">46</w:t>
             </w:r>
           </w:p>
         </w:tc>
@@ -2460,7 +2460,7 @@
                 <w:sz w:val="22"/>
                 <w:szCs w:val="22"/>
               </w:rPr>
-              <w:t xml:space="preserve">36-37</w:t>
+              <w:t xml:space="preserve">47-48</w:t>
             </w:r>
           </w:p>
         </w:tc>
@@ -2558,7 +2558,7 @@
                 <w:sz w:val="22"/>
                 <w:szCs w:val="22"/>
               </w:rPr>
-              <w:t xml:space="preserve">38-39</w:t>
+              <w:t xml:space="preserve">49</w:t>
             </w:r>
           </w:p>
         </w:tc>
@@ -2656,7 +2656,7 @@
                 <w:sz w:val="22"/>
                 <w:szCs w:val="22"/>
               </w:rPr>
-              <w:t xml:space="preserve">40-41</w:t>
+              <w:t xml:space="preserve">50</w:t>
             </w:r>
           </w:p>
         </w:tc>
@@ -2853,6 +2853,396 @@
       </w:r>
     </w:p>
     <w:p>
+      <w:pPr>
+        <w:keepNext/>
+        <w:spacing w:before="160" w:after="120" w:line="360" w:lineRule="auto"/>
+        <w:jc w:val="left"/>
+      </w:pPr>
+      <w:r>
+        <w:rPr>
+          <w:rFonts w:ascii="Times New Roman" w:hAnsi="Times New Roman" w:cs="Times New Roman"/>
+          <w:b/>
+          <w:sz w:val="28"/>
+          <w:szCs w:val="28"/>
+        </w:rPr>
+        <w:t xml:space="preserve">1.6  Historical Background of HAL</w:t>
+      </w:r>
+    </w:p>
+    <w:p>
+      <w:pPr>
+        <w:spacing w:before="0" w:after="120" w:line="360" w:lineRule="auto"/>
+        <w:ind w:firstLine="360"/>
+        <w:jc w:val="both"/>
+      </w:pPr>
+      <w:r>
+        <w:rPr>
+          <w:rFonts w:ascii="Times New Roman" w:hAnsi="Times New Roman" w:cs="Times New Roman"/>
+          <w:sz w:val="24"/>
+          <w:szCs w:val="24"/>
+        </w:rPr>
+        <w:t xml:space="preserve">The origins of HAL trace back to the establishment of an aircraft manufacturing company in Bengaluru in 1940, which was later taken over and expanded by the Government of India. Through a series of mergers and reorganisations, the modern Hindustan Aeronautics Limited came into being and grew into a national centre of aerospace excellence. From the licensed production of aircraft in its early years, HAL progressively developed indigenous design capability, culminating in the creation of fully home-grown aircraft and helicopters. This journey mirrors the nation's aspiration for self-reliance in defence technology.</w:t>
+      </w:r>
+    </w:p>
+    <w:p>
+      <w:pPr>
+        <w:keepNext/>
+        <w:spacing w:before="160" w:after="120" w:line="360" w:lineRule="auto"/>
+        <w:jc w:val="left"/>
+      </w:pPr>
+      <w:r>
+        <w:rPr>
+          <w:rFonts w:ascii="Times New Roman" w:hAnsi="Times New Roman" w:cs="Times New Roman"/>
+          <w:b/>
+          <w:sz w:val="28"/>
+          <w:szCs w:val="28"/>
+        </w:rPr>
+        <w:t xml:space="preserve">1.7  Major Products of HAL</w:t>
+      </w:r>
+    </w:p>
+    <w:p>
+      <w:pPr>
+        <w:spacing w:before="0" w:after="120" w:line="360" w:lineRule="auto"/>
+        <w:jc w:val="both"/>
+      </w:pPr>
+      <w:r>
+        <w:rPr>
+          <w:rFonts w:ascii="Times New Roman" w:hAnsi="Times New Roman" w:cs="Times New Roman"/>
+          <w:sz w:val="24"/>
+          <w:szCs w:val="24"/>
+        </w:rPr>
+        <w:t xml:space="preserve">HAL produces a wide spectrum of aerospace products spanning fixed-wing aircraft, helicopters, engines, avionics and accessories. The major categories are summarised below.</w:t>
+      </w:r>
+    </w:p>
+    <w:p>
+      <w:pPr>
+        <w:spacing w:before="120" w:after="60" w:line="240" w:lineRule="auto"/>
+        <w:jc w:val="center"/>
+      </w:pPr>
+      <w:r>
+        <w:rPr>
+          <w:rFonts w:ascii="Times New Roman" w:hAnsi="Times New Roman" w:cs="Times New Roman"/>
+          <w:i/>
+          <w:sz w:val="22"/>
+          <w:szCs w:val="22"/>
+        </w:rPr>
+        <w:t xml:space="preserve">Table 1  Representative products of HAL</w:t>
+      </w:r>
+    </w:p>
+    <w:tbl>
+      <w:tblPr>
+        <w:tblStyle w:val="TableGrid"/>
+        <w:tblW w:w="0" w:type="auto"/>
+        <w:tblBorders>
+          <w:top w:val="single" w:sz="4" w:color="555555"/>
+          <w:left w:val="single" w:sz="4" w:color="555555"/>
+          <w:bottom w:val="single" w:sz="4" w:color="555555"/>
+          <w:right w:val="single" w:sz="4" w:color="555555"/>
+          <w:insideH w:val="single" w:sz="4" w:color="999999"/>
+          <w:insideV w:val="single" w:sz="4" w:color="999999"/>
+        </w:tblBorders>
+        <w:tblLook w:val="04A0"/>
+      </w:tblPr>
+      <w:tblGrid>
+        <w:gridCol w:w="3000"/>
+        <w:gridCol w:w="6360"/>
+      </w:tblGrid>
+      <w:tr>
+        <w:trPr>
+          <w:tblHeader/>
+        </w:trPr>
+        <w:tc>
+          <w:tcPr>
+            <w:tcW w:w="3000" w:type="dxa"/>
+            <w:shd w:val="clear" w:color="auto" w:fill="1F3864"/>
+            <w:vAlign w:val="center"/>
+          </w:tcPr>
+          <w:p>
+            <w:pPr>
+              <w:spacing w:before="20" w:after="20" w:line="240" w:lineRule="auto"/>
+              <w:jc w:val="left"/>
+            </w:pPr>
+            <w:r>
+              <w:rPr>
+                <w:rFonts w:ascii="Times New Roman" w:hAnsi="Times New Roman" w:cs="Times New Roman"/>
+                <w:b/>
+                <w:color w:val="FFFFFF"/>
+                <w:sz w:val="22"/>
+                <w:szCs w:val="22"/>
+              </w:rPr>
+              <w:t xml:space="preserve">Category</w:t>
+            </w:r>
+          </w:p>
+        </w:tc>
+        <w:tc>
+          <w:tcPr>
+            <w:tcW w:w="6360" w:type="dxa"/>
+            <w:shd w:val="clear" w:color="auto" w:fill="1F3864"/>
+            <w:vAlign w:val="center"/>
+          </w:tcPr>
+          <w:p>
+            <w:pPr>
+              <w:spacing w:before="20" w:after="20" w:line="240" w:lineRule="auto"/>
+              <w:jc w:val="left"/>
+            </w:pPr>
+            <w:r>
+              <w:rPr>
+                <w:rFonts w:ascii="Times New Roman" w:hAnsi="Times New Roman" w:cs="Times New Roman"/>
+                <w:b/>
+                <w:color w:val="FFFFFF"/>
+                <w:sz w:val="22"/>
+                <w:szCs w:val="22"/>
+              </w:rPr>
+              <w:t xml:space="preserve">Representative Products</w:t>
+            </w:r>
+          </w:p>
+        </w:tc>
+      </w:tr>
+      <w:tr>
+        <w:tc>
+          <w:tcPr>
+            <w:tcW w:w="3000" w:type="dxa"/>
+            <w:vAlign w:val="center"/>
+          </w:tcPr>
+          <w:p>
+            <w:pPr>
+              <w:spacing w:before="20" w:after="20" w:line="240" w:lineRule="auto"/>
+              <w:jc w:val="left"/>
+            </w:pPr>
+            <w:r>
+              <w:rPr>
+                <w:rFonts w:ascii="Times New Roman" w:hAnsi="Times New Roman" w:cs="Times New Roman"/>
+                <w:sz w:val="22"/>
+                <w:szCs w:val="22"/>
+              </w:rPr>
+              <w:t xml:space="preserve">Fixed-wing aircraft</w:t>
+            </w:r>
+          </w:p>
+        </w:tc>
+        <w:tc>
+          <w:tcPr>
+            <w:tcW w:w="6360" w:type="dxa"/>
+            <w:vAlign w:val="center"/>
+          </w:tcPr>
+          <w:p>
+            <w:pPr>
+              <w:spacing w:before="20" w:after="20" w:line="240" w:lineRule="auto"/>
+              <w:jc w:val="left"/>
+            </w:pPr>
+            <w:r>
+              <w:rPr>
+                <w:rFonts w:ascii="Times New Roman" w:hAnsi="Times New Roman" w:cs="Times New Roman"/>
+                <w:sz w:val="22"/>
+                <w:szCs w:val="22"/>
+              </w:rPr>
+              <w:t xml:space="preserve">Tejas Light Combat Aircraft, HTT-40 trainer, HJT-36 Sitara</w:t>
+            </w:r>
+          </w:p>
+        </w:tc>
+      </w:tr>
+      <w:tr>
+        <w:tc>
+          <w:tcPr>
+            <w:tcW w:w="3000" w:type="dxa"/>
+            <w:vAlign w:val="center"/>
+          </w:tcPr>
+          <w:p>
+            <w:pPr>
+              <w:spacing w:before="20" w:after="20" w:line="240" w:lineRule="auto"/>
+              <w:jc w:val="left"/>
+            </w:pPr>
+            <w:r>
+              <w:rPr>
+                <w:rFonts w:ascii="Times New Roman" w:hAnsi="Times New Roman" w:cs="Times New Roman"/>
+                <w:sz w:val="22"/>
+                <w:szCs w:val="22"/>
+              </w:rPr>
+              <w:t xml:space="preserve">Helicopters</w:t>
+            </w:r>
+          </w:p>
+        </w:tc>
+        <w:tc>
+          <w:tcPr>
+            <w:tcW w:w="6360" w:type="dxa"/>
+            <w:vAlign w:val="center"/>
+          </w:tcPr>
+          <w:p>
+            <w:pPr>
+              <w:spacing w:before="20" w:after="20" w:line="240" w:lineRule="auto"/>
+              <w:jc w:val="left"/>
+            </w:pPr>
+            <w:r>
+              <w:rPr>
+                <w:rFonts w:ascii="Times New Roman" w:hAnsi="Times New Roman" w:cs="Times New Roman"/>
+                <w:sz w:val="22"/>
+                <w:szCs w:val="22"/>
+              </w:rPr>
+              <w:t xml:space="preserve">ALH Dhruv, Light Combat Helicopter Prachand, Light Utility Helicopter</w:t>
+            </w:r>
+          </w:p>
+        </w:tc>
+      </w:tr>
+      <w:tr>
+        <w:tc>
+          <w:tcPr>
+            <w:tcW w:w="3000" w:type="dxa"/>
+            <w:vAlign w:val="center"/>
+          </w:tcPr>
+          <w:p>
+            <w:pPr>
+              <w:spacing w:before="20" w:after="20" w:line="240" w:lineRule="auto"/>
+              <w:jc w:val="left"/>
+            </w:pPr>
+            <w:r>
+              <w:rPr>
+                <w:rFonts w:ascii="Times New Roman" w:hAnsi="Times New Roman" w:cs="Times New Roman"/>
+                <w:sz w:val="22"/>
+                <w:szCs w:val="22"/>
+              </w:rPr>
+              <w:t xml:space="preserve">Engines</w:t>
+            </w:r>
+          </w:p>
+        </w:tc>
+        <w:tc>
+          <w:tcPr>
+            <w:tcW w:w="6360" w:type="dxa"/>
+            <w:vAlign w:val="center"/>
+          </w:tcPr>
+          <w:p>
+            <w:pPr>
+              <w:spacing w:before="20" w:after="20" w:line="240" w:lineRule="auto"/>
+              <w:jc w:val="left"/>
+            </w:pPr>
+            <w:r>
+              <w:rPr>
+                <w:rFonts w:ascii="Times New Roman" w:hAnsi="Times New Roman" w:cs="Times New Roman"/>
+                <w:sz w:val="22"/>
+                <w:szCs w:val="22"/>
+              </w:rPr>
+              <w:t xml:space="preserve">Indigenous and licence-produced aero-engines</w:t>
+            </w:r>
+          </w:p>
+        </w:tc>
+      </w:tr>
+      <w:tr>
+        <w:tc>
+          <w:tcPr>
+            <w:tcW w:w="3000" w:type="dxa"/>
+            <w:vAlign w:val="center"/>
+          </w:tcPr>
+          <w:p>
+            <w:pPr>
+              <w:spacing w:before="20" w:after="20" w:line="240" w:lineRule="auto"/>
+              <w:jc w:val="left"/>
+            </w:pPr>
+            <w:r>
+              <w:rPr>
+                <w:rFonts w:ascii="Times New Roman" w:hAnsi="Times New Roman" w:cs="Times New Roman"/>
+                <w:sz w:val="22"/>
+                <w:szCs w:val="22"/>
+              </w:rPr>
+              <w:t xml:space="preserve">Avionics &amp; systems</w:t>
+            </w:r>
+          </w:p>
+        </w:tc>
+        <w:tc>
+          <w:tcPr>
+            <w:tcW w:w="6360" w:type="dxa"/>
+            <w:vAlign w:val="center"/>
+          </w:tcPr>
+          <w:p>
+            <w:pPr>
+              <w:spacing w:before="20" w:after="20" w:line="240" w:lineRule="auto"/>
+              <w:jc w:val="left"/>
+            </w:pPr>
+            <w:r>
+              <w:rPr>
+                <w:rFonts w:ascii="Times New Roman" w:hAnsi="Times New Roman" w:cs="Times New Roman"/>
+                <w:sz w:val="22"/>
+                <w:szCs w:val="22"/>
+              </w:rPr>
+              <w:t xml:space="preserve">Navigation, communication, mission and display systems</w:t>
+            </w:r>
+          </w:p>
+        </w:tc>
+      </w:tr>
+    </w:tbl>
+    <w:p>
+      <w:pPr>
+        <w:spacing w:before="0" w:after="60" w:line="120" w:lineRule="auto"/>
+        <w:jc w:val="both"/>
+      </w:pPr>
+      <w:r>
+        <w:rPr>
+          <w:rFonts w:ascii="Times New Roman" w:hAnsi="Times New Roman" w:cs="Times New Roman"/>
+          <w:sz w:val="12"/>
+          <w:szCs w:val="12"/>
+        </w:rPr>
+        <w:t xml:space="preserve"/>
+      </w:r>
+    </w:p>
+    <w:p>
+      <w:pPr>
+        <w:keepNext/>
+        <w:spacing w:before="160" w:after="120" w:line="360" w:lineRule="auto"/>
+        <w:jc w:val="left"/>
+      </w:pPr>
+      <w:r>
+        <w:rPr>
+          <w:rFonts w:ascii="Times New Roman" w:hAnsi="Times New Roman" w:cs="Times New Roman"/>
+          <w:b/>
+          <w:sz w:val="28"/>
+          <w:szCs w:val="28"/>
+        </w:rPr>
+        <w:t xml:space="preserve">1.8  Achievements and National Importance</w:t>
+      </w:r>
+    </w:p>
+    <w:p>
+      <w:pPr>
+        <w:spacing w:before="0" w:after="120" w:line="360" w:lineRule="auto"/>
+        <w:ind w:firstLine="360"/>
+        <w:jc w:val="both"/>
+      </w:pPr>
+      <w:r>
+        <w:rPr>
+          <w:rFonts w:ascii="Times New Roman" w:hAnsi="Times New Roman" w:cs="Times New Roman"/>
+          <w:sz w:val="24"/>
+          <w:szCs w:val="24"/>
+        </w:rPr>
+        <w:t xml:space="preserve">HAL has achieved several milestones that underline its national importance. It has indigenously designed and flight-tested fighter aircraft and helicopters, supported every major operation of the Indian armed forces with maintenance and overhaul services, and contributed to the national space programme through the manufacture of structures and systems for launch vehicles. These achievements have established HAL as a cornerstone of the nation's strategic capability and a symbol of indigenous technological strength.</w:t>
+      </w:r>
+    </w:p>
+    <w:p>
+      <w:pPr>
+        <w:keepNext/>
+        <w:spacing w:before="160" w:after="120" w:line="360" w:lineRule="auto"/>
+        <w:jc w:val="left"/>
+      </w:pPr>
+      <w:r>
+        <w:rPr>
+          <w:rFonts w:ascii="Times New Roman" w:hAnsi="Times New Roman" w:cs="Times New Roman"/>
+          <w:b/>
+          <w:sz w:val="28"/>
+          <w:szCs w:val="28"/>
+        </w:rPr>
+        <w:t xml:space="preserve">1.9  Mission and Vision</w:t>
+      </w:r>
+    </w:p>
+    <w:p>
+      <w:pPr>
+        <w:spacing w:before="0" w:after="120" w:line="360" w:lineRule="auto"/>
+        <w:ind w:firstLine="360"/>
+        <w:jc w:val="both"/>
+      </w:pPr>
+      <w:r>
+        <w:rPr>
+          <w:rFonts w:ascii="Times New Roman" w:hAnsi="Times New Roman" w:cs="Times New Roman"/>
+          <w:sz w:val="24"/>
+          <w:szCs w:val="24"/>
+        </w:rPr>
+        <w:t xml:space="preserve">The mission of HAL is to become a globally competitive aerospace and defence organisation by achieving self-reliance in the design, development and manufacture of aircraft and related systems. Its vision emphasises indigenous capability, technological excellence and customer satisfaction. Looking ahead, HAL continues to invest in next-generation platforms, unmanned systems, advanced avionics and digital engineering, positioning itself for the future of aerospace. It was within this forward-looking and disciplined environment that the present internship was undertaken.</w:t>
+      </w:r>
+    </w:p>
+    <w:p>
       <w:r>
         <w:br w:type="page"/>
       </w:r>
@@ -2915,7 +3305,7 @@
           <w:sz w:val="22"/>
           <w:szCs w:val="22"/>
         </w:rPr>
-        <w:t xml:space="preserve">Table 1  Internship schedule (representative)</w:t>
+        <w:t xml:space="preserve">Table 2  Internship schedule (representative)</w:t>
       </w:r>
     </w:p>
     <w:tbl>
@@ -3647,6 +4037,68 @@
       </w:r>
     </w:p>
     <w:p>
+      <w:pPr>
+        <w:keepNext/>
+        <w:spacing w:before="160" w:after="120" w:line="360" w:lineRule="auto"/>
+        <w:jc w:val="left"/>
+      </w:pPr>
+      <w:r>
+        <w:rPr>
+          <w:rFonts w:ascii="Times New Roman" w:hAnsi="Times New Roman" w:cs="Times New Roman"/>
+          <w:b/>
+          <w:sz w:val="28"/>
+          <w:szCs w:val="28"/>
+        </w:rPr>
+        <w:t xml:space="preserve">2.8  Skills Applied during the Activities</w:t>
+      </w:r>
+    </w:p>
+    <w:p>
+      <w:pPr>
+        <w:spacing w:before="0" w:after="120" w:line="360" w:lineRule="auto"/>
+        <w:ind w:firstLine="360"/>
+        <w:jc w:val="both"/>
+      </w:pPr>
+      <w:r>
+        <w:rPr>
+          <w:rFonts w:ascii="Times New Roman" w:hAnsi="Times New Roman" w:cs="Times New Roman"/>
+          <w:sz w:val="24"/>
+          <w:szCs w:val="24"/>
+        </w:rPr>
+        <w:t xml:space="preserve">Each activity called upon and strengthened a particular set of skills. The observation phase developed attentiveness and the ability to understand a complex working environment quickly. Requirement analysis exercised analytical thinking and clear communication. Interface design drew on creativity and an understanding of usability, while implementation demanded programming proficiency and logical reasoning. Testing required patience and rigour, and documentation called for clarity in technical writing. Together these activities provided a rounded experience of the complete software-development process.</w:t>
+      </w:r>
+    </w:p>
+    <w:p>
+      <w:pPr>
+        <w:keepNext/>
+        <w:spacing w:before="160" w:after="120" w:line="360" w:lineRule="auto"/>
+        <w:jc w:val="left"/>
+      </w:pPr>
+      <w:r>
+        <w:rPr>
+          <w:rFonts w:ascii="Times New Roman" w:hAnsi="Times New Roman" w:cs="Times New Roman"/>
+          <w:b/>
+          <w:sz w:val="28"/>
+          <w:szCs w:val="28"/>
+        </w:rPr>
+        <w:t xml:space="preserve">2.9  Coordination and Professional Conduct</w:t>
+      </w:r>
+    </w:p>
+    <w:p>
+      <w:pPr>
+        <w:spacing w:before="0" w:after="120" w:line="360" w:lineRule="auto"/>
+        <w:ind w:firstLine="360"/>
+        <w:jc w:val="both"/>
+      </w:pPr>
+      <w:r>
+        <w:rPr>
+          <w:rFonts w:ascii="Times New Roman" w:hAnsi="Times New Roman" w:cs="Times New Roman"/>
+          <w:sz w:val="24"/>
+          <w:szCs w:val="24"/>
+        </w:rPr>
+        <w:t xml:space="preserve">Throughout the internship, regular interaction with the mentor and observation of the wider team instilled an appreciation of professional conduct. Punctuality, respect for safety protocols, careful handling of information and a willingness to learn were as important as technical ability. These aspects of professional behaviour, absorbed gradually over the course of the internship, are among its most lasting benefits.</w:t>
+      </w:r>
+    </w:p>
+    <w:p>
       <w:r>
         <w:br w:type="page"/>
       </w:r>
@@ -3725,7 +4177,7 @@
           <w:sz w:val="22"/>
           <w:szCs w:val="22"/>
         </w:rPr>
-        <w:t xml:space="preserve">Table 2  Hardware requirements</w:t>
+        <w:t xml:space="preserve">Table 3  Hardware requirements</w:t>
       </w:r>
     </w:p>
     <w:tbl>
@@ -4174,7 +4626,7 @@
           <w:sz w:val="22"/>
           <w:szCs w:val="22"/>
         </w:rPr>
-        <w:t xml:space="preserve">Table 3  Software requirements</w:t>
+        <w:t xml:space="preserve">Table 4  Software requirements</w:t>
       </w:r>
     </w:p>
     <w:tbl>
@@ -4534,6 +4986,231 @@
       </w:r>
     </w:p>
     <w:p>
+      <w:pPr>
+        <w:keepNext/>
+        <w:spacing w:before="160" w:after="120" w:line="360" w:lineRule="auto"/>
+        <w:jc w:val="left"/>
+      </w:pPr>
+      <w:r>
+        <w:rPr>
+          <w:rFonts w:ascii="Times New Roman" w:hAnsi="Times New Roman" w:cs="Times New Roman"/>
+          <w:b/>
+          <w:sz w:val="28"/>
+          <w:szCs w:val="28"/>
+        </w:rPr>
+        <w:t xml:space="preserve">3.6  Functional Requirements</w:t>
+      </w:r>
+    </w:p>
+    <w:p>
+      <w:pPr>
+        <w:spacing w:before="0" w:after="120" w:line="360" w:lineRule="auto"/>
+        <w:jc w:val="both"/>
+      </w:pPr>
+      <w:r>
+        <w:rPr>
+          <w:rFonts w:ascii="Times New Roman" w:hAnsi="Times New Roman" w:cs="Times New Roman"/>
+          <w:sz w:val="24"/>
+          <w:szCs w:val="24"/>
+        </w:rPr>
+        <w:t xml:space="preserve">The functional requirements describe what the system must do. These were established during requirement analysis and guided the implementation.</w:t>
+      </w:r>
+    </w:p>
+    <w:p>
+      <w:pPr>
+        <w:spacing w:before="0" w:after="60" w:line="360" w:lineRule="auto"/>
+        <w:ind w:left="540" w:hanging="270"/>
+        <w:jc w:val="both"/>
+      </w:pPr>
+      <w:r>
+        <w:rPr>
+          <w:rFonts w:ascii="Times New Roman" w:hAnsi="Times New Roman" w:cs="Times New Roman"/>
+          <w:sz w:val="24"/>
+          <w:szCs w:val="24"/>
+        </w:rPr>
+        <w:t xml:space="preserve">•  Authenticate the operator before granting access to the monitoring functions.</w:t>
+      </w:r>
+    </w:p>
+    <w:p>
+      <w:pPr>
+        <w:spacing w:before="0" w:after="60" w:line="360" w:lineRule="auto"/>
+        <w:ind w:left="540" w:hanging="270"/>
+        <w:jc w:val="both"/>
+      </w:pPr>
+      <w:r>
+        <w:rPr>
+          <w:rFonts w:ascii="Times New Roman" w:hAnsi="Times New Roman" w:cs="Times New Roman"/>
+          <w:sz w:val="24"/>
+          <w:szCs w:val="24"/>
+        </w:rPr>
+        <w:t xml:space="preserve">•  Simulate and process the telemetry of multiple aircraft in real time.</w:t>
+      </w:r>
+    </w:p>
+    <w:p>
+      <w:pPr>
+        <w:spacing w:before="0" w:after="60" w:line="360" w:lineRule="auto"/>
+        <w:ind w:left="540" w:hanging="270"/>
+        <w:jc w:val="both"/>
+      </w:pPr>
+      <w:r>
+        <w:rPr>
+          <w:rFonts w:ascii="Times New Roman" w:hAnsi="Times New Roman" w:cs="Times New Roman"/>
+          <w:sz w:val="24"/>
+          <w:szCs w:val="24"/>
+        </w:rPr>
+        <w:t xml:space="preserve">•  Display aircraft positions on a live map and on a radar scope.</w:t>
+      </w:r>
+    </w:p>
+    <w:p>
+      <w:pPr>
+        <w:spacing w:before="0" w:after="60" w:line="360" w:lineRule="auto"/>
+        <w:ind w:left="540" w:hanging="270"/>
+        <w:jc w:val="both"/>
+      </w:pPr>
+      <w:r>
+        <w:rPr>
+          <w:rFonts w:ascii="Times New Roman" w:hAnsi="Times New Roman" w:cs="Times New Roman"/>
+          <w:sz w:val="24"/>
+          <w:szCs w:val="24"/>
+        </w:rPr>
+        <w:t xml:space="preserve">•  Raise and record alerts when monitored parameters cross defined thresholds.</w:t>
+      </w:r>
+    </w:p>
+    <w:p>
+      <w:pPr>
+        <w:spacing w:before="0" w:after="60" w:line="360" w:lineRule="auto"/>
+        <w:ind w:left="540" w:hanging="270"/>
+        <w:jc w:val="both"/>
+      </w:pPr>
+      <w:r>
+        <w:rPr>
+          <w:rFonts w:ascii="Times New Roman" w:hAnsi="Times New Roman" w:cs="Times New Roman"/>
+          <w:sz w:val="24"/>
+          <w:szCs w:val="24"/>
+        </w:rPr>
+        <w:t xml:space="preserve">•  Produce statistical summaries and charts from the processed telemetry.</w:t>
+      </w:r>
+    </w:p>
+    <w:p>
+      <w:pPr>
+        <w:spacing w:before="0" w:after="60" w:line="360" w:lineRule="auto"/>
+        <w:ind w:left="540" w:hanging="270"/>
+        <w:jc w:val="both"/>
+      </w:pPr>
+      <w:r>
+        <w:rPr>
+          <w:rFonts w:ascii="Times New Roman" w:hAnsi="Times New Roman" w:cs="Times New Roman"/>
+          <w:sz w:val="24"/>
+          <w:szCs w:val="24"/>
+        </w:rPr>
+        <w:t xml:space="preserve">•  Allow aircraft to be registered or removed and settings to be configured.</w:t>
+      </w:r>
+    </w:p>
+    <w:p>
+      <w:pPr>
+        <w:keepNext/>
+        <w:spacing w:before="160" w:after="120" w:line="360" w:lineRule="auto"/>
+        <w:jc w:val="left"/>
+      </w:pPr>
+      <w:r>
+        <w:rPr>
+          <w:rFonts w:ascii="Times New Roman" w:hAnsi="Times New Roman" w:cs="Times New Roman"/>
+          <w:b/>
+          <w:sz w:val="28"/>
+          <w:szCs w:val="28"/>
+        </w:rPr>
+        <w:t xml:space="preserve">3.7  Non-Functional Requirements</w:t>
+      </w:r>
+    </w:p>
+    <w:p>
+      <w:pPr>
+        <w:spacing w:before="0" w:after="120" w:line="360" w:lineRule="auto"/>
+        <w:jc w:val="both"/>
+      </w:pPr>
+      <w:r>
+        <w:rPr>
+          <w:rFonts w:ascii="Times New Roman" w:hAnsi="Times New Roman" w:cs="Times New Roman"/>
+          <w:sz w:val="24"/>
+          <w:szCs w:val="24"/>
+        </w:rPr>
+        <w:t xml:space="preserve">The non-functional requirements describe the qualities the system must possess.</w:t>
+      </w:r>
+    </w:p>
+    <w:p>
+      <w:pPr>
+        <w:spacing w:before="0" w:after="60" w:line="360" w:lineRule="auto"/>
+        <w:ind w:left="540" w:hanging="270"/>
+        <w:jc w:val="both"/>
+      </w:pPr>
+      <w:r>
+        <w:rPr>
+          <w:rFonts w:ascii="Times New Roman" w:hAnsi="Times New Roman" w:cs="Times New Roman"/>
+          <w:sz w:val="24"/>
+          <w:szCs w:val="24"/>
+        </w:rPr>
+        <w:t xml:space="preserve">•  Usability — a clear, professional and intuitive interface.</w:t>
+      </w:r>
+    </w:p>
+    <w:p>
+      <w:pPr>
+        <w:spacing w:before="0" w:after="60" w:line="360" w:lineRule="auto"/>
+        <w:ind w:left="540" w:hanging="270"/>
+        <w:jc w:val="both"/>
+      </w:pPr>
+      <w:r>
+        <w:rPr>
+          <w:rFonts w:ascii="Times New Roman" w:hAnsi="Times New Roman" w:cs="Times New Roman"/>
+          <w:sz w:val="24"/>
+          <w:szCs w:val="24"/>
+        </w:rPr>
+        <w:t xml:space="preserve">•  Performance — smooth, responsive updates of the visualisations.</w:t>
+      </w:r>
+    </w:p>
+    <w:p>
+      <w:pPr>
+        <w:spacing w:before="0" w:after="60" w:line="360" w:lineRule="auto"/>
+        <w:ind w:left="540" w:hanging="270"/>
+        <w:jc w:val="both"/>
+      </w:pPr>
+      <w:r>
+        <w:rPr>
+          <w:rFonts w:ascii="Times New Roman" w:hAnsi="Times New Roman" w:cs="Times New Roman"/>
+          <w:sz w:val="24"/>
+          <w:szCs w:val="24"/>
+        </w:rPr>
+        <w:t xml:space="preserve">•  Portability — operation in any modern browser on any operating system.</w:t>
+      </w:r>
+    </w:p>
+    <w:p>
+      <w:pPr>
+        <w:spacing w:before="0" w:after="60" w:line="360" w:lineRule="auto"/>
+        <w:ind w:left="540" w:hanging="270"/>
+        <w:jc w:val="both"/>
+      </w:pPr>
+      <w:r>
+        <w:rPr>
+          <w:rFonts w:ascii="Times New Roman" w:hAnsi="Times New Roman" w:cs="Times New Roman"/>
+          <w:sz w:val="24"/>
+          <w:szCs w:val="24"/>
+        </w:rPr>
+        <w:t xml:space="preserve">•  Maintainability — clean, modular and well-documented code.</w:t>
+      </w:r>
+    </w:p>
+    <w:p>
+      <w:pPr>
+        <w:spacing w:before="0" w:after="60" w:line="360" w:lineRule="auto"/>
+        <w:ind w:left="540" w:hanging="270"/>
+        <w:jc w:val="both"/>
+      </w:pPr>
+      <w:r>
+        <w:rPr>
+          <w:rFonts w:ascii="Times New Roman" w:hAnsi="Times New Roman" w:cs="Times New Roman"/>
+          <w:sz w:val="24"/>
+          <w:szCs w:val="24"/>
+        </w:rPr>
+        <w:t xml:space="preserve">•  Reliability — consistent and correct processing of the telemetry.</w:t>
+      </w:r>
+    </w:p>
+    <w:p>
       <w:r>
         <w:br w:type="page"/>
       </w:r>
@@ -4782,7 +5459,7 @@
           <w:sz w:val="22"/>
           <w:szCs w:val="22"/>
         </w:rPr>
-        <w:t xml:space="preserve">Table 4  Project deliverables</w:t>
+        <w:t xml:space="preserve">Table 5  Project deliverables</w:t>
       </w:r>
     </w:p>
     <w:tbl>
@@ -4969,6 +5646,435 @@
       </w:r>
     </w:p>
     <w:p>
+      <w:pPr>
+        <w:keepNext/>
+        <w:spacing w:before="160" w:after="120" w:line="360" w:lineRule="auto"/>
+        <w:jc w:val="left"/>
+      </w:pPr>
+      <w:r>
+        <w:rPr>
+          <w:rFonts w:ascii="Times New Roman" w:hAnsi="Times New Roman" w:cs="Times New Roman"/>
+          <w:b/>
+          <w:sz w:val="28"/>
+          <w:szCs w:val="28"/>
+        </w:rPr>
+        <w:t xml:space="preserve">4.8  File and Folder Organisation</w:t>
+      </w:r>
+    </w:p>
+    <w:p>
+      <w:pPr>
+        <w:spacing w:before="0" w:after="120" w:line="360" w:lineRule="auto"/>
+        <w:ind w:firstLine="360"/>
+        <w:jc w:val="both"/>
+      </w:pPr>
+      <w:r>
+        <w:rPr>
+          <w:rFonts w:ascii="Times New Roman" w:hAnsi="Times New Roman" w:cs="Times New Roman"/>
+          <w:sz w:val="24"/>
+          <w:szCs w:val="24"/>
+        </w:rPr>
+        <w:t xml:space="preserve">Good organisation of files and folders is an often-overlooked but important tool of development. The project was arranged so that the application files, the report and the supporting scripts each occupied a clear location. A logical structure makes a project easier to navigate, to maintain and to hand over, and learning to organise work in this way is part of professional discipline.</w:t>
+      </w:r>
+    </w:p>
+    <w:p>
+      <w:pPr>
+        <w:keepNext/>
+        <w:spacing w:before="160" w:after="120" w:line="360" w:lineRule="auto"/>
+        <w:jc w:val="left"/>
+      </w:pPr>
+      <w:r>
+        <w:rPr>
+          <w:rFonts w:ascii="Times New Roman" w:hAnsi="Times New Roman" w:cs="Times New Roman"/>
+          <w:b/>
+          <w:sz w:val="28"/>
+          <w:szCs w:val="28"/>
+        </w:rPr>
+        <w:t xml:space="preserve">4.9  The Browser Console as a Testing Aid</w:t>
+      </w:r>
+    </w:p>
+    <w:p>
+      <w:pPr>
+        <w:spacing w:before="0" w:after="120" w:line="360" w:lineRule="auto"/>
+        <w:ind w:firstLine="360"/>
+        <w:jc w:val="both"/>
+      </w:pPr>
+      <w:r>
+        <w:rPr>
+          <w:rFonts w:ascii="Times New Roman" w:hAnsi="Times New Roman" w:cs="Times New Roman"/>
+          <w:sz w:val="24"/>
+          <w:szCs w:val="24"/>
+        </w:rPr>
+        <w:t xml:space="preserve">The browser console served as a simple but effective testing aid throughout development. By printing intermediate values and observing messages, it was possible to confirm that the processing logic behaved as intended and to locate the source of errors quickly. This lightweight approach to testing complemented the more structured testing carried out on the completed modules.</w:t>
+      </w:r>
+    </w:p>
+    <w:p>
+      <w:pPr>
+        <w:keepNext/>
+        <w:spacing w:before="160" w:after="120" w:line="360" w:lineRule="auto"/>
+        <w:jc w:val="left"/>
+      </w:pPr>
+      <w:r>
+        <w:rPr>
+          <w:rFonts w:ascii="Times New Roman" w:hAnsi="Times New Roman" w:cs="Times New Roman"/>
+          <w:b/>
+          <w:sz w:val="28"/>
+          <w:szCs w:val="28"/>
+        </w:rPr>
+        <w:t xml:space="preserve">4.10  Summary of Tools</w:t>
+      </w:r>
+    </w:p>
+    <w:p>
+      <w:pPr>
+        <w:spacing w:before="120" w:after="60" w:line="240" w:lineRule="auto"/>
+        <w:jc w:val="center"/>
+      </w:pPr>
+      <w:r>
+        <w:rPr>
+          <w:rFonts w:ascii="Times New Roman" w:hAnsi="Times New Roman" w:cs="Times New Roman"/>
+          <w:i/>
+          <w:sz w:val="22"/>
+          <w:szCs w:val="22"/>
+        </w:rPr>
+        <w:t xml:space="preserve">Table 6  Summary of tools used during the internship</w:t>
+      </w:r>
+    </w:p>
+    <w:tbl>
+      <w:tblPr>
+        <w:tblStyle w:val="TableGrid"/>
+        <w:tblW w:w="0" w:type="auto"/>
+        <w:tblBorders>
+          <w:top w:val="single" w:sz="4" w:color="555555"/>
+          <w:left w:val="single" w:sz="4" w:color="555555"/>
+          <w:bottom w:val="single" w:sz="4" w:color="555555"/>
+          <w:right w:val="single" w:sz="4" w:color="555555"/>
+          <w:insideH w:val="single" w:sz="4" w:color="999999"/>
+          <w:insideV w:val="single" w:sz="4" w:color="999999"/>
+        </w:tblBorders>
+        <w:tblLook w:val="04A0"/>
+      </w:tblPr>
+      <w:tblGrid>
+        <w:gridCol w:w="3200"/>
+        <w:gridCol w:w="6160"/>
+      </w:tblGrid>
+      <w:tr>
+        <w:trPr>
+          <w:tblHeader/>
+        </w:trPr>
+        <w:tc>
+          <w:tcPr>
+            <w:tcW w:w="3200" w:type="dxa"/>
+            <w:shd w:val="clear" w:color="auto" w:fill="1F3864"/>
+            <w:vAlign w:val="center"/>
+          </w:tcPr>
+          <w:p>
+            <w:pPr>
+              <w:spacing w:before="20" w:after="20" w:line="240" w:lineRule="auto"/>
+              <w:jc w:val="left"/>
+            </w:pPr>
+            <w:r>
+              <w:rPr>
+                <w:rFonts w:ascii="Times New Roman" w:hAnsi="Times New Roman" w:cs="Times New Roman"/>
+                <w:b/>
+                <w:color w:val="FFFFFF"/>
+                <w:sz w:val="22"/>
+                <w:szCs w:val="22"/>
+              </w:rPr>
+              <w:t xml:space="preserve">Tool</w:t>
+            </w:r>
+          </w:p>
+        </w:tc>
+        <w:tc>
+          <w:tcPr>
+            <w:tcW w:w="6160" w:type="dxa"/>
+            <w:shd w:val="clear" w:color="auto" w:fill="1F3864"/>
+            <w:vAlign w:val="center"/>
+          </w:tcPr>
+          <w:p>
+            <w:pPr>
+              <w:spacing w:before="20" w:after="20" w:line="240" w:lineRule="auto"/>
+              <w:jc w:val="left"/>
+            </w:pPr>
+            <w:r>
+              <w:rPr>
+                <w:rFonts w:ascii="Times New Roman" w:hAnsi="Times New Roman" w:cs="Times New Roman"/>
+                <w:b/>
+                <w:color w:val="FFFFFF"/>
+                <w:sz w:val="22"/>
+                <w:szCs w:val="22"/>
+              </w:rPr>
+              <w:t xml:space="preserve">Purpose</w:t>
+            </w:r>
+          </w:p>
+        </w:tc>
+      </w:tr>
+      <w:tr>
+        <w:tc>
+          <w:tcPr>
+            <w:tcW w:w="3200" w:type="dxa"/>
+            <w:vAlign w:val="center"/>
+          </w:tcPr>
+          <w:p>
+            <w:pPr>
+              <w:spacing w:before="20" w:after="20" w:line="240" w:lineRule="auto"/>
+              <w:jc w:val="left"/>
+            </w:pPr>
+            <w:r>
+              <w:rPr>
+                <w:rFonts w:ascii="Times New Roman" w:hAnsi="Times New Roman" w:cs="Times New Roman"/>
+                <w:sz w:val="22"/>
+                <w:szCs w:val="22"/>
+              </w:rPr>
+              <w:t xml:space="preserve">Visual Studio Code</w:t>
+            </w:r>
+          </w:p>
+        </w:tc>
+        <w:tc>
+          <w:tcPr>
+            <w:tcW w:w="6160" w:type="dxa"/>
+            <w:vAlign w:val="center"/>
+          </w:tcPr>
+          <w:p>
+            <w:pPr>
+              <w:spacing w:before="20" w:after="20" w:line="240" w:lineRule="auto"/>
+              <w:jc w:val="left"/>
+            </w:pPr>
+            <w:r>
+              <w:rPr>
+                <w:rFonts w:ascii="Times New Roman" w:hAnsi="Times New Roman" w:cs="Times New Roman"/>
+                <w:sz w:val="22"/>
+                <w:szCs w:val="22"/>
+              </w:rPr>
+              <w:t xml:space="preserve">Writing and editing the source code</w:t>
+            </w:r>
+          </w:p>
+        </w:tc>
+      </w:tr>
+      <w:tr>
+        <w:tc>
+          <w:tcPr>
+            <w:tcW w:w="3200" w:type="dxa"/>
+            <w:vAlign w:val="center"/>
+          </w:tcPr>
+          <w:p>
+            <w:pPr>
+              <w:spacing w:before="20" w:after="20" w:line="240" w:lineRule="auto"/>
+              <w:jc w:val="left"/>
+            </w:pPr>
+            <w:r>
+              <w:rPr>
+                <w:rFonts w:ascii="Times New Roman" w:hAnsi="Times New Roman" w:cs="Times New Roman"/>
+                <w:sz w:val="22"/>
+                <w:szCs w:val="22"/>
+              </w:rPr>
+              <w:t xml:space="preserve">Web Browser</w:t>
+            </w:r>
+          </w:p>
+        </w:tc>
+        <w:tc>
+          <w:tcPr>
+            <w:tcW w:w="6160" w:type="dxa"/>
+            <w:vAlign w:val="center"/>
+          </w:tcPr>
+          <w:p>
+            <w:pPr>
+              <w:spacing w:before="20" w:after="20" w:line="240" w:lineRule="auto"/>
+              <w:jc w:val="left"/>
+            </w:pPr>
+            <w:r>
+              <w:rPr>
+                <w:rFonts w:ascii="Times New Roman" w:hAnsi="Times New Roman" w:cs="Times New Roman"/>
+                <w:sz w:val="22"/>
+                <w:szCs w:val="22"/>
+              </w:rPr>
+              <w:t xml:space="preserve">Running and demonstrating the application</w:t>
+            </w:r>
+          </w:p>
+        </w:tc>
+      </w:tr>
+      <w:tr>
+        <w:tc>
+          <w:tcPr>
+            <w:tcW w:w="3200" w:type="dxa"/>
+            <w:vAlign w:val="center"/>
+          </w:tcPr>
+          <w:p>
+            <w:pPr>
+              <w:spacing w:before="20" w:after="20" w:line="240" w:lineRule="auto"/>
+              <w:jc w:val="left"/>
+            </w:pPr>
+            <w:r>
+              <w:rPr>
+                <w:rFonts w:ascii="Times New Roman" w:hAnsi="Times New Roman" w:cs="Times New Roman"/>
+                <w:sz w:val="22"/>
+                <w:szCs w:val="22"/>
+              </w:rPr>
+              <w:t xml:space="preserve">Browser Developer Tools</w:t>
+            </w:r>
+          </w:p>
+        </w:tc>
+        <w:tc>
+          <w:tcPr>
+            <w:tcW w:w="6160" w:type="dxa"/>
+            <w:vAlign w:val="center"/>
+          </w:tcPr>
+          <w:p>
+            <w:pPr>
+              <w:spacing w:before="20" w:after="20" w:line="240" w:lineRule="auto"/>
+              <w:jc w:val="left"/>
+            </w:pPr>
+            <w:r>
+              <w:rPr>
+                <w:rFonts w:ascii="Times New Roman" w:hAnsi="Times New Roman" w:cs="Times New Roman"/>
+                <w:sz w:val="22"/>
+                <w:szCs w:val="22"/>
+              </w:rPr>
+              <w:t xml:space="preserve">Inspecting, styling and debugging</w:t>
+            </w:r>
+          </w:p>
+        </w:tc>
+      </w:tr>
+      <w:tr>
+        <w:tc>
+          <w:tcPr>
+            <w:tcW w:w="3200" w:type="dxa"/>
+            <w:vAlign w:val="center"/>
+          </w:tcPr>
+          <w:p>
+            <w:pPr>
+              <w:spacing w:before="20" w:after="20" w:line="240" w:lineRule="auto"/>
+              <w:jc w:val="left"/>
+            </w:pPr>
+            <w:r>
+              <w:rPr>
+                <w:rFonts w:ascii="Times New Roman" w:hAnsi="Times New Roman" w:cs="Times New Roman"/>
+                <w:sz w:val="22"/>
+                <w:szCs w:val="22"/>
+              </w:rPr>
+              <w:t xml:space="preserve">Git</w:t>
+            </w:r>
+          </w:p>
+        </w:tc>
+        <w:tc>
+          <w:tcPr>
+            <w:tcW w:w="6160" w:type="dxa"/>
+            <w:vAlign w:val="center"/>
+          </w:tcPr>
+          <w:p>
+            <w:pPr>
+              <w:spacing w:before="20" w:after="20" w:line="240" w:lineRule="auto"/>
+              <w:jc w:val="left"/>
+            </w:pPr>
+            <w:r>
+              <w:rPr>
+                <w:rFonts w:ascii="Times New Roman" w:hAnsi="Times New Roman" w:cs="Times New Roman"/>
+                <w:sz w:val="22"/>
+                <w:szCs w:val="22"/>
+              </w:rPr>
+              <w:t xml:space="preserve">Version control of the source code</w:t>
+            </w:r>
+          </w:p>
+        </w:tc>
+      </w:tr>
+      <w:tr>
+        <w:tc>
+          <w:tcPr>
+            <w:tcW w:w="3200" w:type="dxa"/>
+            <w:vAlign w:val="center"/>
+          </w:tcPr>
+          <w:p>
+            <w:pPr>
+              <w:spacing w:before="20" w:after="20" w:line="240" w:lineRule="auto"/>
+              <w:jc w:val="left"/>
+            </w:pPr>
+            <w:r>
+              <w:rPr>
+                <w:rFonts w:ascii="Times New Roman" w:hAnsi="Times New Roman" w:cs="Times New Roman"/>
+                <w:sz w:val="22"/>
+                <w:szCs w:val="22"/>
+              </w:rPr>
+              <w:t xml:space="preserve">HTML Canvas</w:t>
+            </w:r>
+          </w:p>
+        </w:tc>
+        <w:tc>
+          <w:tcPr>
+            <w:tcW w:w="6160" w:type="dxa"/>
+            <w:vAlign w:val="center"/>
+          </w:tcPr>
+          <w:p>
+            <w:pPr>
+              <w:spacing w:before="20" w:after="20" w:line="240" w:lineRule="auto"/>
+              <w:jc w:val="left"/>
+            </w:pPr>
+            <w:r>
+              <w:rPr>
+                <w:rFonts w:ascii="Times New Roman" w:hAnsi="Times New Roman" w:cs="Times New Roman"/>
+                <w:sz w:val="22"/>
+                <w:szCs w:val="22"/>
+              </w:rPr>
+              <w:t xml:space="preserve">Programmatic graphical drawing</w:t>
+            </w:r>
+          </w:p>
+        </w:tc>
+      </w:tr>
+      <w:tr>
+        <w:tc>
+          <w:tcPr>
+            <w:tcW w:w="3200" w:type="dxa"/>
+            <w:vAlign w:val="center"/>
+          </w:tcPr>
+          <w:p>
+            <w:pPr>
+              <w:spacing w:before="20" w:after="20" w:line="240" w:lineRule="auto"/>
+              <w:jc w:val="left"/>
+            </w:pPr>
+            <w:r>
+              <w:rPr>
+                <w:rFonts w:ascii="Times New Roman" w:hAnsi="Times New Roman" w:cs="Times New Roman"/>
+                <w:sz w:val="22"/>
+                <w:szCs w:val="22"/>
+              </w:rPr>
+              <w:t xml:space="preserve">Diagramming / wireframes</w:t>
+            </w:r>
+          </w:p>
+        </w:tc>
+        <w:tc>
+          <w:tcPr>
+            <w:tcW w:w="6160" w:type="dxa"/>
+            <w:vAlign w:val="center"/>
+          </w:tcPr>
+          <w:p>
+            <w:pPr>
+              <w:spacing w:before="20" w:after="20" w:line="240" w:lineRule="auto"/>
+              <w:jc w:val="left"/>
+            </w:pPr>
+            <w:r>
+              <w:rPr>
+                <w:rFonts w:ascii="Times New Roman" w:hAnsi="Times New Roman" w:cs="Times New Roman"/>
+                <w:sz w:val="22"/>
+                <w:szCs w:val="22"/>
+              </w:rPr>
+              <w:t xml:space="preserve">Planning the layout and architecture</w:t>
+            </w:r>
+          </w:p>
+        </w:tc>
+      </w:tr>
+    </w:tbl>
+    <w:p>
+      <w:pPr>
+        <w:spacing w:before="0" w:after="60" w:line="120" w:lineRule="auto"/>
+        <w:jc w:val="both"/>
+      </w:pPr>
+      <w:r>
+        <w:rPr>
+          <w:rFonts w:ascii="Times New Roman" w:hAnsi="Times New Roman" w:cs="Times New Roman"/>
+          <w:sz w:val="12"/>
+          <w:szCs w:val="12"/>
+        </w:rPr>
+        <w:t xml:space="preserve"/>
+      </w:r>
+    </w:p>
+    <w:p>
       <w:r>
         <w:br w:type="page"/>
       </w:r>
@@ -5355,7 +6461,100 @@
           <w:sz w:val="28"/>
           <w:szCs w:val="28"/>
         </w:rPr>
-        <w:t xml:space="preserve">5.10  Summary of Technologies</w:t>
+        <w:t xml:space="preserve">5.10  Data Structures and JSON</w:t>
+      </w:r>
+    </w:p>
+    <w:p>
+      <w:pPr>
+        <w:spacing w:before="0" w:after="120" w:line="360" w:lineRule="auto"/>
+        <w:ind w:firstLine="360"/>
+        <w:jc w:val="both"/>
+      </w:pPr>
+      <w:r>
+        <w:rPr>
+          <w:rFonts w:ascii="Times New Roman" w:hAnsi="Times New Roman" w:cs="Times New Roman"/>
+          <w:sz w:val="24"/>
+          <w:szCs w:val="24"/>
+        </w:rPr>
+        <w:t xml:space="preserve">Data within the application is organised using JavaScript objects and arrays, a structure that closely resembles the JavaScript Object Notation, or JSON, widely used for exchanging data between systems. Representing each aircraft as an object with named properties makes the data self-describing and easy to process, and it mirrors the way real systems exchange structured telemetry. Understanding these data structures was essential to designing a clean and efficient processing pipeline.</w:t>
+      </w:r>
+    </w:p>
+    <w:p>
+      <w:pPr>
+        <w:keepNext/>
+        <w:spacing w:before="160" w:after="120" w:line="360" w:lineRule="auto"/>
+        <w:jc w:val="left"/>
+      </w:pPr>
+      <w:r>
+        <w:rPr>
+          <w:rFonts w:ascii="Times New Roman" w:hAnsi="Times New Roman" w:cs="Times New Roman"/>
+          <w:b/>
+          <w:sz w:val="28"/>
+          <w:szCs w:val="28"/>
+        </w:rPr>
+        <w:t xml:space="preserve">5.11  Performance Considerations</w:t>
+      </w:r>
+    </w:p>
+    <w:p>
+      <w:pPr>
+        <w:spacing w:before="0" w:after="120" w:line="360" w:lineRule="auto"/>
+        <w:ind w:firstLine="360"/>
+        <w:jc w:val="both"/>
+      </w:pPr>
+      <w:r>
+        <w:rPr>
+          <w:rFonts w:ascii="Times New Roman" w:hAnsi="Times New Roman" w:cs="Times New Roman"/>
+          <w:sz w:val="24"/>
+          <w:szCs w:val="24"/>
+        </w:rPr>
+        <w:t xml:space="preserve">Because the application redraws its visualisations many times per second, performance was an important consideration. The rendering functions were written to be efficient, clearing and redrawing only what is necessary, and the processing logic avoids unnecessary computation. Choosing an appropriate refresh rate balances the smoothness of the animation against the load placed on the browser, ensuring that the interface remains responsive even while processing the telemetry of several aircraft.</w:t>
+      </w:r>
+    </w:p>
+    <w:p>
+      <w:pPr>
+        <w:keepNext/>
+        <w:spacing w:before="160" w:after="120" w:line="360" w:lineRule="auto"/>
+        <w:jc w:val="left"/>
+      </w:pPr>
+      <w:r>
+        <w:rPr>
+          <w:rFonts w:ascii="Times New Roman" w:hAnsi="Times New Roman" w:cs="Times New Roman"/>
+          <w:b/>
+          <w:sz w:val="28"/>
+          <w:szCs w:val="28"/>
+        </w:rPr>
+        <w:t xml:space="preserve">5.12  Standards and Portability</w:t>
+      </w:r>
+    </w:p>
+    <w:p>
+      <w:pPr>
+        <w:spacing w:before="0" w:after="120" w:line="360" w:lineRule="auto"/>
+        <w:ind w:firstLine="360"/>
+        <w:jc w:val="both"/>
+      </w:pPr>
+      <w:r>
+        <w:rPr>
+          <w:rFonts w:ascii="Times New Roman" w:hAnsi="Times New Roman" w:cs="Times New Roman"/>
+          <w:sz w:val="24"/>
+          <w:szCs w:val="24"/>
+        </w:rPr>
+        <w:t xml:space="preserve">The system relies only on open, standardised web technologies defined by the World Wide Web Consortium and ECMA International. Building on these standards rather than on proprietary frameworks ensures that the application is portable, durable and free of external dependencies. It will continue to run in any standards-compliant browser without modification, which is a significant practical and educational advantage.</w:t>
+      </w:r>
+    </w:p>
+    <w:p>
+      <w:pPr>
+        <w:keepNext/>
+        <w:spacing w:before="160" w:after="120" w:line="360" w:lineRule="auto"/>
+        <w:jc w:val="left"/>
+      </w:pPr>
+      <w:r>
+        <w:rPr>
+          <w:rFonts w:ascii="Times New Roman" w:hAnsi="Times New Roman" w:cs="Times New Roman"/>
+          <w:b/>
+          <w:sz w:val="28"/>
+          <w:szCs w:val="28"/>
+        </w:rPr>
+        <w:t xml:space="preserve">5.13  Summary of Technologies</w:t>
       </w:r>
     </w:p>
     <w:p>
@@ -5370,7 +6569,7 @@
           <w:sz w:val="22"/>
           <w:szCs w:val="22"/>
         </w:rPr>
-        <w:t xml:space="preserve">Table 5  Summary of technologies and their roles</w:t>
+        <w:t xml:space="preserve">Table 7  Summary of technologies and their roles</w:t>
       </w:r>
     </w:p>
     <w:tbl>
@@ -5990,7 +7189,69 @@
           <w:sz w:val="28"/>
           <w:szCs w:val="28"/>
         </w:rPr>
-        <w:t xml:space="preserve">6.9  Summary</w:t>
+        <w:t xml:space="preserve">6.9  Learning from Mistakes</w:t>
+      </w:r>
+    </w:p>
+    <w:p>
+      <w:pPr>
+        <w:spacing w:before="0" w:after="120" w:line="360" w:lineRule="auto"/>
+        <w:ind w:firstLine="360"/>
+        <w:jc w:val="both"/>
+      </w:pPr>
+      <w:r>
+        <w:rPr>
+          <w:rFonts w:ascii="Times New Roman" w:hAnsi="Times New Roman" w:cs="Times New Roman"/>
+          <w:sz w:val="24"/>
+          <w:szCs w:val="24"/>
+        </w:rPr>
+        <w:t xml:space="preserve">Mistakes, far from being merely setbacks, were an important source of learning. Each error in logic or design, once understood and corrected, left a lasting lesson that pure success could not have provided. Adopting a calm and analytical attitude towards mistakes transformed them into opportunities for growth and built the resilience that engineering work requires.</w:t>
+      </w:r>
+    </w:p>
+    <w:p>
+      <w:pPr>
+        <w:keepNext/>
+        <w:spacing w:before="160" w:after="120" w:line="360" w:lineRule="auto"/>
+        <w:jc w:val="left"/>
+      </w:pPr>
+      <w:r>
+        <w:rPr>
+          <w:rFonts w:ascii="Times New Roman" w:hAnsi="Times New Roman" w:cs="Times New Roman"/>
+          <w:b/>
+          <w:sz w:val="28"/>
+          <w:szCs w:val="28"/>
+        </w:rPr>
+        <w:t xml:space="preserve">6.10  Time Management and Planning</w:t>
+      </w:r>
+    </w:p>
+    <w:p>
+      <w:pPr>
+        <w:spacing w:before="0" w:after="120" w:line="360" w:lineRule="auto"/>
+        <w:ind w:firstLine="360"/>
+        <w:jc w:val="both"/>
+      </w:pPr>
+      <w:r>
+        <w:rPr>
+          <w:rFonts w:ascii="Times New Roman" w:hAnsi="Times New Roman" w:cs="Times New Roman"/>
+          <w:sz w:val="24"/>
+          <w:szCs w:val="24"/>
+        </w:rPr>
+        <w:t xml:space="preserve">Working within the fixed duration of the internship taught the value of planning and time management. Breaking the project into manageable tasks, setting informal milestones and maintaining steady progress ensured that the work was completed in good time. This disciplined approach to managing one's own work is a skill that will be valuable in any professional setting.</w:t>
+      </w:r>
+    </w:p>
+    <w:p>
+      <w:pPr>
+        <w:keepNext/>
+        <w:spacing w:before="160" w:after="120" w:line="360" w:lineRule="auto"/>
+        <w:jc w:val="left"/>
+      </w:pPr>
+      <w:r>
+        <w:rPr>
+          <w:rFonts w:ascii="Times New Roman" w:hAnsi="Times New Roman" w:cs="Times New Roman"/>
+          <w:b/>
+          <w:sz w:val="28"/>
+          <w:szCs w:val="28"/>
+        </w:rPr>
+        <w:t xml:space="preserve">6.11  Summary</w:t>
       </w:r>
     </w:p>
     <w:p>
@@ -6005,7 +7266,7 @@
           <w:sz w:val="22"/>
           <w:szCs w:val="22"/>
         </w:rPr>
-        <w:t xml:space="preserve">Table 6  Summary of learning methods</w:t>
+        <w:t xml:space="preserve">Table 8  Summary of learning methods</w:t>
       </w:r>
     </w:p>
     <w:tbl>
@@ -8113,6 +9374,412 @@
       </w:r>
     </w:p>
     <w:p>
+      <w:pPr>
+        <w:keepNext/>
+        <w:spacing w:before="160" w:after="120" w:line="360" w:lineRule="auto"/>
+        <w:jc w:val="left"/>
+      </w:pPr>
+      <w:r>
+        <w:rPr>
+          <w:rFonts w:ascii="Times New Roman" w:hAnsi="Times New Roman" w:cs="Times New Roman"/>
+          <w:b/>
+          <w:sz w:val="28"/>
+          <w:szCs w:val="28"/>
+        </w:rPr>
+        <w:t xml:space="preserve">8.8  Processing Fleet Statistics</w:t>
+      </w:r>
+    </w:p>
+    <w:p>
+      <w:pPr>
+        <w:spacing w:before="0" w:after="120" w:line="360" w:lineRule="auto"/>
+        <w:ind w:firstLine="360"/>
+        <w:jc w:val="both"/>
+      </w:pPr>
+      <w:r>
+        <w:rPr>
+          <w:rFonts w:ascii="Times New Roman" w:hAnsi="Times New Roman" w:cs="Times New Roman"/>
+          <w:sz w:val="24"/>
+          <w:szCs w:val="24"/>
+        </w:rPr>
+        <w:t xml:space="preserve">The analytics module computes summary statistics for the whole fleet. Using the array reduce method, the average of a parameter such as altitude or speed is obtained in a single concise expression, while the minimum and maximum are found with the corresponding helper functions. This demonstrates how higher-order array methods make data processing both compact and readable.</w:t>
+      </w:r>
+    </w:p>
+    <w:tbl>
+      <w:tblPr>
+        <w:tblW w:w="9360" w:type="dxa"/>
+        <w:jc w:val="center"/>
+        <w:tblLook w:val="04A0"/>
+      </w:tblPr>
+      <w:tblGrid>
+        <w:gridCol w:w="9360"/>
+      </w:tblGrid>
+      <w:tr>
+        <w:tc>
+          <w:tcPr>
+            <w:tcW w:w="9360" w:type="dxa"/>
+            <w:tcBorders>
+              <w:top w:val="single" w:sz="4" w:color="CCCCCC"/>
+              <w:left w:val="single" w:sz="4" w:color="CCCCCC"/>
+              <w:bottom w:val="single" w:sz="4" w:color="CCCCCC"/>
+              <w:right w:val="single" w:sz="4" w:color="CCCCCC"/>
+            </w:tcBorders>
+            <w:shd w:val="clear" w:color="auto" w:fill="F5F5F5"/>
+          </w:tcPr>
+          <w:p>
+            <w:pPr>
+              <w:spacing w:before="0" w:after="0" w:line="240" w:lineRule="auto"/>
+              <w:jc w:val="left"/>
+            </w:pPr>
+            <w:r>
+              <w:rPr>
+                <w:rFonts w:ascii="Consolas" w:hAnsi="Consolas" w:cs="Consolas"/>
+                <w:sz w:val="18"/>
+                <w:szCs w:val="18"/>
+              </w:rPr>
+              <w:t xml:space="preserve">const avg = key =&gt;</w:t>
+            </w:r>
+          </w:p>
+          <w:p>
+            <w:pPr>
+              <w:spacing w:before="0" w:after="0" w:line="240" w:lineRule="auto"/>
+              <w:jc w:val="left"/>
+            </w:pPr>
+            <w:r>
+              <w:rPr>
+                <w:rFonts w:ascii="Consolas" w:hAnsi="Consolas" w:cs="Consolas"/>
+                <w:sz w:val="18"/>
+                <w:szCs w:val="18"/>
+              </w:rPr>
+              <w:t xml:space="preserve">  aircraft.reduce((sum,a)=&gt;sum+a[key],0) / aircraft.length;</w:t>
+            </w:r>
+          </w:p>
+          <w:p>
+            <w:pPr>
+              <w:spacing w:before="0" w:after="0" w:line="240" w:lineRule="auto"/>
+              <w:jc w:val="left"/>
+            </w:pPr>
+            <w:r>
+              <w:rPr>
+                <w:rFonts w:ascii="Consolas" w:hAnsi="Consolas" w:cs="Consolas"/>
+                <w:sz w:val="18"/>
+                <w:szCs w:val="18"/>
+              </w:rPr>
+              <w:t xml:space="preserve">const maxAlt = Math.max(...aircraft.map(a=&gt;a.alt));</w:t>
+            </w:r>
+          </w:p>
+          <w:p>
+            <w:pPr>
+              <w:spacing w:before="0" w:after="0" w:line="240" w:lineRule="auto"/>
+              <w:jc w:val="left"/>
+            </w:pPr>
+            <w:r>
+              <w:rPr>
+                <w:rFonts w:ascii="Consolas" w:hAnsi="Consolas" w:cs="Consolas"/>
+                <w:sz w:val="18"/>
+                <w:szCs w:val="18"/>
+              </w:rPr>
+              <w:t xml:space="preserve">const minAlt = Math.min(...aircraft.map(a=&gt;a.alt));</w:t>
+            </w:r>
+          </w:p>
+        </w:tc>
+      </w:tr>
+    </w:tbl>
+    <w:p>
+      <w:pPr>
+        <w:spacing w:before="0" w:after="60" w:line="120" w:lineRule="auto"/>
+        <w:jc w:val="both"/>
+      </w:pPr>
+      <w:r>
+        <w:rPr>
+          <w:rFonts w:ascii="Times New Roman" w:hAnsi="Times New Roman" w:cs="Times New Roman"/>
+          <w:sz w:val="12"/>
+          <w:szCs w:val="12"/>
+        </w:rPr>
+        <w:t xml:space="preserve"/>
+      </w:r>
+    </w:p>
+    <w:p>
+      <w:pPr>
+        <w:keepNext/>
+        <w:spacing w:before="160" w:after="120" w:line="360" w:lineRule="auto"/>
+        <w:jc w:val="left"/>
+      </w:pPr>
+      <w:r>
+        <w:rPr>
+          <w:rFonts w:ascii="Times New Roman" w:hAnsi="Times New Roman" w:cs="Times New Roman"/>
+          <w:b/>
+          <w:sz w:val="28"/>
+          <w:szCs w:val="28"/>
+        </w:rPr>
+        <w:t xml:space="preserve">8.9  Generating and Storing Alerts</w:t>
+      </w:r>
+    </w:p>
+    <w:p>
+      <w:pPr>
+        <w:spacing w:before="0" w:after="120" w:line="360" w:lineRule="auto"/>
+        <w:ind w:firstLine="360"/>
+        <w:jc w:val="both"/>
+      </w:pPr>
+      <w:r>
+        <w:rPr>
+          <w:rFonts w:ascii="Times New Roman" w:hAnsi="Times New Roman" w:cs="Times New Roman"/>
+          <w:sz w:val="24"/>
+          <w:szCs w:val="24"/>
+        </w:rPr>
+        <w:t xml:space="preserve">Alerts are generated whenever a monitored parameter crosses a threshold. Each alert is represented as an object carrying its severity, message and time, and is added to the front of an alert array so that the most recent alert appears first. The array is capped at a reasonable length so that memory use remains bounded during long sessions.</w:t>
+      </w:r>
+    </w:p>
+    <w:tbl>
+      <w:tblPr>
+        <w:tblW w:w="9360" w:type="dxa"/>
+        <w:jc w:val="center"/>
+        <w:tblLook w:val="04A0"/>
+      </w:tblPr>
+      <w:tblGrid>
+        <w:gridCol w:w="9360"/>
+      </w:tblGrid>
+      <w:tr>
+        <w:tc>
+          <w:tcPr>
+            <w:tcW w:w="9360" w:type="dxa"/>
+            <w:tcBorders>
+              <w:top w:val="single" w:sz="4" w:color="CCCCCC"/>
+              <w:left w:val="single" w:sz="4" w:color="CCCCCC"/>
+              <w:bottom w:val="single" w:sz="4" w:color="CCCCCC"/>
+              <w:right w:val="single" w:sz="4" w:color="CCCCCC"/>
+            </w:tcBorders>
+            <w:shd w:val="clear" w:color="auto" w:fill="F5F5F5"/>
+          </w:tcPr>
+          <w:p>
+            <w:pPr>
+              <w:spacing w:before="0" w:after="0" w:line="240" w:lineRule="auto"/>
+              <w:jc w:val="left"/>
+            </w:pPr>
+            <w:r>
+              <w:rPr>
+                <w:rFonts w:ascii="Consolas" w:hAnsi="Consolas" w:cs="Consolas"/>
+                <w:sz w:val="18"/>
+                <w:szCs w:val="18"/>
+              </w:rPr>
+              <w:t xml:space="preserve">function pushAlert(level, message){</w:t>
+            </w:r>
+          </w:p>
+          <w:p>
+            <w:pPr>
+              <w:spacing w:before="0" w:after="0" w:line="240" w:lineRule="auto"/>
+              <w:jc w:val="left"/>
+            </w:pPr>
+            <w:r>
+              <w:rPr>
+                <w:rFonts w:ascii="Consolas" w:hAnsi="Consolas" w:cs="Consolas"/>
+                <w:sz w:val="18"/>
+                <w:szCs w:val="18"/>
+              </w:rPr>
+              <w:t xml:space="preserve">  alerts.unshift({level, message, t: new Date().toLocaleTimeString()});</w:t>
+            </w:r>
+          </w:p>
+          <w:p>
+            <w:pPr>
+              <w:spacing w:before="0" w:after="0" w:line="240" w:lineRule="auto"/>
+              <w:jc w:val="left"/>
+            </w:pPr>
+            <w:r>
+              <w:rPr>
+                <w:rFonts w:ascii="Consolas" w:hAnsi="Consolas" w:cs="Consolas"/>
+                <w:sz w:val="18"/>
+                <w:szCs w:val="18"/>
+              </w:rPr>
+              <w:t xml:space="preserve">  if(alerts.length &gt; 40) alerts.pop();   // keep the list bounded</w:t>
+            </w:r>
+          </w:p>
+          <w:p>
+            <w:pPr>
+              <w:spacing w:before="0" w:after="0" w:line="240" w:lineRule="auto"/>
+              <w:jc w:val="left"/>
+            </w:pPr>
+            <w:r>
+              <w:rPr>
+                <w:rFonts w:ascii="Consolas" w:hAnsi="Consolas" w:cs="Consolas"/>
+                <w:sz w:val="18"/>
+                <w:szCs w:val="18"/>
+              </w:rPr>
+              <w:t xml:space="preserve">}</w:t>
+            </w:r>
+          </w:p>
+        </w:tc>
+      </w:tr>
+    </w:tbl>
+    <w:p>
+      <w:pPr>
+        <w:spacing w:before="0" w:after="60" w:line="120" w:lineRule="auto"/>
+        <w:jc w:val="both"/>
+      </w:pPr>
+      <w:r>
+        <w:rPr>
+          <w:rFonts w:ascii="Times New Roman" w:hAnsi="Times New Roman" w:cs="Times New Roman"/>
+          <w:sz w:val="12"/>
+          <w:szCs w:val="12"/>
+        </w:rPr>
+        <w:t xml:space="preserve"/>
+      </w:r>
+    </w:p>
+    <w:p>
+      <w:pPr>
+        <w:keepNext/>
+        <w:spacing w:before="160" w:after="120" w:line="360" w:lineRule="auto"/>
+        <w:jc w:val="left"/>
+      </w:pPr>
+      <w:r>
+        <w:rPr>
+          <w:rFonts w:ascii="Times New Roman" w:hAnsi="Times New Roman" w:cs="Times New Roman"/>
+          <w:b/>
+          <w:sz w:val="28"/>
+          <w:szCs w:val="28"/>
+        </w:rPr>
+        <w:t xml:space="preserve">8.10  Rendering Data Tables</w:t>
+      </w:r>
+    </w:p>
+    <w:p>
+      <w:pPr>
+        <w:spacing w:before="0" w:after="120" w:line="360" w:lineRule="auto"/>
+        <w:ind w:firstLine="360"/>
+        <w:jc w:val="both"/>
+      </w:pPr>
+      <w:r>
+        <w:rPr>
+          <w:rFonts w:ascii="Times New Roman" w:hAnsi="Times New Roman" w:cs="Times New Roman"/>
+          <w:sz w:val="24"/>
+          <w:szCs w:val="24"/>
+        </w:rPr>
+        <w:t xml:space="preserve">The fleet and tracking tables are produced by mapping the aircraft array to rows of markup and writing the result into the document. This declarative style, in which the display is derived directly from the data, keeps the interface consistent with the underlying state and is a hallmark of clean front-end design.</w:t>
+      </w:r>
+    </w:p>
+    <w:tbl>
+      <w:tblPr>
+        <w:tblW w:w="9360" w:type="dxa"/>
+        <w:jc w:val="center"/>
+        <w:tblLook w:val="04A0"/>
+      </w:tblPr>
+      <w:tblGrid>
+        <w:gridCol w:w="9360"/>
+      </w:tblGrid>
+      <w:tr>
+        <w:tc>
+          <w:tcPr>
+            <w:tcW w:w="9360" w:type="dxa"/>
+            <w:tcBorders>
+              <w:top w:val="single" w:sz="4" w:color="CCCCCC"/>
+              <w:left w:val="single" w:sz="4" w:color="CCCCCC"/>
+              <w:bottom w:val="single" w:sz="4" w:color="CCCCCC"/>
+              <w:right w:val="single" w:sz="4" w:color="CCCCCC"/>
+            </w:tcBorders>
+            <w:shd w:val="clear" w:color="auto" w:fill="F5F5F5"/>
+          </w:tcPr>
+          <w:p>
+            <w:pPr>
+              <w:spacing w:before="0" w:after="0" w:line="240" w:lineRule="auto"/>
+              <w:jc w:val="left"/>
+            </w:pPr>
+            <w:r>
+              <w:rPr>
+                <w:rFonts w:ascii="Consolas" w:hAnsi="Consolas" w:cs="Consolas"/>
+                <w:sz w:val="18"/>
+                <w:szCs w:val="18"/>
+              </w:rPr>
+              <w:t xml:space="preserve">rows.innerHTML = aircraft.map(a =&gt; `</w:t>
+            </w:r>
+          </w:p>
+          <w:p>
+            <w:pPr>
+              <w:spacing w:before="0" w:after="0" w:line="240" w:lineRule="auto"/>
+              <w:jc w:val="left"/>
+            </w:pPr>
+            <w:r>
+              <w:rPr>
+                <w:rFonts w:ascii="Consolas" w:hAnsi="Consolas" w:cs="Consolas"/>
+                <w:sz w:val="18"/>
+                <w:szCs w:val="18"/>
+              </w:rPr>
+              <w:t xml:space="preserve">  &lt;tr&gt;&lt;td&gt;${a.cs}&lt;/td&gt;&lt;td&gt;${a.type}&lt;/td&gt;</w:t>
+            </w:r>
+          </w:p>
+          <w:p>
+            <w:pPr>
+              <w:spacing w:before="0" w:after="0" w:line="240" w:lineRule="auto"/>
+              <w:jc w:val="left"/>
+            </w:pPr>
+            <w:r>
+              <w:rPr>
+                <w:rFonts w:ascii="Consolas" w:hAnsi="Consolas" w:cs="Consolas"/>
+                <w:sz w:val="18"/>
+                <w:szCs w:val="18"/>
+              </w:rPr>
+              <w:t xml:space="preserve">      &lt;td&gt;${Math.round(a.alt)}&lt;/td&gt;&lt;td&gt;${badge(a.status)}&lt;/td&gt;&lt;/tr&gt;</w:t>
+            </w:r>
+          </w:p>
+          <w:p>
+            <w:pPr>
+              <w:spacing w:before="0" w:after="0" w:line="240" w:lineRule="auto"/>
+              <w:jc w:val="left"/>
+            </w:pPr>
+            <w:r>
+              <w:rPr>
+                <w:rFonts w:ascii="Consolas" w:hAnsi="Consolas" w:cs="Consolas"/>
+                <w:sz w:val="18"/>
+                <w:szCs w:val="18"/>
+              </w:rPr>
+              <w:t xml:space="preserve">`).join('');</w:t>
+            </w:r>
+          </w:p>
+        </w:tc>
+      </w:tr>
+    </w:tbl>
+    <w:p>
+      <w:pPr>
+        <w:spacing w:before="0" w:after="60" w:line="120" w:lineRule="auto"/>
+        <w:jc w:val="both"/>
+      </w:pPr>
+      <w:r>
+        <w:rPr>
+          <w:rFonts w:ascii="Times New Roman" w:hAnsi="Times New Roman" w:cs="Times New Roman"/>
+          <w:sz w:val="12"/>
+          <w:szCs w:val="12"/>
+        </w:rPr>
+        <w:t xml:space="preserve"/>
+      </w:r>
+    </w:p>
+    <w:p>
+      <w:pPr>
+        <w:keepNext/>
+        <w:spacing w:before="160" w:after="120" w:line="360" w:lineRule="auto"/>
+        <w:jc w:val="left"/>
+      </w:pPr>
+      <w:r>
+        <w:rPr>
+          <w:rFonts w:ascii="Times New Roman" w:hAnsi="Times New Roman" w:cs="Times New Roman"/>
+          <w:b/>
+          <w:sz w:val="28"/>
+          <w:szCs w:val="28"/>
+        </w:rPr>
+        <w:t xml:space="preserve">8.11  Coding Style and Maintainability</w:t>
+      </w:r>
+    </w:p>
+    <w:p>
+      <w:pPr>
+        <w:spacing w:before="0" w:after="120" w:line="360" w:lineRule="auto"/>
+        <w:ind w:firstLine="360"/>
+        <w:jc w:val="both"/>
+      </w:pPr>
+      <w:r>
+        <w:rPr>
+          <w:rFonts w:ascii="Times New Roman" w:hAnsi="Times New Roman" w:cs="Times New Roman"/>
+          <w:sz w:val="24"/>
+          <w:szCs w:val="24"/>
+        </w:rPr>
+        <w:t xml:space="preserve">Throughout the source code, meaningful names, small single-purpose functions and consistent formatting were used to keep the program readable and maintainable. The clear separation of the data model, the processing logic, the rendering functions and the event handlers means that any part of the system can be understood and modified in isolation, which reflects sound software-engineering practice.</w:t>
+      </w:r>
+    </w:p>
+    <w:p>
       <w:r>
         <w:br w:type="page"/>
       </w:r>
@@ -8222,7 +9889,7 @@
           <w:sz w:val="22"/>
           <w:szCs w:val="22"/>
         </w:rPr>
-        <w:t xml:space="preserve">Table 7  AIRCRAFT and TELEMETRY tables</w:t>
+        <w:t xml:space="preserve">Table 9  AIRCRAFT and TELEMETRY tables</w:t>
       </w:r>
     </w:p>
     <w:tbl>
@@ -8535,6 +10202,764 @@
       </w:r>
     </w:p>
     <w:p>
+      <w:pPr>
+        <w:keepNext/>
+        <w:spacing w:before="160" w:after="120" w:line="360" w:lineRule="auto"/>
+        <w:jc w:val="left"/>
+      </w:pPr>
+      <w:r>
+        <w:rPr>
+          <w:rFonts w:ascii="Times New Roman" w:hAnsi="Times New Roman" w:cs="Times New Roman"/>
+          <w:b/>
+          <w:sz w:val="28"/>
+          <w:szCs w:val="28"/>
+        </w:rPr>
+        <w:t xml:space="preserve">9.4  Entity-Relationship Overview</w:t>
+      </w:r>
+    </w:p>
+    <w:p>
+      <w:pPr>
+        <w:spacing w:before="0" w:after="120" w:line="360" w:lineRule="auto"/>
+        <w:jc w:val="both"/>
+      </w:pPr>
+      <w:r>
+        <w:rPr>
+          <w:rFonts w:ascii="Times New Roman" w:hAnsi="Times New Roman" w:cs="Times New Roman"/>
+          <w:sz w:val="24"/>
+          <w:szCs w:val="24"/>
+        </w:rPr>
+        <w:t xml:space="preserve">The relationships between the entities can be visualised as an entity-relationship diagram. The AIRCRAFT entity sits at the centre, linked by one-to-many relationships to TELEMETRY and ALERT, while SORTIE references the aircraft assigned to it and USER oversees the sorties.</w:t>
+      </w:r>
+    </w:p>
+    <w:p>
+      <w:pPr>
+        <w:spacing w:before="40" w:after="20" w:line="200" w:lineRule="auto"/>
+        <w:jc w:val="center"/>
+      </w:pPr>
+      <w:r>
+        <w:rPr>
+          <w:rFonts w:ascii="Times New Roman" w:hAnsi="Times New Roman" w:cs="Times New Roman"/>
+          <w:b/>
+          <w:color w:val="555555"/>
+          <w:sz w:val="20"/>
+          <w:szCs w:val="20"/>
+        </w:rPr>
+        <w:t xml:space="preserve">Entities and Relationships</w:t>
+      </w:r>
+    </w:p>
+    <w:tbl>
+      <w:tblPr>
+        <w:tblW w:w="9360" w:type="dxa"/>
+        <w:jc w:val="center"/>
+        <w:tblLook w:val="04A0"/>
+      </w:tblPr>
+      <w:tblGrid>
+        <w:gridCol w:w="1872"/>
+        <w:gridCol w:w="1872"/>
+        <w:gridCol w:w="1872"/>
+        <w:gridCol w:w="1872"/>
+        <w:gridCol w:w="1872"/>
+      </w:tblGrid>
+      <w:tr>
+        <w:tc>
+          <w:tcPr>
+            <w:tcW w:w="1872" w:type="dxa"/>
+            <w:tcBorders>
+              <w:top w:val="single" w:sz="8" w:color="1F3864"/>
+              <w:left w:val="single" w:sz="8" w:color="1F3864"/>
+              <w:bottom w:val="single" w:sz="8" w:color="1F3864"/>
+              <w:right w:val="single" w:sz="8" w:color="1F3864"/>
+            </w:tcBorders>
+            <w:shd w:val="clear" w:color="auto" w:fill="DCE6F1"/>
+            <w:vAlign w:val="center"/>
+          </w:tcPr>
+          <w:p>
+            <w:pPr>
+              <w:spacing w:before="40" w:after="40" w:line="240" w:lineRule="auto"/>
+              <w:jc w:val="center"/>
+            </w:pPr>
+            <w:r>
+              <w:rPr>
+                <w:rFonts w:ascii="Times New Roman" w:hAnsi="Times New Roman" w:cs="Times New Roman"/>
+                <w:b/>
+                <w:color w:val="1F3864"/>
+                <w:sz w:val="22"/>
+                <w:szCs w:val="22"/>
+              </w:rPr>
+              <w:t xml:space="preserve">USER</w:t>
+            </w:r>
+          </w:p>
+        </w:tc>
+        <w:tc>
+          <w:tcPr>
+            <w:tcW w:w="1872" w:type="dxa"/>
+            <w:tcBorders>
+              <w:top w:val="single" w:sz="8" w:color="1F3864"/>
+              <w:left w:val="single" w:sz="8" w:color="1F3864"/>
+              <w:bottom w:val="single" w:sz="8" w:color="1F3864"/>
+              <w:right w:val="single" w:sz="8" w:color="1F3864"/>
+            </w:tcBorders>
+            <w:shd w:val="clear" w:color="auto" w:fill="DCE6F1"/>
+            <w:vAlign w:val="center"/>
+          </w:tcPr>
+          <w:p>
+            <w:pPr>
+              <w:spacing w:before="40" w:after="40" w:line="240" w:lineRule="auto"/>
+              <w:jc w:val="center"/>
+            </w:pPr>
+            <w:r>
+              <w:rPr>
+                <w:rFonts w:ascii="Times New Roman" w:hAnsi="Times New Roman" w:cs="Times New Roman"/>
+                <w:b/>
+                <w:color w:val="1F3864"/>
+                <w:sz w:val="22"/>
+                <w:szCs w:val="22"/>
+              </w:rPr>
+              <w:t xml:space="preserve">SORTIE</w:t>
+            </w:r>
+          </w:p>
+        </w:tc>
+        <w:tc>
+          <w:tcPr>
+            <w:tcW w:w="1872" w:type="dxa"/>
+            <w:tcBorders>
+              <w:top w:val="single" w:sz="8" w:color="1F3864"/>
+              <w:left w:val="single" w:sz="8" w:color="1F3864"/>
+              <w:bottom w:val="single" w:sz="8" w:color="1F3864"/>
+              <w:right w:val="single" w:sz="8" w:color="1F3864"/>
+            </w:tcBorders>
+            <w:shd w:val="clear" w:color="auto" w:fill="DCE6F1"/>
+            <w:vAlign w:val="center"/>
+          </w:tcPr>
+          <w:p>
+            <w:pPr>
+              <w:spacing w:before="40" w:after="40" w:line="240" w:lineRule="auto"/>
+              <w:jc w:val="center"/>
+            </w:pPr>
+            <w:r>
+              <w:rPr>
+                <w:rFonts w:ascii="Times New Roman" w:hAnsi="Times New Roman" w:cs="Times New Roman"/>
+                <w:b/>
+                <w:color w:val="1F3864"/>
+                <w:sz w:val="22"/>
+                <w:szCs w:val="22"/>
+              </w:rPr>
+              <w:t xml:space="preserve">AIRCRAFT</w:t>
+            </w:r>
+          </w:p>
+        </w:tc>
+        <w:tc>
+          <w:tcPr>
+            <w:tcW w:w="1872" w:type="dxa"/>
+            <w:tcBorders>
+              <w:top w:val="single" w:sz="8" w:color="1F3864"/>
+              <w:left w:val="single" w:sz="8" w:color="1F3864"/>
+              <w:bottom w:val="single" w:sz="8" w:color="1F3864"/>
+              <w:right w:val="single" w:sz="8" w:color="1F3864"/>
+            </w:tcBorders>
+            <w:shd w:val="clear" w:color="auto" w:fill="DCE6F1"/>
+            <w:vAlign w:val="center"/>
+          </w:tcPr>
+          <w:p>
+            <w:pPr>
+              <w:spacing w:before="40" w:after="40" w:line="240" w:lineRule="auto"/>
+              <w:jc w:val="center"/>
+            </w:pPr>
+            <w:r>
+              <w:rPr>
+                <w:rFonts w:ascii="Times New Roman" w:hAnsi="Times New Roman" w:cs="Times New Roman"/>
+                <w:b/>
+                <w:color w:val="1F3864"/>
+                <w:sz w:val="22"/>
+                <w:szCs w:val="22"/>
+              </w:rPr>
+              <w:t xml:space="preserve">TELEMETRY</w:t>
+            </w:r>
+          </w:p>
+        </w:tc>
+        <w:tc>
+          <w:tcPr>
+            <w:tcW w:w="1872" w:type="dxa"/>
+            <w:tcBorders>
+              <w:top w:val="single" w:sz="8" w:color="1F3864"/>
+              <w:left w:val="single" w:sz="8" w:color="1F3864"/>
+              <w:bottom w:val="single" w:sz="8" w:color="1F3864"/>
+              <w:right w:val="single" w:sz="8" w:color="1F3864"/>
+            </w:tcBorders>
+            <w:shd w:val="clear" w:color="auto" w:fill="DCE6F1"/>
+            <w:vAlign w:val="center"/>
+          </w:tcPr>
+          <w:p>
+            <w:pPr>
+              <w:spacing w:before="40" w:after="40" w:line="240" w:lineRule="auto"/>
+              <w:jc w:val="center"/>
+            </w:pPr>
+            <w:r>
+              <w:rPr>
+                <w:rFonts w:ascii="Times New Roman" w:hAnsi="Times New Roman" w:cs="Times New Roman"/>
+                <w:b/>
+                <w:color w:val="1F3864"/>
+                <w:sz w:val="22"/>
+                <w:szCs w:val="22"/>
+              </w:rPr>
+              <w:t xml:space="preserve">ALERT</w:t>
+            </w:r>
+          </w:p>
+        </w:tc>
+      </w:tr>
+    </w:tbl>
+    <w:p>
+      <w:pPr>
+        <w:spacing w:before="0" w:after="60" w:line="120" w:lineRule="auto"/>
+        <w:jc w:val="both"/>
+      </w:pPr>
+      <w:r>
+        <w:rPr>
+          <w:rFonts w:ascii="Times New Roman" w:hAnsi="Times New Roman" w:cs="Times New Roman"/>
+          <w:sz w:val="12"/>
+          <w:szCs w:val="12"/>
+        </w:rPr>
+        <w:t xml:space="preserve"/>
+      </w:r>
+    </w:p>
+    <w:p>
+      <w:pPr>
+        <w:spacing w:before="60" w:after="200" w:line="240" w:lineRule="auto"/>
+        <w:jc w:val="center"/>
+      </w:pPr>
+      <w:r>
+        <w:rPr>
+          <w:rFonts w:ascii="Times New Roman" w:hAnsi="Times New Roman" w:cs="Times New Roman"/>
+          <w:i/>
+          <w:sz w:val="22"/>
+          <w:szCs w:val="22"/>
+        </w:rPr>
+        <w:t xml:space="preserve">Fig. 9  Entity-relationship overview of the data model</w:t>
+      </w:r>
+    </w:p>
+    <w:p>
+      <w:pPr>
+        <w:keepNext/>
+        <w:spacing w:before="160" w:after="120" w:line="360" w:lineRule="auto"/>
+        <w:jc w:val="left"/>
+      </w:pPr>
+      <w:r>
+        <w:rPr>
+          <w:rFonts w:ascii="Times New Roman" w:hAnsi="Times New Roman" w:cs="Times New Roman"/>
+          <w:b/>
+          <w:sz w:val="28"/>
+          <w:szCs w:val="28"/>
+        </w:rPr>
+        <w:t xml:space="preserve">9.5  Sample Data</w:t>
+      </w:r>
+    </w:p>
+    <w:p>
+      <w:pPr>
+        <w:spacing w:before="120" w:after="60" w:line="240" w:lineRule="auto"/>
+        <w:jc w:val="center"/>
+      </w:pPr>
+      <w:r>
+        <w:rPr>
+          <w:rFonts w:ascii="Times New Roman" w:hAnsi="Times New Roman" w:cs="Times New Roman"/>
+          <w:i/>
+          <w:sz w:val="22"/>
+          <w:szCs w:val="22"/>
+        </w:rPr>
+        <w:t xml:space="preserve">Table 10  Sample AIRCRAFT records</w:t>
+      </w:r>
+    </w:p>
+    <w:tbl>
+      <w:tblPr>
+        <w:tblStyle w:val="TableGrid"/>
+        <w:tblW w:w="0" w:type="auto"/>
+        <w:tblBorders>
+          <w:top w:val="single" w:sz="4" w:color="555555"/>
+          <w:left w:val="single" w:sz="4" w:color="555555"/>
+          <w:bottom w:val="single" w:sz="4" w:color="555555"/>
+          <w:right w:val="single" w:sz="4" w:color="555555"/>
+          <w:insideH w:val="single" w:sz="4" w:color="999999"/>
+          <w:insideV w:val="single" w:sz="4" w:color="999999"/>
+        </w:tblBorders>
+        <w:tblLook w:val="04A0"/>
+      </w:tblPr>
+      <w:tblGrid>
+        <w:gridCol w:w="2200"/>
+        <w:gridCol w:w="2400"/>
+        <w:gridCol w:w="2960"/>
+        <w:gridCol w:w="1800"/>
+      </w:tblGrid>
+      <w:tr>
+        <w:trPr>
+          <w:tblHeader/>
+        </w:trPr>
+        <w:tc>
+          <w:tcPr>
+            <w:tcW w:w="2200" w:type="dxa"/>
+            <w:shd w:val="clear" w:color="auto" w:fill="1F3864"/>
+            <w:vAlign w:val="center"/>
+          </w:tcPr>
+          <w:p>
+            <w:pPr>
+              <w:spacing w:before="20" w:after="20" w:line="240" w:lineRule="auto"/>
+              <w:jc w:val="left"/>
+            </w:pPr>
+            <w:r>
+              <w:rPr>
+                <w:rFonts w:ascii="Times New Roman" w:hAnsi="Times New Roman" w:cs="Times New Roman"/>
+                <w:b/>
+                <w:color w:val="FFFFFF"/>
+                <w:sz w:val="22"/>
+                <w:szCs w:val="22"/>
+              </w:rPr>
+              <w:t xml:space="preserve">aircraft_id</w:t>
+            </w:r>
+          </w:p>
+        </w:tc>
+        <w:tc>
+          <w:tcPr>
+            <w:tcW w:w="2400" w:type="dxa"/>
+            <w:shd w:val="clear" w:color="auto" w:fill="1F3864"/>
+            <w:vAlign w:val="center"/>
+          </w:tcPr>
+          <w:p>
+            <w:pPr>
+              <w:spacing w:before="20" w:after="20" w:line="240" w:lineRule="auto"/>
+              <w:jc w:val="left"/>
+            </w:pPr>
+            <w:r>
+              <w:rPr>
+                <w:rFonts w:ascii="Times New Roman" w:hAnsi="Times New Roman" w:cs="Times New Roman"/>
+                <w:b/>
+                <w:color w:val="FFFFFF"/>
+                <w:sz w:val="22"/>
+                <w:szCs w:val="22"/>
+              </w:rPr>
+              <w:t xml:space="preserve">callsign</w:t>
+            </w:r>
+          </w:p>
+        </w:tc>
+        <w:tc>
+          <w:tcPr>
+            <w:tcW w:w="2960" w:type="dxa"/>
+            <w:shd w:val="clear" w:color="auto" w:fill="1F3864"/>
+            <w:vAlign w:val="center"/>
+          </w:tcPr>
+          <w:p>
+            <w:pPr>
+              <w:spacing w:before="20" w:after="20" w:line="240" w:lineRule="auto"/>
+              <w:jc w:val="left"/>
+            </w:pPr>
+            <w:r>
+              <w:rPr>
+                <w:rFonts w:ascii="Times New Roman" w:hAnsi="Times New Roman" w:cs="Times New Roman"/>
+                <w:b/>
+                <w:color w:val="FFFFFF"/>
+                <w:sz w:val="22"/>
+                <w:szCs w:val="22"/>
+              </w:rPr>
+              <w:t xml:space="preserve">type</w:t>
+            </w:r>
+          </w:p>
+        </w:tc>
+        <w:tc>
+          <w:tcPr>
+            <w:tcW w:w="1800" w:type="dxa"/>
+            <w:shd w:val="clear" w:color="auto" w:fill="1F3864"/>
+            <w:vAlign w:val="center"/>
+          </w:tcPr>
+          <w:p>
+            <w:pPr>
+              <w:spacing w:before="20" w:after="20" w:line="240" w:lineRule="auto"/>
+              <w:jc w:val="left"/>
+            </w:pPr>
+            <w:r>
+              <w:rPr>
+                <w:rFonts w:ascii="Times New Roman" w:hAnsi="Times New Roman" w:cs="Times New Roman"/>
+                <w:b/>
+                <w:color w:val="FFFFFF"/>
+                <w:sz w:val="22"/>
+                <w:szCs w:val="22"/>
+              </w:rPr>
+              <w:t xml:space="preserve">status</w:t>
+            </w:r>
+          </w:p>
+        </w:tc>
+      </w:tr>
+      <w:tr>
+        <w:tc>
+          <w:tcPr>
+            <w:tcW w:w="2200" w:type="dxa"/>
+            <w:vAlign w:val="center"/>
+          </w:tcPr>
+          <w:p>
+            <w:pPr>
+              <w:spacing w:before="20" w:after="20" w:line="240" w:lineRule="auto"/>
+              <w:jc w:val="left"/>
+            </w:pPr>
+            <w:r>
+              <w:rPr>
+                <w:rFonts w:ascii="Times New Roman" w:hAnsi="Times New Roman" w:cs="Times New Roman"/>
+                <w:sz w:val="22"/>
+                <w:szCs w:val="22"/>
+              </w:rPr>
+              <w:t xml:space="preserve">1</w:t>
+            </w:r>
+          </w:p>
+        </w:tc>
+        <w:tc>
+          <w:tcPr>
+            <w:tcW w:w="2400" w:type="dxa"/>
+            <w:vAlign w:val="center"/>
+          </w:tcPr>
+          <w:p>
+            <w:pPr>
+              <w:spacing w:before="20" w:after="20" w:line="240" w:lineRule="auto"/>
+              <w:jc w:val="left"/>
+            </w:pPr>
+            <w:r>
+              <w:rPr>
+                <w:rFonts w:ascii="Times New Roman" w:hAnsi="Times New Roman" w:cs="Times New Roman"/>
+                <w:sz w:val="22"/>
+                <w:szCs w:val="22"/>
+              </w:rPr>
+              <w:t xml:space="preserve">HAL-LCH1</w:t>
+            </w:r>
+          </w:p>
+        </w:tc>
+        <w:tc>
+          <w:tcPr>
+            <w:tcW w:w="2960" w:type="dxa"/>
+            <w:vAlign w:val="center"/>
+          </w:tcPr>
+          <w:p>
+            <w:pPr>
+              <w:spacing w:before="20" w:after="20" w:line="240" w:lineRule="auto"/>
+              <w:jc w:val="left"/>
+            </w:pPr>
+            <w:r>
+              <w:rPr>
+                <w:rFonts w:ascii="Times New Roman" w:hAnsi="Times New Roman" w:cs="Times New Roman"/>
+                <w:sz w:val="22"/>
+                <w:szCs w:val="22"/>
+              </w:rPr>
+              <w:t xml:space="preserve">LCH Prachand</w:t>
+            </w:r>
+          </w:p>
+        </w:tc>
+        <w:tc>
+          <w:tcPr>
+            <w:tcW w:w="1800" w:type="dxa"/>
+            <w:vAlign w:val="center"/>
+          </w:tcPr>
+          <w:p>
+            <w:pPr>
+              <w:spacing w:before="20" w:after="20" w:line="240" w:lineRule="auto"/>
+              <w:jc w:val="left"/>
+            </w:pPr>
+            <w:r>
+              <w:rPr>
+                <w:rFonts w:ascii="Times New Roman" w:hAnsi="Times New Roman" w:cs="Times New Roman"/>
+                <w:sz w:val="22"/>
+                <w:szCs w:val="22"/>
+              </w:rPr>
+              <w:t xml:space="preserve">normal</w:t>
+            </w:r>
+          </w:p>
+        </w:tc>
+      </w:tr>
+      <w:tr>
+        <w:tc>
+          <w:tcPr>
+            <w:tcW w:w="2200" w:type="dxa"/>
+            <w:vAlign w:val="center"/>
+          </w:tcPr>
+          <w:p>
+            <w:pPr>
+              <w:spacing w:before="20" w:after="20" w:line="240" w:lineRule="auto"/>
+              <w:jc w:val="left"/>
+            </w:pPr>
+            <w:r>
+              <w:rPr>
+                <w:rFonts w:ascii="Times New Roman" w:hAnsi="Times New Roman" w:cs="Times New Roman"/>
+                <w:sz w:val="22"/>
+                <w:szCs w:val="22"/>
+              </w:rPr>
+              <w:t xml:space="preserve">2</w:t>
+            </w:r>
+          </w:p>
+        </w:tc>
+        <w:tc>
+          <w:tcPr>
+            <w:tcW w:w="2400" w:type="dxa"/>
+            <w:vAlign w:val="center"/>
+          </w:tcPr>
+          <w:p>
+            <w:pPr>
+              <w:spacing w:before="20" w:after="20" w:line="240" w:lineRule="auto"/>
+              <w:jc w:val="left"/>
+            </w:pPr>
+            <w:r>
+              <w:rPr>
+                <w:rFonts w:ascii="Times New Roman" w:hAnsi="Times New Roman" w:cs="Times New Roman"/>
+                <w:sz w:val="22"/>
+                <w:szCs w:val="22"/>
+              </w:rPr>
+              <w:t xml:space="preserve">HAL-ALH2</w:t>
+            </w:r>
+          </w:p>
+        </w:tc>
+        <w:tc>
+          <w:tcPr>
+            <w:tcW w:w="2960" w:type="dxa"/>
+            <w:vAlign w:val="center"/>
+          </w:tcPr>
+          <w:p>
+            <w:pPr>
+              <w:spacing w:before="20" w:after="20" w:line="240" w:lineRule="auto"/>
+              <w:jc w:val="left"/>
+            </w:pPr>
+            <w:r>
+              <w:rPr>
+                <w:rFonts w:ascii="Times New Roman" w:hAnsi="Times New Roman" w:cs="Times New Roman"/>
+                <w:sz w:val="22"/>
+                <w:szCs w:val="22"/>
+              </w:rPr>
+              <w:t xml:space="preserve">ALH Dhruv</w:t>
+            </w:r>
+          </w:p>
+        </w:tc>
+        <w:tc>
+          <w:tcPr>
+            <w:tcW w:w="1800" w:type="dxa"/>
+            <w:vAlign w:val="center"/>
+          </w:tcPr>
+          <w:p>
+            <w:pPr>
+              <w:spacing w:before="20" w:after="20" w:line="240" w:lineRule="auto"/>
+              <w:jc w:val="left"/>
+            </w:pPr>
+            <w:r>
+              <w:rPr>
+                <w:rFonts w:ascii="Times New Roman" w:hAnsi="Times New Roman" w:cs="Times New Roman"/>
+                <w:sz w:val="22"/>
+                <w:szCs w:val="22"/>
+              </w:rPr>
+              <w:t xml:space="preserve">normal</w:t>
+            </w:r>
+          </w:p>
+        </w:tc>
+      </w:tr>
+      <w:tr>
+        <w:tc>
+          <w:tcPr>
+            <w:tcW w:w="2200" w:type="dxa"/>
+            <w:vAlign w:val="center"/>
+          </w:tcPr>
+          <w:p>
+            <w:pPr>
+              <w:spacing w:before="20" w:after="20" w:line="240" w:lineRule="auto"/>
+              <w:jc w:val="left"/>
+            </w:pPr>
+            <w:r>
+              <w:rPr>
+                <w:rFonts w:ascii="Times New Roman" w:hAnsi="Times New Roman" w:cs="Times New Roman"/>
+                <w:sz w:val="22"/>
+                <w:szCs w:val="22"/>
+              </w:rPr>
+              <w:t xml:space="preserve">3</w:t>
+            </w:r>
+          </w:p>
+        </w:tc>
+        <w:tc>
+          <w:tcPr>
+            <w:tcW w:w="2400" w:type="dxa"/>
+            <w:vAlign w:val="center"/>
+          </w:tcPr>
+          <w:p>
+            <w:pPr>
+              <w:spacing w:before="20" w:after="20" w:line="240" w:lineRule="auto"/>
+              <w:jc w:val="left"/>
+            </w:pPr>
+            <w:r>
+              <w:rPr>
+                <w:rFonts w:ascii="Times New Roman" w:hAnsi="Times New Roman" w:cs="Times New Roman"/>
+                <w:sz w:val="22"/>
+                <w:szCs w:val="22"/>
+              </w:rPr>
+              <w:t xml:space="preserve">HAL-TEJ4</w:t>
+            </w:r>
+          </w:p>
+        </w:tc>
+        <w:tc>
+          <w:tcPr>
+            <w:tcW w:w="2960" w:type="dxa"/>
+            <w:vAlign w:val="center"/>
+          </w:tcPr>
+          <w:p>
+            <w:pPr>
+              <w:spacing w:before="20" w:after="20" w:line="240" w:lineRule="auto"/>
+              <w:jc w:val="left"/>
+            </w:pPr>
+            <w:r>
+              <w:rPr>
+                <w:rFonts w:ascii="Times New Roman" w:hAnsi="Times New Roman" w:cs="Times New Roman"/>
+                <w:sz w:val="22"/>
+                <w:szCs w:val="22"/>
+              </w:rPr>
+              <w:t xml:space="preserve">Tejas LCA</w:t>
+            </w:r>
+          </w:p>
+        </w:tc>
+        <w:tc>
+          <w:tcPr>
+            <w:tcW w:w="1800" w:type="dxa"/>
+            <w:vAlign w:val="center"/>
+          </w:tcPr>
+          <w:p>
+            <w:pPr>
+              <w:spacing w:before="20" w:after="20" w:line="240" w:lineRule="auto"/>
+              <w:jc w:val="left"/>
+            </w:pPr>
+            <w:r>
+              <w:rPr>
+                <w:rFonts w:ascii="Times New Roman" w:hAnsi="Times New Roman" w:cs="Times New Roman"/>
+                <w:sz w:val="22"/>
+                <w:szCs w:val="22"/>
+              </w:rPr>
+              <w:t xml:space="preserve">normal</w:t>
+            </w:r>
+          </w:p>
+        </w:tc>
+      </w:tr>
+      <w:tr>
+        <w:tc>
+          <w:tcPr>
+            <w:tcW w:w="2200" w:type="dxa"/>
+            <w:vAlign w:val="center"/>
+          </w:tcPr>
+          <w:p>
+            <w:pPr>
+              <w:spacing w:before="20" w:after="20" w:line="240" w:lineRule="auto"/>
+              <w:jc w:val="left"/>
+            </w:pPr>
+            <w:r>
+              <w:rPr>
+                <w:rFonts w:ascii="Times New Roman" w:hAnsi="Times New Roman" w:cs="Times New Roman"/>
+                <w:sz w:val="22"/>
+                <w:szCs w:val="22"/>
+              </w:rPr>
+              <w:t xml:space="preserve">4</w:t>
+            </w:r>
+          </w:p>
+        </w:tc>
+        <w:tc>
+          <w:tcPr>
+            <w:tcW w:w="2400" w:type="dxa"/>
+            <w:vAlign w:val="center"/>
+          </w:tcPr>
+          <w:p>
+            <w:pPr>
+              <w:spacing w:before="20" w:after="20" w:line="240" w:lineRule="auto"/>
+              <w:jc w:val="left"/>
+            </w:pPr>
+            <w:r>
+              <w:rPr>
+                <w:rFonts w:ascii="Times New Roman" w:hAnsi="Times New Roman" w:cs="Times New Roman"/>
+                <w:sz w:val="22"/>
+                <w:szCs w:val="22"/>
+              </w:rPr>
+              <w:t xml:space="preserve">HAL-HTT5</w:t>
+            </w:r>
+          </w:p>
+        </w:tc>
+        <w:tc>
+          <w:tcPr>
+            <w:tcW w:w="2960" w:type="dxa"/>
+            <w:vAlign w:val="center"/>
+          </w:tcPr>
+          <w:p>
+            <w:pPr>
+              <w:spacing w:before="20" w:after="20" w:line="240" w:lineRule="auto"/>
+              <w:jc w:val="left"/>
+            </w:pPr>
+            <w:r>
+              <w:rPr>
+                <w:rFonts w:ascii="Times New Roman" w:hAnsi="Times New Roman" w:cs="Times New Roman"/>
+                <w:sz w:val="22"/>
+                <w:szCs w:val="22"/>
+              </w:rPr>
+              <w:t xml:space="preserve">HTT-40</w:t>
+            </w:r>
+          </w:p>
+        </w:tc>
+        <w:tc>
+          <w:tcPr>
+            <w:tcW w:w="1800" w:type="dxa"/>
+            <w:vAlign w:val="center"/>
+          </w:tcPr>
+          <w:p>
+            <w:pPr>
+              <w:spacing w:before="20" w:after="20" w:line="240" w:lineRule="auto"/>
+              <w:jc w:val="left"/>
+            </w:pPr>
+            <w:r>
+              <w:rPr>
+                <w:rFonts w:ascii="Times New Roman" w:hAnsi="Times New Roman" w:cs="Times New Roman"/>
+                <w:sz w:val="22"/>
+                <w:szCs w:val="22"/>
+              </w:rPr>
+              <w:t xml:space="preserve">caution</w:t>
+            </w:r>
+          </w:p>
+        </w:tc>
+      </w:tr>
+    </w:tbl>
+    <w:p>
+      <w:pPr>
+        <w:spacing w:before="0" w:after="60" w:line="120" w:lineRule="auto"/>
+        <w:jc w:val="both"/>
+      </w:pPr>
+      <w:r>
+        <w:rPr>
+          <w:rFonts w:ascii="Times New Roman" w:hAnsi="Times New Roman" w:cs="Times New Roman"/>
+          <w:sz w:val="12"/>
+          <w:szCs w:val="12"/>
+        </w:rPr>
+        <w:t xml:space="preserve"/>
+      </w:r>
+    </w:p>
+    <w:p>
+      <w:pPr>
+        <w:keepNext/>
+        <w:spacing w:before="160" w:after="120" w:line="360" w:lineRule="auto"/>
+        <w:jc w:val="left"/>
+      </w:pPr>
+      <w:r>
+        <w:rPr>
+          <w:rFonts w:ascii="Times New Roman" w:hAnsi="Times New Roman" w:cs="Times New Roman"/>
+          <w:b/>
+          <w:sz w:val="28"/>
+          <w:szCs w:val="28"/>
+        </w:rPr>
+        <w:t xml:space="preserve">9.6  Normalisation and Integrity</w:t>
+      </w:r>
+    </w:p>
+    <w:p>
+      <w:pPr>
+        <w:spacing w:before="0" w:after="120" w:line="360" w:lineRule="auto"/>
+        <w:ind w:firstLine="360"/>
+        <w:jc w:val="both"/>
+      </w:pPr>
+      <w:r>
+        <w:rPr>
+          <w:rFonts w:ascii="Times New Roman" w:hAnsi="Times New Roman" w:cs="Times New Roman"/>
+          <w:sz w:val="24"/>
+          <w:szCs w:val="24"/>
+        </w:rPr>
+        <w:t xml:space="preserve">The data model follows the principles of normalisation, with each entity holding only the attributes that belong to it and relationships expressed through foreign keys rather than duplicated data. This avoids redundancy, prevents inconsistency and makes the database easier to maintain. Although the demonstration system keeps its data in memory, designing it around a normalised relational model means that it could be extended to persistent storage in a straightforward manner.</w:t>
+      </w:r>
+    </w:p>
+    <w:p>
       <w:r>
         <w:br w:type="page"/>
       </w:r>
@@ -8719,7 +11144,7 @@
           <w:sz w:val="22"/>
           <w:szCs w:val="22"/>
         </w:rPr>
-        <w:t xml:space="preserve">Table 8  Summary of benefits</w:t>
+        <w:t xml:space="preserve">Table 11  Summary of benefits</w:t>
       </w:r>
     </w:p>
     <w:tbl>
@@ -9528,6 +11953,37 @@
           <w:szCs w:val="24"/>
         </w:rPr>
         <w:t xml:space="preserve">The scope of the project is the real-time processing and visualisation of simulated aircraft telemetry within a browser-based application. It demonstrates the monitoring and visualisation stages of the flight-data-processing workflow on a safe and reduced scale, and it is designed so that it can be extended in future to work with real telemetry sources.</w:t>
+      </w:r>
+    </w:p>
+    <w:p>
+      <w:pPr>
+        <w:keepNext/>
+        <w:spacing w:before="160" w:after="120" w:line="360" w:lineRule="auto"/>
+        <w:jc w:val="left"/>
+      </w:pPr>
+      <w:r>
+        <w:rPr>
+          <w:rFonts w:ascii="Times New Roman" w:hAnsi="Times New Roman" w:cs="Times New Roman"/>
+          <w:b/>
+          <w:sz w:val="28"/>
+          <w:szCs w:val="28"/>
+        </w:rPr>
+        <w:t xml:space="preserve">12.6  Significance of the Objectives</w:t>
+      </w:r>
+    </w:p>
+    <w:p>
+      <w:pPr>
+        <w:spacing w:before="0" w:after="120" w:line="360" w:lineRule="auto"/>
+        <w:ind w:firstLine="360"/>
+        <w:jc w:val="both"/>
+      </w:pPr>
+      <w:r>
+        <w:rPr>
+          <w:rFonts w:ascii="Times New Roman" w:hAnsi="Times New Roman" w:cs="Times New Roman"/>
+          <w:sz w:val="24"/>
+          <w:szCs w:val="24"/>
+        </w:rPr>
+        <w:t xml:space="preserve">Taken together, these objectives ensured that the internship delivered value on two levels. On the personal level, they guided the development of technical and professional skills and the acquisition of domain knowledge. On the practical level, they directed the creation of a useful, working system that demonstrates real engineering concepts. Meeting these objectives is the measure by which the internship can be judged a success, and the chapters of this report provide the evidence that each of them was achieved.</w:t>
       </w:r>
     </w:p>
     <w:p>

</xml_diff>

<commit_message>
Replace ER placeholder with a proper ER diagram (entities, attributes, keys, 1:N cardinality)
</commit_message>
<xml_diff>
--- a/report/HAL_Internship_Report.docx
+++ b/report/HAL_Internship_Report.docx
@@ -10214,7 +10214,7 @@
           <w:sz w:val="28"/>
           <w:szCs w:val="28"/>
         </w:rPr>
-        <w:t xml:space="preserve">9.4  Entity-Relationship Overview</w:t>
+        <w:t xml:space="preserve">9.4  Entity-Relationship (ER) Diagram</w:t>
       </w:r>
     </w:p>
     <w:p>
@@ -10228,200 +10228,883 @@
           <w:sz w:val="24"/>
           <w:szCs w:val="24"/>
         </w:rPr>
-        <w:t xml:space="preserve">The relationships between the entities can be visualised as an entity-relationship diagram. The AIRCRAFT entity sits at the centre, linked by one-to-many relationships to TELEMETRY and ALERT, while SORTIE references the aircraft assigned to it and USER oversees the sorties.</w:t>
-      </w:r>
-    </w:p>
-    <w:p>
-      <w:pPr>
-        <w:spacing w:before="40" w:after="20" w:line="200" w:lineRule="auto"/>
+        <w:t xml:space="preserve">The entity-relationship diagram below presents the complete data model. Each entity is shown with its attributes, where the primary key is bold and underlined and each foreign key is shown in italics. The connectors indicate the relationships between the entities together with their cardinality, expressed in the one-to-many (1 : N) form.</w:t>
+      </w:r>
+    </w:p>
+    <w:tbl>
+      <w:tblPr>
+        <w:tblW w:w="0" w:type="auto"/>
         <w:jc w:val="center"/>
-      </w:pPr>
-      <w:r>
-        <w:rPr>
-          <w:rFonts w:ascii="Times New Roman" w:hAnsi="Times New Roman" w:cs="Times New Roman"/>
-          <w:b/>
-          <w:color w:val="555555"/>
+        <w:tblLook w:val="04A0"/>
+      </w:tblPr>
+      <w:tblGrid>
+        <w:gridCol w:w="4800"/>
+      </w:tblGrid>
+      <w:tr>
+        <w:tc>
+          <w:tcPr>
+            <w:tcW w:w="4800" w:type="dxa"/>
+            <w:tcBorders>
+              <w:top w:val="single" w:sz="12" w:color="1F3864"/>
+              <w:left w:val="single" w:sz="12" w:color="1F3864"/>
+              <w:bottom w:val="single" w:sz="12" w:color="1F3864"/>
+              <w:right w:val="single" w:sz="12" w:color="1F3864"/>
+            </w:tcBorders>
+            <w:tcMar>
+              <w:top w:w="40" w:type="dxa"/>
+              <w:bottom w:w="40" w:type="dxa"/>
+              <w:left w:w="80" w:type="dxa"/>
+              <w:right w:w="80" w:type="dxa"/>
+            </w:tcMar>
+            <w:vAlign w:val="top"/>
+          </w:tcPr>
+          <w:p>
+            <w:pPr>
+              <w:shd w:val="clear" w:color="auto" w:fill="1F3864"/>
+              <w:spacing w:before="20" w:after="20" w:line="220" w:lineRule="auto"/>
+              <w:jc w:val="center"/>
+            </w:pPr>
+            <w:r>
+              <w:rPr>
+                <w:rFonts w:ascii="Times New Roman" w:hAnsi="Times New Roman" w:cs="Times New Roman"/>
+                <w:b/>
+                <w:color w:val="FFFFFF"/>
+                <w:sz w:val="22"/>
+                <w:szCs w:val="22"/>
+              </w:rPr>
+              <w:t xml:space="preserve">USER</w:t>
+            </w:r>
+          </w:p>
+          <w:p>
+            <w:pPr>
+              <w:spacing w:before="10" w:after="10" w:line="220" w:lineRule="auto"/>
+              <w:jc w:val="left"/>
+            </w:pPr>
+            <w:r>
+              <w:rPr>
+                <w:rFonts w:ascii="Times New Roman" w:hAnsi="Times New Roman" w:cs="Times New Roman"/>
+                <w:b/>
+                <w:sz w:val="20"/>
+                <w:szCs w:val="20"/>
+                <w:u w:val="single"/>
+              </w:rPr>
+              <w:t xml:space="preserve">user_id  (PK)</w:t>
+            </w:r>
+          </w:p>
+          <w:p>
+            <w:pPr>
+              <w:spacing w:before="10" w:after="10" w:line="220" w:lineRule="auto"/>
+              <w:jc w:val="left"/>
+            </w:pPr>
+            <w:r>
+              <w:rPr>
+                <w:rFonts w:ascii="Times New Roman" w:hAnsi="Times New Roman" w:cs="Times New Roman"/>
+                <w:sz w:val="20"/>
+                <w:szCs w:val="20"/>
+              </w:rPr>
+              <w:t xml:space="preserve">username</w:t>
+            </w:r>
+          </w:p>
+          <w:p>
+            <w:pPr>
+              <w:spacing w:before="10" w:after="10" w:line="220" w:lineRule="auto"/>
+              <w:jc w:val="left"/>
+            </w:pPr>
+            <w:r>
+              <w:rPr>
+                <w:rFonts w:ascii="Times New Roman" w:hAnsi="Times New Roman" w:cs="Times New Roman"/>
+                <w:sz w:val="20"/>
+                <w:szCs w:val="20"/>
+              </w:rPr>
+              <w:t xml:space="preserve">role</w:t>
+            </w:r>
+          </w:p>
+        </w:tc>
+      </w:tr>
+    </w:tbl>
+    <w:p>
+      <w:pPr>
+        <w:spacing w:before="20" w:after="0" w:line="180" w:lineRule="auto"/>
+        <w:jc w:val="center"/>
+      </w:pPr>
+      <w:r>
+        <w:rPr>
+          <w:rFonts w:ascii="Times New Roman" w:hAnsi="Times New Roman" w:cs="Times New Roman"/>
+          <w:b/>
+          <w:color w:val="C00000"/>
+          <w:sz w:val="22"/>
+          <w:szCs w:val="22"/>
+        </w:rPr>
+        <w:t xml:space="preserve">1</w:t>
+      </w:r>
+    </w:p>
+    <w:p>
+      <w:pPr>
+        <w:spacing w:before="0" w:after="0" w:line="160" w:lineRule="auto"/>
+        <w:jc w:val="center"/>
+      </w:pPr>
+      <w:r>
+        <w:rPr>
+          <w:rFonts w:ascii="Times New Roman" w:hAnsi="Times New Roman" w:cs="Times New Roman"/>
+          <w:color w:val="1F3864"/>
+          <w:sz w:val="22"/>
+          <w:szCs w:val="22"/>
+        </w:rPr>
+        <w:t xml:space="preserve">│</w:t>
+      </w:r>
+    </w:p>
+    <w:p>
+      <w:pPr>
+        <w:spacing w:before="0" w:after="0" w:line="180" w:lineRule="auto"/>
+        <w:jc w:val="center"/>
+      </w:pPr>
+      <w:r>
+        <w:rPr>
+          <w:rFonts w:ascii="Times New Roman" w:hAnsi="Times New Roman" w:cs="Times New Roman"/>
+          <w:i/>
+          <w:color w:val="1F3864"/>
           <w:sz w:val="20"/>
           <w:szCs w:val="20"/>
         </w:rPr>
-        <w:t xml:space="preserve">Entities and Relationships</w:t>
+        <w:t xml:space="preserve">◇ oversees ◇</w:t>
+      </w:r>
+    </w:p>
+    <w:p>
+      <w:pPr>
+        <w:spacing w:before="0" w:after="0" w:line="160" w:lineRule="auto"/>
+        <w:jc w:val="center"/>
+      </w:pPr>
+      <w:r>
+        <w:rPr>
+          <w:rFonts w:ascii="Times New Roman" w:hAnsi="Times New Roman" w:cs="Times New Roman"/>
+          <w:color w:val="1F3864"/>
+          <w:sz w:val="22"/>
+          <w:szCs w:val="22"/>
+        </w:rPr>
+        <w:t xml:space="preserve">│</w:t>
+      </w:r>
+    </w:p>
+    <w:p>
+      <w:pPr>
+        <w:spacing w:before="0" w:after="20" w:line="180" w:lineRule="auto"/>
+        <w:jc w:val="center"/>
+      </w:pPr>
+      <w:r>
+        <w:rPr>
+          <w:rFonts w:ascii="Times New Roman" w:hAnsi="Times New Roman" w:cs="Times New Roman"/>
+          <w:b/>
+          <w:color w:val="C00000"/>
+          <w:sz w:val="22"/>
+          <w:szCs w:val="22"/>
+        </w:rPr>
+        <w:t xml:space="preserve">N</w:t>
+      </w:r>
+    </w:p>
+    <w:tbl>
+      <w:tblPr>
+        <w:tblW w:w="0" w:type="auto"/>
+        <w:jc w:val="center"/>
+        <w:tblLook w:val="04A0"/>
+      </w:tblPr>
+      <w:tblGrid>
+        <w:gridCol w:w="4800"/>
+      </w:tblGrid>
+      <w:tr>
+        <w:tc>
+          <w:tcPr>
+            <w:tcW w:w="4800" w:type="dxa"/>
+            <w:tcBorders>
+              <w:top w:val="single" w:sz="12" w:color="1F3864"/>
+              <w:left w:val="single" w:sz="12" w:color="1F3864"/>
+              <w:bottom w:val="single" w:sz="12" w:color="1F3864"/>
+              <w:right w:val="single" w:sz="12" w:color="1F3864"/>
+            </w:tcBorders>
+            <w:tcMar>
+              <w:top w:w="40" w:type="dxa"/>
+              <w:bottom w:w="40" w:type="dxa"/>
+              <w:left w:w="80" w:type="dxa"/>
+              <w:right w:w="80" w:type="dxa"/>
+            </w:tcMar>
+            <w:vAlign w:val="top"/>
+          </w:tcPr>
+          <w:p>
+            <w:pPr>
+              <w:shd w:val="clear" w:color="auto" w:fill="1F3864"/>
+              <w:spacing w:before="20" w:after="20" w:line="220" w:lineRule="auto"/>
+              <w:jc w:val="center"/>
+            </w:pPr>
+            <w:r>
+              <w:rPr>
+                <w:rFonts w:ascii="Times New Roman" w:hAnsi="Times New Roman" w:cs="Times New Roman"/>
+                <w:b/>
+                <w:color w:val="FFFFFF"/>
+                <w:sz w:val="22"/>
+                <w:szCs w:val="22"/>
+              </w:rPr>
+              <w:t xml:space="preserve">SORTIE</w:t>
+            </w:r>
+          </w:p>
+          <w:p>
+            <w:pPr>
+              <w:spacing w:before="10" w:after="10" w:line="220" w:lineRule="auto"/>
+              <w:jc w:val="left"/>
+            </w:pPr>
+            <w:r>
+              <w:rPr>
+                <w:rFonts w:ascii="Times New Roman" w:hAnsi="Times New Roman" w:cs="Times New Roman"/>
+                <w:b/>
+                <w:sz w:val="20"/>
+                <w:szCs w:val="20"/>
+                <w:u w:val="single"/>
+              </w:rPr>
+              <w:t xml:space="preserve">sortie_id  (PK)</w:t>
+            </w:r>
+          </w:p>
+          <w:p>
+            <w:pPr>
+              <w:spacing w:before="10" w:after="10" w:line="220" w:lineRule="auto"/>
+              <w:jc w:val="left"/>
+            </w:pPr>
+            <w:r>
+              <w:rPr>
+                <w:rFonts w:ascii="Times New Roman" w:hAnsi="Times New Roman" w:cs="Times New Roman"/>
+                <w:i/>
+                <w:sz w:val="20"/>
+                <w:szCs w:val="20"/>
+              </w:rPr>
+              <w:t xml:space="preserve">aircraft_id  (FK)</w:t>
+            </w:r>
+          </w:p>
+          <w:p>
+            <w:pPr>
+              <w:spacing w:before="10" w:after="10" w:line="220" w:lineRule="auto"/>
+              <w:jc w:val="left"/>
+            </w:pPr>
+            <w:r>
+              <w:rPr>
+                <w:rFonts w:ascii="Times New Roman" w:hAnsi="Times New Roman" w:cs="Times New Roman"/>
+                <w:sz w:val="20"/>
+                <w:szCs w:val="20"/>
+              </w:rPr>
+              <w:t xml:space="preserve">objective</w:t>
+            </w:r>
+          </w:p>
+          <w:p>
+            <w:pPr>
+              <w:spacing w:before="10" w:after="10" w:line="220" w:lineRule="auto"/>
+              <w:jc w:val="left"/>
+            </w:pPr>
+            <w:r>
+              <w:rPr>
+                <w:rFonts w:ascii="Times New Roman" w:hAnsi="Times New Roman" w:cs="Times New Roman"/>
+                <w:sz w:val="20"/>
+                <w:szCs w:val="20"/>
+              </w:rPr>
+              <w:t xml:space="preserve">phase</w:t>
+            </w:r>
+          </w:p>
+          <w:p>
+            <w:pPr>
+              <w:spacing w:before="10" w:after="10" w:line="220" w:lineRule="auto"/>
+              <w:jc w:val="left"/>
+            </w:pPr>
+            <w:r>
+              <w:rPr>
+                <w:rFonts w:ascii="Times New Roman" w:hAnsi="Times New Roman" w:cs="Times New Roman"/>
+                <w:sz w:val="20"/>
+                <w:szCs w:val="20"/>
+              </w:rPr>
+              <w:t xml:space="preserve">progress</w:t>
+            </w:r>
+          </w:p>
+        </w:tc>
+      </w:tr>
+    </w:tbl>
+    <w:p>
+      <w:pPr>
+        <w:spacing w:before="20" w:after="0" w:line="180" w:lineRule="auto"/>
+        <w:jc w:val="center"/>
+      </w:pPr>
+      <w:r>
+        <w:rPr>
+          <w:rFonts w:ascii="Times New Roman" w:hAnsi="Times New Roman" w:cs="Times New Roman"/>
+          <w:b/>
+          <w:color w:val="C00000"/>
+          <w:sz w:val="22"/>
+          <w:szCs w:val="22"/>
+        </w:rPr>
+        <w:t xml:space="preserve">N</w:t>
+      </w:r>
+    </w:p>
+    <w:p>
+      <w:pPr>
+        <w:spacing w:before="0" w:after="0" w:line="160" w:lineRule="auto"/>
+        <w:jc w:val="center"/>
+      </w:pPr>
+      <w:r>
+        <w:rPr>
+          <w:rFonts w:ascii="Times New Roman" w:hAnsi="Times New Roman" w:cs="Times New Roman"/>
+          <w:color w:val="1F3864"/>
+          <w:sz w:val="22"/>
+          <w:szCs w:val="22"/>
+        </w:rPr>
+        <w:t xml:space="preserve">│</w:t>
+      </w:r>
+    </w:p>
+    <w:p>
+      <w:pPr>
+        <w:spacing w:before="0" w:after="0" w:line="180" w:lineRule="auto"/>
+        <w:jc w:val="center"/>
+      </w:pPr>
+      <w:r>
+        <w:rPr>
+          <w:rFonts w:ascii="Times New Roman" w:hAnsi="Times New Roman" w:cs="Times New Roman"/>
+          <w:i/>
+          <w:color w:val="1F3864"/>
+          <w:sz w:val="20"/>
+          <w:szCs w:val="20"/>
+        </w:rPr>
+        <w:t xml:space="preserve">◇ assigned to ◇</w:t>
+      </w:r>
+    </w:p>
+    <w:p>
+      <w:pPr>
+        <w:spacing w:before="0" w:after="0" w:line="160" w:lineRule="auto"/>
+        <w:jc w:val="center"/>
+      </w:pPr>
+      <w:r>
+        <w:rPr>
+          <w:rFonts w:ascii="Times New Roman" w:hAnsi="Times New Roman" w:cs="Times New Roman"/>
+          <w:color w:val="1F3864"/>
+          <w:sz w:val="22"/>
+          <w:szCs w:val="22"/>
+        </w:rPr>
+        <w:t xml:space="preserve">│</w:t>
+      </w:r>
+    </w:p>
+    <w:p>
+      <w:pPr>
+        <w:spacing w:before="0" w:after="20" w:line="180" w:lineRule="auto"/>
+        <w:jc w:val="center"/>
+      </w:pPr>
+      <w:r>
+        <w:rPr>
+          <w:rFonts w:ascii="Times New Roman" w:hAnsi="Times New Roman" w:cs="Times New Roman"/>
+          <w:b/>
+          <w:color w:val="C00000"/>
+          <w:sz w:val="22"/>
+          <w:szCs w:val="22"/>
+        </w:rPr>
+        <w:t xml:space="preserve">1</w:t>
+      </w:r>
+    </w:p>
+    <w:tbl>
+      <w:tblPr>
+        <w:tblW w:w="0" w:type="auto"/>
+        <w:jc w:val="center"/>
+        <w:tblLook w:val="04A0"/>
+      </w:tblPr>
+      <w:tblGrid>
+        <w:gridCol w:w="4800"/>
+      </w:tblGrid>
+      <w:tr>
+        <w:tc>
+          <w:tcPr>
+            <w:tcW w:w="4800" w:type="dxa"/>
+            <w:tcBorders>
+              <w:top w:val="single" w:sz="12" w:color="1F3864"/>
+              <w:left w:val="single" w:sz="12" w:color="1F3864"/>
+              <w:bottom w:val="single" w:sz="12" w:color="1F3864"/>
+              <w:right w:val="single" w:sz="12" w:color="1F3864"/>
+            </w:tcBorders>
+            <w:tcMar>
+              <w:top w:w="40" w:type="dxa"/>
+              <w:bottom w:w="40" w:type="dxa"/>
+              <w:left w:w="80" w:type="dxa"/>
+              <w:right w:w="80" w:type="dxa"/>
+            </w:tcMar>
+            <w:vAlign w:val="top"/>
+          </w:tcPr>
+          <w:p>
+            <w:pPr>
+              <w:shd w:val="clear" w:color="auto" w:fill="1F3864"/>
+              <w:spacing w:before="20" w:after="20" w:line="220" w:lineRule="auto"/>
+              <w:jc w:val="center"/>
+            </w:pPr>
+            <w:r>
+              <w:rPr>
+                <w:rFonts w:ascii="Times New Roman" w:hAnsi="Times New Roman" w:cs="Times New Roman"/>
+                <w:b/>
+                <w:color w:val="FFFFFF"/>
+                <w:sz w:val="22"/>
+                <w:szCs w:val="22"/>
+              </w:rPr>
+              <w:t xml:space="preserve">AIRCRAFT</w:t>
+            </w:r>
+          </w:p>
+          <w:p>
+            <w:pPr>
+              <w:spacing w:before="10" w:after="10" w:line="220" w:lineRule="auto"/>
+              <w:jc w:val="left"/>
+            </w:pPr>
+            <w:r>
+              <w:rPr>
+                <w:rFonts w:ascii="Times New Roman" w:hAnsi="Times New Roman" w:cs="Times New Roman"/>
+                <w:b/>
+                <w:sz w:val="20"/>
+                <w:szCs w:val="20"/>
+                <w:u w:val="single"/>
+              </w:rPr>
+              <w:t xml:space="preserve">aircraft_id  (PK)</w:t>
+            </w:r>
+          </w:p>
+          <w:p>
+            <w:pPr>
+              <w:spacing w:before="10" w:after="10" w:line="220" w:lineRule="auto"/>
+              <w:jc w:val="left"/>
+            </w:pPr>
+            <w:r>
+              <w:rPr>
+                <w:rFonts w:ascii="Times New Roman" w:hAnsi="Times New Roman" w:cs="Times New Roman"/>
+                <w:sz w:val="20"/>
+                <w:szCs w:val="20"/>
+              </w:rPr>
+              <w:t xml:space="preserve">callsign</w:t>
+            </w:r>
+          </w:p>
+          <w:p>
+            <w:pPr>
+              <w:spacing w:before="10" w:after="10" w:line="220" w:lineRule="auto"/>
+              <w:jc w:val="left"/>
+            </w:pPr>
+            <w:r>
+              <w:rPr>
+                <w:rFonts w:ascii="Times New Roman" w:hAnsi="Times New Roman" w:cs="Times New Roman"/>
+                <w:sz w:val="20"/>
+                <w:szCs w:val="20"/>
+              </w:rPr>
+              <w:t xml:space="preserve">type</w:t>
+            </w:r>
+          </w:p>
+          <w:p>
+            <w:pPr>
+              <w:spacing w:before="10" w:after="10" w:line="220" w:lineRule="auto"/>
+              <w:jc w:val="left"/>
+            </w:pPr>
+            <w:r>
+              <w:rPr>
+                <w:rFonts w:ascii="Times New Roman" w:hAnsi="Times New Roman" w:cs="Times New Roman"/>
+                <w:sz w:val="20"/>
+                <w:szCs w:val="20"/>
+              </w:rPr>
+              <w:t xml:space="preserve">status</w:t>
+            </w:r>
+          </w:p>
+        </w:tc>
+      </w:tr>
+    </w:tbl>
+    <w:p>
+      <w:pPr>
+        <w:spacing w:before="20" w:after="0" w:line="180" w:lineRule="auto"/>
+        <w:jc w:val="center"/>
+      </w:pPr>
+      <w:r>
+        <w:rPr>
+          <w:rFonts w:ascii="Times New Roman" w:hAnsi="Times New Roman" w:cs="Times New Roman"/>
+          <w:b/>
+          <w:color w:val="C00000"/>
+          <w:sz w:val="22"/>
+          <w:szCs w:val="22"/>
+        </w:rPr>
+        <w:t xml:space="preserve">1</w:t>
       </w:r>
     </w:p>
     <w:tbl>
       <w:tblPr>
         <w:tblW w:w="9360" w:type="dxa"/>
         <w:jc w:val="center"/>
+        <w:tblBorders>
+          <w:top w:val="nil"/>
+          <w:left w:val="nil"/>
+          <w:bottom w:val="nil"/>
+          <w:right w:val="nil"/>
+          <w:insideH w:val="nil"/>
+          <w:insideV w:val="nil"/>
+        </w:tblBorders>
         <w:tblLook w:val="04A0"/>
       </w:tblPr>
       <w:tblGrid>
-        <w:gridCol w:w="1872"/>
-        <w:gridCol w:w="1872"/>
-        <w:gridCol w:w="1872"/>
-        <w:gridCol w:w="1872"/>
-        <w:gridCol w:w="1872"/>
+        <w:gridCol w:w="4680"/>
+        <w:gridCol w:w="4680"/>
       </w:tblGrid>
       <w:tr>
         <w:tc>
           <w:tcPr>
-            <w:tcW w:w="1872" w:type="dxa"/>
-            <w:tcBorders>
-              <w:top w:val="single" w:sz="8" w:color="1F3864"/>
-              <w:left w:val="single" w:sz="8" w:color="1F3864"/>
-              <w:bottom w:val="single" w:sz="8" w:color="1F3864"/>
-              <w:right w:val="single" w:sz="8" w:color="1F3864"/>
-            </w:tcBorders>
-            <w:shd w:val="clear" w:color="auto" w:fill="DCE6F1"/>
-            <w:vAlign w:val="center"/>
-          </w:tcPr>
-          <w:p>
-            <w:pPr>
-              <w:spacing w:before="40" w:after="40" w:line="240" w:lineRule="auto"/>
+            <w:tcW w:w="4680" w:type="dxa"/>
+          </w:tcPr>
+          <w:p>
+            <w:pPr>
+              <w:spacing w:before="0" w:after="0" w:line="180" w:lineRule="auto"/>
               <w:jc w:val="center"/>
             </w:pPr>
             <w:r>
               <w:rPr>
                 <w:rFonts w:ascii="Times New Roman" w:hAnsi="Times New Roman" w:cs="Times New Roman"/>
-                <w:b/>
+                <w:i/>
                 <w:color w:val="1F3864"/>
-                <w:sz w:val="22"/>
-                <w:szCs w:val="22"/>
-              </w:rPr>
-              <w:t xml:space="preserve">USER</w:t>
-            </w:r>
-          </w:p>
-        </w:tc>
-        <w:tc>
-          <w:tcPr>
-            <w:tcW w:w="1872" w:type="dxa"/>
-            <w:tcBorders>
-              <w:top w:val="single" w:sz="8" w:color="1F3864"/>
-              <w:left w:val="single" w:sz="8" w:color="1F3864"/>
-              <w:bottom w:val="single" w:sz="8" w:color="1F3864"/>
-              <w:right w:val="single" w:sz="8" w:color="1F3864"/>
-            </w:tcBorders>
-            <w:shd w:val="clear" w:color="auto" w:fill="DCE6F1"/>
-            <w:vAlign w:val="center"/>
-          </w:tcPr>
-          <w:p>
-            <w:pPr>
-              <w:spacing w:before="40" w:after="40" w:line="240" w:lineRule="auto"/>
+                <w:sz w:val="20"/>
+                <w:szCs w:val="20"/>
+              </w:rPr>
+              <w:t xml:space="preserve">↙ generates</w:t>
+            </w:r>
+          </w:p>
+        </w:tc>
+        <w:tc>
+          <w:tcPr>
+            <w:tcW w:w="4680" w:type="dxa"/>
+          </w:tcPr>
+          <w:p>
+            <w:pPr>
+              <w:spacing w:before="0" w:after="0" w:line="180" w:lineRule="auto"/>
               <w:jc w:val="center"/>
             </w:pPr>
             <w:r>
               <w:rPr>
                 <w:rFonts w:ascii="Times New Roman" w:hAnsi="Times New Roman" w:cs="Times New Roman"/>
-                <w:b/>
+                <w:i/>
                 <w:color w:val="1F3864"/>
-                <w:sz w:val="22"/>
-                <w:szCs w:val="22"/>
-              </w:rPr>
-              <w:t xml:space="preserve">SORTIE</w:t>
-            </w:r>
-          </w:p>
-        </w:tc>
-        <w:tc>
-          <w:tcPr>
-            <w:tcW w:w="1872" w:type="dxa"/>
-            <w:tcBorders>
-              <w:top w:val="single" w:sz="8" w:color="1F3864"/>
-              <w:left w:val="single" w:sz="8" w:color="1F3864"/>
-              <w:bottom w:val="single" w:sz="8" w:color="1F3864"/>
-              <w:right w:val="single" w:sz="8" w:color="1F3864"/>
-            </w:tcBorders>
-            <w:shd w:val="clear" w:color="auto" w:fill="DCE6F1"/>
-            <w:vAlign w:val="center"/>
-          </w:tcPr>
-          <w:p>
-            <w:pPr>
-              <w:spacing w:before="40" w:after="40" w:line="240" w:lineRule="auto"/>
-              <w:jc w:val="center"/>
-            </w:pPr>
-            <w:r>
-              <w:rPr>
-                <w:rFonts w:ascii="Times New Roman" w:hAnsi="Times New Roman" w:cs="Times New Roman"/>
-                <w:b/>
-                <w:color w:val="1F3864"/>
-                <w:sz w:val="22"/>
-                <w:szCs w:val="22"/>
-              </w:rPr>
-              <w:t xml:space="preserve">AIRCRAFT</w:t>
-            </w:r>
-          </w:p>
-        </w:tc>
-        <w:tc>
-          <w:tcPr>
-            <w:tcW w:w="1872" w:type="dxa"/>
-            <w:tcBorders>
-              <w:top w:val="single" w:sz="8" w:color="1F3864"/>
-              <w:left w:val="single" w:sz="8" w:color="1F3864"/>
-              <w:bottom w:val="single" w:sz="8" w:color="1F3864"/>
-              <w:right w:val="single" w:sz="8" w:color="1F3864"/>
-            </w:tcBorders>
-            <w:shd w:val="clear" w:color="auto" w:fill="DCE6F1"/>
-            <w:vAlign w:val="center"/>
-          </w:tcPr>
-          <w:p>
-            <w:pPr>
-              <w:spacing w:before="40" w:after="40" w:line="240" w:lineRule="auto"/>
-              <w:jc w:val="center"/>
-            </w:pPr>
-            <w:r>
-              <w:rPr>
-                <w:rFonts w:ascii="Times New Roman" w:hAnsi="Times New Roman" w:cs="Times New Roman"/>
-                <w:b/>
-                <w:color w:val="1F3864"/>
-                <w:sz w:val="22"/>
-                <w:szCs w:val="22"/>
-              </w:rPr>
-              <w:t xml:space="preserve">TELEMETRY</w:t>
-            </w:r>
-          </w:p>
-        </w:tc>
-        <w:tc>
-          <w:tcPr>
-            <w:tcW w:w="1872" w:type="dxa"/>
-            <w:tcBorders>
-              <w:top w:val="single" w:sz="8" w:color="1F3864"/>
-              <w:left w:val="single" w:sz="8" w:color="1F3864"/>
-              <w:bottom w:val="single" w:sz="8" w:color="1F3864"/>
-              <w:right w:val="single" w:sz="8" w:color="1F3864"/>
-            </w:tcBorders>
-            <w:shd w:val="clear" w:color="auto" w:fill="DCE6F1"/>
-            <w:vAlign w:val="center"/>
-          </w:tcPr>
-          <w:p>
-            <w:pPr>
-              <w:spacing w:before="40" w:after="40" w:line="240" w:lineRule="auto"/>
-              <w:jc w:val="center"/>
-            </w:pPr>
-            <w:r>
-              <w:rPr>
-                <w:rFonts w:ascii="Times New Roman" w:hAnsi="Times New Roman" w:cs="Times New Roman"/>
-                <w:b/>
-                <w:color w:val="1F3864"/>
-                <w:sz w:val="22"/>
-                <w:szCs w:val="22"/>
-              </w:rPr>
-              <w:t xml:space="preserve">ALERT</w:t>
+                <w:sz w:val="20"/>
+                <w:szCs w:val="20"/>
+              </w:rPr>
+              <w:t xml:space="preserve">raises ↘</w:t>
             </w:r>
           </w:p>
         </w:tc>
       </w:tr>
     </w:tbl>
-    <w:p>
-      <w:pPr>
-        <w:spacing w:before="0" w:after="60" w:line="120" w:lineRule="auto"/>
-        <w:jc w:val="both"/>
-      </w:pPr>
-      <w:r>
-        <w:rPr>
-          <w:rFonts w:ascii="Times New Roman" w:hAnsi="Times New Roman" w:cs="Times New Roman"/>
-          <w:sz w:val="12"/>
-          <w:szCs w:val="12"/>
-        </w:rPr>
-        <w:t xml:space="preserve"/>
-      </w:r>
-    </w:p>
+    <w:tbl>
+      <w:tblPr>
+        <w:tblW w:w="9360" w:type="dxa"/>
+        <w:jc w:val="center"/>
+        <w:tblBorders>
+          <w:top w:val="nil"/>
+          <w:left w:val="nil"/>
+          <w:bottom w:val="nil"/>
+          <w:right w:val="nil"/>
+          <w:insideH w:val="nil"/>
+          <w:insideV w:val="nil"/>
+        </w:tblBorders>
+        <w:tblLook w:val="04A0"/>
+      </w:tblPr>
+      <w:tblGrid>
+        <w:gridCol w:w="4680"/>
+        <w:gridCol w:w="4680"/>
+      </w:tblGrid>
+      <w:tr>
+        <w:tc>
+          <w:tcPr>
+            <w:tcW w:w="4680" w:type="dxa"/>
+          </w:tcPr>
+          <w:p>
+            <w:pPr>
+              <w:spacing w:before="0" w:after="20" w:line="180" w:lineRule="auto"/>
+              <w:jc w:val="center"/>
+            </w:pPr>
+            <w:r>
+              <w:rPr>
+                <w:rFonts w:ascii="Times New Roman" w:hAnsi="Times New Roman" w:cs="Times New Roman"/>
+                <w:b/>
+                <w:color w:val="C00000"/>
+                <w:sz w:val="22"/>
+                <w:szCs w:val="22"/>
+              </w:rPr>
+              <w:t xml:space="preserve">N</w:t>
+            </w:r>
+          </w:p>
+        </w:tc>
+        <w:tc>
+          <w:tcPr>
+            <w:tcW w:w="4680" w:type="dxa"/>
+          </w:tcPr>
+          <w:p>
+            <w:pPr>
+              <w:spacing w:before="0" w:after="20" w:line="180" w:lineRule="auto"/>
+              <w:jc w:val="center"/>
+            </w:pPr>
+            <w:r>
+              <w:rPr>
+                <w:rFonts w:ascii="Times New Roman" w:hAnsi="Times New Roman" w:cs="Times New Roman"/>
+                <w:b/>
+                <w:color w:val="C00000"/>
+                <w:sz w:val="22"/>
+                <w:szCs w:val="22"/>
+              </w:rPr>
+              <w:t xml:space="preserve">N</w:t>
+            </w:r>
+          </w:p>
+        </w:tc>
+      </w:tr>
+    </w:tbl>
+    <w:tbl>
+      <w:tblPr>
+        <w:tblW w:w="0" w:type="auto"/>
+        <w:jc w:val="center"/>
+        <w:tblLook w:val="04A0"/>
+      </w:tblPr>
+      <w:tblGrid>
+        <w:gridCol w:w="4400"/>
+        <w:gridCol w:w="560"/>
+        <w:gridCol w:w="4400"/>
+      </w:tblGrid>
+      <w:tr>
+        <w:tc>
+          <w:tcPr>
+            <w:tcW w:w="4400" w:type="dxa"/>
+            <w:tcBorders>
+              <w:top w:val="single" w:sz="12" w:color="1F3864"/>
+              <w:left w:val="single" w:sz="12" w:color="1F3864"/>
+              <w:bottom w:val="single" w:sz="12" w:color="1F3864"/>
+              <w:right w:val="single" w:sz="12" w:color="1F3864"/>
+            </w:tcBorders>
+            <w:tcMar>
+              <w:top w:w="40" w:type="dxa"/>
+              <w:bottom w:w="40" w:type="dxa"/>
+              <w:left w:w="80" w:type="dxa"/>
+              <w:right w:w="80" w:type="dxa"/>
+            </w:tcMar>
+            <w:vAlign w:val="top"/>
+          </w:tcPr>
+          <w:p>
+            <w:pPr>
+              <w:shd w:val="clear" w:color="auto" w:fill="1F3864"/>
+              <w:spacing w:before="20" w:after="20" w:line="220" w:lineRule="auto"/>
+              <w:jc w:val="center"/>
+            </w:pPr>
+            <w:r>
+              <w:rPr>
+                <w:rFonts w:ascii="Times New Roman" w:hAnsi="Times New Roman" w:cs="Times New Roman"/>
+                <w:b/>
+                <w:color w:val="FFFFFF"/>
+                <w:sz w:val="22"/>
+                <w:szCs w:val="22"/>
+              </w:rPr>
+              <w:t xml:space="preserve">TELEMETRY</w:t>
+            </w:r>
+          </w:p>
+          <w:p>
+            <w:pPr>
+              <w:spacing w:before="10" w:after="10" w:line="220" w:lineRule="auto"/>
+              <w:jc w:val="left"/>
+            </w:pPr>
+            <w:r>
+              <w:rPr>
+                <w:rFonts w:ascii="Times New Roman" w:hAnsi="Times New Roman" w:cs="Times New Roman"/>
+                <w:b/>
+                <w:sz w:val="20"/>
+                <w:szCs w:val="20"/>
+                <w:u w:val="single"/>
+              </w:rPr>
+              <w:t xml:space="preserve">telemetry_id  (PK)</w:t>
+            </w:r>
+          </w:p>
+          <w:p>
+            <w:pPr>
+              <w:spacing w:before="10" w:after="10" w:line="220" w:lineRule="auto"/>
+              <w:jc w:val="left"/>
+            </w:pPr>
+            <w:r>
+              <w:rPr>
+                <w:rFonts w:ascii="Times New Roman" w:hAnsi="Times New Roman" w:cs="Times New Roman"/>
+                <w:i/>
+                <w:sz w:val="20"/>
+                <w:szCs w:val="20"/>
+              </w:rPr>
+              <w:t xml:space="preserve">aircraft_id  (FK)</w:t>
+            </w:r>
+          </w:p>
+          <w:p>
+            <w:pPr>
+              <w:spacing w:before="10" w:after="10" w:line="220" w:lineRule="auto"/>
+              <w:jc w:val="left"/>
+            </w:pPr>
+            <w:r>
+              <w:rPr>
+                <w:rFonts w:ascii="Times New Roman" w:hAnsi="Times New Roman" w:cs="Times New Roman"/>
+                <w:sz w:val="20"/>
+                <w:szCs w:val="20"/>
+              </w:rPr>
+              <w:t xml:space="preserve">altitude</w:t>
+            </w:r>
+          </w:p>
+          <w:p>
+            <w:pPr>
+              <w:spacing w:before="10" w:after="10" w:line="220" w:lineRule="auto"/>
+              <w:jc w:val="left"/>
+            </w:pPr>
+            <w:r>
+              <w:rPr>
+                <w:rFonts w:ascii="Times New Roman" w:hAnsi="Times New Roman" w:cs="Times New Roman"/>
+                <w:sz w:val="20"/>
+                <w:szCs w:val="20"/>
+              </w:rPr>
+              <w:t xml:space="preserve">speed</w:t>
+            </w:r>
+          </w:p>
+          <w:p>
+            <w:pPr>
+              <w:spacing w:before="10" w:after="10" w:line="220" w:lineRule="auto"/>
+              <w:jc w:val="left"/>
+            </w:pPr>
+            <w:r>
+              <w:rPr>
+                <w:rFonts w:ascii="Times New Roman" w:hAnsi="Times New Roman" w:cs="Times New Roman"/>
+                <w:sz w:val="20"/>
+                <w:szCs w:val="20"/>
+              </w:rPr>
+              <w:t xml:space="preserve">heading</w:t>
+            </w:r>
+          </w:p>
+          <w:p>
+            <w:pPr>
+              <w:spacing w:before="10" w:after="10" w:line="220" w:lineRule="auto"/>
+              <w:jc w:val="left"/>
+            </w:pPr>
+            <w:r>
+              <w:rPr>
+                <w:rFonts w:ascii="Times New Roman" w:hAnsi="Times New Roman" w:cs="Times New Roman"/>
+                <w:sz w:val="20"/>
+                <w:szCs w:val="20"/>
+              </w:rPr>
+              <w:t xml:space="preserve">timestamp</w:t>
+            </w:r>
+          </w:p>
+        </w:tc>
+        <w:tc>
+          <w:tcPr>
+            <w:tcW w:w="560" w:type="dxa"/>
+            <w:tcBorders>
+              <w:top w:val="nil"/>
+              <w:left w:val="nil"/>
+              <w:bottom w:val="nil"/>
+              <w:right w:val="nil"/>
+            </w:tcBorders>
+          </w:tcPr>
+          <w:p>
+            <w:pPr>
+              <w:spacing w:after="0"/>
+            </w:pPr>
+          </w:p>
+        </w:tc>
+        <w:tc>
+          <w:tcPr>
+            <w:tcW w:w="4400" w:type="dxa"/>
+            <w:tcBorders>
+              <w:top w:val="single" w:sz="12" w:color="1F3864"/>
+              <w:left w:val="single" w:sz="12" w:color="1F3864"/>
+              <w:bottom w:val="single" w:sz="12" w:color="1F3864"/>
+              <w:right w:val="single" w:sz="12" w:color="1F3864"/>
+            </w:tcBorders>
+            <w:tcMar>
+              <w:top w:w="40" w:type="dxa"/>
+              <w:bottom w:w="40" w:type="dxa"/>
+              <w:left w:w="80" w:type="dxa"/>
+              <w:right w:w="80" w:type="dxa"/>
+            </w:tcMar>
+            <w:vAlign w:val="top"/>
+          </w:tcPr>
+          <w:p>
+            <w:pPr>
+              <w:shd w:val="clear" w:color="auto" w:fill="1F3864"/>
+              <w:spacing w:before="20" w:after="20" w:line="220" w:lineRule="auto"/>
+              <w:jc w:val="center"/>
+            </w:pPr>
+            <w:r>
+              <w:rPr>
+                <w:rFonts w:ascii="Times New Roman" w:hAnsi="Times New Roman" w:cs="Times New Roman"/>
+                <w:b/>
+                <w:color w:val="FFFFFF"/>
+                <w:sz w:val="22"/>
+                <w:szCs w:val="22"/>
+              </w:rPr>
+              <w:t xml:space="preserve">ALERT</w:t>
+            </w:r>
+          </w:p>
+          <w:p>
+            <w:pPr>
+              <w:spacing w:before="10" w:after="10" w:line="220" w:lineRule="auto"/>
+              <w:jc w:val="left"/>
+            </w:pPr>
+            <w:r>
+              <w:rPr>
+                <w:rFonts w:ascii="Times New Roman" w:hAnsi="Times New Roman" w:cs="Times New Roman"/>
+                <w:b/>
+                <w:sz w:val="20"/>
+                <w:szCs w:val="20"/>
+                <w:u w:val="single"/>
+              </w:rPr>
+              <w:t xml:space="preserve">alert_id  (PK)</w:t>
+            </w:r>
+          </w:p>
+          <w:p>
+            <w:pPr>
+              <w:spacing w:before="10" w:after="10" w:line="220" w:lineRule="auto"/>
+              <w:jc w:val="left"/>
+            </w:pPr>
+            <w:r>
+              <w:rPr>
+                <w:rFonts w:ascii="Times New Roman" w:hAnsi="Times New Roman" w:cs="Times New Roman"/>
+                <w:i/>
+                <w:sz w:val="20"/>
+                <w:szCs w:val="20"/>
+              </w:rPr>
+              <w:t xml:space="preserve">aircraft_id  (FK)</w:t>
+            </w:r>
+          </w:p>
+          <w:p>
+            <w:pPr>
+              <w:spacing w:before="10" w:after="10" w:line="220" w:lineRule="auto"/>
+              <w:jc w:val="left"/>
+            </w:pPr>
+            <w:r>
+              <w:rPr>
+                <w:rFonts w:ascii="Times New Roman" w:hAnsi="Times New Roman" w:cs="Times New Roman"/>
+                <w:sz w:val="20"/>
+                <w:szCs w:val="20"/>
+              </w:rPr>
+              <w:t xml:space="preserve">severity</w:t>
+            </w:r>
+          </w:p>
+          <w:p>
+            <w:pPr>
+              <w:spacing w:before="10" w:after="10" w:line="220" w:lineRule="auto"/>
+              <w:jc w:val="left"/>
+            </w:pPr>
+            <w:r>
+              <w:rPr>
+                <w:rFonts w:ascii="Times New Roman" w:hAnsi="Times New Roman" w:cs="Times New Roman"/>
+                <w:sz w:val="20"/>
+                <w:szCs w:val="20"/>
+              </w:rPr>
+              <w:t xml:space="preserve">message</w:t>
+            </w:r>
+          </w:p>
+          <w:p>
+            <w:pPr>
+              <w:spacing w:before="10" w:after="10" w:line="220" w:lineRule="auto"/>
+              <w:jc w:val="left"/>
+            </w:pPr>
+            <w:r>
+              <w:rPr>
+                <w:rFonts w:ascii="Times New Roman" w:hAnsi="Times New Roman" w:cs="Times New Roman"/>
+                <w:sz w:val="20"/>
+                <w:szCs w:val="20"/>
+              </w:rPr>
+              <w:t xml:space="preserve">timestamp</w:t>
+            </w:r>
+          </w:p>
+        </w:tc>
+      </w:tr>
+    </w:tbl>
     <w:p>
       <w:pPr>
         <w:spacing w:before="60" w:after="200" w:line="240" w:lineRule="auto"/>
@@ -10434,7 +11117,22 @@
           <w:sz w:val="22"/>
           <w:szCs w:val="22"/>
         </w:rPr>
-        <w:t xml:space="preserve">Fig. 9  Entity-relationship overview of the data model</w:t>
+        <w:t xml:space="preserve">Fig. 9  Entity-Relationship (ER) diagram of the data model</w:t>
+      </w:r>
+    </w:p>
+    <w:p>
+      <w:pPr>
+        <w:spacing w:before="0" w:after="120" w:line="360" w:lineRule="auto"/>
+        <w:ind w:firstLine="360"/>
+        <w:jc w:val="both"/>
+      </w:pPr>
+      <w:r>
+        <w:rPr>
+          <w:rFonts w:ascii="Times New Roman" w:hAnsi="Times New Roman" w:cs="Times New Roman"/>
+          <w:sz w:val="24"/>
+          <w:szCs w:val="24"/>
+        </w:rPr>
+        <w:t xml:space="preserve">As the diagram shows, AIRCRAFT is the central entity. One USER oversees many SORTIE records; each SORTIE is assigned to exactly one AIRCRAFT, while one AIRCRAFT may appear in many sorties. One AIRCRAFT generates many TELEMETRY records and raises many ALERT records. These one-to-many relationships, enforced through the foreign keys shown in italics, preserve the integrity of the data and allow it to be queried efficiently.</w:t>
       </w:r>
     </w:p>
     <w:p>

</xml_diff>

<commit_message>
Add System Architecture, Data Flow Diagram and system flowchart; renumber sections
</commit_message>
<xml_diff>
--- a/report/HAL_Internship_Report.docx
+++ b/report/HAL_Internship_Report.docx
@@ -7711,7 +7711,507 @@
           <w:sz w:val="28"/>
           <w:szCs w:val="28"/>
         </w:rPr>
-        <w:t xml:space="preserve">7.2  Login Page</w:t>
+        <w:t xml:space="preserve">7.2  System Architecture</w:t>
+      </w:r>
+    </w:p>
+    <w:p>
+      <w:pPr>
+        <w:spacing w:before="0" w:after="120" w:line="360" w:lineRule="auto"/>
+        <w:jc w:val="both"/>
+      </w:pPr>
+      <w:r>
+        <w:rPr>
+          <w:rFonts w:ascii="Times New Roman" w:hAnsi="Times New Roman" w:cs="Times New Roman"/>
+          <w:sz w:val="24"/>
+          <w:szCs w:val="24"/>
+        </w:rPr>
+        <w:t xml:space="preserve">Before describing the individual pages, it is useful to view the overall architecture of the application. The system follows a layered client-side architecture in which a data layer holds the aircraft model, an application layer simulates and processes the telemetry, and a presentation layer renders the various pages and visualisations.</w:t>
+      </w:r>
+    </w:p>
+    <w:p>
+      <w:pPr>
+        <w:spacing w:before="40" w:after="20" w:line="200" w:lineRule="auto"/>
+        <w:jc w:val="center"/>
+      </w:pPr>
+      <w:r>
+        <w:rPr>
+          <w:rFonts w:ascii="Times New Roman" w:hAnsi="Times New Roman" w:cs="Times New Roman"/>
+          <w:b/>
+          <w:color w:val="555555"/>
+          <w:sz w:val="20"/>
+          <w:szCs w:val="20"/>
+        </w:rPr>
+        <w:t xml:space="preserve">Presentation Layer</w:t>
+      </w:r>
+    </w:p>
+    <w:tbl>
+      <w:tblPr>
+        <w:tblW w:w="9360" w:type="dxa"/>
+        <w:jc w:val="center"/>
+        <w:tblLook w:val="04A0"/>
+      </w:tblPr>
+      <w:tblGrid>
+        <w:gridCol w:w="1872"/>
+        <w:gridCol w:w="1872"/>
+        <w:gridCol w:w="1872"/>
+        <w:gridCol w:w="1872"/>
+        <w:gridCol w:w="1872"/>
+      </w:tblGrid>
+      <w:tr>
+        <w:tc>
+          <w:tcPr>
+            <w:tcW w:w="1872" w:type="dxa"/>
+            <w:tcBorders>
+              <w:top w:val="single" w:sz="8" w:color="1F3864"/>
+              <w:left w:val="single" w:sz="8" w:color="1F3864"/>
+              <w:bottom w:val="single" w:sz="8" w:color="1F3864"/>
+              <w:right w:val="single" w:sz="8" w:color="1F3864"/>
+            </w:tcBorders>
+            <w:shd w:val="clear" w:color="auto" w:fill="DCE6F1"/>
+            <w:vAlign w:val="center"/>
+          </w:tcPr>
+          <w:p>
+            <w:pPr>
+              <w:spacing w:before="40" w:after="40" w:line="240" w:lineRule="auto"/>
+              <w:jc w:val="center"/>
+            </w:pPr>
+            <w:r>
+              <w:rPr>
+                <w:rFonts w:ascii="Times New Roman" w:hAnsi="Times New Roman" w:cs="Times New Roman"/>
+                <w:b/>
+                <w:color w:val="1F3864"/>
+                <w:sz w:val="22"/>
+                <w:szCs w:val="22"/>
+              </w:rPr>
+              <w:t xml:space="preserve">Dashboard</w:t>
+            </w:r>
+          </w:p>
+        </w:tc>
+        <w:tc>
+          <w:tcPr>
+            <w:tcW w:w="1872" w:type="dxa"/>
+            <w:tcBorders>
+              <w:top w:val="single" w:sz="8" w:color="1F3864"/>
+              <w:left w:val="single" w:sz="8" w:color="1F3864"/>
+              <w:bottom w:val="single" w:sz="8" w:color="1F3864"/>
+              <w:right w:val="single" w:sz="8" w:color="1F3864"/>
+            </w:tcBorders>
+            <w:shd w:val="clear" w:color="auto" w:fill="DCE6F1"/>
+            <w:vAlign w:val="center"/>
+          </w:tcPr>
+          <w:p>
+            <w:pPr>
+              <w:spacing w:before="40" w:after="40" w:line="240" w:lineRule="auto"/>
+              <w:jc w:val="center"/>
+            </w:pPr>
+            <w:r>
+              <w:rPr>
+                <w:rFonts w:ascii="Times New Roman" w:hAnsi="Times New Roman" w:cs="Times New Roman"/>
+                <w:b/>
+                <w:color w:val="1F3864"/>
+                <w:sz w:val="22"/>
+                <w:szCs w:val="22"/>
+              </w:rPr>
+              <w:t xml:space="preserve">Tracking</w:t>
+            </w:r>
+          </w:p>
+        </w:tc>
+        <w:tc>
+          <w:tcPr>
+            <w:tcW w:w="1872" w:type="dxa"/>
+            <w:tcBorders>
+              <w:top w:val="single" w:sz="8" w:color="1F3864"/>
+              <w:left w:val="single" w:sz="8" w:color="1F3864"/>
+              <w:bottom w:val="single" w:sz="8" w:color="1F3864"/>
+              <w:right w:val="single" w:sz="8" w:color="1F3864"/>
+            </w:tcBorders>
+            <w:shd w:val="clear" w:color="auto" w:fill="DCE6F1"/>
+            <w:vAlign w:val="center"/>
+          </w:tcPr>
+          <w:p>
+            <w:pPr>
+              <w:spacing w:before="40" w:after="40" w:line="240" w:lineRule="auto"/>
+              <w:jc w:val="center"/>
+            </w:pPr>
+            <w:r>
+              <w:rPr>
+                <w:rFonts w:ascii="Times New Roman" w:hAnsi="Times New Roman" w:cs="Times New Roman"/>
+                <w:b/>
+                <w:color w:val="1F3864"/>
+                <w:sz w:val="22"/>
+                <w:szCs w:val="22"/>
+              </w:rPr>
+              <w:t xml:space="preserve">Radar</w:t>
+            </w:r>
+          </w:p>
+        </w:tc>
+        <w:tc>
+          <w:tcPr>
+            <w:tcW w:w="1872" w:type="dxa"/>
+            <w:tcBorders>
+              <w:top w:val="single" w:sz="8" w:color="1F3864"/>
+              <w:left w:val="single" w:sz="8" w:color="1F3864"/>
+              <w:bottom w:val="single" w:sz="8" w:color="1F3864"/>
+              <w:right w:val="single" w:sz="8" w:color="1F3864"/>
+            </w:tcBorders>
+            <w:shd w:val="clear" w:color="auto" w:fill="DCE6F1"/>
+            <w:vAlign w:val="center"/>
+          </w:tcPr>
+          <w:p>
+            <w:pPr>
+              <w:spacing w:before="40" w:after="40" w:line="240" w:lineRule="auto"/>
+              <w:jc w:val="center"/>
+            </w:pPr>
+            <w:r>
+              <w:rPr>
+                <w:rFonts w:ascii="Times New Roman" w:hAnsi="Times New Roman" w:cs="Times New Roman"/>
+                <w:b/>
+                <w:color w:val="1F3864"/>
+                <w:sz w:val="22"/>
+                <w:szCs w:val="22"/>
+              </w:rPr>
+              <w:t xml:space="preserve">Analytics</w:t>
+            </w:r>
+          </w:p>
+        </w:tc>
+        <w:tc>
+          <w:tcPr>
+            <w:tcW w:w="1872" w:type="dxa"/>
+            <w:tcBorders>
+              <w:top w:val="single" w:sz="8" w:color="1F3864"/>
+              <w:left w:val="single" w:sz="8" w:color="1F3864"/>
+              <w:bottom w:val="single" w:sz="8" w:color="1F3864"/>
+              <w:right w:val="single" w:sz="8" w:color="1F3864"/>
+            </w:tcBorders>
+            <w:shd w:val="clear" w:color="auto" w:fill="DCE6F1"/>
+            <w:vAlign w:val="center"/>
+          </w:tcPr>
+          <w:p>
+            <w:pPr>
+              <w:spacing w:before="40" w:after="40" w:line="240" w:lineRule="auto"/>
+              <w:jc w:val="center"/>
+            </w:pPr>
+            <w:r>
+              <w:rPr>
+                <w:rFonts w:ascii="Times New Roman" w:hAnsi="Times New Roman" w:cs="Times New Roman"/>
+                <w:b/>
+                <w:color w:val="1F3864"/>
+                <w:sz w:val="22"/>
+                <w:szCs w:val="22"/>
+              </w:rPr>
+              <w:t xml:space="preserve">Mission / Alerts</w:t>
+            </w:r>
+          </w:p>
+        </w:tc>
+      </w:tr>
+    </w:tbl>
+    <w:p>
+      <w:pPr>
+        <w:spacing w:before="0" w:after="0" w:line="200" w:lineRule="auto"/>
+        <w:jc w:val="center"/>
+      </w:pPr>
+      <w:r>
+        <w:rPr>
+          <w:rFonts w:ascii="Times New Roman" w:hAnsi="Times New Roman" w:cs="Times New Roman"/>
+          <w:color w:val="1F3864"/>
+          <w:sz w:val="24"/>
+          <w:szCs w:val="24"/>
+        </w:rPr>
+        <w:t xml:space="preserve">▼</w:t>
+      </w:r>
+    </w:p>
+    <w:p>
+      <w:pPr>
+        <w:spacing w:before="40" w:after="20" w:line="200" w:lineRule="auto"/>
+        <w:jc w:val="center"/>
+      </w:pPr>
+      <w:r>
+        <w:rPr>
+          <w:rFonts w:ascii="Times New Roman" w:hAnsi="Times New Roman" w:cs="Times New Roman"/>
+          <w:b/>
+          <w:color w:val="555555"/>
+          <w:sz w:val="20"/>
+          <w:szCs w:val="20"/>
+        </w:rPr>
+        <w:t xml:space="preserve">Application / Processing Layer</w:t>
+      </w:r>
+    </w:p>
+    <w:tbl>
+      <w:tblPr>
+        <w:tblW w:w="9360" w:type="dxa"/>
+        <w:jc w:val="center"/>
+        <w:tblLook w:val="04A0"/>
+      </w:tblPr>
+      <w:tblGrid>
+        <w:gridCol w:w="3120"/>
+        <w:gridCol w:w="3120"/>
+        <w:gridCol w:w="3120"/>
+      </w:tblGrid>
+      <w:tr>
+        <w:tc>
+          <w:tcPr>
+            <w:tcW w:w="3120" w:type="dxa"/>
+            <w:tcBorders>
+              <w:top w:val="single" w:sz="8" w:color="1F3864"/>
+              <w:left w:val="single" w:sz="8" w:color="1F3864"/>
+              <w:bottom w:val="single" w:sz="8" w:color="1F3864"/>
+              <w:right w:val="single" w:sz="8" w:color="1F3864"/>
+            </w:tcBorders>
+            <w:shd w:val="clear" w:color="auto" w:fill="DCE6F1"/>
+            <w:vAlign w:val="center"/>
+          </w:tcPr>
+          <w:p>
+            <w:pPr>
+              <w:spacing w:before="40" w:after="40" w:line="240" w:lineRule="auto"/>
+              <w:jc w:val="center"/>
+            </w:pPr>
+            <w:r>
+              <w:rPr>
+                <w:rFonts w:ascii="Times New Roman" w:hAnsi="Times New Roman" w:cs="Times New Roman"/>
+                <w:b/>
+                <w:color w:val="1F3864"/>
+                <w:sz w:val="22"/>
+                <w:szCs w:val="22"/>
+              </w:rPr>
+              <w:t xml:space="preserve">Simulation Engine</w:t>
+            </w:r>
+          </w:p>
+        </w:tc>
+        <w:tc>
+          <w:tcPr>
+            <w:tcW w:w="3120" w:type="dxa"/>
+            <w:tcBorders>
+              <w:top w:val="single" w:sz="8" w:color="1F3864"/>
+              <w:left w:val="single" w:sz="8" w:color="1F3864"/>
+              <w:bottom w:val="single" w:sz="8" w:color="1F3864"/>
+              <w:right w:val="single" w:sz="8" w:color="1F3864"/>
+            </w:tcBorders>
+            <w:shd w:val="clear" w:color="auto" w:fill="DCE6F1"/>
+            <w:vAlign w:val="center"/>
+          </w:tcPr>
+          <w:p>
+            <w:pPr>
+              <w:spacing w:before="40" w:after="40" w:line="240" w:lineRule="auto"/>
+              <w:jc w:val="center"/>
+            </w:pPr>
+            <w:r>
+              <w:rPr>
+                <w:rFonts w:ascii="Times New Roman" w:hAnsi="Times New Roman" w:cs="Times New Roman"/>
+                <w:b/>
+                <w:color w:val="1F3864"/>
+                <w:sz w:val="22"/>
+                <w:szCs w:val="22"/>
+              </w:rPr>
+              <w:t xml:space="preserve">Telemetry Processing</w:t>
+            </w:r>
+          </w:p>
+        </w:tc>
+        <w:tc>
+          <w:tcPr>
+            <w:tcW w:w="3120" w:type="dxa"/>
+            <w:tcBorders>
+              <w:top w:val="single" w:sz="8" w:color="1F3864"/>
+              <w:left w:val="single" w:sz="8" w:color="1F3864"/>
+              <w:bottom w:val="single" w:sz="8" w:color="1F3864"/>
+              <w:right w:val="single" w:sz="8" w:color="1F3864"/>
+            </w:tcBorders>
+            <w:shd w:val="clear" w:color="auto" w:fill="DCE6F1"/>
+            <w:vAlign w:val="center"/>
+          </w:tcPr>
+          <w:p>
+            <w:pPr>
+              <w:spacing w:before="40" w:after="40" w:line="240" w:lineRule="auto"/>
+              <w:jc w:val="center"/>
+            </w:pPr>
+            <w:r>
+              <w:rPr>
+                <w:rFonts w:ascii="Times New Roman" w:hAnsi="Times New Roman" w:cs="Times New Roman"/>
+                <w:b/>
+                <w:color w:val="1F3864"/>
+                <w:sz w:val="22"/>
+                <w:szCs w:val="22"/>
+              </w:rPr>
+              <w:t xml:space="preserve">Alert Engine</w:t>
+            </w:r>
+          </w:p>
+        </w:tc>
+      </w:tr>
+    </w:tbl>
+    <w:p>
+      <w:pPr>
+        <w:spacing w:before="0" w:after="0" w:line="200" w:lineRule="auto"/>
+        <w:jc w:val="center"/>
+      </w:pPr>
+      <w:r>
+        <w:rPr>
+          <w:rFonts w:ascii="Times New Roman" w:hAnsi="Times New Roman" w:cs="Times New Roman"/>
+          <w:color w:val="1F3864"/>
+          <w:sz w:val="24"/>
+          <w:szCs w:val="24"/>
+        </w:rPr>
+        <w:t xml:space="preserve">▼</w:t>
+      </w:r>
+    </w:p>
+    <w:p>
+      <w:pPr>
+        <w:spacing w:before="40" w:after="20" w:line="200" w:lineRule="auto"/>
+        <w:jc w:val="center"/>
+      </w:pPr>
+      <w:r>
+        <w:rPr>
+          <w:rFonts w:ascii="Times New Roman" w:hAnsi="Times New Roman" w:cs="Times New Roman"/>
+          <w:b/>
+          <w:color w:val="555555"/>
+          <w:sz w:val="20"/>
+          <w:szCs w:val="20"/>
+        </w:rPr>
+        <w:t xml:space="preserve">Data Layer</w:t>
+      </w:r>
+    </w:p>
+    <w:tbl>
+      <w:tblPr>
+        <w:tblW w:w="9360" w:type="dxa"/>
+        <w:jc w:val="center"/>
+        <w:tblLook w:val="04A0"/>
+      </w:tblPr>
+      <w:tblGrid>
+        <w:gridCol w:w="3120"/>
+        <w:gridCol w:w="3120"/>
+        <w:gridCol w:w="3120"/>
+      </w:tblGrid>
+      <w:tr>
+        <w:tc>
+          <w:tcPr>
+            <w:tcW w:w="3120" w:type="dxa"/>
+            <w:tcBorders>
+              <w:top w:val="single" w:sz="8" w:color="1F3864"/>
+              <w:left w:val="single" w:sz="8" w:color="1F3864"/>
+              <w:bottom w:val="single" w:sz="8" w:color="1F3864"/>
+              <w:right w:val="single" w:sz="8" w:color="1F3864"/>
+            </w:tcBorders>
+            <w:shd w:val="clear" w:color="auto" w:fill="DCE6F1"/>
+            <w:vAlign w:val="center"/>
+          </w:tcPr>
+          <w:p>
+            <w:pPr>
+              <w:spacing w:before="40" w:after="40" w:line="240" w:lineRule="auto"/>
+              <w:jc w:val="center"/>
+            </w:pPr>
+            <w:r>
+              <w:rPr>
+                <w:rFonts w:ascii="Times New Roman" w:hAnsi="Times New Roman" w:cs="Times New Roman"/>
+                <w:b/>
+                <w:color w:val="1F3864"/>
+                <w:sz w:val="22"/>
+                <w:szCs w:val="22"/>
+              </w:rPr>
+              <w:t xml:space="preserve">Aircraft Data Model</w:t>
+            </w:r>
+          </w:p>
+        </w:tc>
+        <w:tc>
+          <w:tcPr>
+            <w:tcW w:w="3120" w:type="dxa"/>
+            <w:tcBorders>
+              <w:top w:val="single" w:sz="8" w:color="1F3864"/>
+              <w:left w:val="single" w:sz="8" w:color="1F3864"/>
+              <w:bottom w:val="single" w:sz="8" w:color="1F3864"/>
+              <w:right w:val="single" w:sz="8" w:color="1F3864"/>
+            </w:tcBorders>
+            <w:shd w:val="clear" w:color="auto" w:fill="DCE6F1"/>
+            <w:vAlign w:val="center"/>
+          </w:tcPr>
+          <w:p>
+            <w:pPr>
+              <w:spacing w:before="40" w:after="40" w:line="240" w:lineRule="auto"/>
+              <w:jc w:val="center"/>
+            </w:pPr>
+            <w:r>
+              <w:rPr>
+                <w:rFonts w:ascii="Times New Roman" w:hAnsi="Times New Roman" w:cs="Times New Roman"/>
+                <w:b/>
+                <w:color w:val="1F3864"/>
+                <w:sz w:val="22"/>
+                <w:szCs w:val="22"/>
+              </w:rPr>
+              <w:t xml:space="preserve">Alert Store</w:t>
+            </w:r>
+          </w:p>
+        </w:tc>
+        <w:tc>
+          <w:tcPr>
+            <w:tcW w:w="3120" w:type="dxa"/>
+            <w:tcBorders>
+              <w:top w:val="single" w:sz="8" w:color="1F3864"/>
+              <w:left w:val="single" w:sz="8" w:color="1F3864"/>
+              <w:bottom w:val="single" w:sz="8" w:color="1F3864"/>
+              <w:right w:val="single" w:sz="8" w:color="1F3864"/>
+            </w:tcBorders>
+            <w:shd w:val="clear" w:color="auto" w:fill="DCE6F1"/>
+            <w:vAlign w:val="center"/>
+          </w:tcPr>
+          <w:p>
+            <w:pPr>
+              <w:spacing w:before="40" w:after="40" w:line="240" w:lineRule="auto"/>
+              <w:jc w:val="center"/>
+            </w:pPr>
+            <w:r>
+              <w:rPr>
+                <w:rFonts w:ascii="Times New Roman" w:hAnsi="Times New Roman" w:cs="Times New Roman"/>
+                <w:b/>
+                <w:color w:val="1F3864"/>
+                <w:sz w:val="22"/>
+                <w:szCs w:val="22"/>
+              </w:rPr>
+              <w:t xml:space="preserve">Configuration</w:t>
+            </w:r>
+          </w:p>
+        </w:tc>
+      </w:tr>
+    </w:tbl>
+    <w:p>
+      <w:pPr>
+        <w:spacing w:before="0" w:after="60" w:line="120" w:lineRule="auto"/>
+        <w:jc w:val="both"/>
+      </w:pPr>
+      <w:r>
+        <w:rPr>
+          <w:rFonts w:ascii="Times New Roman" w:hAnsi="Times New Roman" w:cs="Times New Roman"/>
+          <w:sz w:val="12"/>
+          <w:szCs w:val="12"/>
+        </w:rPr>
+        <w:t xml:space="preserve"/>
+      </w:r>
+    </w:p>
+    <w:p>
+      <w:pPr>
+        <w:spacing w:before="60" w:after="200" w:line="240" w:lineRule="auto"/>
+        <w:jc w:val="center"/>
+      </w:pPr>
+      <w:r>
+        <w:rPr>
+          <w:rFonts w:ascii="Times New Roman" w:hAnsi="Times New Roman" w:cs="Times New Roman"/>
+          <w:i/>
+          <w:sz w:val="22"/>
+          <w:szCs w:val="22"/>
+        </w:rPr>
+        <w:t xml:space="preserve">Fig. 1  Layered system architecture of the application</w:t>
+      </w:r>
+    </w:p>
+    <w:p>
+      <w:pPr>
+        <w:keepNext/>
+        <w:spacing w:before="160" w:after="120" w:line="360" w:lineRule="auto"/>
+        <w:jc w:val="left"/>
+      </w:pPr>
+      <w:r>
+        <w:rPr>
+          <w:rFonts w:ascii="Times New Roman" w:hAnsi="Times New Roman" w:cs="Times New Roman"/>
+          <w:b/>
+          <w:sz w:val="28"/>
+          <w:szCs w:val="28"/>
+        </w:rPr>
+        <w:t xml:space="preserve">7.3  Login Page</w:t>
       </w:r>
     </w:p>
     <w:p>
@@ -7798,7 +8298,7 @@
           <w:sz w:val="22"/>
           <w:szCs w:val="22"/>
         </w:rPr>
-        <w:t xml:space="preserve">Fig. 1  Login Page of the Advanced Live Aircraft Tracking System</w:t>
+        <w:t xml:space="preserve">Fig. 2  Login Page of the Advanced Live Aircraft Tracking System</w:t>
       </w:r>
     </w:p>
     <w:p>
@@ -7814,7 +8314,7 @@
           <w:sz w:val="28"/>
           <w:szCs w:val="28"/>
         </w:rPr>
-        <w:t xml:space="preserve">7.3  Dashboard Page</w:t>
+        <w:t xml:space="preserve">7.4  Dashboard Page</w:t>
       </w:r>
     </w:p>
     <w:p>
@@ -7901,7 +8401,7 @@
           <w:sz w:val="22"/>
           <w:szCs w:val="22"/>
         </w:rPr>
-        <w:t xml:space="preserve">Fig. 2  Dashboard Page of the Advanced Live Aircraft Tracking System</w:t>
+        <w:t xml:space="preserve">Fig. 3  Dashboard Page of the Advanced Live Aircraft Tracking System</w:t>
       </w:r>
     </w:p>
     <w:p>
@@ -7917,7 +8417,7 @@
           <w:sz w:val="28"/>
           <w:szCs w:val="28"/>
         </w:rPr>
-        <w:t xml:space="preserve">7.4  Live Tracking Page</w:t>
+        <w:t xml:space="preserve">7.5  Live Tracking Page</w:t>
       </w:r>
     </w:p>
     <w:p>
@@ -8004,7 +8504,7 @@
           <w:sz w:val="22"/>
           <w:szCs w:val="22"/>
         </w:rPr>
-        <w:t xml:space="preserve">Fig. 3  Live Tracking Page of the Advanced Live Aircraft Tracking System</w:t>
+        <w:t xml:space="preserve">Fig. 4  Live Tracking Page of the Advanced Live Aircraft Tracking System</w:t>
       </w:r>
     </w:p>
     <w:p>
@@ -8020,7 +8520,7 @@
           <w:sz w:val="28"/>
           <w:szCs w:val="28"/>
         </w:rPr>
-        <w:t xml:space="preserve">7.5  Radar Scope Page</w:t>
+        <w:t xml:space="preserve">7.6  Radar Scope Page</w:t>
       </w:r>
     </w:p>
     <w:p>
@@ -8107,7 +8607,7 @@
           <w:sz w:val="22"/>
           <w:szCs w:val="22"/>
         </w:rPr>
-        <w:t xml:space="preserve">Fig. 4  Radar Scope Page of the Advanced Live Aircraft Tracking System</w:t>
+        <w:t xml:space="preserve">Fig. 5  Radar Scope Page of the Advanced Live Aircraft Tracking System</w:t>
       </w:r>
     </w:p>
     <w:p>
@@ -8123,7 +8623,7 @@
           <w:sz w:val="28"/>
           <w:szCs w:val="28"/>
         </w:rPr>
-        <w:t xml:space="preserve">7.6  Analytics Page</w:t>
+        <w:t xml:space="preserve">7.7  Analytics Page</w:t>
       </w:r>
     </w:p>
     <w:p>
@@ -8210,7 +8710,7 @@
           <w:sz w:val="22"/>
           <w:szCs w:val="22"/>
         </w:rPr>
-        <w:t xml:space="preserve">Fig. 5  Analytics Page of the Advanced Live Aircraft Tracking System</w:t>
+        <w:t xml:space="preserve">Fig. 6  Analytics Page of the Advanced Live Aircraft Tracking System</w:t>
       </w:r>
     </w:p>
     <w:p>
@@ -8226,7 +8726,7 @@
           <w:sz w:val="28"/>
           <w:szCs w:val="28"/>
         </w:rPr>
-        <w:t xml:space="preserve">7.7  Mission Control Page</w:t>
+        <w:t xml:space="preserve">7.8  Mission Control Page</w:t>
       </w:r>
     </w:p>
     <w:p>
@@ -8313,7 +8813,7 @@
           <w:sz w:val="22"/>
           <w:szCs w:val="22"/>
         </w:rPr>
-        <w:t xml:space="preserve">Fig. 6  Mission Control Page of the Advanced Live Aircraft Tracking System</w:t>
+        <w:t xml:space="preserve">Fig. 7  Mission Control Page of the Advanced Live Aircraft Tracking System</w:t>
       </w:r>
     </w:p>
     <w:p>
@@ -8329,7 +8829,7 @@
           <w:sz w:val="28"/>
           <w:szCs w:val="28"/>
         </w:rPr>
-        <w:t xml:space="preserve">7.8  Alert Feed Page</w:t>
+        <w:t xml:space="preserve">7.9  Alert Feed Page</w:t>
       </w:r>
     </w:p>
     <w:p>
@@ -8416,7 +8916,7 @@
           <w:sz w:val="22"/>
           <w:szCs w:val="22"/>
         </w:rPr>
-        <w:t xml:space="preserve">Fig. 7  Alert Feed Page of the Advanced Live Aircraft Tracking System</w:t>
+        <w:t xml:space="preserve">Fig. 8  Alert Feed Page of the Advanced Live Aircraft Tracking System</w:t>
       </w:r>
     </w:p>
     <w:p>
@@ -8432,7 +8932,7 @@
           <w:sz w:val="28"/>
           <w:szCs w:val="28"/>
         </w:rPr>
-        <w:t xml:space="preserve">7.9  Admin Panel Page</w:t>
+        <w:t xml:space="preserve">7.10  Admin Panel Page</w:t>
       </w:r>
     </w:p>
     <w:p>
@@ -8519,7 +9019,7 @@
           <w:sz w:val="22"/>
           <w:szCs w:val="22"/>
         </w:rPr>
-        <w:t xml:space="preserve">Fig. 8  Admin Panel Page of the Advanced Live Aircraft Tracking System</w:t>
+        <w:t xml:space="preserve">Fig. 9  Admin Panel Page of the Advanced Live Aircraft Tracking System</w:t>
       </w:r>
     </w:p>
     <w:p>
@@ -8617,7 +9117,823 @@
           <w:sz w:val="28"/>
           <w:szCs w:val="28"/>
         </w:rPr>
-        <w:t xml:space="preserve">8.3  The Aircraft Data Model</w:t>
+        <w:t xml:space="preserve">8.3  System Flowchart</w:t>
+      </w:r>
+    </w:p>
+    <w:p>
+      <w:pPr>
+        <w:spacing w:before="0" w:after="120" w:line="360" w:lineRule="auto"/>
+        <w:jc w:val="both"/>
+      </w:pPr>
+      <w:r>
+        <w:rPr>
+          <w:rFonts w:ascii="Times New Roman" w:hAnsi="Times New Roman" w:cs="Times New Roman"/>
+          <w:sz w:val="24"/>
+          <w:szCs w:val="24"/>
+        </w:rPr>
+        <w:t xml:space="preserve">The flowchart below shows the overall flow of control of the application, from the operator logging in to the continuous real-time processing loop that drives every visualisation.</w:t>
+      </w:r>
+    </w:p>
+    <w:tbl>
+      <w:tblPr>
+        <w:tblW w:w="0" w:type="auto"/>
+        <w:jc w:val="center"/>
+        <w:tblLook w:val="04A0"/>
+      </w:tblPr>
+      <w:tblGrid>
+        <w:gridCol w:w="6600"/>
+      </w:tblGrid>
+      <w:tr>
+        <w:tc>
+          <w:tcPr>
+            <w:tcW w:w="6600" w:type="dxa"/>
+            <w:tcBorders>
+              <w:top w:val="single" w:sz="8" w:color="1F3864"/>
+              <w:left w:val="single" w:sz="8" w:color="1F3864"/>
+              <w:bottom w:val="single" w:sz="8" w:color="1F3864"/>
+              <w:right w:val="single" w:sz="8" w:color="1F3864"/>
+            </w:tcBorders>
+            <w:shd w:val="clear" w:color="auto" w:fill="DCE6F1"/>
+            <w:vAlign w:val="center"/>
+          </w:tcPr>
+          <w:p>
+            <w:pPr>
+              <w:spacing w:before="40" w:after="40" w:line="240" w:lineRule="auto"/>
+              <w:jc w:val="center"/>
+            </w:pPr>
+            <w:r>
+              <w:rPr>
+                <w:rFonts w:ascii="Times New Roman" w:hAnsi="Times New Roman" w:cs="Times New Roman"/>
+                <w:b/>
+                <w:color w:val="1F3864"/>
+                <w:sz w:val="22"/>
+                <w:szCs w:val="22"/>
+              </w:rPr>
+              <w:t xml:space="preserve">Start → Operator Login</w:t>
+            </w:r>
+          </w:p>
+        </w:tc>
+      </w:tr>
+    </w:tbl>
+    <w:p>
+      <w:pPr>
+        <w:spacing w:before="0" w:after="0" w:line="200" w:lineRule="auto"/>
+        <w:jc w:val="center"/>
+      </w:pPr>
+      <w:r>
+        <w:rPr>
+          <w:rFonts w:ascii="Times New Roman" w:hAnsi="Times New Roman" w:cs="Times New Roman"/>
+          <w:color w:val="1F3864"/>
+          <w:sz w:val="24"/>
+          <w:szCs w:val="24"/>
+        </w:rPr>
+        <w:t xml:space="preserve">▼</w:t>
+      </w:r>
+    </w:p>
+    <w:tbl>
+      <w:tblPr>
+        <w:tblW w:w="0" w:type="auto"/>
+        <w:jc w:val="center"/>
+        <w:tblLook w:val="04A0"/>
+      </w:tblPr>
+      <w:tblGrid>
+        <w:gridCol w:w="6600"/>
+      </w:tblGrid>
+      <w:tr>
+        <w:tc>
+          <w:tcPr>
+            <w:tcW w:w="6600" w:type="dxa"/>
+            <w:tcBorders>
+              <w:top w:val="single" w:sz="8" w:color="1F3864"/>
+              <w:left w:val="single" w:sz="8" w:color="1F3864"/>
+              <w:bottom w:val="single" w:sz="8" w:color="1F3864"/>
+              <w:right w:val="single" w:sz="8" w:color="1F3864"/>
+            </w:tcBorders>
+            <w:shd w:val="clear" w:color="auto" w:fill="DCE6F1"/>
+            <w:vAlign w:val="center"/>
+          </w:tcPr>
+          <w:p>
+            <w:pPr>
+              <w:spacing w:before="40" w:after="40" w:line="240" w:lineRule="auto"/>
+              <w:jc w:val="center"/>
+            </w:pPr>
+            <w:r>
+              <w:rPr>
+                <w:rFonts w:ascii="Times New Roman" w:hAnsi="Times New Roman" w:cs="Times New Roman"/>
+                <w:b/>
+                <w:color w:val="1F3864"/>
+                <w:sz w:val="22"/>
+                <w:szCs w:val="22"/>
+              </w:rPr>
+              <w:t xml:space="preserve">Initialise data model and views</w:t>
+            </w:r>
+          </w:p>
+        </w:tc>
+      </w:tr>
+    </w:tbl>
+    <w:p>
+      <w:pPr>
+        <w:spacing w:before="0" w:after="0" w:line="200" w:lineRule="auto"/>
+        <w:jc w:val="center"/>
+      </w:pPr>
+      <w:r>
+        <w:rPr>
+          <w:rFonts w:ascii="Times New Roman" w:hAnsi="Times New Roman" w:cs="Times New Roman"/>
+          <w:color w:val="1F3864"/>
+          <w:sz w:val="24"/>
+          <w:szCs w:val="24"/>
+        </w:rPr>
+        <w:t xml:space="preserve">▼</w:t>
+      </w:r>
+    </w:p>
+    <w:tbl>
+      <w:tblPr>
+        <w:tblW w:w="0" w:type="auto"/>
+        <w:jc w:val="center"/>
+        <w:tblLook w:val="04A0"/>
+      </w:tblPr>
+      <w:tblGrid>
+        <w:gridCol w:w="6600"/>
+      </w:tblGrid>
+      <w:tr>
+        <w:tc>
+          <w:tcPr>
+            <w:tcW w:w="6600" w:type="dxa"/>
+            <w:tcBorders>
+              <w:top w:val="single" w:sz="8" w:color="1F3864"/>
+              <w:left w:val="single" w:sz="8" w:color="1F3864"/>
+              <w:bottom w:val="single" w:sz="8" w:color="1F3864"/>
+              <w:right w:val="single" w:sz="8" w:color="1F3864"/>
+            </w:tcBorders>
+            <w:shd w:val="clear" w:color="auto" w:fill="DCE6F1"/>
+            <w:vAlign w:val="center"/>
+          </w:tcPr>
+          <w:p>
+            <w:pPr>
+              <w:spacing w:before="40" w:after="40" w:line="240" w:lineRule="auto"/>
+              <w:jc w:val="center"/>
+            </w:pPr>
+            <w:r>
+              <w:rPr>
+                <w:rFonts w:ascii="Times New Roman" w:hAnsi="Times New Roman" w:cs="Times New Roman"/>
+                <w:b/>
+                <w:color w:val="1F3864"/>
+                <w:sz w:val="22"/>
+                <w:szCs w:val="22"/>
+              </w:rPr>
+              <w:t xml:space="preserve">Timer triggers a processing cycle</w:t>
+            </w:r>
+          </w:p>
+        </w:tc>
+      </w:tr>
+    </w:tbl>
+    <w:p>
+      <w:pPr>
+        <w:spacing w:before="0" w:after="0" w:line="200" w:lineRule="auto"/>
+        <w:jc w:val="center"/>
+      </w:pPr>
+      <w:r>
+        <w:rPr>
+          <w:rFonts w:ascii="Times New Roman" w:hAnsi="Times New Roman" w:cs="Times New Roman"/>
+          <w:color w:val="1F3864"/>
+          <w:sz w:val="24"/>
+          <w:szCs w:val="24"/>
+        </w:rPr>
+        <w:t xml:space="preserve">▼</w:t>
+      </w:r>
+    </w:p>
+    <w:tbl>
+      <w:tblPr>
+        <w:tblW w:w="0" w:type="auto"/>
+        <w:jc w:val="center"/>
+        <w:tblLook w:val="04A0"/>
+      </w:tblPr>
+      <w:tblGrid>
+        <w:gridCol w:w="6600"/>
+      </w:tblGrid>
+      <w:tr>
+        <w:tc>
+          <w:tcPr>
+            <w:tcW w:w="6600" w:type="dxa"/>
+            <w:tcBorders>
+              <w:top w:val="single" w:sz="8" w:color="1F3864"/>
+              <w:left w:val="single" w:sz="8" w:color="1F3864"/>
+              <w:bottom w:val="single" w:sz="8" w:color="1F3864"/>
+              <w:right w:val="single" w:sz="8" w:color="1F3864"/>
+            </w:tcBorders>
+            <w:shd w:val="clear" w:color="auto" w:fill="DCE6F1"/>
+            <w:vAlign w:val="center"/>
+          </w:tcPr>
+          <w:p>
+            <w:pPr>
+              <w:spacing w:before="40" w:after="40" w:line="240" w:lineRule="auto"/>
+              <w:jc w:val="center"/>
+            </w:pPr>
+            <w:r>
+              <w:rPr>
+                <w:rFonts w:ascii="Times New Roman" w:hAnsi="Times New Roman" w:cs="Times New Roman"/>
+                <w:b/>
+                <w:color w:val="1F3864"/>
+                <w:sz w:val="22"/>
+                <w:szCs w:val="22"/>
+              </w:rPr>
+              <w:t xml:space="preserve">Simulate and process telemetry of each aircraft</w:t>
+            </w:r>
+          </w:p>
+        </w:tc>
+      </w:tr>
+    </w:tbl>
+    <w:p>
+      <w:pPr>
+        <w:spacing w:before="0" w:after="0" w:line="200" w:lineRule="auto"/>
+        <w:jc w:val="center"/>
+      </w:pPr>
+      <w:r>
+        <w:rPr>
+          <w:rFonts w:ascii="Times New Roman" w:hAnsi="Times New Roman" w:cs="Times New Roman"/>
+          <w:color w:val="1F3864"/>
+          <w:sz w:val="24"/>
+          <w:szCs w:val="24"/>
+        </w:rPr>
+        <w:t xml:space="preserve">▼</w:t>
+      </w:r>
+    </w:p>
+    <w:tbl>
+      <w:tblPr>
+        <w:tblW w:w="0" w:type="auto"/>
+        <w:jc w:val="center"/>
+        <w:tblLook w:val="04A0"/>
+      </w:tblPr>
+      <w:tblGrid>
+        <w:gridCol w:w="6600"/>
+      </w:tblGrid>
+      <w:tr>
+        <w:tc>
+          <w:tcPr>
+            <w:tcW w:w="6600" w:type="dxa"/>
+            <w:tcBorders>
+              <w:top w:val="single" w:sz="8" w:color="1F3864"/>
+              <w:left w:val="single" w:sz="8" w:color="1F3864"/>
+              <w:bottom w:val="single" w:sz="8" w:color="1F3864"/>
+              <w:right w:val="single" w:sz="8" w:color="1F3864"/>
+            </w:tcBorders>
+            <w:shd w:val="clear" w:color="auto" w:fill="DCE6F1"/>
+            <w:vAlign w:val="center"/>
+          </w:tcPr>
+          <w:p>
+            <w:pPr>
+              <w:spacing w:before="40" w:after="40" w:line="240" w:lineRule="auto"/>
+              <w:jc w:val="center"/>
+            </w:pPr>
+            <w:r>
+              <w:rPr>
+                <w:rFonts w:ascii="Times New Roman" w:hAnsi="Times New Roman" w:cs="Times New Roman"/>
+                <w:b/>
+                <w:color w:val="1F3864"/>
+                <w:sz w:val="22"/>
+                <w:szCs w:val="22"/>
+              </w:rPr>
+              <w:t xml:space="preserve">Compare parameters against thresholds</w:t>
+            </w:r>
+          </w:p>
+        </w:tc>
+      </w:tr>
+    </w:tbl>
+    <w:p>
+      <w:pPr>
+        <w:spacing w:before="0" w:after="0" w:line="200" w:lineRule="auto"/>
+        <w:jc w:val="center"/>
+      </w:pPr>
+      <w:r>
+        <w:rPr>
+          <w:rFonts w:ascii="Times New Roman" w:hAnsi="Times New Roman" w:cs="Times New Roman"/>
+          <w:color w:val="1F3864"/>
+          <w:sz w:val="24"/>
+          <w:szCs w:val="24"/>
+        </w:rPr>
+        <w:t xml:space="preserve">▼</w:t>
+      </w:r>
+    </w:p>
+    <w:tbl>
+      <w:tblPr>
+        <w:tblW w:w="0" w:type="auto"/>
+        <w:jc w:val="center"/>
+        <w:tblLook w:val="04A0"/>
+      </w:tblPr>
+      <w:tblGrid>
+        <w:gridCol w:w="6600"/>
+      </w:tblGrid>
+      <w:tr>
+        <w:tc>
+          <w:tcPr>
+            <w:tcW w:w="6600" w:type="dxa"/>
+            <w:tcBorders>
+              <w:top w:val="single" w:sz="8" w:color="1F3864"/>
+              <w:left w:val="single" w:sz="8" w:color="1F3864"/>
+              <w:bottom w:val="single" w:sz="8" w:color="1F3864"/>
+              <w:right w:val="single" w:sz="8" w:color="1F3864"/>
+            </w:tcBorders>
+            <w:shd w:val="clear" w:color="auto" w:fill="DCE6F1"/>
+            <w:vAlign w:val="center"/>
+          </w:tcPr>
+          <w:p>
+            <w:pPr>
+              <w:spacing w:before="40" w:after="40" w:line="240" w:lineRule="auto"/>
+              <w:jc w:val="center"/>
+            </w:pPr>
+            <w:r>
+              <w:rPr>
+                <w:rFonts w:ascii="Times New Roman" w:hAnsi="Times New Roman" w:cs="Times New Roman"/>
+                <w:b/>
+                <w:color w:val="1F3864"/>
+                <w:sz w:val="22"/>
+                <w:szCs w:val="22"/>
+              </w:rPr>
+              <w:t xml:space="preserve">Raise alert if a threshold is crossed</w:t>
+            </w:r>
+          </w:p>
+        </w:tc>
+      </w:tr>
+    </w:tbl>
+    <w:p>
+      <w:pPr>
+        <w:spacing w:before="0" w:after="0" w:line="200" w:lineRule="auto"/>
+        <w:jc w:val="center"/>
+      </w:pPr>
+      <w:r>
+        <w:rPr>
+          <w:rFonts w:ascii="Times New Roman" w:hAnsi="Times New Roman" w:cs="Times New Roman"/>
+          <w:color w:val="1F3864"/>
+          <w:sz w:val="24"/>
+          <w:szCs w:val="24"/>
+        </w:rPr>
+        <w:t xml:space="preserve">▼</w:t>
+      </w:r>
+    </w:p>
+    <w:tbl>
+      <w:tblPr>
+        <w:tblW w:w="0" w:type="auto"/>
+        <w:jc w:val="center"/>
+        <w:tblLook w:val="04A0"/>
+      </w:tblPr>
+      <w:tblGrid>
+        <w:gridCol w:w="6600"/>
+      </w:tblGrid>
+      <w:tr>
+        <w:tc>
+          <w:tcPr>
+            <w:tcW w:w="6600" w:type="dxa"/>
+            <w:tcBorders>
+              <w:top w:val="single" w:sz="8" w:color="1F3864"/>
+              <w:left w:val="single" w:sz="8" w:color="1F3864"/>
+              <w:bottom w:val="single" w:sz="8" w:color="1F3864"/>
+              <w:right w:val="single" w:sz="8" w:color="1F3864"/>
+            </w:tcBorders>
+            <w:shd w:val="clear" w:color="auto" w:fill="DCE6F1"/>
+            <w:vAlign w:val="center"/>
+          </w:tcPr>
+          <w:p>
+            <w:pPr>
+              <w:spacing w:before="40" w:after="40" w:line="240" w:lineRule="auto"/>
+              <w:jc w:val="center"/>
+            </w:pPr>
+            <w:r>
+              <w:rPr>
+                <w:rFonts w:ascii="Times New Roman" w:hAnsi="Times New Roman" w:cs="Times New Roman"/>
+                <w:b/>
+                <w:color w:val="1F3864"/>
+                <w:sz w:val="22"/>
+                <w:szCs w:val="22"/>
+              </w:rPr>
+              <w:t xml:space="preserve">Redraw map, radar, tables and charts</w:t>
+            </w:r>
+          </w:p>
+        </w:tc>
+      </w:tr>
+    </w:tbl>
+    <w:p>
+      <w:pPr>
+        <w:spacing w:before="0" w:after="0" w:line="200" w:lineRule="auto"/>
+        <w:jc w:val="center"/>
+      </w:pPr>
+      <w:r>
+        <w:rPr>
+          <w:rFonts w:ascii="Times New Roman" w:hAnsi="Times New Roman" w:cs="Times New Roman"/>
+          <w:color w:val="1F3864"/>
+          <w:sz w:val="24"/>
+          <w:szCs w:val="24"/>
+        </w:rPr>
+        <w:t xml:space="preserve">▼</w:t>
+      </w:r>
+    </w:p>
+    <w:tbl>
+      <w:tblPr>
+        <w:tblW w:w="0" w:type="auto"/>
+        <w:jc w:val="center"/>
+        <w:tblLook w:val="04A0"/>
+      </w:tblPr>
+      <w:tblGrid>
+        <w:gridCol w:w="6600"/>
+      </w:tblGrid>
+      <w:tr>
+        <w:tc>
+          <w:tcPr>
+            <w:tcW w:w="6600" w:type="dxa"/>
+            <w:tcBorders>
+              <w:top w:val="single" w:sz="8" w:color="1F3864"/>
+              <w:left w:val="single" w:sz="8" w:color="1F3864"/>
+              <w:bottom w:val="single" w:sz="8" w:color="1F3864"/>
+              <w:right w:val="single" w:sz="8" w:color="1F3864"/>
+            </w:tcBorders>
+            <w:shd w:val="clear" w:color="auto" w:fill="DCE6F1"/>
+            <w:vAlign w:val="center"/>
+          </w:tcPr>
+          <w:p>
+            <w:pPr>
+              <w:spacing w:before="40" w:after="40" w:line="240" w:lineRule="auto"/>
+              <w:jc w:val="center"/>
+            </w:pPr>
+            <w:r>
+              <w:rPr>
+                <w:rFonts w:ascii="Times New Roman" w:hAnsi="Times New Roman" w:cs="Times New Roman"/>
+                <w:b/>
+                <w:color w:val="1F3864"/>
+                <w:sz w:val="22"/>
+                <w:szCs w:val="22"/>
+              </w:rPr>
+              <w:t xml:space="preserve">Repeat until logout → End</w:t>
+            </w:r>
+          </w:p>
+        </w:tc>
+      </w:tr>
+    </w:tbl>
+    <w:p>
+      <w:pPr>
+        <w:spacing w:before="0" w:after="60" w:line="120" w:lineRule="auto"/>
+        <w:jc w:val="both"/>
+      </w:pPr>
+      <w:r>
+        <w:rPr>
+          <w:rFonts w:ascii="Times New Roman" w:hAnsi="Times New Roman" w:cs="Times New Roman"/>
+          <w:sz w:val="12"/>
+          <w:szCs w:val="12"/>
+        </w:rPr>
+        <w:t xml:space="preserve"/>
+      </w:r>
+    </w:p>
+    <w:p>
+      <w:pPr>
+        <w:spacing w:before="60" w:after="200" w:line="240" w:lineRule="auto"/>
+        <w:jc w:val="center"/>
+      </w:pPr>
+      <w:r>
+        <w:rPr>
+          <w:rFonts w:ascii="Times New Roman" w:hAnsi="Times New Roman" w:cs="Times New Roman"/>
+          <w:i/>
+          <w:sz w:val="22"/>
+          <w:szCs w:val="22"/>
+        </w:rPr>
+        <w:t xml:space="preserve">Fig. 10  System flowchart of the real-time processing loop</w:t>
+      </w:r>
+    </w:p>
+    <w:p>
+      <w:pPr>
+        <w:keepNext/>
+        <w:spacing w:before="160" w:after="120" w:line="360" w:lineRule="auto"/>
+        <w:jc w:val="left"/>
+      </w:pPr>
+      <w:r>
+        <w:rPr>
+          <w:rFonts w:ascii="Times New Roman" w:hAnsi="Times New Roman" w:cs="Times New Roman"/>
+          <w:b/>
+          <w:sz w:val="28"/>
+          <w:szCs w:val="28"/>
+        </w:rPr>
+        <w:t xml:space="preserve">8.4  Data Flow Diagram</w:t>
+      </w:r>
+    </w:p>
+    <w:p>
+      <w:pPr>
+        <w:spacing w:before="0" w:after="120" w:line="360" w:lineRule="auto"/>
+        <w:jc w:val="both"/>
+      </w:pPr>
+      <w:r>
+        <w:rPr>
+          <w:rFonts w:ascii="Times New Roman" w:hAnsi="Times New Roman" w:cs="Times New Roman"/>
+          <w:sz w:val="24"/>
+          <w:szCs w:val="24"/>
+        </w:rPr>
+        <w:t xml:space="preserve">The data flow diagram describes how data moves through the system, from the telemetry source, through the processing stages, to the displays seen by the operator.</w:t>
+      </w:r>
+    </w:p>
+    <w:tbl>
+      <w:tblPr>
+        <w:tblW w:w="0" w:type="auto"/>
+        <w:jc w:val="center"/>
+        <w:tblLook w:val="04A0"/>
+      </w:tblPr>
+      <w:tblGrid>
+        <w:gridCol w:w="6600"/>
+      </w:tblGrid>
+      <w:tr>
+        <w:tc>
+          <w:tcPr>
+            <w:tcW w:w="6600" w:type="dxa"/>
+            <w:tcBorders>
+              <w:top w:val="single" w:sz="8" w:color="1F3864"/>
+              <w:left w:val="single" w:sz="8" w:color="1F3864"/>
+              <w:bottom w:val="single" w:sz="8" w:color="1F3864"/>
+              <w:right w:val="single" w:sz="8" w:color="1F3864"/>
+            </w:tcBorders>
+            <w:shd w:val="clear" w:color="auto" w:fill="DCE6F1"/>
+            <w:vAlign w:val="center"/>
+          </w:tcPr>
+          <w:p>
+            <w:pPr>
+              <w:spacing w:before="40" w:after="40" w:line="240" w:lineRule="auto"/>
+              <w:jc w:val="center"/>
+            </w:pPr>
+            <w:r>
+              <w:rPr>
+                <w:rFonts w:ascii="Times New Roman" w:hAnsi="Times New Roman" w:cs="Times New Roman"/>
+                <w:b/>
+                <w:color w:val="1F3864"/>
+                <w:sz w:val="22"/>
+                <w:szCs w:val="22"/>
+              </w:rPr>
+              <w:t xml:space="preserve">1.0  Acquire / Simulate Telemetry</w:t>
+            </w:r>
+          </w:p>
+        </w:tc>
+      </w:tr>
+    </w:tbl>
+    <w:p>
+      <w:pPr>
+        <w:spacing w:before="0" w:after="0" w:line="200" w:lineRule="auto"/>
+        <w:jc w:val="center"/>
+      </w:pPr>
+      <w:r>
+        <w:rPr>
+          <w:rFonts w:ascii="Times New Roman" w:hAnsi="Times New Roman" w:cs="Times New Roman"/>
+          <w:color w:val="1F3864"/>
+          <w:sz w:val="24"/>
+          <w:szCs w:val="24"/>
+        </w:rPr>
+        <w:t xml:space="preserve">▼</w:t>
+      </w:r>
+    </w:p>
+    <w:tbl>
+      <w:tblPr>
+        <w:tblW w:w="0" w:type="auto"/>
+        <w:jc w:val="center"/>
+        <w:tblLook w:val="04A0"/>
+      </w:tblPr>
+      <w:tblGrid>
+        <w:gridCol w:w="6600"/>
+      </w:tblGrid>
+      <w:tr>
+        <w:tc>
+          <w:tcPr>
+            <w:tcW w:w="6600" w:type="dxa"/>
+            <w:tcBorders>
+              <w:top w:val="single" w:sz="8" w:color="1F3864"/>
+              <w:left w:val="single" w:sz="8" w:color="1F3864"/>
+              <w:bottom w:val="single" w:sz="8" w:color="1F3864"/>
+              <w:right w:val="single" w:sz="8" w:color="1F3864"/>
+            </w:tcBorders>
+            <w:shd w:val="clear" w:color="auto" w:fill="DCE6F1"/>
+            <w:vAlign w:val="center"/>
+          </w:tcPr>
+          <w:p>
+            <w:pPr>
+              <w:spacing w:before="40" w:after="40" w:line="240" w:lineRule="auto"/>
+              <w:jc w:val="center"/>
+            </w:pPr>
+            <w:r>
+              <w:rPr>
+                <w:rFonts w:ascii="Times New Roman" w:hAnsi="Times New Roman" w:cs="Times New Roman"/>
+                <w:b/>
+                <w:color w:val="1F3864"/>
+                <w:sz w:val="22"/>
+                <w:szCs w:val="22"/>
+              </w:rPr>
+              <w:t xml:space="preserve">2.0  Process and Validate Parameters</w:t>
+            </w:r>
+          </w:p>
+        </w:tc>
+      </w:tr>
+    </w:tbl>
+    <w:p>
+      <w:pPr>
+        <w:spacing w:before="0" w:after="0" w:line="200" w:lineRule="auto"/>
+        <w:jc w:val="center"/>
+      </w:pPr>
+      <w:r>
+        <w:rPr>
+          <w:rFonts w:ascii="Times New Roman" w:hAnsi="Times New Roman" w:cs="Times New Roman"/>
+          <w:color w:val="1F3864"/>
+          <w:sz w:val="24"/>
+          <w:szCs w:val="24"/>
+        </w:rPr>
+        <w:t xml:space="preserve">▼</w:t>
+      </w:r>
+    </w:p>
+    <w:tbl>
+      <w:tblPr>
+        <w:tblW w:w="0" w:type="auto"/>
+        <w:jc w:val="center"/>
+        <w:tblLook w:val="04A0"/>
+      </w:tblPr>
+      <w:tblGrid>
+        <w:gridCol w:w="6600"/>
+      </w:tblGrid>
+      <w:tr>
+        <w:tc>
+          <w:tcPr>
+            <w:tcW w:w="6600" w:type="dxa"/>
+            <w:tcBorders>
+              <w:top w:val="single" w:sz="8" w:color="1F3864"/>
+              <w:left w:val="single" w:sz="8" w:color="1F3864"/>
+              <w:bottom w:val="single" w:sz="8" w:color="1F3864"/>
+              <w:right w:val="single" w:sz="8" w:color="1F3864"/>
+            </w:tcBorders>
+            <w:shd w:val="clear" w:color="auto" w:fill="DCE6F1"/>
+            <w:vAlign w:val="center"/>
+          </w:tcPr>
+          <w:p>
+            <w:pPr>
+              <w:spacing w:before="40" w:after="40" w:line="240" w:lineRule="auto"/>
+              <w:jc w:val="center"/>
+            </w:pPr>
+            <w:r>
+              <w:rPr>
+                <w:rFonts w:ascii="Times New Roman" w:hAnsi="Times New Roman" w:cs="Times New Roman"/>
+                <w:b/>
+                <w:color w:val="1F3864"/>
+                <w:sz w:val="22"/>
+                <w:szCs w:val="22"/>
+              </w:rPr>
+              <w:t xml:space="preserve">3.0  Evaluate Alert Thresholds</w:t>
+            </w:r>
+          </w:p>
+        </w:tc>
+      </w:tr>
+    </w:tbl>
+    <w:p>
+      <w:pPr>
+        <w:spacing w:before="0" w:after="0" w:line="200" w:lineRule="auto"/>
+        <w:jc w:val="center"/>
+      </w:pPr>
+      <w:r>
+        <w:rPr>
+          <w:rFonts w:ascii="Times New Roman" w:hAnsi="Times New Roman" w:cs="Times New Roman"/>
+          <w:color w:val="1F3864"/>
+          <w:sz w:val="24"/>
+          <w:szCs w:val="24"/>
+        </w:rPr>
+        <w:t xml:space="preserve">▼</w:t>
+      </w:r>
+    </w:p>
+    <w:tbl>
+      <w:tblPr>
+        <w:tblW w:w="0" w:type="auto"/>
+        <w:jc w:val="center"/>
+        <w:tblLook w:val="04A0"/>
+      </w:tblPr>
+      <w:tblGrid>
+        <w:gridCol w:w="6600"/>
+      </w:tblGrid>
+      <w:tr>
+        <w:tc>
+          <w:tcPr>
+            <w:tcW w:w="6600" w:type="dxa"/>
+            <w:tcBorders>
+              <w:top w:val="single" w:sz="8" w:color="1F3864"/>
+              <w:left w:val="single" w:sz="8" w:color="1F3864"/>
+              <w:bottom w:val="single" w:sz="8" w:color="1F3864"/>
+              <w:right w:val="single" w:sz="8" w:color="1F3864"/>
+            </w:tcBorders>
+            <w:shd w:val="clear" w:color="auto" w:fill="DCE6F1"/>
+            <w:vAlign w:val="center"/>
+          </w:tcPr>
+          <w:p>
+            <w:pPr>
+              <w:spacing w:before="40" w:after="40" w:line="240" w:lineRule="auto"/>
+              <w:jc w:val="center"/>
+            </w:pPr>
+            <w:r>
+              <w:rPr>
+                <w:rFonts w:ascii="Times New Roman" w:hAnsi="Times New Roman" w:cs="Times New Roman"/>
+                <w:b/>
+                <w:color w:val="1F3864"/>
+                <w:sz w:val="22"/>
+                <w:szCs w:val="22"/>
+              </w:rPr>
+              <w:t xml:space="preserve">4.0  Update Data Store</w:t>
+            </w:r>
+          </w:p>
+        </w:tc>
+      </w:tr>
+    </w:tbl>
+    <w:p>
+      <w:pPr>
+        <w:spacing w:before="0" w:after="0" w:line="200" w:lineRule="auto"/>
+        <w:jc w:val="center"/>
+      </w:pPr>
+      <w:r>
+        <w:rPr>
+          <w:rFonts w:ascii="Times New Roman" w:hAnsi="Times New Roman" w:cs="Times New Roman"/>
+          <w:color w:val="1F3864"/>
+          <w:sz w:val="24"/>
+          <w:szCs w:val="24"/>
+        </w:rPr>
+        <w:t xml:space="preserve">▼</w:t>
+      </w:r>
+    </w:p>
+    <w:tbl>
+      <w:tblPr>
+        <w:tblW w:w="0" w:type="auto"/>
+        <w:jc w:val="center"/>
+        <w:tblLook w:val="04A0"/>
+      </w:tblPr>
+      <w:tblGrid>
+        <w:gridCol w:w="6600"/>
+      </w:tblGrid>
+      <w:tr>
+        <w:tc>
+          <w:tcPr>
+            <w:tcW w:w="6600" w:type="dxa"/>
+            <w:tcBorders>
+              <w:top w:val="single" w:sz="8" w:color="1F3864"/>
+              <w:left w:val="single" w:sz="8" w:color="1F3864"/>
+              <w:bottom w:val="single" w:sz="8" w:color="1F3864"/>
+              <w:right w:val="single" w:sz="8" w:color="1F3864"/>
+            </w:tcBorders>
+            <w:shd w:val="clear" w:color="auto" w:fill="DCE6F1"/>
+            <w:vAlign w:val="center"/>
+          </w:tcPr>
+          <w:p>
+            <w:pPr>
+              <w:spacing w:before="40" w:after="40" w:line="240" w:lineRule="auto"/>
+              <w:jc w:val="center"/>
+            </w:pPr>
+            <w:r>
+              <w:rPr>
+                <w:rFonts w:ascii="Times New Roman" w:hAnsi="Times New Roman" w:cs="Times New Roman"/>
+                <w:b/>
+                <w:color w:val="1F3864"/>
+                <w:sz w:val="22"/>
+                <w:szCs w:val="22"/>
+              </w:rPr>
+              <w:t xml:space="preserve">5.0  Render Visualisations and Dashboard</w:t>
+            </w:r>
+          </w:p>
+        </w:tc>
+      </w:tr>
+    </w:tbl>
+    <w:p>
+      <w:pPr>
+        <w:spacing w:before="0" w:after="60" w:line="120" w:lineRule="auto"/>
+        <w:jc w:val="both"/>
+      </w:pPr>
+      <w:r>
+        <w:rPr>
+          <w:rFonts w:ascii="Times New Roman" w:hAnsi="Times New Roman" w:cs="Times New Roman"/>
+          <w:sz w:val="12"/>
+          <w:szCs w:val="12"/>
+        </w:rPr>
+        <w:t xml:space="preserve"/>
+      </w:r>
+    </w:p>
+    <w:p>
+      <w:pPr>
+        <w:spacing w:before="60" w:after="200" w:line="240" w:lineRule="auto"/>
+        <w:jc w:val="center"/>
+      </w:pPr>
+      <w:r>
+        <w:rPr>
+          <w:rFonts w:ascii="Times New Roman" w:hAnsi="Times New Roman" w:cs="Times New Roman"/>
+          <w:i/>
+          <w:sz w:val="22"/>
+          <w:szCs w:val="22"/>
+        </w:rPr>
+        <w:t xml:space="preserve">Fig. 11  Data Flow Diagram (Level 1) of the system</w:t>
+      </w:r>
+    </w:p>
+    <w:p>
+      <w:pPr>
+        <w:keepNext/>
+        <w:spacing w:before="160" w:after="120" w:line="360" w:lineRule="auto"/>
+        <w:jc w:val="left"/>
+      </w:pPr>
+      <w:r>
+        <w:rPr>
+          <w:rFonts w:ascii="Times New Roman" w:hAnsi="Times New Roman" w:cs="Times New Roman"/>
+          <w:b/>
+          <w:sz w:val="28"/>
+          <w:szCs w:val="28"/>
+        </w:rPr>
+        <w:t xml:space="preserve">8.5  The Aircraft Data Model</w:t>
       </w:r>
     </w:p>
     <w:p>
@@ -8756,7 +10072,7 @@
           <w:sz w:val="28"/>
           <w:szCs w:val="28"/>
         </w:rPr>
-        <w:t xml:space="preserve">8.4  The Simulation and Processing Function</w:t>
+        <w:t xml:space="preserve">8.6  The Simulation and Processing Function</w:t>
       </w:r>
     </w:p>
     <w:p>
@@ -8993,7 +10309,7 @@
           <w:sz w:val="28"/>
           <w:szCs w:val="28"/>
         </w:rPr>
-        <w:t xml:space="preserve">8.5  Canvas Drawing and Animation</w:t>
+        <w:t xml:space="preserve">8.7  Canvas Drawing and Animation</w:t>
       </w:r>
     </w:p>
     <w:p>
@@ -9216,7 +10532,7 @@
           <w:sz w:val="28"/>
           <w:szCs w:val="28"/>
         </w:rPr>
-        <w:t xml:space="preserve">8.6  Event Handling and Navigation</w:t>
+        <w:t xml:space="preserve">8.8  Event Handling and Navigation</w:t>
       </w:r>
     </w:p>
     <w:p>
@@ -9355,7 +10671,7 @@
           <w:sz w:val="28"/>
           <w:szCs w:val="28"/>
         </w:rPr>
-        <w:t xml:space="preserve">8.7  Timers and Real-time Updates</w:t>
+        <w:t xml:space="preserve">8.9  Timers and Real-time Updates</w:t>
       </w:r>
     </w:p>
     <w:p>
@@ -9386,7 +10702,7 @@
           <w:sz w:val="28"/>
           <w:szCs w:val="28"/>
         </w:rPr>
-        <w:t xml:space="preserve">8.8  Processing Fleet Statistics</w:t>
+        <w:t xml:space="preserve">8.10  Processing Fleet Statistics</w:t>
       </w:r>
     </w:p>
     <w:p>
@@ -9511,7 +10827,7 @@
           <w:sz w:val="28"/>
           <w:szCs w:val="28"/>
         </w:rPr>
-        <w:t xml:space="preserve">8.9  Generating and Storing Alerts</w:t>
+        <w:t xml:space="preserve">8.11  Generating and Storing Alerts</w:t>
       </w:r>
     </w:p>
     <w:p>
@@ -9636,7 +10952,7 @@
           <w:sz w:val="28"/>
           <w:szCs w:val="28"/>
         </w:rPr>
-        <w:t xml:space="preserve">8.10  Rendering Data Tables</w:t>
+        <w:t xml:space="preserve">8.12  Rendering Data Tables</w:t>
       </w:r>
     </w:p>
     <w:p>
@@ -9761,7 +11077,7 @@
           <w:sz w:val="28"/>
           <w:szCs w:val="28"/>
         </w:rPr>
-        <w:t xml:space="preserve">8.11  Coding Style and Maintainability</w:t>
+        <w:t xml:space="preserve">8.13  Coding Style and Maintainability</w:t>
       </w:r>
     </w:p>
     <w:p>
@@ -11117,7 +12433,7 @@
           <w:sz w:val="22"/>
           <w:szCs w:val="22"/>
         </w:rPr>
-        <w:t xml:space="preserve">Fig. 9  Entity-Relationship (ER) diagram of the data model</w:t>
+        <w:t xml:space="preserve">Fig. 12  Entity-Relationship (ER) diagram of the data model</w:t>
       </w:r>
     </w:p>
     <w:p>

</xml_diff>